<commit_message>
Owner approves every proposed default (165 decisions)
The owner approved all proposed defaults in the decisions register on
2026-10-12. Each approved row in the 43 readiness documents is marked;
the register records the approval. The open-items register records the
decisions: O-18 option (a), O-19 refuse NULL tenant audit rows from
tenant connections, O-12 gap-free numbering for requests and proformas,
O-20 to O-22 accepted as low residual risks, O-24 closed before login
code with mandatory MFA and pre-login procedures in the database,
O-03 lender changes through a correction revision, O-07 owner columns.

Claude-Session: https://claude.ai/code/session_012HHcRrzuvMBTL2FYxXtsyv
</commit_message>
<xml_diff>
--- a/treasury-platform/docs/31-OWNER-DECISIONS.docx
+++ b/treasury-platform/docs/31-OWNER-DECISIONS.docx
@@ -518,7 +518,7 @@
                 <w:szCs w:val="18"/>
                 <w:rtl/>
               </w:rPr>
-              <w:t xml:space="preserve">طريقة الرد</w:t>
+              <w:t xml:space="preserve">الحالة</w:t>
             </w:r>
           </w:p>
         </w:tc>
@@ -547,35 +547,65 @@
             </w:pPr>
             <w:r>
               <w:rPr>
-                <w:rFonts w:ascii="Arial" w:cs="Arial" w:eastAsia="Arial" w:hAnsi="Arial"/>
-                <w:b w:val="false"/>
-                <w:bCs w:val="false"/>
-                <w:sz w:val="18"/>
-                <w:szCs w:val="18"/>
-                <w:rtl/>
-              </w:rPr>
-              <w:t xml:space="preserve">لكل قرار افتراض مقترح </w:t>
-            </w:r>
-            <w:r>
-              <w:rPr>
-                <w:rFonts w:ascii="Arial" w:cs="Arial" w:eastAsia="Arial" w:hAnsi="Arial"/>
-                <w:color w:val="E0A800"/>
-                <w:sz w:val="18"/>
-                <w:szCs w:val="18"/>
-                <w:rtl/>
-              </w:rPr>
-              <w:t xml:space="preserve">●</w:t>
-            </w:r>
-            <w:r>
-              <w:rPr>
-                <w:rFonts w:ascii="Arial" w:cs="Arial" w:eastAsia="Arial" w:hAnsi="Arial"/>
-                <w:b w:val="false"/>
-                <w:bCs w:val="false"/>
-                <w:sz w:val="18"/>
-                <w:szCs w:val="18"/>
-                <w:rtl/>
-              </w:rPr>
-              <w:t xml:space="preserve">. يكفي أن تكتب أمام المعرّف «موافق» أو البديل الذي تريده؛ ما لا يُرد عليه يبقى مفتوحًا ولا يُعتمد ضمنيًا</w:t>
+                <w:rFonts w:ascii="Segoe UI Emoji" w:cs="Segoe UI Emoji" w:eastAsia="Segoe UI Emoji" w:hAnsi="Segoe UI Emoji"/>
+                <w:sz w:val="18"/>
+                <w:szCs w:val="18"/>
+                <w:rtl/>
+              </w:rPr>
+              <w:t xml:space="preserve">✅</w:t>
+            </w:r>
+            <w:r>
+              <w:rPr>
+                <w:rFonts w:ascii="Arial" w:cs="Arial" w:eastAsia="Arial" w:hAnsi="Arial"/>
+                <w:b w:val="false"/>
+                <w:bCs w:val="false"/>
+                <w:sz w:val="18"/>
+                <w:szCs w:val="18"/>
+                <w:rtl/>
+              </w:rPr>
+              <w:t xml:space="preserve"> </w:t>
+            </w:r>
+            <w:r>
+              <w:rPr>
+                <w:rFonts w:ascii="Arial" w:cs="Arial" w:eastAsia="Arial" w:hAnsi="Arial"/>
+                <w:b/>
+                <w:bCs/>
+                <w:sz w:val="18"/>
+                <w:szCs w:val="18"/>
+                <w:rtl/>
+              </w:rPr>
+              <w:t xml:space="preserve">اعتمد المالك كل الافتراضات المقترحة في هذا السجل في 2026-10-12.</w:t>
+            </w:r>
+            <w:r>
+              <w:rPr>
+                <w:rFonts w:ascii="Arial" w:cs="Arial" w:eastAsia="Arial" w:hAnsi="Arial"/>
+                <w:b w:val="false"/>
+                <w:bCs w:val="false"/>
+                <w:sz w:val="18"/>
+                <w:szCs w:val="18"/>
+                <w:rtl/>
+              </w:rPr>
+              <w:t xml:space="preserve"> كل صف معتمد مُعلَّم «</w:t>
+            </w:r>
+            <w:r>
+              <w:rPr>
+                <w:rFonts w:ascii="Segoe UI Emoji" w:cs="Segoe UI Emoji" w:eastAsia="Segoe UI Emoji" w:hAnsi="Segoe UI Emoji"/>
+                <w:sz w:val="18"/>
+                <w:szCs w:val="18"/>
+                <w:rtl/>
+              </w:rPr>
+              <w:t xml:space="preserve">✅</w:t>
+            </w:r>
+            <w:r>
+              <w:rPr>
+                <w:rFonts w:ascii="Arial" w:cs="Arial" w:eastAsia="Arial" w:hAnsi="Arial"/>
+                <w:b w:val="false"/>
+                <w:bCs w:val="false"/>
+                <w:sz w:val="18"/>
+                <w:szCs w:val="18"/>
+                <w:rtl/>
+              </w:rPr>
+              <w:t xml:space="preserve"> معتمد من المالك» في مستنده. القرارات التي افتراضها «بعد رأي قانوني» أو «يُتحقق قبل الشراء» تبقى أعمالًا مطلوبة لا قرارات مفتوحة</w:t>
             </w:r>
           </w:p>
         </w:tc>
@@ -710,7 +740,7 @@
           <w:szCs w:val="21"/>
           <w:rtl/>
         </w:rPr>
-        <w:t xml:space="preserve">هذه أهم القرارات وأكثرها تعطيلًا للعمل، مرتبة حسب وقت الحاجة إليها. القائمة الكاملة في القسم 3.</w:t>
+        <w:t xml:space="preserve">هذه أهم القرارات وأكثرها تعطيلًا للعمل، مرتبة حسب وقت الحاجة إليها، وكلها معتمدة كما اقتُرحت. القائمة الكاملة في القسم 3.</w:t>
       </w:r>
     </w:p>
     <w:p>
@@ -40434,7 +40464,7 @@
         <w:szCs w:val="17"/>
         <w:rtl/>
       </w:rPr>
-      <w:t xml:space="preserve">القرارات المطلوبة من المالك · BankFas · 2026-10-12</w:t>
+      <w:t xml:space="preserve">القرارات المعتمدة من المالك · BankFas · 2026-10-12</w:t>
     </w:r>
   </w:p>
 </w:hdr>

</xml_diff>

<commit_message>
Word files rebuilt for the self-review and the financial statements module
The design documents (version 0.3 and 0.4), the detailed analysis, the English
relationship diagrams with the new M5 tables (dated 2026-10-18), the owner
decisions, the review findings, the package and the new self-review record
(docs/34-SELF-REVIEW.docx), and the P0 readiness volume.

Spec 00 now gives the database's current state (203 tables, 26 CI steps, the
self-review and the module) instead of version 0.2; the owner decisions say the
138 and 139 permission counts were those of their day, 140 now.

Co-Authored-By: Claude Opus 5.5 <noreply@anthropic.com>
Claude-Session: https://claude.ai/code/session_012HHcRrzuvMBTL2FYxXtsyv
</commit_message>
<xml_diff>
--- a/treasury-platform/docs/31-OWNER-DECISIONS.docx
+++ b/treasury-platform/docs/31-OWNER-DECISIONS.docx
@@ -684,7 +684,7 @@
                 <w:szCs w:val="18"/>
                 <w:rtl/>
               </w:rPr>
-              <w:t xml:space="preserve">القرارات 1 إلى 4 في §1.1 منفّذة في القاعدة وتمر في CI (2026-10-12): docs/adr/0003-account-security-in-the-database.md، db/static/035_account_security.sql، db/tests/auth_flow_tests.sql. ومنفّذ أيضًا (ADR 0004): مهل الجلسة وإعدادات الأمان لكل مشترك (DQ-S03-6، DQ-S04-14)، وحسابات المشغّلين ودخولهم (DQ-S04-10، DQ-F07-3)، وربط الدعم المؤقت (DQ-F04-6)، والباقة STANDARD (DQ-B05-4)، والتهيئة وانتقالات الحالة (DQ-F05-2، DQ-F05-4، DQ-F05-6، DQ-F05-7)، وربط المهام الخلفية بالمقترح (DQ-F04-4). ومنفّذ أيضًا (ADR 0005): الترقيم بلا فجوات للطلبات والبروفورما مع اختبار تزامن (القرار 10، DQ-B02-4، O-12)، وقوائم الدول والعملات كاملة بإصدار ISO مسجَّل (DQ-B05-5)، ورموز الصلاحيات الـ138 (القرار 7، DQ-F07-1، DQ-F09-1). ومنفّذ أيضًا (2026-10-13): نموذج حالة الطلب الموحّد في المواصفة 13 (القرار 9، DQ-F08-1، O-10)، وقرارات نتائج المراجعة (O-15، ADR 0011)</w:t>
+              <w:t xml:space="preserve">القرارات 1 إلى 4 في §1.1 منفّذة في القاعدة وتمر في CI (2026-10-12): docs/adr/0003-account-security-in-the-database.md، db/static/035_account_security.sql، db/tests/auth_flow_tests.sql. ومنفّذ أيضًا (ADR 0004): مهل الجلسة وإعدادات الأمان لكل مشترك (DQ-S03-6، DQ-S04-14)، وحسابات المشغّلين ودخولهم (DQ-S04-10، DQ-F07-3)، وربط الدعم المؤقت (DQ-F04-6)، والباقة STANDARD (DQ-B05-4)، والتهيئة وانتقالات الحالة (DQ-F05-2، DQ-F05-4، DQ-F05-6، DQ-F05-7)، وربط المهام الخلفية بالمقترح (DQ-F04-4). ومنفّذ أيضًا (ADR 0005): الترقيم بلا فجوات للطلبات والبروفورما مع اختبار تزامن (القرار 10، DQ-B02-4، O-12)، وقوائم الدول والعملات كاملة بإصدار ISO مسجَّل (DQ-B05-5)، ورموز الصلاحيات (القرار 7، DQ-F07-1، DQ-F09-1؛ 138 يومها، و140 اليوم). ومنفّذ أيضًا (2026-10-13): نموذج حالة الطلب الموحّد في المواصفة 13 (القرار 9، DQ-F08-1، O-10)، وقرارات نتائج المراجعة (O-15، ADR 0011)</w:t>
             </w:r>
           </w:p>
         </w:tc>
@@ -744,7 +744,7 @@
         <w:spacing w:after="50" w:before="0"/>
         <w:ind w:left="0"/>
       </w:pPr>
-      <w:hyperlink w:history="1" w:anchor="_sec5">
+      <w:hyperlink w:history="1" w:anchor="_sec6">
         <w:r>
           <w:rPr>
             <w:rFonts w:ascii="Arial" w:cs="Arial" w:eastAsia="Arial" w:hAnsi="Arial"/>
@@ -765,7 +765,7 @@
         <w:spacing w:after="50" w:before="0"/>
         <w:ind w:left="0"/>
       </w:pPr>
-      <w:hyperlink w:history="1" w:anchor="_sec6">
+      <w:hyperlink w:history="1" w:anchor="_sec7">
         <w:r>
           <w:rPr>
             <w:rFonts w:ascii="Arial" w:cs="Arial" w:eastAsia="Arial" w:hAnsi="Arial"/>
@@ -5056,10 +5056,398 @@
     </w:p>
     <w:p>
       <w:pPr>
+        <w:pStyle w:val="Heading2"/>
+        <w:bidi/>
+      </w:pPr>
+      <w:bookmarkStart w:name="_sec5" w:id="5"/>
+      <w:r>
+        <w:rPr>
+          <w:rFonts w:ascii="Arial" w:cs="Arial" w:eastAsia="Arial" w:hAnsi="Arial"/>
+          <w:b/>
+          <w:bCs/>
+          <w:color w:val="2B5C8A"/>
+          <w:sz w:val="26"/>
+          <w:szCs w:val="26"/>
+          <w:rtl/>
+        </w:rPr>
+        <w:t xml:space="preserve">1.4 طلبات المالك بعد الاعتماد</w:t>
+      </w:r>
+      <w:bookmarkEnd w:id="5"/>
+    </w:p>
+    <w:tbl>
+      <w:tblPr>
+        <w:bidiVisual/>
+        <w:tblW w:type="dxa" w:w="9864"/>
+        <w:tblBorders>
+          <w:top w:val="single" w:color="auto" w:sz="4"/>
+          <w:left w:val="single" w:color="auto" w:sz="4"/>
+          <w:bottom w:val="single" w:color="auto" w:sz="4"/>
+          <w:right w:val="single" w:color="auto" w:sz="4"/>
+          <w:insideH w:val="single" w:color="auto" w:sz="4"/>
+          <w:insideV w:val="single" w:color="auto" w:sz="4"/>
+        </w:tblBorders>
+      </w:tblPr>
+      <w:tblGrid>
+        <w:gridCol w:w="953"/>
+        <w:gridCol w:w="3429"/>
+        <w:gridCol w:w="3343"/>
+        <w:gridCol w:w="2139"/>
+      </w:tblGrid>
+      <w:tr>
+        <w:trPr>
+          <w:cantSplit/>
+          <w:tblHeader/>
+        </w:trPr>
+        <w:tc>
+          <w:tcPr>
+            <w:tcW w:type="dxa" w:w="953"/>
+            <w:tcBorders>
+              <w:top w:val="single" w:color="BFC9D6" w:sz="4"/>
+              <w:left w:val="single" w:color="BFC9D6" w:sz="4"/>
+              <w:bottom w:val="single" w:color="BFC9D6" w:sz="4"/>
+              <w:right w:val="single" w:color="BFC9D6" w:sz="4"/>
+            </w:tcBorders>
+            <w:shd w:fill="1F3A5F" w:color="auto" w:val="clear"/>
+            <w:tcMar>
+              <w:top w:type="dxa" w:w="50"/>
+              <w:left w:type="dxa" w:w="90"/>
+              <w:bottom w:type="dxa" w:w="50"/>
+              <w:right w:type="dxa" w:w="90"/>
+            </w:tcMar>
+            <w:vAlign w:val="center"/>
+          </w:tcPr>
+          <w:p>
+            <w:pPr>
+              <w:keepNext w:val="false"/>
+              <w:bidi/>
+              <w:spacing w:after="30" w:before="30" w:line="264"/>
+            </w:pPr>
+            <w:r>
+              <w:rPr>
+                <w:rFonts w:ascii="Arial" w:cs="Arial" w:eastAsia="Arial" w:hAnsi="Arial"/>
+                <w:b/>
+                <w:bCs/>
+                <w:color w:val="FFFFFF"/>
+                <w:sz w:val="18"/>
+                <w:szCs w:val="18"/>
+                <w:rtl/>
+              </w:rPr>
+              <w:t xml:space="preserve">#</w:t>
+            </w:r>
+          </w:p>
+        </w:tc>
+        <w:tc>
+          <w:tcPr>
+            <w:tcW w:type="dxa" w:w="3429"/>
+            <w:tcBorders>
+              <w:top w:val="single" w:color="BFC9D6" w:sz="4"/>
+              <w:left w:val="single" w:color="BFC9D6" w:sz="4"/>
+              <w:bottom w:val="single" w:color="BFC9D6" w:sz="4"/>
+              <w:right w:val="single" w:color="BFC9D6" w:sz="4"/>
+            </w:tcBorders>
+            <w:shd w:fill="1F3A5F" w:color="auto" w:val="clear"/>
+            <w:tcMar>
+              <w:top w:type="dxa" w:w="50"/>
+              <w:left w:type="dxa" w:w="90"/>
+              <w:bottom w:type="dxa" w:w="50"/>
+              <w:right w:type="dxa" w:w="90"/>
+            </w:tcMar>
+            <w:vAlign w:val="center"/>
+          </w:tcPr>
+          <w:p>
+            <w:pPr>
+              <w:keepNext w:val="false"/>
+              <w:bidi/>
+              <w:spacing w:after="30" w:before="30" w:line="264"/>
+            </w:pPr>
+            <w:r>
+              <w:rPr>
+                <w:rFonts w:ascii="Arial" w:cs="Arial" w:eastAsia="Arial" w:hAnsi="Arial"/>
+                <w:b/>
+                <w:bCs/>
+                <w:color w:val="FFFFFF"/>
+                <w:sz w:val="18"/>
+                <w:szCs w:val="18"/>
+                <w:rtl/>
+              </w:rPr>
+              <w:t xml:space="preserve">الطلب</w:t>
+            </w:r>
+          </w:p>
+        </w:tc>
+        <w:tc>
+          <w:tcPr>
+            <w:tcW w:type="dxa" w:w="3343"/>
+            <w:tcBorders>
+              <w:top w:val="single" w:color="BFC9D6" w:sz="4"/>
+              <w:left w:val="single" w:color="BFC9D6" w:sz="4"/>
+              <w:bottom w:val="single" w:color="BFC9D6" w:sz="4"/>
+              <w:right w:val="single" w:color="BFC9D6" w:sz="4"/>
+            </w:tcBorders>
+            <w:shd w:fill="1F3A5F" w:color="auto" w:val="clear"/>
+            <w:tcMar>
+              <w:top w:type="dxa" w:w="50"/>
+              <w:left w:type="dxa" w:w="90"/>
+              <w:bottom w:type="dxa" w:w="50"/>
+              <w:right w:type="dxa" w:w="90"/>
+            </w:tcMar>
+            <w:vAlign w:val="center"/>
+          </w:tcPr>
+          <w:p>
+            <w:pPr>
+              <w:keepNext w:val="false"/>
+              <w:bidi/>
+              <w:spacing w:after="30" w:before="30" w:line="264"/>
+            </w:pPr>
+            <w:r>
+              <w:rPr>
+                <w:rFonts w:ascii="Arial" w:cs="Arial" w:eastAsia="Arial" w:hAnsi="Arial"/>
+                <w:b/>
+                <w:bCs/>
+                <w:color w:val="FFFFFF"/>
+                <w:sz w:val="18"/>
+                <w:szCs w:val="18"/>
+                <w:rtl/>
+              </w:rPr>
+              <w:t xml:space="preserve">ما بُني</w:t>
+            </w:r>
+          </w:p>
+        </w:tc>
+        <w:tc>
+          <w:tcPr>
+            <w:tcW w:type="dxa" w:w="2139"/>
+            <w:tcBorders>
+              <w:top w:val="single" w:color="BFC9D6" w:sz="4"/>
+              <w:left w:val="single" w:color="BFC9D6" w:sz="4"/>
+              <w:bottom w:val="single" w:color="BFC9D6" w:sz="4"/>
+              <w:right w:val="single" w:color="BFC9D6" w:sz="4"/>
+            </w:tcBorders>
+            <w:shd w:fill="1F3A5F" w:color="auto" w:val="clear"/>
+            <w:tcMar>
+              <w:top w:type="dxa" w:w="50"/>
+              <w:left w:type="dxa" w:w="90"/>
+              <w:bottom w:type="dxa" w:w="50"/>
+              <w:right w:type="dxa" w:w="90"/>
+            </w:tcMar>
+            <w:vAlign w:val="center"/>
+          </w:tcPr>
+          <w:p>
+            <w:pPr>
+              <w:keepNext w:val="false"/>
+              <w:bidi/>
+              <w:spacing w:after="30" w:before="30" w:line="264"/>
+            </w:pPr>
+            <w:r>
+              <w:rPr>
+                <w:rFonts w:ascii="Arial" w:cs="Arial" w:eastAsia="Arial" w:hAnsi="Arial"/>
+                <w:b/>
+                <w:bCs/>
+                <w:color w:val="FFFFFF"/>
+                <w:sz w:val="18"/>
+                <w:szCs w:val="18"/>
+                <w:rtl/>
+              </w:rPr>
+              <w:t xml:space="preserve">المرجع</w:t>
+            </w:r>
+          </w:p>
+        </w:tc>
+      </w:tr>
+      <w:tr>
+        <w:trPr>
+          <w:cantSplit/>
+        </w:trPr>
+        <w:tc>
+          <w:tcPr>
+            <w:tcW w:type="dxa" w:w="953"/>
+            <w:tcBorders>
+              <w:top w:val="single" w:color="BFC9D6" w:sz="4"/>
+              <w:left w:val="single" w:color="BFC9D6" w:sz="4"/>
+              <w:bottom w:val="single" w:color="BFC9D6" w:sz="4"/>
+              <w:right w:val="single" w:color="BFC9D6" w:sz="4"/>
+            </w:tcBorders>
+            <w:tcMar>
+              <w:top w:type="dxa" w:w="50"/>
+              <w:left w:type="dxa" w:w="90"/>
+              <w:bottom w:type="dxa" w:w="50"/>
+              <w:right w:type="dxa" w:w="90"/>
+            </w:tcMar>
+            <w:vAlign w:val="top"/>
+          </w:tcPr>
+          <w:p>
+            <w:pPr>
+              <w:keepNext w:val="false"/>
+              <w:bidi/>
+              <w:spacing w:after="30" w:before="30" w:line="264"/>
+            </w:pPr>
+            <w:r>
+              <w:rPr>
+                <w:rFonts w:ascii="Arial" w:cs="Arial" w:eastAsia="Arial" w:hAnsi="Arial"/>
+                <w:b w:val="false"/>
+                <w:bCs w:val="false"/>
+                <w:sz w:val="18"/>
+                <w:szCs w:val="18"/>
+                <w:rtl/>
+              </w:rPr>
+              <w:t xml:space="preserve">25</w:t>
+            </w:r>
+          </w:p>
+        </w:tc>
+        <w:tc>
+          <w:tcPr>
+            <w:tcW w:type="dxa" w:w="3429"/>
+            <w:tcBorders>
+              <w:top w:val="single" w:color="BFC9D6" w:sz="4"/>
+              <w:left w:val="single" w:color="BFC9D6" w:sz="4"/>
+              <w:bottom w:val="single" w:color="BFC9D6" w:sz="4"/>
+              <w:right w:val="single" w:color="BFC9D6" w:sz="4"/>
+            </w:tcBorders>
+            <w:tcMar>
+              <w:top w:type="dxa" w:w="50"/>
+              <w:left w:type="dxa" w:w="90"/>
+              <w:bottom w:type="dxa" w:w="50"/>
+              <w:right w:type="dxa" w:w="90"/>
+            </w:tcMar>
+            <w:vAlign w:val="top"/>
+          </w:tcPr>
+          <w:p>
+            <w:pPr>
+              <w:keepNext w:val="false"/>
+              <w:bidi/>
+              <w:spacing w:after="30" w:before="30" w:line="264"/>
+            </w:pPr>
+            <w:r>
+              <w:rPr>
+                <w:rFonts w:ascii="Arial" w:cs="Arial" w:eastAsia="Arial" w:hAnsi="Arial"/>
+                <w:b/>
+                <w:bCs/>
+                <w:sz w:val="18"/>
+                <w:szCs w:val="18"/>
+                <w:rtl/>
+              </w:rPr>
+              <w:t xml:space="preserve">وحدة الميزانية في قسم التسهيلات (2026-10-18).</w:t>
+            </w:r>
+            <w:r>
+              <w:rPr>
+                <w:rFonts w:ascii="Arial" w:cs="Arial" w:eastAsia="Arial" w:hAnsi="Arial"/>
+                <w:b w:val="false"/>
+                <w:bCs w:val="false"/>
+                <w:sz w:val="18"/>
+                <w:szCs w:val="18"/>
+                <w:rtl/>
+              </w:rPr>
+              <w:t xml:space="preserve"> قوائم الشركة المستقلة، وللقابضة قوائم موحدة أو مستقلة بكامل وحداتها، تُدخل لدراسة الميزانية؛ وتقرير من النظام بكل الخروقات الناشئة عن القوائم في ظل التعهدات البنكية؛ وقياس أداء الشركة في الالتزام بالسيولة المحوَّلة إلى البنك. الربط بنظام آخر للتقييم الائتماني مرحلة لاحقة</w:t>
+            </w:r>
+          </w:p>
+        </w:tc>
+        <w:tc>
+          <w:tcPr>
+            <w:tcW w:type="dxa" w:w="3343"/>
+            <w:tcBorders>
+              <w:top w:val="single" w:color="BFC9D6" w:sz="4"/>
+              <w:left w:val="single" w:color="BFC9D6" w:sz="4"/>
+              <w:bottom w:val="single" w:color="BFC9D6" w:sz="4"/>
+              <w:right w:val="single" w:color="BFC9D6" w:sz="4"/>
+            </w:tcBorders>
+            <w:tcMar>
+              <w:top w:type="dxa" w:w="50"/>
+              <w:left w:type="dxa" w:w="90"/>
+              <w:bottom w:type="dxa" w:w="50"/>
+              <w:right w:type="dxa" w:w="90"/>
+            </w:tcMar>
+            <w:vAlign w:val="top"/>
+          </w:tcPr>
+          <w:p>
+            <w:pPr>
+              <w:keepNext w:val="false"/>
+              <w:bidi/>
+              <w:spacing w:after="30" w:before="30" w:line="264"/>
+            </w:pPr>
+            <w:r>
+              <w:rPr>
+                <w:rFonts w:ascii="Arial" w:cs="Arial" w:eastAsia="Arial" w:hAnsi="Arial"/>
+                <w:b w:val="false"/>
+                <w:bCs w:val="false"/>
+                <w:sz w:val="18"/>
+                <w:szCs w:val="18"/>
+                <w:rtl/>
+              </w:rPr>
+              <w:t xml:space="preserve">بُني الآن في S2-ب: الوحدات والقوائم الموحدة، ومقاييس التحليل، وتقرير الخروقات، وأداء التحويلات، وتقدير الإيراد (045، ADR 0016). التقييم الائتماني لا يُبنى الآن؛ نقطة جاهزيته في المواصفة 12 §11</w:t>
+            </w:r>
+          </w:p>
+        </w:tc>
+        <w:tc>
+          <w:tcPr>
+            <w:tcW w:type="dxa" w:w="2139"/>
+            <w:tcBorders>
+              <w:top w:val="single" w:color="BFC9D6" w:sz="4"/>
+              <w:left w:val="single" w:color="BFC9D6" w:sz="4"/>
+              <w:bottom w:val="single" w:color="BFC9D6" w:sz="4"/>
+              <w:right w:val="single" w:color="BFC9D6" w:sz="4"/>
+            </w:tcBorders>
+            <w:tcMar>
+              <w:top w:type="dxa" w:w="50"/>
+              <w:left w:type="dxa" w:w="90"/>
+              <w:bottom w:type="dxa" w:w="50"/>
+              <w:right w:type="dxa" w:w="90"/>
+            </w:tcMar>
+            <w:vAlign w:val="top"/>
+          </w:tcPr>
+          <w:p>
+            <w:pPr>
+              <w:keepNext w:val="false"/>
+              <w:bidi/>
+              <w:spacing w:after="30" w:before="30" w:line="264"/>
+            </w:pPr>
+            <w:r>
+              <w:rPr>
+                <w:rFonts w:ascii="Arial" w:cs="Arial" w:eastAsia="Arial" w:hAnsi="Arial"/>
+                <w:b w:val="false"/>
+                <w:bCs w:val="false"/>
+                <w:sz w:val="18"/>
+                <w:szCs w:val="18"/>
+                <w:rtl/>
+              </w:rPr>
+              <w:t xml:space="preserve">FR-FIN-015 إلى FR-FIN-019؛ </w:t>
+            </w:r>
+            <w:r>
+              <w:rPr>
+                <w:rFonts w:ascii="Courier New" w:cs="Courier New" w:eastAsia="Courier New" w:hAnsi="Courier New"/>
+                <w:b w:val="false"/>
+                <w:bCs w:val="false"/>
+                <w:color w:val="1F2937"/>
+                <w:sz w:val="16"/>
+                <w:szCs w:val="16"/>
+                <w:shd w:fill="F1F3F5" w:color="auto" w:val="clear"/>
+                <w:rtl/>
+              </w:rPr>
+              <w:t xml:space="preserve">‎docs/03‎</w:t>
+            </w:r>
+            <w:r>
+              <w:rPr>
+                <w:rFonts w:ascii="Arial" w:cs="Arial" w:eastAsia="Arial" w:hAnsi="Arial"/>
+                <w:b w:val="false"/>
+                <w:bCs w:val="false"/>
+                <w:sz w:val="18"/>
+                <w:szCs w:val="18"/>
+                <w:rtl/>
+              </w:rPr>
+              <w:t xml:space="preserve"> §10</w:t>
+            </w:r>
+          </w:p>
+        </w:tc>
+      </w:tr>
+    </w:tbl>
+    <w:p>
+      <w:pPr>
+        <w:bidi/>
+        <w:spacing w:after="120" w:before="0"/>
+      </w:pPr>
+    </w:p>
+    <w:p>
+      <w:pPr>
         <w:pStyle w:val="Heading1"/>
         <w:bidi/>
       </w:pPr>
-      <w:bookmarkStart w:name="_sec5" w:id="5"/>
+      <w:bookmarkStart w:name="_sec6" w:id="6"/>
       <w:r>
         <w:rPr>
           <w:rFonts w:ascii="Arial" w:cs="Arial" w:eastAsia="Arial" w:hAnsi="Arial"/>
@@ -5072,7 +5460,7 @@
         </w:rPr>
         <w:t xml:space="preserve">2. بنود مفتوحة في سجل البنود تحتاج قرارك</w:t>
       </w:r>
-      <w:bookmarkEnd w:id="5"/>
+      <w:bookmarkEnd w:id="6"/>
     </w:p>
     <w:tbl>
       <w:tblPr>
@@ -6402,7 +6790,7 @@
         <w:pStyle w:val="Heading1"/>
         <w:bidi/>
       </w:pPr>
-      <w:bookmarkStart w:name="_sec6" w:id="6"/>
+      <w:bookmarkStart w:name="_sec7" w:id="7"/>
       <w:r>
         <w:rPr>
           <w:rFonts w:ascii="Arial" w:cs="Arial" w:eastAsia="Arial" w:hAnsi="Arial"/>
@@ -6415,7 +6803,7 @@
         </w:rPr>
         <w:t xml:space="preserve">3. القائمة الكاملة حسب المستند</w:t>
       </w:r>
-      <w:bookmarkEnd w:id="6"/>
+      <w:bookmarkEnd w:id="7"/>
     </w:p>
     <w:p>
       <w:pPr>
@@ -6439,7 +6827,7 @@
         <w:pStyle w:val="Heading2"/>
         <w:bidi/>
       </w:pPr>
-      <w:bookmarkStart w:name="_sec7" w:id="7"/>
+      <w:bookmarkStart w:name="_sec8" w:id="8"/>
       <w:r>
         <w:rPr>
           <w:rFonts w:ascii="Arial" w:cs="Arial" w:eastAsia="Arial" w:hAnsi="Arial"/>
@@ -6452,7 +6840,7 @@
         </w:rPr>
         <w:t xml:space="preserve">3.1 مستندات P0 (قبل S0)</w:t>
       </w:r>
-      <w:bookmarkEnd w:id="7"/>
+      <w:bookmarkEnd w:id="8"/>
     </w:p>
     <w:p>
       <w:pPr>
@@ -6496,10 +6884,10 @@
         </w:tblBorders>
       </w:tblPr>
       <w:tblGrid>
-        <w:gridCol w:w="1578"/>
-        <w:gridCol w:w="1578"/>
-        <w:gridCol w:w="4736"/>
-        <w:gridCol w:w="1972"/>
+        <w:gridCol w:w="1195"/>
+        <w:gridCol w:w="1195"/>
+        <w:gridCol w:w="5980"/>
+        <w:gridCol w:w="1494"/>
       </w:tblGrid>
       <w:tr>
         <w:trPr>
@@ -6508,7 +6896,7 @@
         </w:trPr>
         <w:tc>
           <w:tcPr>
-            <w:tcW w:type="dxa" w:w="1578"/>
+            <w:tcW w:type="dxa" w:w="1195"/>
             <w:tcBorders>
               <w:top w:val="single" w:color="BFC9D6" w:sz="4"/>
               <w:left w:val="single" w:color="BFC9D6" w:sz="4"/>
@@ -6546,7 +6934,7 @@
         </w:tc>
         <w:tc>
           <w:tcPr>
-            <w:tcW w:type="dxa" w:w="1578"/>
+            <w:tcW w:type="dxa" w:w="1195"/>
             <w:tcBorders>
               <w:top w:val="single" w:color="BFC9D6" w:sz="4"/>
               <w:left w:val="single" w:color="BFC9D6" w:sz="4"/>
@@ -6584,7 +6972,7 @@
         </w:tc>
         <w:tc>
           <w:tcPr>
-            <w:tcW w:type="dxa" w:w="4736"/>
+            <w:tcW w:type="dxa" w:w="5980"/>
             <w:tcBorders>
               <w:top w:val="single" w:color="BFC9D6" w:sz="4"/>
               <w:left w:val="single" w:color="BFC9D6" w:sz="4"/>
@@ -6622,7 +7010,7 @@
         </w:tc>
         <w:tc>
           <w:tcPr>
-            <w:tcW w:type="dxa" w:w="1972"/>
+            <w:tcW w:type="dxa" w:w="1494"/>
             <w:tcBorders>
               <w:top w:val="single" w:color="BFC9D6" w:sz="4"/>
               <w:left w:val="single" w:color="BFC9D6" w:sz="4"/>
@@ -6665,7 +7053,7 @@
         </w:trPr>
         <w:tc>
           <w:tcPr>
-            <w:tcW w:type="dxa" w:w="1578"/>
+            <w:tcW w:type="dxa" w:w="1195"/>
             <w:tcBorders>
               <w:top w:val="single" w:color="BFC9D6" w:sz="4"/>
               <w:left w:val="single" w:color="BFC9D6" w:sz="4"/>
@@ -6701,7 +7089,7 @@
         </w:tc>
         <w:tc>
           <w:tcPr>
-            <w:tcW w:type="dxa" w:w="1578"/>
+            <w:tcW w:type="dxa" w:w="1195"/>
             <w:tcBorders>
               <w:top w:val="single" w:color="BFC9D6" w:sz="4"/>
               <w:left w:val="single" w:color="BFC9D6" w:sz="4"/>
@@ -6737,7 +7125,7 @@
         </w:tc>
         <w:tc>
           <w:tcPr>
-            <w:tcW w:type="dxa" w:w="4736"/>
+            <w:tcW w:type="dxa" w:w="5980"/>
             <w:tcBorders>
               <w:top w:val="single" w:color="BFC9D6" w:sz="4"/>
               <w:left w:val="single" w:color="BFC9D6" w:sz="4"/>
@@ -6851,11 +7239,90 @@
               </w:rPr>
               <w:t xml:space="preserve">●</w:t>
             </w:r>
-          </w:p>
-        </w:tc>
-        <w:tc>
-          <w:tcPr>
-            <w:tcW w:type="dxa" w:w="1972"/>
+            <w:r>
+              <w:rPr>
+                <w:rFonts w:ascii="Arial" w:cs="Arial" w:eastAsia="Arial" w:hAnsi="Arial"/>
+                <w:b w:val="false"/>
+                <w:bCs w:val="false"/>
+                <w:sz w:val="18"/>
+                <w:szCs w:val="18"/>
+                <w:rtl/>
+              </w:rPr>
+              <w:t xml:space="preserve">. </w:t>
+            </w:r>
+            <w:r>
+              <w:rPr>
+                <w:rFonts w:ascii="Segoe UI Emoji" w:cs="Segoe UI Emoji" w:eastAsia="Segoe UI Emoji" w:hAnsi="Segoe UI Emoji"/>
+                <w:sz w:val="18"/>
+                <w:szCs w:val="18"/>
+                <w:rtl/>
+              </w:rPr>
+              <w:t xml:space="preserve">✅</w:t>
+            </w:r>
+            <w:r>
+              <w:rPr>
+                <w:rFonts w:ascii="Arial" w:cs="Arial" w:eastAsia="Arial" w:hAnsi="Arial"/>
+                <w:b w:val="false"/>
+                <w:bCs w:val="false"/>
+                <w:sz w:val="18"/>
+                <w:szCs w:val="18"/>
+                <w:rtl/>
+              </w:rPr>
+              <w:t xml:space="preserve"> نُفِّذ بصيغة DQ-F04-6 أدناه: دخول خاص في </w:t>
+            </w:r>
+            <w:r>
+              <w:rPr>
+                <w:rFonts w:ascii="Courier New" w:cs="Courier New" w:eastAsia="Courier New" w:hAnsi="Courier New"/>
+                <w:b w:val="false"/>
+                <w:bCs w:val="false"/>
+                <w:color w:val="1F2937"/>
+                <w:sz w:val="16"/>
+                <w:szCs w:val="16"/>
+                <w:shd w:fill="F1F3F5" w:color="auto" w:val="clear"/>
+                <w:rtl/>
+              </w:rPr>
+              <w:t xml:space="preserve">‎tp_support‎</w:t>
+            </w:r>
+            <w:r>
+              <w:rPr>
+                <w:rFonts w:ascii="Arial" w:cs="Arial" w:eastAsia="Arial" w:hAnsi="Arial"/>
+                <w:b w:val="false"/>
+                <w:bCs w:val="false"/>
+                <w:sz w:val="18"/>
+                <w:szCs w:val="18"/>
+                <w:rtl/>
+              </w:rPr>
+              <w:t xml:space="preserve"> للقراءة فقط، لا </w:t>
+            </w:r>
+            <w:r>
+              <w:rPr>
+                <w:rFonts w:ascii="Courier New" w:cs="Courier New" w:eastAsia="Courier New" w:hAnsi="Courier New"/>
+                <w:b w:val="false"/>
+                <w:bCs w:val="false"/>
+                <w:color w:val="1F2937"/>
+                <w:sz w:val="16"/>
+                <w:szCs w:val="16"/>
+                <w:shd w:fill="F1F3F5" w:color="auto" w:val="clear"/>
+                <w:rtl/>
+              </w:rPr>
+              <w:t xml:space="preserve">‎tp_app‎</w:t>
+            </w:r>
+            <w:r>
+              <w:rPr>
+                <w:rFonts w:ascii="Arial" w:cs="Arial" w:eastAsia="Arial" w:hAnsi="Arial"/>
+                <w:b w:val="false"/>
+                <w:bCs w:val="false"/>
+                <w:sz w:val="18"/>
+                <w:szCs w:val="18"/>
+                <w:rtl/>
+              </w:rPr>
+              <w:t xml:space="preserve"> (db/static/036_operator_and_support.sql؛ DOC-F01 DQ-F01-7)</w:t>
+            </w:r>
+          </w:p>
+        </w:tc>
+        <w:tc>
+          <w:tcPr>
+            <w:tcW w:type="dxa" w:w="1494"/>
             <w:tcBorders>
               <w:top w:val="single" w:color="BFC9D6" w:sz="4"/>
               <w:left w:val="single" w:color="BFC9D6" w:sz="4"/>
@@ -26192,7 +26659,7 @@
         <w:pStyle w:val="Heading2"/>
         <w:bidi/>
       </w:pPr>
-      <w:bookmarkStart w:name="_sec8" w:id="8"/>
+      <w:bookmarkStart w:name="_sec9" w:id="9"/>
       <w:r>
         <w:rPr>
           <w:rFonts w:ascii="Arial" w:cs="Arial" w:eastAsia="Arial" w:hAnsi="Arial"/>
@@ -26205,7 +26672,7 @@
         </w:rPr>
         <w:t xml:space="preserve">3.2 مستندات P1 (قبل S2 وS3)</w:t>
       </w:r>
-      <w:bookmarkEnd w:id="8"/>
+      <w:bookmarkEnd w:id="9"/>
     </w:p>
     <w:p>
       <w:pPr>
@@ -28152,10 +28619,10 @@
         </w:tblBorders>
       </w:tblPr>
       <w:tblGrid>
-        <w:gridCol w:w="1459"/>
-        <w:gridCol w:w="1428"/>
-        <w:gridCol w:w="3895"/>
-        <w:gridCol w:w="3082"/>
+        <w:gridCol w:w="1219"/>
+        <w:gridCol w:w="1193"/>
+        <w:gridCol w:w="4878"/>
+        <w:gridCol w:w="2574"/>
       </w:tblGrid>
       <w:tr>
         <w:trPr>
@@ -28164,7 +28631,7 @@
         </w:trPr>
         <w:tc>
           <w:tcPr>
-            <w:tcW w:type="dxa" w:w="1459"/>
+            <w:tcW w:type="dxa" w:w="1219"/>
             <w:tcBorders>
               <w:top w:val="single" w:color="BFC9D6" w:sz="4"/>
               <w:left w:val="single" w:color="BFC9D6" w:sz="4"/>
@@ -28202,7 +28669,7 @@
         </w:tc>
         <w:tc>
           <w:tcPr>
-            <w:tcW w:type="dxa" w:w="1428"/>
+            <w:tcW w:type="dxa" w:w="1193"/>
             <w:tcBorders>
               <w:top w:val="single" w:color="BFC9D6" w:sz="4"/>
               <w:left w:val="single" w:color="BFC9D6" w:sz="4"/>
@@ -28240,7 +28707,7 @@
         </w:tc>
         <w:tc>
           <w:tcPr>
-            <w:tcW w:type="dxa" w:w="3895"/>
+            <w:tcW w:type="dxa" w:w="4878"/>
             <w:tcBorders>
               <w:top w:val="single" w:color="BFC9D6" w:sz="4"/>
               <w:left w:val="single" w:color="BFC9D6" w:sz="4"/>
@@ -28278,7 +28745,7 @@
         </w:tc>
         <w:tc>
           <w:tcPr>
-            <w:tcW w:type="dxa" w:w="3082"/>
+            <w:tcW w:type="dxa" w:w="2574"/>
             <w:tcBorders>
               <w:top w:val="single" w:color="BFC9D6" w:sz="4"/>
               <w:left w:val="single" w:color="BFC9D6" w:sz="4"/>
@@ -28321,7 +28788,7 @@
         </w:trPr>
         <w:tc>
           <w:tcPr>
-            <w:tcW w:type="dxa" w:w="1459"/>
+            <w:tcW w:type="dxa" w:w="1219"/>
             <w:tcBorders>
               <w:top w:val="single" w:color="BFC9D6" w:sz="4"/>
               <w:left w:val="single" w:color="BFC9D6" w:sz="4"/>
@@ -28357,7 +28824,7 @@
         </w:tc>
         <w:tc>
           <w:tcPr>
-            <w:tcW w:type="dxa" w:w="1428"/>
+            <w:tcW w:type="dxa" w:w="1193"/>
             <w:tcBorders>
               <w:top w:val="single" w:color="BFC9D6" w:sz="4"/>
               <w:left w:val="single" w:color="BFC9D6" w:sz="4"/>
@@ -28393,7 +28860,7 @@
         </w:tc>
         <w:tc>
           <w:tcPr>
-            <w:tcW w:type="dxa" w:w="3895"/>
+            <w:tcW w:type="dxa" w:w="4878"/>
             <w:tcBorders>
               <w:top w:val="single" w:color="BFC9D6" w:sz="4"/>
               <w:left w:val="single" w:color="BFC9D6" w:sz="4"/>
@@ -28429,7 +28896,7 @@
         </w:tc>
         <w:tc>
           <w:tcPr>
-            <w:tcW w:type="dxa" w:w="3082"/>
+            <w:tcW w:type="dxa" w:w="2574"/>
             <w:tcBorders>
               <w:top w:val="single" w:color="BFC9D6" w:sz="4"/>
               <w:left w:val="single" w:color="BFC9D6" w:sz="4"/>
@@ -28470,7 +28937,7 @@
         </w:trPr>
         <w:tc>
           <w:tcPr>
-            <w:tcW w:type="dxa" w:w="1459"/>
+            <w:tcW w:type="dxa" w:w="1219"/>
             <w:tcBorders>
               <w:top w:val="single" w:color="BFC9D6" w:sz="4"/>
               <w:left w:val="single" w:color="BFC9D6" w:sz="4"/>
@@ -28507,7 +28974,7 @@
         </w:tc>
         <w:tc>
           <w:tcPr>
-            <w:tcW w:type="dxa" w:w="1428"/>
+            <w:tcW w:type="dxa" w:w="1193"/>
             <w:tcBorders>
               <w:top w:val="single" w:color="BFC9D6" w:sz="4"/>
               <w:left w:val="single" w:color="BFC9D6" w:sz="4"/>
@@ -28544,7 +29011,7 @@
         </w:tc>
         <w:tc>
           <w:tcPr>
-            <w:tcW w:type="dxa" w:w="3895"/>
+            <w:tcW w:type="dxa" w:w="4878"/>
             <w:tcBorders>
               <w:top w:val="single" w:color="BFC9D6" w:sz="4"/>
               <w:left w:val="single" w:color="BFC9D6" w:sz="4"/>
@@ -28575,13 +29042,81 @@
                 <w:szCs w:val="18"/>
                 <w:rtl/>
               </w:rPr>
-              <w:t xml:space="preserve">نعم لـ TM فقط، بتأكيد مكتوب من البنك مرفق وسبب</w:t>
-            </w:r>
-          </w:p>
-        </w:tc>
-        <w:tc>
-          <w:tcPr>
-            <w:tcW w:type="dxa" w:w="3082"/>
+              <w:t xml:space="preserve">نعم لـ TM فقط، بتأكيد مكتوب من البنك مرفق وسبب. </w:t>
+            </w:r>
+            <w:r>
+              <w:rPr>
+                <w:rFonts w:ascii="Segoe UI Emoji" w:cs="Segoe UI Emoji" w:eastAsia="Segoe UI Emoji" w:hAnsi="Segoe UI Emoji"/>
+                <w:sz w:val="18"/>
+                <w:szCs w:val="18"/>
+                <w:rtl/>
+              </w:rPr>
+              <w:t xml:space="preserve">✅</w:t>
+            </w:r>
+            <w:r>
+              <w:rPr>
+                <w:rFonts w:ascii="Arial" w:cs="Arial" w:eastAsia="Arial" w:hAnsi="Arial"/>
+                <w:b w:val="false"/>
+                <w:bCs w:val="false"/>
+                <w:sz w:val="18"/>
+                <w:szCs w:val="18"/>
+                <w:rtl/>
+              </w:rPr>
+              <w:t xml:space="preserve"> منفّذ (2026-10-18، B7e): </w:t>
+            </w:r>
+            <w:r>
+              <w:rPr>
+                <w:rFonts w:ascii="Courier New" w:cs="Courier New" w:eastAsia="Courier New" w:hAnsi="Courier New"/>
+                <w:b w:val="false"/>
+                <w:bCs w:val="false"/>
+                <w:color w:val="1F2937"/>
+                <w:sz w:val="16"/>
+                <w:szCs w:val="16"/>
+                <w:shd w:fill="F1F3F5" w:color="auto" w:val="clear"/>
+                <w:rtl/>
+              </w:rPr>
+              <w:t xml:space="preserve">‎lc.LcAmendment.WithdrawalDocumentId‎</w:t>
+            </w:r>
+            <w:r>
+              <w:rPr>
+                <w:rFonts w:ascii="Arial" w:cs="Arial" w:eastAsia="Arial" w:hAnsi="Arial"/>
+                <w:b w:val="false"/>
+                <w:bCs w:val="false"/>
+                <w:sz w:val="18"/>
+                <w:szCs w:val="18"/>
+                <w:rtl/>
+              </w:rPr>
+              <w:t xml:space="preserve">، وسحب تعديل له </w:t>
+            </w:r>
+            <w:r>
+              <w:rPr>
+                <w:rFonts w:ascii="Courier New" w:cs="Courier New" w:eastAsia="Courier New" w:hAnsi="Courier New"/>
+                <w:b w:val="false"/>
+                <w:bCs w:val="false"/>
+                <w:color w:val="1F2937"/>
+                <w:sz w:val="16"/>
+                <w:szCs w:val="16"/>
+                <w:shd w:fill="F1F3F5" w:color="auto" w:val="clear"/>
+                <w:rtl/>
+              </w:rPr>
+              <w:t xml:space="preserve">‎BankIssuedOn‎</w:t>
+            </w:r>
+            <w:r>
+              <w:rPr>
+                <w:rFonts w:ascii="Arial" w:cs="Arial" w:eastAsia="Arial" w:hAnsi="Arial"/>
+                <w:b w:val="false"/>
+                <w:bCs w:val="false"/>
+                <w:sz w:val="18"/>
+                <w:szCs w:val="18"/>
+                <w:rtl/>
+              </w:rPr>
+              <w:t xml:space="preserve"> يستلزم الوثيقة والسبب (SR3)؛ وقصره على TM يفحصه التطبيق</w:t>
+            </w:r>
+          </w:p>
+        </w:tc>
+        <w:tc>
+          <w:tcPr>
+            <w:tcW w:type="dxa" w:w="2574"/>
             <w:tcBorders>
               <w:top w:val="single" w:color="BFC9D6" w:sz="4"/>
               <w:left w:val="single" w:color="BFC9D6" w:sz="4"/>
@@ -28636,7 +29171,7 @@
         </w:trPr>
         <w:tc>
           <w:tcPr>
-            <w:tcW w:type="dxa" w:w="1459"/>
+            <w:tcW w:type="dxa" w:w="1219"/>
             <w:tcBorders>
               <w:top w:val="single" w:color="BFC9D6" w:sz="4"/>
               <w:left w:val="single" w:color="BFC9D6" w:sz="4"/>
@@ -28672,7 +29207,7 @@
         </w:tc>
         <w:tc>
           <w:tcPr>
-            <w:tcW w:type="dxa" w:w="1428"/>
+            <w:tcW w:type="dxa" w:w="1193"/>
             <w:tcBorders>
               <w:top w:val="single" w:color="BFC9D6" w:sz="4"/>
               <w:left w:val="single" w:color="BFC9D6" w:sz="4"/>
@@ -28708,7 +29243,7 @@
         </w:tc>
         <w:tc>
           <w:tcPr>
-            <w:tcW w:type="dxa" w:w="3895"/>
+            <w:tcW w:type="dxa" w:w="4878"/>
             <w:tcBorders>
               <w:top w:val="single" w:color="BFC9D6" w:sz="4"/>
               <w:left w:val="single" w:color="BFC9D6" w:sz="4"/>
@@ -28757,7 +29292,7 @@
         </w:tc>
         <w:tc>
           <w:tcPr>
-            <w:tcW w:type="dxa" w:w="3082"/>
+            <w:tcW w:type="dxa" w:w="2574"/>
             <w:tcBorders>
               <w:top w:val="single" w:color="BFC9D6" w:sz="4"/>
               <w:left w:val="single" w:color="BFC9D6" w:sz="4"/>
@@ -28800,7 +29335,7 @@
         </w:trPr>
         <w:tc>
           <w:tcPr>
-            <w:tcW w:type="dxa" w:w="1459"/>
+            <w:tcW w:type="dxa" w:w="1219"/>
             <w:tcBorders>
               <w:top w:val="single" w:color="BFC9D6" w:sz="4"/>
               <w:left w:val="single" w:color="BFC9D6" w:sz="4"/>
@@ -28837,7 +29372,7 @@
         </w:tc>
         <w:tc>
           <w:tcPr>
-            <w:tcW w:type="dxa" w:w="1428"/>
+            <w:tcW w:type="dxa" w:w="1193"/>
             <w:tcBorders>
               <w:top w:val="single" w:color="BFC9D6" w:sz="4"/>
               <w:left w:val="single" w:color="BFC9D6" w:sz="4"/>
@@ -28874,7 +29409,7 @@
         </w:tc>
         <w:tc>
           <w:tcPr>
-            <w:tcW w:type="dxa" w:w="3895"/>
+            <w:tcW w:type="dxa" w:w="4878"/>
             <w:tcBorders>
               <w:top w:val="single" w:color="BFC9D6" w:sz="4"/>
               <w:left w:val="single" w:color="BFC9D6" w:sz="4"/>
@@ -28911,7 +29446,7 @@
         </w:tc>
         <w:tc>
           <w:tcPr>
-            <w:tcW w:type="dxa" w:w="3082"/>
+            <w:tcW w:type="dxa" w:w="2574"/>
             <w:tcBorders>
               <w:top w:val="single" w:color="BFC9D6" w:sz="4"/>
               <w:left w:val="single" w:color="BFC9D6" w:sz="4"/>
@@ -29672,10 +30207,10 @@
         </w:tblBorders>
       </w:tblPr>
       <w:tblGrid>
-        <w:gridCol w:w="1775"/>
-        <w:gridCol w:w="2170"/>
-        <w:gridCol w:w="3947"/>
-        <w:gridCol w:w="1972"/>
+        <w:gridCol w:w="1557"/>
+        <w:gridCol w:w="1903"/>
+        <w:gridCol w:w="4674"/>
+        <w:gridCol w:w="1730"/>
       </w:tblGrid>
       <w:tr>
         <w:trPr>
@@ -29684,7 +30219,7 @@
         </w:trPr>
         <w:tc>
           <w:tcPr>
-            <w:tcW w:type="dxa" w:w="1775"/>
+            <w:tcW w:type="dxa" w:w="1557"/>
             <w:tcBorders>
               <w:top w:val="single" w:color="BFC9D6" w:sz="4"/>
               <w:left w:val="single" w:color="BFC9D6" w:sz="4"/>
@@ -29722,7 +30257,7 @@
         </w:tc>
         <w:tc>
           <w:tcPr>
-            <w:tcW w:type="dxa" w:w="2170"/>
+            <w:tcW w:type="dxa" w:w="1903"/>
             <w:tcBorders>
               <w:top w:val="single" w:color="BFC9D6" w:sz="4"/>
               <w:left w:val="single" w:color="BFC9D6" w:sz="4"/>
@@ -29760,7 +30295,7 @@
         </w:tc>
         <w:tc>
           <w:tcPr>
-            <w:tcW w:type="dxa" w:w="3947"/>
+            <w:tcW w:type="dxa" w:w="4674"/>
             <w:tcBorders>
               <w:top w:val="single" w:color="BFC9D6" w:sz="4"/>
               <w:left w:val="single" w:color="BFC9D6" w:sz="4"/>
@@ -29798,7 +30333,7 @@
         </w:tc>
         <w:tc>
           <w:tcPr>
-            <w:tcW w:type="dxa" w:w="1972"/>
+            <w:tcW w:type="dxa" w:w="1730"/>
             <w:tcBorders>
               <w:top w:val="single" w:color="BFC9D6" w:sz="4"/>
               <w:left w:val="single" w:color="BFC9D6" w:sz="4"/>
@@ -29841,7 +30376,7 @@
         </w:trPr>
         <w:tc>
           <w:tcPr>
-            <w:tcW w:type="dxa" w:w="1775"/>
+            <w:tcW w:type="dxa" w:w="1557"/>
             <w:tcBorders>
               <w:top w:val="single" w:color="BFC9D6" w:sz="4"/>
               <w:left w:val="single" w:color="BFC9D6" w:sz="4"/>
@@ -29877,7 +30412,7 @@
         </w:tc>
         <w:tc>
           <w:tcPr>
-            <w:tcW w:type="dxa" w:w="2170"/>
+            <w:tcW w:type="dxa" w:w="1903"/>
             <w:tcBorders>
               <w:top w:val="single" w:color="BFC9D6" w:sz="4"/>
               <w:left w:val="single" w:color="BFC9D6" w:sz="4"/>
@@ -29913,7 +30448,7 @@
         </w:tc>
         <w:tc>
           <w:tcPr>
-            <w:tcW w:type="dxa" w:w="3947"/>
+            <w:tcW w:type="dxa" w:w="4674"/>
             <w:tcBorders>
               <w:top w:val="single" w:color="BFC9D6" w:sz="4"/>
               <w:left w:val="single" w:color="BFC9D6" w:sz="4"/>
@@ -29956,13 +30491,105 @@
                 <w:szCs w:val="18"/>
                 <w:rtl/>
               </w:rPr>
-              <w:t xml:space="preserve"> لـ TM وFO، والتعليق ورفعه لـ TM فقط</w:t>
-            </w:r>
-          </w:p>
-        </w:tc>
-        <w:tc>
-          <w:tcPr>
-            <w:tcW w:type="dxa" w:w="1972"/>
+              <w:t xml:space="preserve"> لـ TM وFO، والتعليق ورفعه لـ TM فقط. </w:t>
+            </w:r>
+            <w:r>
+              <w:rPr>
+                <w:rFonts w:ascii="Segoe UI Emoji" w:cs="Segoe UI Emoji" w:eastAsia="Segoe UI Emoji" w:hAnsi="Segoe UI Emoji"/>
+                <w:sz w:val="18"/>
+                <w:szCs w:val="18"/>
+                <w:rtl/>
+              </w:rPr>
+              <w:t xml:space="preserve">✅</w:t>
+            </w:r>
+            <w:r>
+              <w:rPr>
+                <w:rFonts w:ascii="Arial" w:cs="Arial" w:eastAsia="Arial" w:hAnsi="Arial"/>
+                <w:b w:val="false"/>
+                <w:bCs w:val="false"/>
+                <w:sz w:val="18"/>
+                <w:szCs w:val="18"/>
+                <w:rtl/>
+              </w:rPr>
+              <w:t xml:space="preserve"> منفّذ (2026-10-18، B7d): </w:t>
+            </w:r>
+            <w:r>
+              <w:rPr>
+                <w:rFonts w:ascii="Courier New" w:cs="Courier New" w:eastAsia="Courier New" w:hAnsi="Courier New"/>
+                <w:b w:val="false"/>
+                <w:bCs w:val="false"/>
+                <w:color w:val="1F2937"/>
+                <w:sz w:val="16"/>
+                <w:szCs w:val="16"/>
+                <w:shd w:fill="F1F3F5" w:color="auto" w:val="clear"/>
+                <w:rtl/>
+              </w:rPr>
+              <w:t xml:space="preserve">‎fac.lifecycle.manage‎</w:t>
+            </w:r>
+            <w:r>
+              <w:rPr>
+                <w:rFonts w:ascii="Arial" w:cs="Arial" w:eastAsia="Arial" w:hAnsi="Arial"/>
+                <w:b w:val="false"/>
+                <w:bCs w:val="false"/>
+                <w:sz w:val="18"/>
+                <w:szCs w:val="18"/>
+                <w:rtl/>
+              </w:rPr>
+              <w:t xml:space="preserve"> لـ TM وFO و</w:t>
+            </w:r>
+            <w:r>
+              <w:rPr>
+                <w:rFonts w:ascii="Courier New" w:cs="Courier New" w:eastAsia="Courier New" w:hAnsi="Courier New"/>
+                <w:b w:val="false"/>
+                <w:bCs w:val="false"/>
+                <w:color w:val="1F2937"/>
+                <w:sz w:val="16"/>
+                <w:szCs w:val="16"/>
+                <w:shd w:fill="F1F3F5" w:color="auto" w:val="clear"/>
+                <w:rtl/>
+              </w:rPr>
+              <w:t xml:space="preserve">‎fac.lifecycle.suspend‎</w:t>
+            </w:r>
+            <w:r>
+              <w:rPr>
+                <w:rFonts w:ascii="Arial" w:cs="Arial" w:eastAsia="Arial" w:hAnsi="Arial"/>
+                <w:b w:val="false"/>
+                <w:bCs w:val="false"/>
+                <w:sz w:val="18"/>
+                <w:szCs w:val="18"/>
+                <w:rtl/>
+              </w:rPr>
+              <w:t xml:space="preserve"> لـ TM في db/seed/102_permissions.sql (139 صلاحية يومها، و140 بعد </w:t>
+            </w:r>
+            <w:r>
+              <w:rPr>
+                <w:rFonts w:ascii="Courier New" w:cs="Courier New" w:eastAsia="Courier New" w:hAnsi="Courier New"/>
+                <w:b w:val="false"/>
+                <w:bCs w:val="false"/>
+                <w:color w:val="1F2937"/>
+                <w:sz w:val="16"/>
+                <w:szCs w:val="16"/>
+                <w:shd w:fill="F1F3F5" w:color="auto" w:val="clear"/>
+                <w:rtl/>
+              </w:rPr>
+              <w:t xml:space="preserve">‎fin.stats.confirm‎</w:t>
+            </w:r>
+            <w:r>
+              <w:rPr>
+                <w:rFonts w:ascii="Arial" w:cs="Arial" w:eastAsia="Arial" w:hAnsi="Arial"/>
+                <w:b w:val="false"/>
+                <w:bCs w:val="false"/>
+                <w:sz w:val="18"/>
+                <w:szCs w:val="18"/>
+                <w:rtl/>
+              </w:rPr>
+              <w:t xml:space="preserve">، ADR 0016)</w:t>
+            </w:r>
+          </w:p>
+        </w:tc>
+        <w:tc>
+          <w:tcPr>
+            <w:tcW w:type="dxa" w:w="1730"/>
             <w:tcBorders>
               <w:top w:val="single" w:color="BFC9D6" w:sz="4"/>
               <w:left w:val="single" w:color="BFC9D6" w:sz="4"/>
@@ -30003,7 +30630,7 @@
         </w:trPr>
         <w:tc>
           <w:tcPr>
-            <w:tcW w:type="dxa" w:w="1775"/>
+            <w:tcW w:type="dxa" w:w="1557"/>
             <w:tcBorders>
               <w:top w:val="single" w:color="BFC9D6" w:sz="4"/>
               <w:left w:val="single" w:color="BFC9D6" w:sz="4"/>
@@ -30040,7 +30667,7 @@
         </w:tc>
         <w:tc>
           <w:tcPr>
-            <w:tcW w:type="dxa" w:w="2170"/>
+            <w:tcW w:type="dxa" w:w="1903"/>
             <w:tcBorders>
               <w:top w:val="single" w:color="BFC9D6" w:sz="4"/>
               <w:left w:val="single" w:color="BFC9D6" w:sz="4"/>
@@ -30077,7 +30704,7 @@
         </w:tc>
         <w:tc>
           <w:tcPr>
-            <w:tcW w:type="dxa" w:w="3947"/>
+            <w:tcW w:type="dxa" w:w="4674"/>
             <w:tcBorders>
               <w:top w:val="single" w:color="BFC9D6" w:sz="4"/>
               <w:left w:val="single" w:color="BFC9D6" w:sz="4"/>
@@ -30114,7 +30741,7 @@
         </w:tc>
         <w:tc>
           <w:tcPr>
-            <w:tcW w:type="dxa" w:w="1972"/>
+            <w:tcW w:type="dxa" w:w="1730"/>
             <w:tcBorders>
               <w:top w:val="single" w:color="BFC9D6" w:sz="4"/>
               <w:left w:val="single" w:color="BFC9D6" w:sz="4"/>
@@ -30156,7 +30783,7 @@
         </w:trPr>
         <w:tc>
           <w:tcPr>
-            <w:tcW w:type="dxa" w:w="1775"/>
+            <w:tcW w:type="dxa" w:w="1557"/>
             <w:tcBorders>
               <w:top w:val="single" w:color="BFC9D6" w:sz="4"/>
               <w:left w:val="single" w:color="BFC9D6" w:sz="4"/>
@@ -30192,7 +30819,7 @@
         </w:tc>
         <w:tc>
           <w:tcPr>
-            <w:tcW w:type="dxa" w:w="2170"/>
+            <w:tcW w:type="dxa" w:w="1903"/>
             <w:tcBorders>
               <w:top w:val="single" w:color="BFC9D6" w:sz="4"/>
               <w:left w:val="single" w:color="BFC9D6" w:sz="4"/>
@@ -30228,7 +30855,7 @@
         </w:tc>
         <w:tc>
           <w:tcPr>
-            <w:tcW w:type="dxa" w:w="3947"/>
+            <w:tcW w:type="dxa" w:w="4674"/>
             <w:tcBorders>
               <w:top w:val="single" w:color="BFC9D6" w:sz="4"/>
               <w:left w:val="single" w:color="BFC9D6" w:sz="4"/>
@@ -30264,7 +30891,7 @@
         </w:tc>
         <w:tc>
           <w:tcPr>
-            <w:tcW w:type="dxa" w:w="1972"/>
+            <w:tcW w:type="dxa" w:w="1730"/>
             <w:tcBorders>
               <w:top w:val="single" w:color="BFC9D6" w:sz="4"/>
               <w:left w:val="single" w:color="BFC9D6" w:sz="4"/>
@@ -30305,7 +30932,7 @@
         </w:trPr>
         <w:tc>
           <w:tcPr>
-            <w:tcW w:type="dxa" w:w="1775"/>
+            <w:tcW w:type="dxa" w:w="1557"/>
             <w:tcBorders>
               <w:top w:val="single" w:color="BFC9D6" w:sz="4"/>
               <w:left w:val="single" w:color="BFC9D6" w:sz="4"/>
@@ -30342,7 +30969,7 @@
         </w:tc>
         <w:tc>
           <w:tcPr>
-            <w:tcW w:type="dxa" w:w="2170"/>
+            <w:tcW w:type="dxa" w:w="1903"/>
             <w:tcBorders>
               <w:top w:val="single" w:color="BFC9D6" w:sz="4"/>
               <w:left w:val="single" w:color="BFC9D6" w:sz="4"/>
@@ -30379,7 +31006,7 @@
         </w:tc>
         <w:tc>
           <w:tcPr>
-            <w:tcW w:type="dxa" w:w="3947"/>
+            <w:tcW w:type="dxa" w:w="4674"/>
             <w:tcBorders>
               <w:top w:val="single" w:color="BFC9D6" w:sz="4"/>
               <w:left w:val="single" w:color="BFC9D6" w:sz="4"/>
@@ -30440,7 +31067,7 @@
         </w:tc>
         <w:tc>
           <w:tcPr>
-            <w:tcW w:type="dxa" w:w="1972"/>
+            <w:tcW w:type="dxa" w:w="1730"/>
             <w:tcBorders>
               <w:top w:val="single" w:color="BFC9D6" w:sz="4"/>
               <w:left w:val="single" w:color="BFC9D6" w:sz="4"/>
@@ -30482,7 +31109,7 @@
         </w:trPr>
         <w:tc>
           <w:tcPr>
-            <w:tcW w:type="dxa" w:w="1775"/>
+            <w:tcW w:type="dxa" w:w="1557"/>
             <w:tcBorders>
               <w:top w:val="single" w:color="BFC9D6" w:sz="4"/>
               <w:left w:val="single" w:color="BFC9D6" w:sz="4"/>
@@ -30518,7 +31145,7 @@
         </w:tc>
         <w:tc>
           <w:tcPr>
-            <w:tcW w:type="dxa" w:w="2170"/>
+            <w:tcW w:type="dxa" w:w="1903"/>
             <w:tcBorders>
               <w:top w:val="single" w:color="BFC9D6" w:sz="4"/>
               <w:left w:val="single" w:color="BFC9D6" w:sz="4"/>
@@ -30554,43 +31181,135 @@
         </w:tc>
         <w:tc>
           <w:tcPr>
-            <w:tcW w:type="dxa" w:w="3947"/>
-            <w:tcBorders>
-              <w:top w:val="single" w:color="BFC9D6" w:sz="4"/>
-              <w:left w:val="single" w:color="BFC9D6" w:sz="4"/>
-              <w:bottom w:val="single" w:color="BFC9D6" w:sz="4"/>
-              <w:right w:val="single" w:color="BFC9D6" w:sz="4"/>
-            </w:tcBorders>
-            <w:tcMar>
-              <w:top w:type="dxa" w:w="50"/>
-              <w:left w:type="dxa" w:w="90"/>
-              <w:bottom w:type="dxa" w:w="50"/>
-              <w:right w:type="dxa" w:w="90"/>
-            </w:tcMar>
-            <w:vAlign w:val="top"/>
-          </w:tcPr>
-          <w:p>
-            <w:pPr>
-              <w:keepNext w:val="false"/>
-              <w:bidi/>
-              <w:spacing w:after="30" w:before="30" w:line="264"/>
-            </w:pPr>
-            <w:r>
-              <w:rPr>
-                <w:rFonts w:ascii="Arial" w:cs="Arial" w:eastAsia="Arial" w:hAnsi="Arial"/>
-                <w:b w:val="false"/>
-                <w:bCs w:val="false"/>
-                <w:sz w:val="18"/>
-                <w:szCs w:val="18"/>
-                <w:rtl/>
-              </w:rPr>
-              <w:t xml:space="preserve">تُنقل إلى العقدة بالرمز نفسه في اللاحق بحركة مدققة؛ وما لا مقابل له يظهر في R-FAC-03</w:t>
-            </w:r>
-          </w:p>
-        </w:tc>
-        <w:tc>
-          <w:tcPr>
-            <w:tcW w:type="dxa" w:w="1972"/>
+            <w:tcW w:type="dxa" w:w="4674"/>
+            <w:tcBorders>
+              <w:top w:val="single" w:color="BFC9D6" w:sz="4"/>
+              <w:left w:val="single" w:color="BFC9D6" w:sz="4"/>
+              <w:bottom w:val="single" w:color="BFC9D6" w:sz="4"/>
+              <w:right w:val="single" w:color="BFC9D6" w:sz="4"/>
+            </w:tcBorders>
+            <w:tcMar>
+              <w:top w:type="dxa" w:w="50"/>
+              <w:left w:type="dxa" w:w="90"/>
+              <w:bottom w:type="dxa" w:w="50"/>
+              <w:right w:type="dxa" w:w="90"/>
+            </w:tcMar>
+            <w:vAlign w:val="top"/>
+          </w:tcPr>
+          <w:p>
+            <w:pPr>
+              <w:keepNext w:val="false"/>
+              <w:bidi/>
+              <w:spacing w:after="30" w:before="30" w:line="264"/>
+            </w:pPr>
+            <w:r>
+              <w:rPr>
+                <w:rFonts w:ascii="Arial" w:cs="Arial" w:eastAsia="Arial" w:hAnsi="Arial"/>
+                <w:b w:val="false"/>
+                <w:bCs w:val="false"/>
+                <w:sz w:val="18"/>
+                <w:szCs w:val="18"/>
+                <w:rtl/>
+              </w:rPr>
+              <w:t xml:space="preserve">تُنقل إلى العقدة بالرمز نفسه في اللاحق بحركة مدققة؛ وما لا مقابل له يظهر في R-FAC-03. </w:t>
+            </w:r>
+            <w:r>
+              <w:rPr>
+                <w:rFonts w:ascii="Segoe UI Emoji" w:cs="Segoe UI Emoji" w:eastAsia="Segoe UI Emoji" w:hAnsi="Segoe UI Emoji"/>
+                <w:sz w:val="18"/>
+                <w:szCs w:val="18"/>
+                <w:rtl/>
+              </w:rPr>
+              <w:t xml:space="preserve">✅</w:t>
+            </w:r>
+            <w:r>
+              <w:rPr>
+                <w:rFonts w:ascii="Arial" w:cs="Arial" w:eastAsia="Arial" w:hAnsi="Arial"/>
+                <w:b w:val="false"/>
+                <w:bCs w:val="false"/>
+                <w:sz w:val="18"/>
+                <w:szCs w:val="18"/>
+                <w:rtl/>
+              </w:rPr>
+              <w:t xml:space="preserve"> منفّذ (2026-10-18، B6): </w:t>
+            </w:r>
+            <w:r>
+              <w:rPr>
+                <w:rFonts w:ascii="Courier New" w:cs="Courier New" w:eastAsia="Courier New" w:hAnsi="Courier New"/>
+                <w:b w:val="false"/>
+                <w:bCs w:val="false"/>
+                <w:color w:val="1F2937"/>
+                <w:sz w:val="16"/>
+                <w:szCs w:val="16"/>
+                <w:shd w:fill="F1F3F5" w:color="auto" w:val="clear"/>
+                <w:rtl/>
+              </w:rPr>
+              <w:t xml:space="preserve">‎fac.Utilization‎</w:t>
+            </w:r>
+            <w:r>
+              <w:rPr>
+                <w:rFonts w:ascii="Arial" w:cs="Arial" w:eastAsia="Arial" w:hAnsi="Arial"/>
+                <w:b w:val="false"/>
+                <w:bCs w:val="false"/>
+                <w:sz w:val="18"/>
+                <w:szCs w:val="18"/>
+                <w:rtl/>
+              </w:rPr>
+              <w:t xml:space="preserve"> في TRANSFERRED يشير ببند في اللاحق نفسه (</w:t>
+            </w:r>
+            <w:r>
+              <w:rPr>
+                <w:rFonts w:ascii="Courier New" w:cs="Courier New" w:eastAsia="Courier New" w:hAnsi="Courier New"/>
+                <w:b w:val="false"/>
+                <w:bCs w:val="false"/>
+                <w:color w:val="1F2937"/>
+                <w:sz w:val="16"/>
+                <w:szCs w:val="16"/>
+                <w:shd w:fill="F1F3F5" w:color="auto" w:val="clear"/>
+                <w:rtl/>
+              </w:rPr>
+              <w:t xml:space="preserve">‎PreviousFacilityId‎</w:t>
+            </w:r>
+            <w:r>
+              <w:rPr>
+                <w:rFonts w:ascii="Arial" w:cs="Arial" w:eastAsia="Arial" w:hAnsi="Arial"/>
+                <w:b w:val="false"/>
+                <w:bCs w:val="false"/>
+                <w:sz w:val="18"/>
+                <w:szCs w:val="18"/>
+                <w:rtl/>
+              </w:rPr>
+              <w:t xml:space="preserve">) عبر مفتاحين مركّبين، وحركة TRANSFER بسبب في </w:t>
+            </w:r>
+            <w:r>
+              <w:rPr>
+                <w:rFonts w:ascii="Courier New" w:cs="Courier New" w:eastAsia="Courier New" w:hAnsi="Courier New"/>
+                <w:b w:val="false"/>
+                <w:bCs w:val="false"/>
+                <w:color w:val="1F2937"/>
+                <w:sz w:val="16"/>
+                <w:szCs w:val="16"/>
+                <w:shd w:fill="F1F3F5" w:color="auto" w:val="clear"/>
+                <w:rtl/>
+              </w:rPr>
+              <w:t xml:space="preserve">‎fac.LimitMovement‎</w:t>
+            </w:r>
+            <w:r>
+              <w:rPr>
+                <w:rFonts w:ascii="Arial" w:cs="Arial" w:eastAsia="Arial" w:hAnsi="Arial"/>
+                <w:b w:val="false"/>
+                <w:bCs w:val="false"/>
+                <w:sz w:val="18"/>
+                <w:szCs w:val="18"/>
+                <w:rtl/>
+              </w:rPr>
+              <w:t xml:space="preserve"> (SR9)؛ ومطابقة الرمز يفحصها التطبيق، والحجز يُفك بسبب SUPERSEDED</w:t>
+            </w:r>
+          </w:p>
+        </w:tc>
+        <w:tc>
+          <w:tcPr>
+            <w:tcW w:type="dxa" w:w="1730"/>
             <w:tcBorders>
               <w:top w:val="single" w:color="BFC9D6" w:sz="4"/>
               <w:left w:val="single" w:color="BFC9D6" w:sz="4"/>
@@ -30631,7 +31350,7 @@
         </w:trPr>
         <w:tc>
           <w:tcPr>
-            <w:tcW w:type="dxa" w:w="1775"/>
+            <w:tcW w:type="dxa" w:w="1557"/>
             <w:tcBorders>
               <w:top w:val="single" w:color="BFC9D6" w:sz="4"/>
               <w:left w:val="single" w:color="BFC9D6" w:sz="4"/>
@@ -30668,7 +31387,7 @@
         </w:tc>
         <w:tc>
           <w:tcPr>
-            <w:tcW w:type="dxa" w:w="2170"/>
+            <w:tcW w:type="dxa" w:w="1903"/>
             <w:tcBorders>
               <w:top w:val="single" w:color="BFC9D6" w:sz="4"/>
               <w:left w:val="single" w:color="BFC9D6" w:sz="4"/>
@@ -30705,7 +31424,7 @@
         </w:tc>
         <w:tc>
           <w:tcPr>
-            <w:tcW w:type="dxa" w:w="3947"/>
+            <w:tcW w:type="dxa" w:w="4674"/>
             <w:tcBorders>
               <w:top w:val="single" w:color="BFC9D6" w:sz="4"/>
               <w:left w:val="single" w:color="BFC9D6" w:sz="4"/>
@@ -30742,7 +31461,7 @@
         </w:tc>
         <w:tc>
           <w:tcPr>
-            <w:tcW w:type="dxa" w:w="1972"/>
+            <w:tcW w:type="dxa" w:w="1730"/>
             <w:tcBorders>
               <w:top w:val="single" w:color="BFC9D6" w:sz="4"/>
               <w:left w:val="single" w:color="BFC9D6" w:sz="4"/>
@@ -30784,7 +31503,7 @@
         </w:trPr>
         <w:tc>
           <w:tcPr>
-            <w:tcW w:type="dxa" w:w="1775"/>
+            <w:tcW w:type="dxa" w:w="1557"/>
             <w:tcBorders>
               <w:top w:val="single" w:color="BFC9D6" w:sz="4"/>
               <w:left w:val="single" w:color="BFC9D6" w:sz="4"/>
@@ -30820,7 +31539,7 @@
         </w:tc>
         <w:tc>
           <w:tcPr>
-            <w:tcW w:type="dxa" w:w="2170"/>
+            <w:tcW w:type="dxa" w:w="1903"/>
             <w:tcBorders>
               <w:top w:val="single" w:color="BFC9D6" w:sz="4"/>
               <w:left w:val="single" w:color="BFC9D6" w:sz="4"/>
@@ -30856,7 +31575,7 @@
         </w:tc>
         <w:tc>
           <w:tcPr>
-            <w:tcW w:type="dxa" w:w="3947"/>
+            <w:tcW w:type="dxa" w:w="4674"/>
             <w:tcBorders>
               <w:top w:val="single" w:color="BFC9D6" w:sz="4"/>
               <w:left w:val="single" w:color="BFC9D6" w:sz="4"/>
@@ -30905,7 +31624,7 @@
         </w:tc>
         <w:tc>
           <w:tcPr>
-            <w:tcW w:type="dxa" w:w="1972"/>
+            <w:tcW w:type="dxa" w:w="1730"/>
             <w:tcBorders>
               <w:top w:val="single" w:color="BFC9D6" w:sz="4"/>
               <w:left w:val="single" w:color="BFC9D6" w:sz="4"/>
@@ -30946,7 +31665,7 @@
         </w:trPr>
         <w:tc>
           <w:tcPr>
-            <w:tcW w:type="dxa" w:w="1775"/>
+            <w:tcW w:type="dxa" w:w="1557"/>
             <w:tcBorders>
               <w:top w:val="single" w:color="BFC9D6" w:sz="4"/>
               <w:left w:val="single" w:color="BFC9D6" w:sz="4"/>
@@ -30983,7 +31702,7 @@
         </w:tc>
         <w:tc>
           <w:tcPr>
-            <w:tcW w:type="dxa" w:w="2170"/>
+            <w:tcW w:type="dxa" w:w="1903"/>
             <w:tcBorders>
               <w:top w:val="single" w:color="BFC9D6" w:sz="4"/>
               <w:left w:val="single" w:color="BFC9D6" w:sz="4"/>
@@ -31020,7 +31739,7 @@
         </w:tc>
         <w:tc>
           <w:tcPr>
-            <w:tcW w:type="dxa" w:w="3947"/>
+            <w:tcW w:type="dxa" w:w="4674"/>
             <w:tcBorders>
               <w:top w:val="single" w:color="BFC9D6" w:sz="4"/>
               <w:left w:val="single" w:color="BFC9D6" w:sz="4"/>
@@ -31057,7 +31776,7 @@
         </w:tc>
         <w:tc>
           <w:tcPr>
-            <w:tcW w:type="dxa" w:w="1972"/>
+            <w:tcW w:type="dxa" w:w="1730"/>
             <w:tcBorders>
               <w:top w:val="single" w:color="BFC9D6" w:sz="4"/>
               <w:left w:val="single" w:color="BFC9D6" w:sz="4"/>
@@ -31142,10 +31861,10 @@
         </w:tblBorders>
       </w:tblPr>
       <w:tblGrid>
-        <w:gridCol w:w="1675"/>
-        <w:gridCol w:w="2605"/>
-        <w:gridCol w:w="3723"/>
-        <w:gridCol w:w="1861"/>
+        <w:gridCol w:w="1644"/>
+        <w:gridCol w:w="2557"/>
+        <w:gridCol w:w="3837"/>
+        <w:gridCol w:w="1826"/>
       </w:tblGrid>
       <w:tr>
         <w:trPr>
@@ -31154,7 +31873,7 @@
         </w:trPr>
         <w:tc>
           <w:tcPr>
-            <w:tcW w:type="dxa" w:w="1675"/>
+            <w:tcW w:type="dxa" w:w="1644"/>
             <w:tcBorders>
               <w:top w:val="single" w:color="BFC9D6" w:sz="4"/>
               <w:left w:val="single" w:color="BFC9D6" w:sz="4"/>
@@ -31192,7 +31911,7 @@
         </w:tc>
         <w:tc>
           <w:tcPr>
-            <w:tcW w:type="dxa" w:w="2605"/>
+            <w:tcW w:type="dxa" w:w="2557"/>
             <w:tcBorders>
               <w:top w:val="single" w:color="BFC9D6" w:sz="4"/>
               <w:left w:val="single" w:color="BFC9D6" w:sz="4"/>
@@ -31230,7 +31949,7 @@
         </w:tc>
         <w:tc>
           <w:tcPr>
-            <w:tcW w:type="dxa" w:w="3723"/>
+            <w:tcW w:type="dxa" w:w="3837"/>
             <w:tcBorders>
               <w:top w:val="single" w:color="BFC9D6" w:sz="4"/>
               <w:left w:val="single" w:color="BFC9D6" w:sz="4"/>
@@ -31268,7 +31987,7 @@
         </w:tc>
         <w:tc>
           <w:tcPr>
-            <w:tcW w:type="dxa" w:w="1861"/>
+            <w:tcW w:type="dxa" w:w="1826"/>
             <w:tcBorders>
               <w:top w:val="single" w:color="BFC9D6" w:sz="4"/>
               <w:left w:val="single" w:color="BFC9D6" w:sz="4"/>
@@ -31311,7 +32030,7 @@
         </w:trPr>
         <w:tc>
           <w:tcPr>
-            <w:tcW w:type="dxa" w:w="1675"/>
+            <w:tcW w:type="dxa" w:w="1644"/>
             <w:tcBorders>
               <w:top w:val="single" w:color="BFC9D6" w:sz="4"/>
               <w:left w:val="single" w:color="BFC9D6" w:sz="4"/>
@@ -31347,7 +32066,7 @@
         </w:tc>
         <w:tc>
           <w:tcPr>
-            <w:tcW w:type="dxa" w:w="2605"/>
+            <w:tcW w:type="dxa" w:w="2557"/>
             <w:tcBorders>
               <w:top w:val="single" w:color="BFC9D6" w:sz="4"/>
               <w:left w:val="single" w:color="BFC9D6" w:sz="4"/>
@@ -31383,43 +32102,87 @@
         </w:tc>
         <w:tc>
           <w:tcPr>
-            <w:tcW w:type="dxa" w:w="3723"/>
-            <w:tcBorders>
-              <w:top w:val="single" w:color="BFC9D6" w:sz="4"/>
-              <w:left w:val="single" w:color="BFC9D6" w:sz="4"/>
-              <w:bottom w:val="single" w:color="BFC9D6" w:sz="4"/>
-              <w:right w:val="single" w:color="BFC9D6" w:sz="4"/>
-            </w:tcBorders>
-            <w:tcMar>
-              <w:top w:type="dxa" w:w="50"/>
-              <w:left w:type="dxa" w:w="90"/>
-              <w:bottom w:type="dxa" w:w="50"/>
-              <w:right w:type="dxa" w:w="90"/>
-            </w:tcMar>
-            <w:vAlign w:val="top"/>
-          </w:tcPr>
-          <w:p>
-            <w:pPr>
-              <w:keepNext w:val="false"/>
-              <w:bidi/>
-              <w:spacing w:after="30" w:before="30" w:line="264"/>
-            </w:pPr>
-            <w:r>
-              <w:rPr>
-                <w:rFonts w:ascii="Arial" w:cs="Arial" w:eastAsia="Arial" w:hAnsi="Arial"/>
-                <w:b w:val="false"/>
-                <w:bCs w:val="false"/>
-                <w:sz w:val="18"/>
-                <w:szCs w:val="18"/>
-                <w:rtl/>
-              </w:rPr>
-              <w:t xml:space="preserve">SUSPENDED ورفعه بمراجعة؛ ENDED مشتقة؛ البنود المستقبلية تُلغى بسبب</w:t>
-            </w:r>
-          </w:p>
-        </w:tc>
-        <w:tc>
-          <w:tcPr>
-            <w:tcW w:type="dxa" w:w="1861"/>
+            <w:tcW w:type="dxa" w:w="3837"/>
+            <w:tcBorders>
+              <w:top w:val="single" w:color="BFC9D6" w:sz="4"/>
+              <w:left w:val="single" w:color="BFC9D6" w:sz="4"/>
+              <w:bottom w:val="single" w:color="BFC9D6" w:sz="4"/>
+              <w:right w:val="single" w:color="BFC9D6" w:sz="4"/>
+            </w:tcBorders>
+            <w:tcMar>
+              <w:top w:type="dxa" w:w="50"/>
+              <w:left w:type="dxa" w:w="90"/>
+              <w:bottom w:type="dxa" w:w="50"/>
+              <w:right w:type="dxa" w:w="90"/>
+            </w:tcMar>
+            <w:vAlign w:val="top"/>
+          </w:tcPr>
+          <w:p>
+            <w:pPr>
+              <w:keepNext w:val="false"/>
+              <w:bidi/>
+              <w:spacing w:after="30" w:before="30" w:line="264"/>
+            </w:pPr>
+            <w:r>
+              <w:rPr>
+                <w:rFonts w:ascii="Arial" w:cs="Arial" w:eastAsia="Arial" w:hAnsi="Arial"/>
+                <w:b w:val="false"/>
+                <w:bCs w:val="false"/>
+                <w:sz w:val="18"/>
+                <w:szCs w:val="18"/>
+                <w:rtl/>
+              </w:rPr>
+              <w:t xml:space="preserve">SUSPENDED ورفعه بمراجعة؛ ENDED مشتقة؛ البنود المستقبلية تُلغى بسبب. </w:t>
+            </w:r>
+            <w:r>
+              <w:rPr>
+                <w:rFonts w:ascii="Segoe UI Emoji" w:cs="Segoe UI Emoji" w:eastAsia="Segoe UI Emoji" w:hAnsi="Segoe UI Emoji"/>
+                <w:sz w:val="18"/>
+                <w:szCs w:val="18"/>
+                <w:rtl/>
+              </w:rPr>
+              <w:t xml:space="preserve">✅</w:t>
+            </w:r>
+            <w:r>
+              <w:rPr>
+                <w:rFonts w:ascii="Arial" w:cs="Arial" w:eastAsia="Arial" w:hAnsi="Arial"/>
+                <w:b w:val="false"/>
+                <w:bCs w:val="false"/>
+                <w:sz w:val="18"/>
+                <w:szCs w:val="18"/>
+                <w:rtl/>
+              </w:rPr>
+              <w:t xml:space="preserve"> منفّذ (2026-10-18، المراجعة الذاتية B7c): </w:t>
+            </w:r>
+            <w:r>
+              <w:rPr>
+                <w:rFonts w:ascii="Courier New" w:cs="Courier New" w:eastAsia="Courier New" w:hAnsi="Courier New"/>
+                <w:b w:val="false"/>
+                <w:bCs w:val="false"/>
+                <w:color w:val="1F2937"/>
+                <w:sz w:val="16"/>
+                <w:szCs w:val="16"/>
+                <w:shd w:fill="F1F3F5" w:color="auto" w:val="clear"/>
+                <w:rtl/>
+              </w:rPr>
+              <w:t xml:space="preserve">‎obl.Obligation.Status‎</w:t>
+            </w:r>
+            <w:r>
+              <w:rPr>
+                <w:rFonts w:ascii="Arial" w:cs="Arial" w:eastAsia="Arial" w:hAnsi="Arial"/>
+                <w:b w:val="false"/>
+                <w:bCs w:val="false"/>
+                <w:sz w:val="18"/>
+                <w:szCs w:val="18"/>
+                <w:rtl/>
+              </w:rPr>
+              <w:t xml:space="preserve"> لا يقبل إلا ACTIVE وSUSPENDED، وENDED تُشتق (SR9)</w:t>
+            </w:r>
+          </w:p>
+        </w:tc>
+        <w:tc>
+          <w:tcPr>
+            <w:tcW w:type="dxa" w:w="1826"/>
             <w:tcBorders>
               <w:top w:val="single" w:color="BFC9D6" w:sz="4"/>
               <w:left w:val="single" w:color="BFC9D6" w:sz="4"/>
@@ -31460,7 +32223,7 @@
         </w:trPr>
         <w:tc>
           <w:tcPr>
-            <w:tcW w:type="dxa" w:w="1675"/>
+            <w:tcW w:type="dxa" w:w="1644"/>
             <w:tcBorders>
               <w:top w:val="single" w:color="BFC9D6" w:sz="4"/>
               <w:left w:val="single" w:color="BFC9D6" w:sz="4"/>
@@ -31497,7 +32260,7 @@
         </w:tc>
         <w:tc>
           <w:tcPr>
-            <w:tcW w:type="dxa" w:w="2605"/>
+            <w:tcW w:type="dxa" w:w="2557"/>
             <w:tcBorders>
               <w:top w:val="single" w:color="BFC9D6" w:sz="4"/>
               <w:left w:val="single" w:color="BFC9D6" w:sz="4"/>
@@ -31534,7 +32297,7 @@
         </w:tc>
         <w:tc>
           <w:tcPr>
-            <w:tcW w:type="dxa" w:w="3723"/>
+            <w:tcW w:type="dxa" w:w="3837"/>
             <w:tcBorders>
               <w:top w:val="single" w:color="BFC9D6" w:sz="4"/>
               <w:left w:val="single" w:color="BFC9D6" w:sz="4"/>
@@ -31571,7 +32334,7 @@
         </w:tc>
         <w:tc>
           <w:tcPr>
-            <w:tcW w:type="dxa" w:w="1861"/>
+            <w:tcW w:type="dxa" w:w="1826"/>
             <w:tcBorders>
               <w:top w:val="single" w:color="BFC9D6" w:sz="4"/>
               <w:left w:val="single" w:color="BFC9D6" w:sz="4"/>
@@ -31613,7 +32376,7 @@
         </w:trPr>
         <w:tc>
           <w:tcPr>
-            <w:tcW w:type="dxa" w:w="1675"/>
+            <w:tcW w:type="dxa" w:w="1644"/>
             <w:tcBorders>
               <w:top w:val="single" w:color="BFC9D6" w:sz="4"/>
               <w:left w:val="single" w:color="BFC9D6" w:sz="4"/>
@@ -31649,7 +32412,7 @@
         </w:tc>
         <w:tc>
           <w:tcPr>
-            <w:tcW w:type="dxa" w:w="2605"/>
+            <w:tcW w:type="dxa" w:w="2557"/>
             <w:tcBorders>
               <w:top w:val="single" w:color="BFC9D6" w:sz="4"/>
               <w:left w:val="single" w:color="BFC9D6" w:sz="4"/>
@@ -31685,7 +32448,7 @@
         </w:tc>
         <w:tc>
           <w:tcPr>
-            <w:tcW w:type="dxa" w:w="3723"/>
+            <w:tcW w:type="dxa" w:w="3837"/>
             <w:tcBorders>
               <w:top w:val="single" w:color="BFC9D6" w:sz="4"/>
               <w:left w:val="single" w:color="BFC9D6" w:sz="4"/>
@@ -31745,7 +32508,7 @@
         </w:tc>
         <w:tc>
           <w:tcPr>
-            <w:tcW w:type="dxa" w:w="1861"/>
+            <w:tcW w:type="dxa" w:w="1826"/>
             <w:tcBorders>
               <w:top w:val="single" w:color="BFC9D6" w:sz="4"/>
               <w:left w:val="single" w:color="BFC9D6" w:sz="4"/>
@@ -31786,7 +32549,7 @@
         </w:trPr>
         <w:tc>
           <w:tcPr>
-            <w:tcW w:type="dxa" w:w="1675"/>
+            <w:tcW w:type="dxa" w:w="1644"/>
             <w:tcBorders>
               <w:top w:val="single" w:color="BFC9D6" w:sz="4"/>
               <w:left w:val="single" w:color="BFC9D6" w:sz="4"/>
@@ -31823,7 +32586,7 @@
         </w:tc>
         <w:tc>
           <w:tcPr>
-            <w:tcW w:type="dxa" w:w="2605"/>
+            <w:tcW w:type="dxa" w:w="2557"/>
             <w:tcBorders>
               <w:top w:val="single" w:color="BFC9D6" w:sz="4"/>
               <w:left w:val="single" w:color="BFC9D6" w:sz="4"/>
@@ -31860,7 +32623,7 @@
         </w:tc>
         <w:tc>
           <w:tcPr>
-            <w:tcW w:type="dxa" w:w="3723"/>
+            <w:tcW w:type="dxa" w:w="3837"/>
             <w:tcBorders>
               <w:top w:val="single" w:color="BFC9D6" w:sz="4"/>
               <w:left w:val="single" w:color="BFC9D6" w:sz="4"/>
@@ -31921,7 +32684,7 @@
         </w:tc>
         <w:tc>
           <w:tcPr>
-            <w:tcW w:type="dxa" w:w="1861"/>
+            <w:tcW w:type="dxa" w:w="1826"/>
             <w:tcBorders>
               <w:top w:val="single" w:color="BFC9D6" w:sz="4"/>
               <w:left w:val="single" w:color="BFC9D6" w:sz="4"/>
@@ -31963,7 +32726,7 @@
         </w:trPr>
         <w:tc>
           <w:tcPr>
-            <w:tcW w:type="dxa" w:w="1675"/>
+            <w:tcW w:type="dxa" w:w="1644"/>
             <w:tcBorders>
               <w:top w:val="single" w:color="BFC9D6" w:sz="4"/>
               <w:left w:val="single" w:color="BFC9D6" w:sz="4"/>
@@ -31999,7 +32762,7 @@
         </w:tc>
         <w:tc>
           <w:tcPr>
-            <w:tcW w:type="dxa" w:w="2605"/>
+            <w:tcW w:type="dxa" w:w="2557"/>
             <w:tcBorders>
               <w:top w:val="single" w:color="BFC9D6" w:sz="4"/>
               <w:left w:val="single" w:color="BFC9D6" w:sz="4"/>
@@ -32035,7 +32798,7 @@
         </w:tc>
         <w:tc>
           <w:tcPr>
-            <w:tcW w:type="dxa" w:w="3723"/>
+            <w:tcW w:type="dxa" w:w="3837"/>
             <w:tcBorders>
               <w:top w:val="single" w:color="BFC9D6" w:sz="4"/>
               <w:left w:val="single" w:color="BFC9D6" w:sz="4"/>
@@ -32089,13 +32852,81 @@
                 <w:szCs w:val="18"/>
                 <w:rtl/>
               </w:rPr>
-              <w:t xml:space="preserve">، والسماح بحقول التنازل في OPEN وIN_CURE، وWAIVED يستلزم الاعتماد</w:t>
-            </w:r>
-          </w:p>
-        </w:tc>
-        <w:tc>
-          <w:tcPr>
-            <w:tcW w:type="dxa" w:w="1861"/>
+              <w:t xml:space="preserve">، والسماح بحقول التنازل في OPEN وIN_CURE، وWAIVED يستلزم الاعتماد. </w:t>
+            </w:r>
+            <w:r>
+              <w:rPr>
+                <w:rFonts w:ascii="Segoe UI Emoji" w:cs="Segoe UI Emoji" w:eastAsia="Segoe UI Emoji" w:hAnsi="Segoe UI Emoji"/>
+                <w:sz w:val="18"/>
+                <w:szCs w:val="18"/>
+                <w:rtl/>
+              </w:rPr>
+              <w:t xml:space="preserve">✅</w:t>
+            </w:r>
+            <w:r>
+              <w:rPr>
+                <w:rFonts w:ascii="Arial" w:cs="Arial" w:eastAsia="Arial" w:hAnsi="Arial"/>
+                <w:b w:val="false"/>
+                <w:bCs w:val="false"/>
+                <w:sz w:val="18"/>
+                <w:szCs w:val="18"/>
+                <w:rtl/>
+              </w:rPr>
+              <w:t xml:space="preserve"> منفّذ (2026-10-18، B2): </w:t>
+            </w:r>
+            <w:r>
+              <w:rPr>
+                <w:rFonts w:ascii="Courier New" w:cs="Courier New" w:eastAsia="Courier New" w:hAnsi="Courier New"/>
+                <w:b w:val="false"/>
+                <w:bCs w:val="false"/>
+                <w:color w:val="1F2937"/>
+                <w:sz w:val="16"/>
+                <w:szCs w:val="16"/>
+                <w:shd w:fill="F1F3F5" w:color="auto" w:val="clear"/>
+                <w:rtl/>
+              </w:rPr>
+              <w:t xml:space="preserve">‎WaiverApprovedBy/On‎</w:t>
+            </w:r>
+            <w:r>
+              <w:rPr>
+                <w:rFonts w:ascii="Arial" w:cs="Arial" w:eastAsia="Arial" w:hAnsi="Arial"/>
+                <w:b w:val="false"/>
+                <w:bCs w:val="false"/>
+                <w:sz w:val="18"/>
+                <w:szCs w:val="18"/>
+                <w:rtl/>
+              </w:rPr>
+              <w:t xml:space="preserve"> في </w:t>
+            </w:r>
+            <w:r>
+              <w:rPr>
+                <w:rFonts w:ascii="Courier New" w:cs="Courier New" w:eastAsia="Courier New" w:hAnsi="Courier New"/>
+                <w:b w:val="false"/>
+                <w:bCs w:val="false"/>
+                <w:color w:val="1F2937"/>
+                <w:sz w:val="16"/>
+                <w:szCs w:val="16"/>
+                <w:shd w:fill="F1F3F5" w:color="auto" w:val="clear"/>
+                <w:rtl/>
+              </w:rPr>
+              <w:t xml:space="preserve">‎obl.ObligationBreach‎</w:t>
+            </w:r>
+            <w:r>
+              <w:rPr>
+                <w:rFonts w:ascii="Arial" w:cs="Arial" w:eastAsia="Arial" w:hAnsi="Arial"/>
+                <w:b w:val="false"/>
+                <w:bCs w:val="false"/>
+                <w:sz w:val="18"/>
+                <w:szCs w:val="18"/>
+                <w:rtl/>
+              </w:rPr>
+              <w:t xml:space="preserve">؛ حقول التنازل تُسجَّل في OPEN وIN_CURE، والاعتماد هو الانتقال إلى WAIVED (SR9)</w:t>
+            </w:r>
+          </w:p>
+        </w:tc>
+        <w:tc>
+          <w:tcPr>
+            <w:tcW w:type="dxa" w:w="1826"/>
             <w:tcBorders>
               <w:top w:val="single" w:color="BFC9D6" w:sz="4"/>
               <w:left w:val="single" w:color="BFC9D6" w:sz="4"/>
@@ -32136,7 +32967,7 @@
         </w:trPr>
         <w:tc>
           <w:tcPr>
-            <w:tcW w:type="dxa" w:w="1675"/>
+            <w:tcW w:type="dxa" w:w="1644"/>
             <w:tcBorders>
               <w:top w:val="single" w:color="BFC9D6" w:sz="4"/>
               <w:left w:val="single" w:color="BFC9D6" w:sz="4"/>
@@ -32173,7 +33004,7 @@
         </w:tc>
         <w:tc>
           <w:tcPr>
-            <w:tcW w:type="dxa" w:w="2605"/>
+            <w:tcW w:type="dxa" w:w="2557"/>
             <w:tcBorders>
               <w:top w:val="single" w:color="BFC9D6" w:sz="4"/>
               <w:left w:val="single" w:color="BFC9D6" w:sz="4"/>
@@ -32210,7 +33041,7 @@
         </w:tc>
         <w:tc>
           <w:tcPr>
-            <w:tcW w:type="dxa" w:w="3723"/>
+            <w:tcW w:type="dxa" w:w="3837"/>
             <w:tcBorders>
               <w:top w:val="single" w:color="BFC9D6" w:sz="4"/>
               <w:left w:val="single" w:color="BFC9D6" w:sz="4"/>
@@ -32241,13 +33072,33 @@
                 <w:szCs w:val="18"/>
                 <w:rtl/>
               </w:rPr>
-              <w:t xml:space="preserve">لا خرق ثانٍ؛ NeedsReview على القائم</w:t>
-            </w:r>
-          </w:p>
-        </w:tc>
-        <w:tc>
-          <w:tcPr>
-            <w:tcW w:type="dxa" w:w="1861"/>
+              <w:t xml:space="preserve">لا خرق ثانٍ؛ NeedsReview على القائم. </w:t>
+            </w:r>
+            <w:r>
+              <w:rPr>
+                <w:rFonts w:ascii="Segoe UI Emoji" w:cs="Segoe UI Emoji" w:eastAsia="Segoe UI Emoji" w:hAnsi="Segoe UI Emoji"/>
+                <w:sz w:val="18"/>
+                <w:szCs w:val="18"/>
+                <w:rtl/>
+              </w:rPr>
+              <w:t xml:space="preserve">✅</w:t>
+            </w:r>
+            <w:r>
+              <w:rPr>
+                <w:rFonts w:ascii="Arial" w:cs="Arial" w:eastAsia="Arial" w:hAnsi="Arial"/>
+                <w:b w:val="false"/>
+                <w:bCs w:val="false"/>
+                <w:sz w:val="18"/>
+                <w:szCs w:val="18"/>
+                <w:rtl/>
+              </w:rPr>
+              <w:t xml:space="preserve"> منفّذ (2026-10-18، B1): الخرق يحمل جذر التعهد ونهاية الفترة بمفتاح مركّب، وخرق مفتوح واحد لكل تعهد وفترة ولو أعيد التقييم (SR9)</w:t>
+            </w:r>
+          </w:p>
+        </w:tc>
+        <w:tc>
+          <w:tcPr>
+            <w:tcW w:type="dxa" w:w="1826"/>
             <w:tcBorders>
               <w:top w:val="single" w:color="BFC9D6" w:sz="4"/>
               <w:left w:val="single" w:color="BFC9D6" w:sz="4"/>
@@ -32289,7 +33140,7 @@
         </w:trPr>
         <w:tc>
           <w:tcPr>
-            <w:tcW w:type="dxa" w:w="1675"/>
+            <w:tcW w:type="dxa" w:w="1644"/>
             <w:tcBorders>
               <w:top w:val="single" w:color="BFC9D6" w:sz="4"/>
               <w:left w:val="single" w:color="BFC9D6" w:sz="4"/>
@@ -32325,7 +33176,7 @@
         </w:tc>
         <w:tc>
           <w:tcPr>
-            <w:tcW w:type="dxa" w:w="2605"/>
+            <w:tcW w:type="dxa" w:w="2557"/>
             <w:tcBorders>
               <w:top w:val="single" w:color="BFC9D6" w:sz="4"/>
               <w:left w:val="single" w:color="BFC9D6" w:sz="4"/>
@@ -32361,7 +33212,7 @@
         </w:tc>
         <w:tc>
           <w:tcPr>
-            <w:tcW w:type="dxa" w:w="3723"/>
+            <w:tcW w:type="dxa" w:w="3837"/>
             <w:tcBorders>
               <w:top w:val="single" w:color="BFC9D6" w:sz="4"/>
               <w:left w:val="single" w:color="BFC9D6" w:sz="4"/>
@@ -32415,13 +33266,105 @@
                 <w:szCs w:val="18"/>
                 <w:rtl/>
               </w:rPr>
-              <w:t xml:space="preserve">، وسبب ووثيقة إلزاميان</w:t>
-            </w:r>
-          </w:p>
-        </w:tc>
-        <w:tc>
-          <w:tcPr>
-            <w:tcW w:type="dxa" w:w="1861"/>
+              <w:t xml:space="preserve">، وسبب ووثيقة إلزاميان. </w:t>
+            </w:r>
+            <w:r>
+              <w:rPr>
+                <w:rFonts w:ascii="Segoe UI Emoji" w:cs="Segoe UI Emoji" w:eastAsia="Segoe UI Emoji" w:hAnsi="Segoe UI Emoji"/>
+                <w:sz w:val="18"/>
+                <w:szCs w:val="18"/>
+                <w:rtl/>
+              </w:rPr>
+              <w:t xml:space="preserve">✅</w:t>
+            </w:r>
+            <w:r>
+              <w:rPr>
+                <w:rFonts w:ascii="Arial" w:cs="Arial" w:eastAsia="Arial" w:hAnsi="Arial"/>
+                <w:b w:val="false"/>
+                <w:bCs w:val="false"/>
+                <w:sz w:val="18"/>
+                <w:szCs w:val="18"/>
+                <w:rtl/>
+              </w:rPr>
+              <w:t xml:space="preserve"> منفّذ (2026-10-18، B7a): بند الأجندة WAIVED يستلزم </w:t>
+            </w:r>
+            <w:r>
+              <w:rPr>
+                <w:rFonts w:ascii="Courier New" w:cs="Courier New" w:eastAsia="Courier New" w:hAnsi="Courier New"/>
+                <w:b w:val="false"/>
+                <w:bCs w:val="false"/>
+                <w:color w:val="1F2937"/>
+                <w:sz w:val="16"/>
+                <w:szCs w:val="16"/>
+                <w:shd w:fill="F1F3F5" w:color="auto" w:val="clear"/>
+                <w:rtl/>
+              </w:rPr>
+              <w:t xml:space="preserve">‎StatusReason‎</w:t>
+            </w:r>
+            <w:r>
+              <w:rPr>
+                <w:rFonts w:ascii="Arial" w:cs="Arial" w:eastAsia="Arial" w:hAnsi="Arial"/>
+                <w:b w:val="false"/>
+                <w:bCs w:val="false"/>
+                <w:sz w:val="18"/>
+                <w:szCs w:val="18"/>
+                <w:rtl/>
+              </w:rPr>
+              <w:t xml:space="preserve"> و</w:t>
+            </w:r>
+            <w:r>
+              <w:rPr>
+                <w:rFonts w:ascii="Courier New" w:cs="Courier New" w:eastAsia="Courier New" w:hAnsi="Courier New"/>
+                <w:b w:val="false"/>
+                <w:bCs w:val="false"/>
+                <w:color w:val="1F2937"/>
+                <w:sz w:val="16"/>
+                <w:szCs w:val="16"/>
+                <w:shd w:fill="F1F3F5" w:color="auto" w:val="clear"/>
+                <w:rtl/>
+              </w:rPr>
+              <w:t xml:space="preserve">‎EvidenceDocumentId‎</w:t>
+            </w:r>
+            <w:r>
+              <w:rPr>
+                <w:rFonts w:ascii="Arial" w:cs="Arial" w:eastAsia="Arial" w:hAnsi="Arial"/>
+                <w:b w:val="false"/>
+                <w:bCs w:val="false"/>
+                <w:sz w:val="18"/>
+                <w:szCs w:val="18"/>
+                <w:rtl/>
+              </w:rPr>
+              <w:t xml:space="preserve"> (SR9، RF29)؛ وصلاحية </w:t>
+            </w:r>
+            <w:r>
+              <w:rPr>
+                <w:rFonts w:ascii="Courier New" w:cs="Courier New" w:eastAsia="Courier New" w:hAnsi="Courier New"/>
+                <w:b w:val="false"/>
+                <w:bCs w:val="false"/>
+                <w:color w:val="1F2937"/>
+                <w:sz w:val="16"/>
+                <w:szCs w:val="16"/>
+                <w:shd w:fill="F1F3F5" w:color="auto" w:val="clear"/>
+                <w:rtl/>
+              </w:rPr>
+              <w:t xml:space="preserve">‎obl.waiver.approve‎</w:t>
+            </w:r>
+            <w:r>
+              <w:rPr>
+                <w:rFonts w:ascii="Arial" w:cs="Arial" w:eastAsia="Arial" w:hAnsi="Arial"/>
+                <w:b w:val="false"/>
+                <w:bCs w:val="false"/>
+                <w:sz w:val="18"/>
+                <w:szCs w:val="18"/>
+                <w:rtl/>
+              </w:rPr>
+              <w:t xml:space="preserve"> يفحصها التطبيق</w:t>
+            </w:r>
+          </w:p>
+        </w:tc>
+        <w:tc>
+          <w:tcPr>
+            <w:tcW w:type="dxa" w:w="1826"/>
             <w:tcBorders>
               <w:top w:val="single" w:color="BFC9D6" w:sz="4"/>
               <w:left w:val="single" w:color="BFC9D6" w:sz="4"/>
@@ -32462,7 +33405,7 @@
         </w:trPr>
         <w:tc>
           <w:tcPr>
-            <w:tcW w:type="dxa" w:w="1675"/>
+            <w:tcW w:type="dxa" w:w="1644"/>
             <w:tcBorders>
               <w:top w:val="single" w:color="BFC9D6" w:sz="4"/>
               <w:left w:val="single" w:color="BFC9D6" w:sz="4"/>
@@ -32499,7 +33442,7 @@
         </w:tc>
         <w:tc>
           <w:tcPr>
-            <w:tcW w:type="dxa" w:w="2605"/>
+            <w:tcW w:type="dxa" w:w="2557"/>
             <w:tcBorders>
               <w:top w:val="single" w:color="BFC9D6" w:sz="4"/>
               <w:left w:val="single" w:color="BFC9D6" w:sz="4"/>
@@ -32536,7 +33479,7 @@
         </w:tc>
         <w:tc>
           <w:tcPr>
-            <w:tcW w:type="dxa" w:w="3723"/>
+            <w:tcW w:type="dxa" w:w="3837"/>
             <w:tcBorders>
               <w:top w:val="single" w:color="BFC9D6" w:sz="4"/>
               <w:left w:val="single" w:color="BFC9D6" w:sz="4"/>
@@ -32573,7 +33516,7 @@
         </w:tc>
         <w:tc>
           <w:tcPr>
-            <w:tcW w:type="dxa" w:w="1861"/>
+            <w:tcW w:type="dxa" w:w="1826"/>
             <w:tcBorders>
               <w:top w:val="single" w:color="BFC9D6" w:sz="4"/>
               <w:left w:val="single" w:color="BFC9D6" w:sz="4"/>
@@ -32615,7 +33558,7 @@
         </w:trPr>
         <w:tc>
           <w:tcPr>
-            <w:tcW w:type="dxa" w:w="1675"/>
+            <w:tcW w:type="dxa" w:w="1644"/>
             <w:tcBorders>
               <w:top w:val="single" w:color="BFC9D6" w:sz="4"/>
               <w:left w:val="single" w:color="BFC9D6" w:sz="4"/>
@@ -32651,7 +33594,7 @@
         </w:tc>
         <w:tc>
           <w:tcPr>
-            <w:tcW w:type="dxa" w:w="2605"/>
+            <w:tcW w:type="dxa" w:w="2557"/>
             <w:tcBorders>
               <w:top w:val="single" w:color="BFC9D6" w:sz="4"/>
               <w:left w:val="single" w:color="BFC9D6" w:sz="4"/>
@@ -32687,7 +33630,7 @@
         </w:tc>
         <w:tc>
           <w:tcPr>
-            <w:tcW w:type="dxa" w:w="3723"/>
+            <w:tcW w:type="dxa" w:w="3837"/>
             <w:tcBorders>
               <w:top w:val="single" w:color="BFC9D6" w:sz="4"/>
               <w:left w:val="single" w:color="BFC9D6" w:sz="4"/>
@@ -32723,7 +33666,7 @@
         </w:tc>
         <w:tc>
           <w:tcPr>
-            <w:tcW w:type="dxa" w:w="1861"/>
+            <w:tcW w:type="dxa" w:w="1826"/>
             <w:tcBorders>
               <w:top w:val="single" w:color="BFC9D6" w:sz="4"/>
               <w:left w:val="single" w:color="BFC9D6" w:sz="4"/>
@@ -32764,7 +33707,7 @@
         </w:trPr>
         <w:tc>
           <w:tcPr>
-            <w:tcW w:type="dxa" w:w="1675"/>
+            <w:tcW w:type="dxa" w:w="1644"/>
             <w:tcBorders>
               <w:top w:val="single" w:color="BFC9D6" w:sz="4"/>
               <w:left w:val="single" w:color="BFC9D6" w:sz="4"/>
@@ -32801,7 +33744,7 @@
         </w:tc>
         <w:tc>
           <w:tcPr>
-            <w:tcW w:type="dxa" w:w="2605"/>
+            <w:tcW w:type="dxa" w:w="2557"/>
             <w:tcBorders>
               <w:top w:val="single" w:color="BFC9D6" w:sz="4"/>
               <w:left w:val="single" w:color="BFC9D6" w:sz="4"/>
@@ -32838,7 +33781,7 @@
         </w:tc>
         <w:tc>
           <w:tcPr>
-            <w:tcW w:type="dxa" w:w="3723"/>
+            <w:tcW w:type="dxa" w:w="3837"/>
             <w:tcBorders>
               <w:top w:val="single" w:color="BFC9D6" w:sz="4"/>
               <w:left w:val="single" w:color="BFC9D6" w:sz="4"/>
@@ -32875,7 +33818,7 @@
         </w:tc>
         <w:tc>
           <w:tcPr>
-            <w:tcW w:type="dxa" w:w="1861"/>
+            <w:tcW w:type="dxa" w:w="1826"/>
             <w:tcBorders>
               <w:top w:val="single" w:color="BFC9D6" w:sz="4"/>
               <w:left w:val="single" w:color="BFC9D6" w:sz="4"/>
@@ -32917,7 +33860,7 @@
         </w:trPr>
         <w:tc>
           <w:tcPr>
-            <w:tcW w:type="dxa" w:w="1675"/>
+            <w:tcW w:type="dxa" w:w="1644"/>
             <w:tcBorders>
               <w:top w:val="single" w:color="BFC9D6" w:sz="4"/>
               <w:left w:val="single" w:color="BFC9D6" w:sz="4"/>
@@ -32953,7 +33896,7 @@
         </w:tc>
         <w:tc>
           <w:tcPr>
-            <w:tcW w:type="dxa" w:w="2605"/>
+            <w:tcW w:type="dxa" w:w="2557"/>
             <w:tcBorders>
               <w:top w:val="single" w:color="BFC9D6" w:sz="4"/>
               <w:left w:val="single" w:color="BFC9D6" w:sz="4"/>
@@ -32989,7 +33932,7 @@
         </w:tc>
         <w:tc>
           <w:tcPr>
-            <w:tcW w:type="dxa" w:w="3723"/>
+            <w:tcW w:type="dxa" w:w="3837"/>
             <w:tcBorders>
               <w:top w:val="single" w:color="BFC9D6" w:sz="4"/>
               <w:left w:val="single" w:color="BFC9D6" w:sz="4"/>
@@ -33049,7 +33992,7 @@
         </w:tc>
         <w:tc>
           <w:tcPr>
-            <w:tcW w:type="dxa" w:w="1861"/>
+            <w:tcW w:type="dxa" w:w="1826"/>
             <w:tcBorders>
               <w:top w:val="single" w:color="BFC9D6" w:sz="4"/>
               <w:left w:val="single" w:color="BFC9D6" w:sz="4"/>
@@ -37651,7 +38594,7 @@
         <w:pStyle w:val="Heading2"/>
         <w:bidi/>
       </w:pPr>
-      <w:bookmarkStart w:name="_sec9" w:id="9"/>
+      <w:bookmarkStart w:name="_sec10" w:id="10"/>
       <w:r>
         <w:rPr>
           <w:rFonts w:ascii="Arial" w:cs="Arial" w:eastAsia="Arial" w:hAnsi="Arial"/>
@@ -37664,7 +38607,7 @@
         </w:rPr>
         <w:t xml:space="preserve">3.3 مستندات P2 (قبل الإطلاق)</w:t>
       </w:r>
-      <w:bookmarkEnd w:id="9"/>
+      <w:bookmarkEnd w:id="10"/>
     </w:p>
     <w:p>
       <w:pPr>
@@ -40692,7 +41635,7 @@
         <w:szCs w:val="17"/>
         <w:rtl/>
       </w:rPr>
-      <w:t xml:space="preserve">القرارات المعتمدة من المالك · BankFas · 2026-10-14</w:t>
+      <w:t xml:space="preserve">القرارات المعتمدة من المالك · BankFas · 2026-10-18</w:t>
     </w:r>
   </w:p>
 </w:hdr>

</xml_diff>

<commit_message>
Word files for the credit assessment; docs/35 notes on its sources
- docs/35-CREDIT-ASSESSMENT-METHODOLOGY.docx (new), and the design
  documents, the detailed analysis, the owner decisions, the review
  package, DOC-F09 and both readiness volumes rebuilt from their sources.
- docs/35: the stress cases are computed without a comparison statement,
  so case e0 sums to 10.15 against 10.11 in the worked example, with the
  same grade; one methodology link is a copy on a third-party site.

Readiness files whose text did not change are left as committed (the
diagram renderer writes different PNG bytes on each run).

Co-Authored-By: Claude Opus 5.5 <noreply@anthropic.com>
Claude-Session: https://claude.ai/code/session_012HHcRrzuvMBTL2FYxXtsyv
</commit_message>
<xml_diff>
--- a/treasury-platform/docs/31-OWNER-DECISIONS.docx
+++ b/treasury-platform/docs/31-OWNER-DECISIONS.docx
@@ -271,7 +271,7 @@
                 <w:szCs w:val="18"/>
                 <w:rtl/>
               </w:rPr>
-              <w:t xml:space="preserve">2026-10-12</w:t>
+              <w:t xml:space="preserve">2026-10-12 (آخر تحديث 2026-10-18)</w:t>
             </w:r>
           </w:p>
         </w:tc>
@@ -5089,9 +5089,9 @@
       </w:tblPr>
       <w:tblGrid>
         <w:gridCol w:w="953"/>
-        <w:gridCol w:w="3429"/>
-        <w:gridCol w:w="3343"/>
-        <w:gridCol w:w="2139"/>
+        <w:gridCol w:w="3396"/>
+        <w:gridCol w:w="3395"/>
+        <w:gridCol w:w="2120"/>
       </w:tblGrid>
       <w:tr>
         <w:trPr>
@@ -5138,7 +5138,7 @@
         </w:tc>
         <w:tc>
           <w:tcPr>
-            <w:tcW w:type="dxa" w:w="3429"/>
+            <w:tcW w:type="dxa" w:w="3396"/>
             <w:tcBorders>
               <w:top w:val="single" w:color="BFC9D6" w:sz="4"/>
               <w:left w:val="single" w:color="BFC9D6" w:sz="4"/>
@@ -5176,7 +5176,7 @@
         </w:tc>
         <w:tc>
           <w:tcPr>
-            <w:tcW w:type="dxa" w:w="3343"/>
+            <w:tcW w:type="dxa" w:w="3395"/>
             <w:tcBorders>
               <w:top w:val="single" w:color="BFC9D6" w:sz="4"/>
               <w:left w:val="single" w:color="BFC9D6" w:sz="4"/>
@@ -5214,7 +5214,7 @@
         </w:tc>
         <w:tc>
           <w:tcPr>
-            <w:tcW w:type="dxa" w:w="2139"/>
+            <w:tcW w:type="dxa" w:w="2120"/>
             <w:tcBorders>
               <w:top w:val="single" w:color="BFC9D6" w:sz="4"/>
               <w:left w:val="single" w:color="BFC9D6" w:sz="4"/>
@@ -5293,7 +5293,7 @@
         </w:tc>
         <w:tc>
           <w:tcPr>
-            <w:tcW w:type="dxa" w:w="3429"/>
+            <w:tcW w:type="dxa" w:w="3396"/>
             <w:tcBorders>
               <w:top w:val="single" w:color="BFC9D6" w:sz="4"/>
               <w:left w:val="single" w:color="BFC9D6" w:sz="4"/>
@@ -5340,7 +5340,7 @@
         </w:tc>
         <w:tc>
           <w:tcPr>
-            <w:tcW w:type="dxa" w:w="3343"/>
+            <w:tcW w:type="dxa" w:w="3395"/>
             <w:tcBorders>
               <w:top w:val="single" w:color="BFC9D6" w:sz="4"/>
               <w:left w:val="single" w:color="BFC9D6" w:sz="4"/>
@@ -5376,7 +5376,7 @@
         </w:tc>
         <w:tc>
           <w:tcPr>
-            <w:tcW w:type="dxa" w:w="2139"/>
+            <w:tcW w:type="dxa" w:w="2120"/>
             <w:tcBorders>
               <w:top w:val="single" w:color="BFC9D6" w:sz="4"/>
               <w:left w:val="single" w:color="BFC9D6" w:sz="4"/>
@@ -5431,6 +5431,445 @@
                 <w:rtl/>
               </w:rPr>
               <w:t xml:space="preserve"> §10</w:t>
+            </w:r>
+          </w:p>
+        </w:tc>
+      </w:tr>
+      <w:tr>
+        <w:trPr>
+          <w:cantSplit/>
+        </w:trPr>
+        <w:tc>
+          <w:tcPr>
+            <w:tcW w:type="dxa" w:w="953"/>
+            <w:tcBorders>
+              <w:top w:val="single" w:color="BFC9D6" w:sz="4"/>
+              <w:left w:val="single" w:color="BFC9D6" w:sz="4"/>
+              <w:bottom w:val="single" w:color="BFC9D6" w:sz="4"/>
+              <w:right w:val="single" w:color="BFC9D6" w:sz="4"/>
+            </w:tcBorders>
+            <w:shd w:fill="F5F8FC" w:color="auto" w:val="clear"/>
+            <w:tcMar>
+              <w:top w:type="dxa" w:w="50"/>
+              <w:left w:type="dxa" w:w="90"/>
+              <w:bottom w:type="dxa" w:w="50"/>
+              <w:right w:type="dxa" w:w="90"/>
+            </w:tcMar>
+            <w:vAlign w:val="top"/>
+          </w:tcPr>
+          <w:p>
+            <w:pPr>
+              <w:keepNext w:val="false"/>
+              <w:bidi/>
+              <w:spacing w:after="30" w:before="30" w:line="264"/>
+            </w:pPr>
+            <w:r>
+              <w:rPr>
+                <w:rFonts w:ascii="Arial" w:cs="Arial" w:eastAsia="Arial" w:hAnsi="Arial"/>
+                <w:b w:val="false"/>
+                <w:bCs w:val="false"/>
+                <w:sz w:val="18"/>
+                <w:szCs w:val="18"/>
+                <w:rtl/>
+              </w:rPr>
+              <w:t xml:space="preserve">26</w:t>
+            </w:r>
+          </w:p>
+        </w:tc>
+        <w:tc>
+          <w:tcPr>
+            <w:tcW w:type="dxa" w:w="3396"/>
+            <w:tcBorders>
+              <w:top w:val="single" w:color="BFC9D6" w:sz="4"/>
+              <w:left w:val="single" w:color="BFC9D6" w:sz="4"/>
+              <w:bottom w:val="single" w:color="BFC9D6" w:sz="4"/>
+              <w:right w:val="single" w:color="BFC9D6" w:sz="4"/>
+            </w:tcBorders>
+            <w:shd w:fill="F5F8FC" w:color="auto" w:val="clear"/>
+            <w:tcMar>
+              <w:top w:type="dxa" w:w="50"/>
+              <w:left w:type="dxa" w:w="90"/>
+              <w:bottom w:type="dxa" w:w="50"/>
+              <w:right w:type="dxa" w:w="90"/>
+            </w:tcMar>
+            <w:vAlign w:val="top"/>
+          </w:tcPr>
+          <w:p>
+            <w:pPr>
+              <w:keepNext w:val="false"/>
+              <w:bidi/>
+              <w:spacing w:after="30" w:before="30" w:line="264"/>
+            </w:pPr>
+            <w:r>
+              <w:rPr>
+                <w:rFonts w:ascii="Arial" w:cs="Arial" w:eastAsia="Arial" w:hAnsi="Arial"/>
+                <w:b/>
+                <w:bCs/>
+                <w:sz w:val="18"/>
+                <w:szCs w:val="18"/>
+                <w:rtl/>
+              </w:rPr>
+              <w:t xml:space="preserve">اعتماد قاعدة BR-FIN-016 كما هي (2026-10-18).</w:t>
+            </w:r>
+            <w:r>
+              <w:rPr>
+                <w:rFonts w:ascii="Arial" w:cs="Arial" w:eastAsia="Arial" w:hAnsi="Arial"/>
+                <w:b w:val="false"/>
+                <w:bCs w:val="false"/>
+                <w:sz w:val="18"/>
+                <w:szCs w:val="18"/>
+                <w:rtl/>
+              </w:rPr>
+              <w:t xml:space="preserve"> التحويل المنسوب إلى تسهيل يُعدّ له وحده، والتحويل على مستوى البنك يُعدّ لكل تعهدات تسهيلات ذلك البنك</w:t>
+            </w:r>
+          </w:p>
+        </w:tc>
+        <w:tc>
+          <w:tcPr>
+            <w:tcW w:type="dxa" w:w="3395"/>
+            <w:tcBorders>
+              <w:top w:val="single" w:color="BFC9D6" w:sz="4"/>
+              <w:left w:val="single" w:color="BFC9D6" w:sz="4"/>
+              <w:bottom w:val="single" w:color="BFC9D6" w:sz="4"/>
+              <w:right w:val="single" w:color="BFC9D6" w:sz="4"/>
+            </w:tcBorders>
+            <w:shd w:fill="F5F8FC" w:color="auto" w:val="clear"/>
+            <w:tcMar>
+              <w:top w:type="dxa" w:w="50"/>
+              <w:left w:type="dxa" w:w="90"/>
+              <w:bottom w:type="dxa" w:w="50"/>
+              <w:right w:type="dxa" w:w="90"/>
+            </w:tcMar>
+            <w:vAlign w:val="top"/>
+          </w:tcPr>
+          <w:p>
+            <w:pPr>
+              <w:keepNext w:val="false"/>
+              <w:bidi/>
+              <w:spacing w:after="30" w:before="30" w:line="264"/>
+            </w:pPr>
+            <w:r>
+              <w:rPr>
+                <w:rFonts w:ascii="Arial" w:cs="Arial" w:eastAsia="Arial" w:hAnsi="Arial"/>
+                <w:b w:val="false"/>
+                <w:bCs w:val="false"/>
+                <w:sz w:val="18"/>
+                <w:szCs w:val="18"/>
+                <w:rtl/>
+              </w:rPr>
+              <w:t xml:space="preserve">لا تغيير في القاعدة؛ رُفعت علامة </w:t>
+            </w:r>
+            <w:r>
+              <w:rPr>
+                <w:rFonts w:ascii="Arial" w:cs="Arial" w:eastAsia="Arial" w:hAnsi="Arial"/>
+                <w:color w:val="E0A800"/>
+                <w:sz w:val="18"/>
+                <w:szCs w:val="18"/>
+                <w:rtl/>
+              </w:rPr>
+              <w:t xml:space="preserve">●</w:t>
+            </w:r>
+            <w:r>
+              <w:rPr>
+                <w:rFonts w:ascii="Arial" w:cs="Arial" w:eastAsia="Arial" w:hAnsi="Arial"/>
+                <w:b w:val="false"/>
+                <w:bCs w:val="false"/>
+                <w:sz w:val="18"/>
+                <w:szCs w:val="18"/>
+                <w:rtl/>
+              </w:rPr>
+              <w:t xml:space="preserve"> من المواصفة 12 وdocs/03 وADR 0016</w:t>
+            </w:r>
+          </w:p>
+        </w:tc>
+        <w:tc>
+          <w:tcPr>
+            <w:tcW w:type="dxa" w:w="2120"/>
+            <w:tcBorders>
+              <w:top w:val="single" w:color="BFC9D6" w:sz="4"/>
+              <w:left w:val="single" w:color="BFC9D6" w:sz="4"/>
+              <w:bottom w:val="single" w:color="BFC9D6" w:sz="4"/>
+              <w:right w:val="single" w:color="BFC9D6" w:sz="4"/>
+            </w:tcBorders>
+            <w:shd w:fill="F5F8FC" w:color="auto" w:val="clear"/>
+            <w:tcMar>
+              <w:top w:type="dxa" w:w="50"/>
+              <w:left w:type="dxa" w:w="90"/>
+              <w:bottom w:type="dxa" w:w="50"/>
+              <w:right w:type="dxa" w:w="90"/>
+            </w:tcMar>
+            <w:vAlign w:val="top"/>
+          </w:tcPr>
+          <w:p>
+            <w:pPr>
+              <w:keepNext w:val="false"/>
+              <w:bidi/>
+              <w:spacing w:after="30" w:before="30" w:line="264"/>
+            </w:pPr>
+            <w:r>
+              <w:rPr>
+                <w:rFonts w:ascii="Arial" w:cs="Arial" w:eastAsia="Arial" w:hAnsi="Arial"/>
+                <w:b w:val="false"/>
+                <w:bCs w:val="false"/>
+                <w:sz w:val="18"/>
+                <w:szCs w:val="18"/>
+                <w:rtl/>
+              </w:rPr>
+              <w:t xml:space="preserve">BR-FIN-016</w:t>
+            </w:r>
+          </w:p>
+        </w:tc>
+      </w:tr>
+      <w:tr>
+        <w:trPr>
+          <w:cantSplit/>
+        </w:trPr>
+        <w:tc>
+          <w:tcPr>
+            <w:tcW w:type="dxa" w:w="953"/>
+            <w:tcBorders>
+              <w:top w:val="single" w:color="BFC9D6" w:sz="4"/>
+              <w:left w:val="single" w:color="BFC9D6" w:sz="4"/>
+              <w:bottom w:val="single" w:color="BFC9D6" w:sz="4"/>
+              <w:right w:val="single" w:color="BFC9D6" w:sz="4"/>
+            </w:tcBorders>
+            <w:tcMar>
+              <w:top w:type="dxa" w:w="50"/>
+              <w:left w:type="dxa" w:w="90"/>
+              <w:bottom w:type="dxa" w:w="50"/>
+              <w:right w:type="dxa" w:w="90"/>
+            </w:tcMar>
+            <w:vAlign w:val="top"/>
+          </w:tcPr>
+          <w:p>
+            <w:pPr>
+              <w:keepNext w:val="false"/>
+              <w:bidi/>
+              <w:spacing w:after="30" w:before="30" w:line="264"/>
+            </w:pPr>
+            <w:r>
+              <w:rPr>
+                <w:rFonts w:ascii="Arial" w:cs="Arial" w:eastAsia="Arial" w:hAnsi="Arial"/>
+                <w:b w:val="false"/>
+                <w:bCs w:val="false"/>
+                <w:sz w:val="18"/>
+                <w:szCs w:val="18"/>
+                <w:rtl/>
+              </w:rPr>
+              <w:t xml:space="preserve">27</w:t>
+            </w:r>
+          </w:p>
+        </w:tc>
+        <w:tc>
+          <w:tcPr>
+            <w:tcW w:type="dxa" w:w="3396"/>
+            <w:tcBorders>
+              <w:top w:val="single" w:color="BFC9D6" w:sz="4"/>
+              <w:left w:val="single" w:color="BFC9D6" w:sz="4"/>
+              <w:bottom w:val="single" w:color="BFC9D6" w:sz="4"/>
+              <w:right w:val="single" w:color="BFC9D6" w:sz="4"/>
+            </w:tcBorders>
+            <w:tcMar>
+              <w:top w:type="dxa" w:w="50"/>
+              <w:left w:type="dxa" w:w="90"/>
+              <w:bottom w:type="dxa" w:w="50"/>
+              <w:right w:type="dxa" w:w="90"/>
+            </w:tcMar>
+            <w:vAlign w:val="top"/>
+          </w:tcPr>
+          <w:p>
+            <w:pPr>
+              <w:keepNext w:val="false"/>
+              <w:bidi/>
+              <w:spacing w:after="30" w:before="30" w:line="264"/>
+            </w:pPr>
+            <w:r>
+              <w:rPr>
+                <w:rFonts w:ascii="Arial" w:cs="Arial" w:eastAsia="Arial" w:hAnsi="Arial"/>
+                <w:b/>
+                <w:bCs/>
+                <w:sz w:val="18"/>
+                <w:szCs w:val="18"/>
+                <w:rtl/>
+              </w:rPr>
+              <w:t xml:space="preserve">التقييم الشامل للميزانية على أسس موديز (2026-10-18).</w:t>
+            </w:r>
+            <w:r>
+              <w:rPr>
+                <w:rFonts w:ascii="Arial" w:cs="Arial" w:eastAsia="Arial" w:hAnsi="Arial"/>
+                <w:b w:val="false"/>
+                <w:bCs w:val="false"/>
+                <w:sz w:val="18"/>
+                <w:szCs w:val="18"/>
+                <w:rtl/>
+              </w:rPr>
+              <w:t xml:space="preserve"> تقييم شامل عند دراسة الميزانية، ونقاط القوة من النسب المالية ومدى توافقها مع النسب، والمخاطر الناتجة في تقرير من النظام؛ والمعايير يبنيها المحلل بالاستعانة بخبير ائتمان مصرفي على أسس موديز: وزن لكل نسبة ودرجات مخاطر لكل بند من الميزانية والتحليلات الناتجة عنها</w:t>
+            </w:r>
+          </w:p>
+        </w:tc>
+        <w:tc>
+          <w:tcPr>
+            <w:tcW w:type="dxa" w:w="3395"/>
+            <w:tcBorders>
+              <w:top w:val="single" w:color="BFC9D6" w:sz="4"/>
+              <w:left w:val="single" w:color="BFC9D6" w:sz="4"/>
+              <w:bottom w:val="single" w:color="BFC9D6" w:sz="4"/>
+              <w:right w:val="single" w:color="BFC9D6" w:sz="4"/>
+            </w:tcBorders>
+            <w:tcMar>
+              <w:top w:type="dxa" w:w="50"/>
+              <w:left w:type="dxa" w:w="90"/>
+              <w:bottom w:type="dxa" w:w="50"/>
+              <w:right w:type="dxa" w:w="90"/>
+            </w:tcMar>
+            <w:vAlign w:val="top"/>
+          </w:tcPr>
+          <w:p>
+            <w:pPr>
+              <w:keepNext w:val="false"/>
+              <w:bidi/>
+              <w:spacing w:after="30" w:before="30" w:line="264"/>
+            </w:pPr>
+            <w:r>
+              <w:rPr>
+                <w:rFonts w:ascii="Arial" w:cs="Arial" w:eastAsia="Arial" w:hAnsi="Arial"/>
+                <w:b w:val="false"/>
+                <w:bCs w:val="false"/>
+                <w:sz w:val="18"/>
+                <w:szCs w:val="18"/>
+                <w:rtl/>
+              </w:rPr>
+              <w:t xml:space="preserve">بُني في S2-ب: سلّم موديز بـ21 درجة، وثلاث بطاقات قطاعية بأوزانها وشبكاتها، و23 قاعدة لمخاطر البنود، و17 تعديلًا وسقف قطاع، وتقرير بنقاط القوة والضعف والمخاطر والتوافق مع التعهدات والتحويلات (046، 104، ADR 0017). راجعها خبير مستقل وعُدّلت بملاحظاته. </w:t>
+            </w:r>
+            <w:r>
+              <w:rPr>
+                <w:rFonts w:ascii="Arial" w:cs="Arial" w:eastAsia="Arial" w:hAnsi="Arial"/>
+                <w:b/>
+                <w:bCs/>
+                <w:sz w:val="18"/>
+                <w:szCs w:val="18"/>
+                <w:rtl/>
+              </w:rPr>
+              <w:t xml:space="preserve">سبعة أسئلة لك</w:t>
+            </w:r>
+            <w:r>
+              <w:rPr>
+                <w:rFonts w:ascii="Arial" w:cs="Arial" w:eastAsia="Arial" w:hAnsi="Arial"/>
+                <w:b w:val="false"/>
+                <w:bCs w:val="false"/>
+                <w:sz w:val="18"/>
+                <w:szCs w:val="18"/>
+                <w:rtl/>
+              </w:rPr>
+              <w:t xml:space="preserve"> في </w:t>
+            </w:r>
+            <w:r>
+              <w:rPr>
+                <w:rFonts w:ascii="Courier New" w:cs="Courier New" w:eastAsia="Courier New" w:hAnsi="Courier New"/>
+                <w:b w:val="false"/>
+                <w:bCs w:val="false"/>
+                <w:color w:val="1F2937"/>
+                <w:sz w:val="16"/>
+                <w:szCs w:val="16"/>
+                <w:shd w:fill="F1F3F5" w:color="auto" w:val="clear"/>
+                <w:rtl/>
+              </w:rPr>
+              <w:t xml:space="preserve">‎docs/35‎</w:t>
+            </w:r>
+            <w:r>
+              <w:rPr>
+                <w:rFonts w:ascii="Arial" w:cs="Arial" w:eastAsia="Arial" w:hAnsi="Arial"/>
+                <w:b w:val="false"/>
+                <w:bCs w:val="false"/>
+                <w:sz w:val="18"/>
+                <w:szCs w:val="18"/>
+                <w:rtl/>
+              </w:rPr>
+              <w:t xml:space="preserve"> §15 بقيمها المبنية. الربط مع نظام التقييم الخارجي يبقى مرحلة لاحقة</w:t>
+            </w:r>
+          </w:p>
+        </w:tc>
+        <w:tc>
+          <w:tcPr>
+            <w:tcW w:type="dxa" w:w="2120"/>
+            <w:tcBorders>
+              <w:top w:val="single" w:color="BFC9D6" w:sz="4"/>
+              <w:left w:val="single" w:color="BFC9D6" w:sz="4"/>
+              <w:bottom w:val="single" w:color="BFC9D6" w:sz="4"/>
+              <w:right w:val="single" w:color="BFC9D6" w:sz="4"/>
+            </w:tcBorders>
+            <w:tcMar>
+              <w:top w:type="dxa" w:w="50"/>
+              <w:left w:type="dxa" w:w="90"/>
+              <w:bottom w:type="dxa" w:w="50"/>
+              <w:right w:type="dxa" w:w="90"/>
+            </w:tcMar>
+            <w:vAlign w:val="top"/>
+          </w:tcPr>
+          <w:p>
+            <w:pPr>
+              <w:keepNext w:val="false"/>
+              <w:bidi/>
+              <w:spacing w:after="30" w:before="30" w:line="264"/>
+            </w:pPr>
+            <w:r>
+              <w:rPr>
+                <w:rFonts w:ascii="Arial" w:cs="Arial" w:eastAsia="Arial" w:hAnsi="Arial"/>
+                <w:b w:val="false"/>
+                <w:bCs w:val="false"/>
+                <w:sz w:val="18"/>
+                <w:szCs w:val="18"/>
+                <w:rtl/>
+              </w:rPr>
+              <w:t xml:space="preserve">FR-FIN-020 إلى FR-FIN-024؛ </w:t>
+            </w:r>
+            <w:r>
+              <w:rPr>
+                <w:rFonts w:ascii="Courier New" w:cs="Courier New" w:eastAsia="Courier New" w:hAnsi="Courier New"/>
+                <w:b w:val="false"/>
+                <w:bCs w:val="false"/>
+                <w:color w:val="1F2937"/>
+                <w:sz w:val="16"/>
+                <w:szCs w:val="16"/>
+                <w:shd w:fill="F1F3F5" w:color="auto" w:val="clear"/>
+                <w:rtl/>
+              </w:rPr>
+              <w:t xml:space="preserve">‎docs/35‎</w:t>
+            </w:r>
+            <w:r>
+              <w:rPr>
+                <w:rFonts w:ascii="Arial" w:cs="Arial" w:eastAsia="Arial" w:hAnsi="Arial"/>
+                <w:b w:val="false"/>
+                <w:bCs w:val="false"/>
+                <w:sz w:val="18"/>
+                <w:szCs w:val="18"/>
+                <w:rtl/>
+              </w:rPr>
+              <w:t xml:space="preserve">؛ </w:t>
+            </w:r>
+            <w:r>
+              <w:rPr>
+                <w:rFonts w:ascii="Courier New" w:cs="Courier New" w:eastAsia="Courier New" w:hAnsi="Courier New"/>
+                <w:b w:val="false"/>
+                <w:bCs w:val="false"/>
+                <w:color w:val="1F2937"/>
+                <w:sz w:val="16"/>
+                <w:szCs w:val="16"/>
+                <w:shd w:fill="F1F3F5" w:color="auto" w:val="clear"/>
+                <w:rtl/>
+              </w:rPr>
+              <w:t xml:space="preserve">‎docs/03‎</w:t>
+            </w:r>
+            <w:r>
+              <w:rPr>
+                <w:rFonts w:ascii="Arial" w:cs="Arial" w:eastAsia="Arial" w:hAnsi="Arial"/>
+                <w:b w:val="false"/>
+                <w:bCs w:val="false"/>
+                <w:sz w:val="18"/>
+                <w:szCs w:val="18"/>
+                <w:rtl/>
+              </w:rPr>
+              <w:t xml:space="preserve"> §11</w:t>
             </w:r>
           </w:p>
         </w:tc>

</xml_diff>

<commit_message>
docs: record the owner's answers on country ceilings, treasury review and a current-event scenario
Co-Authored-By: Claude Opus 5.5 <noreply@anthropic.com>
Claude-Session: https://claude.ai/code/session_012HHcRrzuvMBTL2FYxXtsyv
</commit_message>
<xml_diff>
--- a/treasury-platform/docs/31-OWNER-DECISIONS.docx
+++ b/treasury-platform/docs/31-OWNER-DECISIONS.docx
@@ -6358,6 +6358,207 @@
                 <w:rtl/>
               </w:rPr>
               <w:t xml:space="preserve"> الإصدار 2.1</w:t>
+            </w:r>
+          </w:p>
+        </w:tc>
+      </w:tr>
+      <w:tr>
+        <w:trPr>
+          <w:cantSplit/>
+        </w:trPr>
+        <w:tc>
+          <w:tcPr>
+            <w:tcW w:type="dxa" w:w="953"/>
+            <w:tcBorders>
+              <w:top w:val="single" w:color="BFC9D6" w:sz="4"/>
+              <w:left w:val="single" w:color="BFC9D6" w:sz="4"/>
+              <w:bottom w:val="single" w:color="BFC9D6" w:sz="4"/>
+              <w:right w:val="single" w:color="BFC9D6" w:sz="4"/>
+            </w:tcBorders>
+            <w:shd w:fill="F5F8FC" w:color="auto" w:val="clear"/>
+            <w:tcMar>
+              <w:top w:type="dxa" w:w="50"/>
+              <w:left w:type="dxa" w:w="90"/>
+              <w:bottom w:type="dxa" w:w="50"/>
+              <w:right w:type="dxa" w:w="90"/>
+            </w:tcMar>
+            <w:vAlign w:val="top"/>
+          </w:tcPr>
+          <w:p>
+            <w:pPr>
+              <w:keepNext w:val="false"/>
+              <w:bidi/>
+              <w:spacing w:after="30" w:before="30" w:line="264"/>
+            </w:pPr>
+            <w:r>
+              <w:rPr>
+                <w:rFonts w:ascii="Arial" w:cs="Arial" w:eastAsia="Arial" w:hAnsi="Arial"/>
+                <w:b w:val="false"/>
+                <w:bCs w:val="false"/>
+                <w:sz w:val="18"/>
+                <w:szCs w:val="18"/>
+                <w:rtl/>
+              </w:rPr>
+              <w:t xml:space="preserve">30</w:t>
+            </w:r>
+          </w:p>
+        </w:tc>
+        <w:tc>
+          <w:tcPr>
+            <w:tcW w:type="dxa" w:w="3396"/>
+            <w:tcBorders>
+              <w:top w:val="single" w:color="BFC9D6" w:sz="4"/>
+              <w:left w:val="single" w:color="BFC9D6" w:sz="4"/>
+              <w:bottom w:val="single" w:color="BFC9D6" w:sz="4"/>
+              <w:right w:val="single" w:color="BFC9D6" w:sz="4"/>
+            </w:tcBorders>
+            <w:shd w:fill="F5F8FC" w:color="auto" w:val="clear"/>
+            <w:tcMar>
+              <w:top w:type="dxa" w:w="50"/>
+              <w:left w:type="dxa" w:w="90"/>
+              <w:bottom w:type="dxa" w:w="50"/>
+              <w:right w:type="dxa" w:w="90"/>
+            </w:tcMar>
+            <w:vAlign w:val="top"/>
+          </w:tcPr>
+          <w:p>
+            <w:pPr>
+              <w:keepNext w:val="false"/>
+              <w:bidi/>
+              <w:spacing w:after="30" w:before="30" w:line="264"/>
+            </w:pPr>
+            <w:r>
+              <w:rPr>
+                <w:rFonts w:ascii="Arial" w:cs="Arial" w:eastAsia="Arial" w:hAnsi="Arial"/>
+                <w:b/>
+                <w:bCs/>
+                <w:sz w:val="18"/>
+                <w:szCs w:val="18"/>
+                <w:rtl/>
+              </w:rPr>
+              <w:t xml:space="preserve">السقف السيادي والمراجعة وسيناريو الحدث الجاري (2026-10-19).</w:t>
+            </w:r>
+            <w:r>
+              <w:rPr>
+                <w:rFonts w:ascii="Arial" w:cs="Arial" w:eastAsia="Arial" w:hAnsi="Arial"/>
+                <w:b w:val="false"/>
+                <w:bCs w:val="false"/>
+                <w:sz w:val="18"/>
+                <w:szCs w:val="18"/>
+                <w:rtl/>
+              </w:rPr>
+              <w:t xml:space="preserve"> يعتمد مشغّل المنصة التصنيفات السيادية؛ ويمكن أن تراجع إدارة الخزينة مخاطر بلدانها؛ ونعم لسيناريو خاص بحدث جارٍ</w:t>
+            </w:r>
+          </w:p>
+        </w:tc>
+        <w:tc>
+          <w:tcPr>
+            <w:tcW w:type="dxa" w:w="3395"/>
+            <w:tcBorders>
+              <w:top w:val="single" w:color="BFC9D6" w:sz="4"/>
+              <w:left w:val="single" w:color="BFC9D6" w:sz="4"/>
+              <w:bottom w:val="single" w:color="BFC9D6" w:sz="4"/>
+              <w:right w:val="single" w:color="BFC9D6" w:sz="4"/>
+            </w:tcBorders>
+            <w:shd w:fill="F5F8FC" w:color="auto" w:val="clear"/>
+            <w:tcMar>
+              <w:top w:type="dxa" w:w="50"/>
+              <w:left w:type="dxa" w:w="90"/>
+              <w:bottom w:type="dxa" w:w="50"/>
+              <w:right w:type="dxa" w:w="90"/>
+            </w:tcMar>
+            <w:vAlign w:val="top"/>
+          </w:tcPr>
+          <w:p>
+            <w:pPr>
+              <w:keepNext w:val="false"/>
+              <w:bidi/>
+              <w:spacing w:after="30" w:before="30" w:line="264"/>
+            </w:pPr>
+            <w:r>
+              <w:rPr>
+                <w:rFonts w:ascii="Arial" w:cs="Arial" w:eastAsia="Arial" w:hAnsi="Arial"/>
+                <w:b w:val="false"/>
+                <w:bCs w:val="false"/>
+                <w:sz w:val="18"/>
+                <w:szCs w:val="18"/>
+                <w:rtl/>
+              </w:rPr>
+              <w:t xml:space="preserve">سُجّل في </w:t>
+            </w:r>
+            <w:r>
+              <w:rPr>
+                <w:rFonts w:ascii="Courier New" w:cs="Courier New" w:eastAsia="Courier New" w:hAnsi="Courier New"/>
+                <w:b w:val="false"/>
+                <w:bCs w:val="false"/>
+                <w:color w:val="1F2937"/>
+                <w:sz w:val="16"/>
+                <w:szCs w:val="16"/>
+                <w:shd w:fill="F1F3F5" w:color="auto" w:val="clear"/>
+                <w:rtl/>
+              </w:rPr>
+              <w:t xml:space="preserve">‎docs/35‎</w:t>
+            </w:r>
+            <w:r>
+              <w:rPr>
+                <w:rFonts w:ascii="Arial" w:cs="Arial" w:eastAsia="Arial" w:hAnsi="Arial"/>
+                <w:b w:val="false"/>
+                <w:bCs w:val="false"/>
+                <w:sz w:val="18"/>
+                <w:szCs w:val="18"/>
+                <w:rtl/>
+              </w:rPr>
+              <w:t xml:space="preserve"> §24؛ تفاصيل السيناريو مطلوبة من المالك قبل بنائه</w:t>
+            </w:r>
+          </w:p>
+        </w:tc>
+        <w:tc>
+          <w:tcPr>
+            <w:tcW w:type="dxa" w:w="2120"/>
+            <w:tcBorders>
+              <w:top w:val="single" w:color="BFC9D6" w:sz="4"/>
+              <w:left w:val="single" w:color="BFC9D6" w:sz="4"/>
+              <w:bottom w:val="single" w:color="BFC9D6" w:sz="4"/>
+              <w:right w:val="single" w:color="BFC9D6" w:sz="4"/>
+            </w:tcBorders>
+            <w:shd w:fill="F5F8FC" w:color="auto" w:val="clear"/>
+            <w:tcMar>
+              <w:top w:type="dxa" w:w="50"/>
+              <w:left w:type="dxa" w:w="90"/>
+              <w:bottom w:type="dxa" w:w="50"/>
+              <w:right w:type="dxa" w:w="90"/>
+            </w:tcMar>
+            <w:vAlign w:val="top"/>
+          </w:tcPr>
+          <w:p>
+            <w:pPr>
+              <w:keepNext w:val="false"/>
+              <w:bidi/>
+              <w:spacing w:after="30" w:before="30" w:line="264"/>
+            </w:pPr>
+            <w:r>
+              <w:rPr>
+                <w:rFonts w:ascii="Courier New" w:cs="Courier New" w:eastAsia="Courier New" w:hAnsi="Courier New"/>
+                <w:b w:val="false"/>
+                <w:bCs w:val="false"/>
+                <w:color w:val="1F2937"/>
+                <w:sz w:val="16"/>
+                <w:szCs w:val="16"/>
+                <w:shd w:fill="F1F3F5" w:color="auto" w:val="clear"/>
+                <w:rtl/>
+              </w:rPr>
+              <w:t xml:space="preserve">‎docs/35‎</w:t>
+            </w:r>
+            <w:r>
+              <w:rPr>
+                <w:rFonts w:ascii="Arial" w:cs="Arial" w:eastAsia="Arial" w:hAnsi="Arial"/>
+                <w:b w:val="false"/>
+                <w:bCs w:val="false"/>
+                <w:sz w:val="18"/>
+                <w:szCs w:val="18"/>
+                <w:rtl/>
+              </w:rPr>
+              <w:t xml:space="preserve"> §24</w:t>
             </w:r>
           </w:p>
         </w:tc>

</xml_diff>

<commit_message>
Credit assessment: the lender's stance in every scenario (owner's decision 32)
A bank that sees a sector's risk rise does not withdraw drawn facilities; it may stop
limits it approved but has not released, cut them, or raise its margin and fees. Every
scenario now estimates that stance with a lender factor (activity credit sensitivity,
country credit exposure, the scenario's country multiplier): short-term lines cut at
renewal, a share of committed undrawn limits stopped, and margin and fees added to the
short-term facilities repriced at renewal; a term loan keeps its contract price.

The 51 review cases stay within the reviewer's ranges; CA14 reads one notch lower in
the oil price collapse.

Co-Authored-By: Claude Opus 5.5 <noreply@anthropic.com>
Claude-Session: https://claude.ai/code/session_012HHcRrzuvMBTL2FYxXtsyv
</commit_message>
<xml_diff>
--- a/treasury-platform/docs/31-OWNER-DECISIONS.docx
+++ b/treasury-platform/docs/31-OWNER-DECISIONS.docx
@@ -6790,6 +6790,183 @@
               </w:rPr>
               <w:t xml:space="preserve">O-03، O-05، O-06، O-07؛ </w:t>
             </w:r>
+            <w:r>
+              <w:rPr>
+                <w:rFonts w:ascii="Courier New" w:cs="Courier New" w:eastAsia="Courier New" w:hAnsi="Courier New"/>
+                <w:b w:val="false"/>
+                <w:bCs w:val="false"/>
+                <w:color w:val="1F2937"/>
+                <w:sz w:val="16"/>
+                <w:szCs w:val="16"/>
+                <w:shd w:fill="F1F3F5" w:color="auto" w:val="clear"/>
+                <w:rtl/>
+              </w:rPr>
+              <w:t xml:space="preserve">‎docs/35‎</w:t>
+            </w:r>
+            <w:r>
+              <w:rPr>
+                <w:rFonts w:ascii="Arial" w:cs="Arial" w:eastAsia="Arial" w:hAnsi="Arial"/>
+                <w:b w:val="false"/>
+                <w:bCs w:val="false"/>
+                <w:sz w:val="18"/>
+                <w:szCs w:val="18"/>
+                <w:rtl/>
+              </w:rPr>
+              <w:t xml:space="preserve"> §14؛ ADR 0020</w:t>
+            </w:r>
+          </w:p>
+        </w:tc>
+      </w:tr>
+      <w:tr>
+        <w:trPr>
+          <w:cantSplit/>
+        </w:trPr>
+        <w:tc>
+          <w:tcPr>
+            <w:tcW w:type="dxa" w:w="944"/>
+            <w:tcBorders>
+              <w:top w:val="single" w:color="BFC9D6" w:sz="4"/>
+              <w:left w:val="single" w:color="BFC9D6" w:sz="4"/>
+              <w:bottom w:val="single" w:color="BFC9D6" w:sz="4"/>
+              <w:right w:val="single" w:color="BFC9D6" w:sz="4"/>
+            </w:tcBorders>
+            <w:shd w:fill="F5F8FC" w:color="auto" w:val="clear"/>
+            <w:tcMar>
+              <w:top w:type="dxa" w:w="50"/>
+              <w:left w:type="dxa" w:w="90"/>
+              <w:bottom w:type="dxa" w:w="50"/>
+              <w:right w:type="dxa" w:w="90"/>
+            </w:tcMar>
+            <w:vAlign w:val="top"/>
+          </w:tcPr>
+          <w:p>
+            <w:pPr>
+              <w:keepNext w:val="false"/>
+              <w:bidi/>
+              <w:spacing w:after="30" w:before="30" w:line="264"/>
+            </w:pPr>
+            <w:r>
+              <w:rPr>
+                <w:rFonts w:ascii="Arial" w:cs="Arial" w:eastAsia="Arial" w:hAnsi="Arial"/>
+                <w:b w:val="false"/>
+                <w:bCs w:val="false"/>
+                <w:sz w:val="18"/>
+                <w:szCs w:val="18"/>
+                <w:rtl/>
+              </w:rPr>
+              <w:t xml:space="preserve">32</w:t>
+            </w:r>
+          </w:p>
+        </w:tc>
+        <w:tc>
+          <w:tcPr>
+            <w:tcW w:type="dxa" w:w="2727"/>
+            <w:tcBorders>
+              <w:top w:val="single" w:color="BFC9D6" w:sz="4"/>
+              <w:left w:val="single" w:color="BFC9D6" w:sz="4"/>
+              <w:bottom w:val="single" w:color="BFC9D6" w:sz="4"/>
+              <w:right w:val="single" w:color="BFC9D6" w:sz="4"/>
+            </w:tcBorders>
+            <w:shd w:fill="F5F8FC" w:color="auto" w:val="clear"/>
+            <w:tcMar>
+              <w:top w:type="dxa" w:w="50"/>
+              <w:left w:type="dxa" w:w="90"/>
+              <w:bottom w:type="dxa" w:w="50"/>
+              <w:right w:type="dxa" w:w="90"/>
+            </w:tcMar>
+            <w:vAlign w:val="top"/>
+          </w:tcPr>
+          <w:p>
+            <w:pPr>
+              <w:keepNext w:val="false"/>
+              <w:bidi/>
+              <w:spacing w:after="30" w:before="30" w:line="264"/>
+            </w:pPr>
+            <w:r>
+              <w:rPr>
+                <w:rFonts w:ascii="Arial" w:cs="Arial" w:eastAsia="Arial" w:hAnsi="Arial"/>
+                <w:b/>
+                <w:bCs/>
+                <w:sz w:val="18"/>
+                <w:szCs w:val="18"/>
+                <w:rtl/>
+              </w:rPr>
+              <w:t xml:space="preserve">موقف البنك من التسهيلات في الأزمات (2026-10-19).</w:t>
+            </w:r>
+            <w:r>
+              <w:rPr>
+                <w:rFonts w:ascii="Arial" w:cs="Arial" w:eastAsia="Arial" w:hAnsi="Arial"/>
+                <w:b w:val="false"/>
+                <w:bCs w:val="false"/>
+                <w:sz w:val="18"/>
+                <w:szCs w:val="18"/>
+                <w:rtl/>
+              </w:rPr>
+              <w:t xml:space="preserve"> البنك الذي يرى مخاطر مرتفعة قد لا يسحب التسهيلات أو الحدود، لكنه يعود إلى الموافقات النهائية: إن أُطلقت الحدود فله أن يوقفها، وقد يوقفها إن ارتفعت مخاطر قطاع معين أو يخفضها أو يرفع التسعير والمصاريف الإدارية؛ وكل ذلك يخضع لمعايير الجهة المانحة وتقديراتها</w:t>
+            </w:r>
+          </w:p>
+        </w:tc>
+        <w:tc>
+          <w:tcPr>
+            <w:tcW w:type="dxa" w:w="4491"/>
+            <w:tcBorders>
+              <w:top w:val="single" w:color="BFC9D6" w:sz="4"/>
+              <w:left w:val="single" w:color="BFC9D6" w:sz="4"/>
+              <w:bottom w:val="single" w:color="BFC9D6" w:sz="4"/>
+              <w:right w:val="single" w:color="BFC9D6" w:sz="4"/>
+            </w:tcBorders>
+            <w:shd w:fill="F5F8FC" w:color="auto" w:val="clear"/>
+            <w:tcMar>
+              <w:top w:type="dxa" w:w="50"/>
+              <w:left w:type="dxa" w:w="90"/>
+              <w:bottom w:type="dxa" w:w="50"/>
+              <w:right w:type="dxa" w:w="90"/>
+            </w:tcMar>
+            <w:vAlign w:val="top"/>
+          </w:tcPr>
+          <w:p>
+            <w:pPr>
+              <w:keepNext w:val="false"/>
+              <w:bidi/>
+              <w:spacing w:after="30" w:before="30" w:line="264"/>
+            </w:pPr>
+            <w:r>
+              <w:rPr>
+                <w:rFonts w:ascii="Arial" w:cs="Arial" w:eastAsia="Arial" w:hAnsi="Arial"/>
+                <w:b w:val="false"/>
+                <w:bCs w:val="false"/>
+                <w:sz w:val="18"/>
+                <w:szCs w:val="18"/>
+                <w:rtl/>
+              </w:rPr>
+              <w:t xml:space="preserve">في السيناريوهات السبعة كلها (ADR 0020): لا تُسحب الخطوط المستعملة؛ تُخفض الخطوط قصيرة الأجل عند تجديدها، وتُوقف نسبة من الحدود الملتزمة غير المسحوبة، ويُضاف هامش ورسوم على التسهيلات قصيرة الأجل عند تجديدها، كلها بعامل البنك من مخاطر القطاع وتعرض البلد؛ والقرض طويل الأجل يبقى بسعر عقده. وهي تقدير للتقييم لا قرار البنك الفعلي. بقيت حالات المراجعة الـ51 في مداها</w:t>
+            </w:r>
+          </w:p>
+        </w:tc>
+        <w:tc>
+          <w:tcPr>
+            <w:tcW w:type="dxa" w:w="1702"/>
+            <w:tcBorders>
+              <w:top w:val="single" w:color="BFC9D6" w:sz="4"/>
+              <w:left w:val="single" w:color="BFC9D6" w:sz="4"/>
+              <w:bottom w:val="single" w:color="BFC9D6" w:sz="4"/>
+              <w:right w:val="single" w:color="BFC9D6" w:sz="4"/>
+            </w:tcBorders>
+            <w:shd w:fill="F5F8FC" w:color="auto" w:val="clear"/>
+            <w:tcMar>
+              <w:top w:type="dxa" w:w="50"/>
+              <w:left w:type="dxa" w:w="90"/>
+              <w:bottom w:type="dxa" w:w="50"/>
+              <w:right w:type="dxa" w:w="90"/>
+            </w:tcMar>
+            <w:vAlign w:val="top"/>
+          </w:tcPr>
+          <w:p>
+            <w:pPr>
+              <w:keepNext w:val="false"/>
+              <w:bidi/>
+              <w:spacing w:after="30" w:before="30" w:line="264"/>
+            </w:pPr>
             <w:r>
               <w:rPr>
                 <w:rFonts w:ascii="Courier New" w:cs="Courier New" w:eastAsia="Courier New" w:hAnsi="Courier New"/>

</xml_diff>

<commit_message>
Record the lender's actual decision on each facility (owner's decision 33)
fac.FacilityLenderDecision holds a lender's decision on a facility with its date,
effective date and source stamp: keep it, stop the undrawn limit, reduce the limit,
or not renew it, and any change of margin and fees. The credit assessment reads the
latest decision effective on its date in place of the estimate for that facility: the
decided limit in liquidity, the amount drawn above it as due, and the new margin and
fees in the scenarios; the estimate of the lender's stance covers the other
facilities only. The facility snapshot keeps the decision (ADR 0021).

Tests: CA17 through the tables (five cases) and engine case V20 (142 cases);
RF18 and the review fix check count the new source text column.

Co-Authored-By: Claude Opus 5.5 <noreply@anthropic.com>
Claude-Session: https://claude.ai/code/session_012HHcRrzuvMBTL2FYxXtsyv
</commit_message>
<xml_diff>
--- a/treasury-platform/docs/31-OWNER-DECISIONS.docx
+++ b/treasury-platform/docs/31-OWNER-DECISIONS.docx
@@ -6990,6 +6990,203 @@
                 <w:rtl/>
               </w:rPr>
               <w:t xml:space="preserve"> §14؛ ADR 0020</w:t>
+            </w:r>
+          </w:p>
+        </w:tc>
+      </w:tr>
+      <w:tr>
+        <w:trPr>
+          <w:cantSplit/>
+        </w:trPr>
+        <w:tc>
+          <w:tcPr>
+            <w:tcW w:type="dxa" w:w="944"/>
+            <w:tcBorders>
+              <w:top w:val="single" w:color="BFC9D6" w:sz="4"/>
+              <w:left w:val="single" w:color="BFC9D6" w:sz="4"/>
+              <w:bottom w:val="single" w:color="BFC9D6" w:sz="4"/>
+              <w:right w:val="single" w:color="BFC9D6" w:sz="4"/>
+            </w:tcBorders>
+            <w:tcMar>
+              <w:top w:type="dxa" w:w="50"/>
+              <w:left w:type="dxa" w:w="90"/>
+              <w:bottom w:type="dxa" w:w="50"/>
+              <w:right w:type="dxa" w:w="90"/>
+            </w:tcMar>
+            <w:vAlign w:val="top"/>
+          </w:tcPr>
+          <w:p>
+            <w:pPr>
+              <w:keepNext w:val="false"/>
+              <w:bidi/>
+              <w:spacing w:after="30" w:before="30" w:line="264"/>
+            </w:pPr>
+            <w:r>
+              <w:rPr>
+                <w:rFonts w:ascii="Arial" w:cs="Arial" w:eastAsia="Arial" w:hAnsi="Arial"/>
+                <w:b w:val="false"/>
+                <w:bCs w:val="false"/>
+                <w:sz w:val="18"/>
+                <w:szCs w:val="18"/>
+                <w:rtl/>
+              </w:rPr>
+              <w:t xml:space="preserve">33</w:t>
+            </w:r>
+          </w:p>
+        </w:tc>
+        <w:tc>
+          <w:tcPr>
+            <w:tcW w:type="dxa" w:w="2727"/>
+            <w:tcBorders>
+              <w:top w:val="single" w:color="BFC9D6" w:sz="4"/>
+              <w:left w:val="single" w:color="BFC9D6" w:sz="4"/>
+              <w:bottom w:val="single" w:color="BFC9D6" w:sz="4"/>
+              <w:right w:val="single" w:color="BFC9D6" w:sz="4"/>
+            </w:tcBorders>
+            <w:tcMar>
+              <w:top w:type="dxa" w:w="50"/>
+              <w:left w:type="dxa" w:w="90"/>
+              <w:bottom w:type="dxa" w:w="50"/>
+              <w:right w:type="dxa" w:w="90"/>
+            </w:tcMar>
+            <w:vAlign w:val="top"/>
+          </w:tcPr>
+          <w:p>
+            <w:pPr>
+              <w:keepNext w:val="false"/>
+              <w:bidi/>
+              <w:spacing w:after="30" w:before="30" w:line="264"/>
+            </w:pPr>
+            <w:r>
+              <w:rPr>
+                <w:rFonts w:ascii="Arial" w:cs="Arial" w:eastAsia="Arial" w:hAnsi="Arial"/>
+                <w:b/>
+                <w:bCs/>
+                <w:sz w:val="18"/>
+                <w:szCs w:val="18"/>
+                <w:rtl/>
+              </w:rPr>
+              <w:t xml:space="preserve">إدخال قرار البنك الفعلي لكل تسهيل (2026-10-19).</w:t>
+            </w:r>
+            <w:r>
+              <w:rPr>
+                <w:rFonts w:ascii="Arial" w:cs="Arial" w:eastAsia="Arial" w:hAnsi="Arial"/>
+                <w:b w:val="false"/>
+                <w:bCs w:val="false"/>
+                <w:sz w:val="18"/>
+                <w:szCs w:val="18"/>
+                <w:rtl/>
+              </w:rPr>
+              <w:t xml:space="preserve"> نعم، يُضاف</w:t>
+            </w:r>
+          </w:p>
+        </w:tc>
+        <w:tc>
+          <w:tcPr>
+            <w:tcW w:type="dxa" w:w="4491"/>
+            <w:tcBorders>
+              <w:top w:val="single" w:color="BFC9D6" w:sz="4"/>
+              <w:left w:val="single" w:color="BFC9D6" w:sz="4"/>
+              <w:bottom w:val="single" w:color="BFC9D6" w:sz="4"/>
+              <w:right w:val="single" w:color="BFC9D6" w:sz="4"/>
+            </w:tcBorders>
+            <w:tcMar>
+              <w:top w:type="dxa" w:w="50"/>
+              <w:left w:type="dxa" w:w="90"/>
+              <w:bottom w:type="dxa" w:w="50"/>
+              <w:right w:type="dxa" w:w="90"/>
+            </w:tcMar>
+            <w:vAlign w:val="top"/>
+          </w:tcPr>
+          <w:p>
+            <w:pPr>
+              <w:keepNext w:val="false"/>
+              <w:bidi/>
+              <w:spacing w:after="30" w:before="30" w:line="264"/>
+            </w:pPr>
+            <w:r>
+              <w:rPr>
+                <w:rFonts w:ascii="Courier New" w:cs="Courier New" w:eastAsia="Courier New" w:hAnsi="Courier New"/>
+                <w:b w:val="false"/>
+                <w:bCs w:val="false"/>
+                <w:color w:val="1F2937"/>
+                <w:sz w:val="16"/>
+                <w:szCs w:val="16"/>
+                <w:shd w:fill="F1F3F5" w:color="auto" w:val="clear"/>
+                <w:rtl/>
+              </w:rPr>
+              <w:t xml:space="preserve">‎fac.FacilityLenderDecision‎</w:t>
+            </w:r>
+            <w:r>
+              <w:rPr>
+                <w:rFonts w:ascii="Arial" w:cs="Arial" w:eastAsia="Arial" w:hAnsi="Arial"/>
+                <w:b w:val="false"/>
+                <w:bCs w:val="false"/>
+                <w:sz w:val="18"/>
+                <w:szCs w:val="18"/>
+                <w:rtl/>
+              </w:rPr>
+              <w:t xml:space="preserve"> (ADR 0021): القرار بتاريخه ونفاذه ومستنده (إبقاء، إيقاف الحد غير المسحوب، تخفيض الحد، عدم تجديد، وتغيّر الهامش والرسوم)؛ وآخر قرار نافذ يحل محل التقدير لذلك التسهيل في السيولة والسيناريوهات، والمسحوب فوق الحد الجديد مستحق</w:t>
+            </w:r>
+          </w:p>
+        </w:tc>
+        <w:tc>
+          <w:tcPr>
+            <w:tcW w:type="dxa" w:w="1702"/>
+            <w:tcBorders>
+              <w:top w:val="single" w:color="BFC9D6" w:sz="4"/>
+              <w:left w:val="single" w:color="BFC9D6" w:sz="4"/>
+              <w:bottom w:val="single" w:color="BFC9D6" w:sz="4"/>
+              <w:right w:val="single" w:color="BFC9D6" w:sz="4"/>
+            </w:tcBorders>
+            <w:tcMar>
+              <w:top w:type="dxa" w:w="50"/>
+              <w:left w:type="dxa" w:w="90"/>
+              <w:bottom w:type="dxa" w:w="50"/>
+              <w:right w:type="dxa" w:w="90"/>
+            </w:tcMar>
+            <w:vAlign w:val="top"/>
+          </w:tcPr>
+          <w:p>
+            <w:pPr>
+              <w:keepNext w:val="false"/>
+              <w:bidi/>
+              <w:spacing w:after="30" w:before="30" w:line="264"/>
+            </w:pPr>
+            <w:r>
+              <w:rPr>
+                <w:rFonts w:ascii="Arial" w:cs="Arial" w:eastAsia="Arial" w:hAnsi="Arial"/>
+                <w:b w:val="false"/>
+                <w:bCs w:val="false"/>
+                <w:sz w:val="18"/>
+                <w:szCs w:val="18"/>
+                <w:rtl/>
+              </w:rPr>
+              <w:t xml:space="preserve">FR-FIN-034، BR-FIN-035؛ </w:t>
+            </w:r>
+            <w:r>
+              <w:rPr>
+                <w:rFonts w:ascii="Courier New" w:cs="Courier New" w:eastAsia="Courier New" w:hAnsi="Courier New"/>
+                <w:b w:val="false"/>
+                <w:bCs w:val="false"/>
+                <w:color w:val="1F2937"/>
+                <w:sz w:val="16"/>
+                <w:szCs w:val="16"/>
+                <w:shd w:fill="F1F3F5" w:color="auto" w:val="clear"/>
+                <w:rtl/>
+              </w:rPr>
+              <w:t xml:space="preserve">‎docs/35‎</w:t>
+            </w:r>
+            <w:r>
+              <w:rPr>
+                <w:rFonts w:ascii="Arial" w:cs="Arial" w:eastAsia="Arial" w:hAnsi="Arial"/>
+                <w:b w:val="false"/>
+                <w:bCs w:val="false"/>
+                <w:sz w:val="18"/>
+                <w:szCs w:val="18"/>
+                <w:rtl/>
+              </w:rPr>
+              <w:t xml:space="preserve"> §10</w:t>
             </w:r>
           </w:p>
         </w:tc>

</xml_diff>

<commit_message>
Credit assessment from the company's side: wording (phase A) and the trial assessment (phase B)
The owner approved the study of docs/36 (decision 34): the platform serves companies,
not banks. Phase A rewrites the methodology from the company's side: the preparer of
the assessment instead of the analyst, what the company expects of its lenders in a
crisis, what a lender has notified, and the strength of collateral before a lender.

Phase B (ADR 0022): fin.CreditAssessment.IsTrial. A trial assessment reads a draft,
submitted or approved statement, is computed again as the draft changes, stays a
draft and says so in its summary; its hash also holds the statement's lines and
status. Test CA18 (18 credit assessment tests, 142 engine cases).

Co-Authored-By: Claude Opus 5.5 <noreply@anthropic.com>
Claude-Session: https://claude.ai/code/session_012HHcRrzuvMBTL2FYxXtsyv
</commit_message>
<xml_diff>
--- a/treasury-platform/docs/31-OWNER-DECISIONS.docx
+++ b/treasury-platform/docs/31-OWNER-DECISIONS.docx
@@ -7191,6 +7191,207 @@
           </w:p>
         </w:tc>
       </w:tr>
+      <w:tr>
+        <w:trPr>
+          <w:cantSplit/>
+        </w:trPr>
+        <w:tc>
+          <w:tcPr>
+            <w:tcW w:type="dxa" w:w="944"/>
+            <w:tcBorders>
+              <w:top w:val="single" w:color="BFC9D6" w:sz="4"/>
+              <w:left w:val="single" w:color="BFC9D6" w:sz="4"/>
+              <w:bottom w:val="single" w:color="BFC9D6" w:sz="4"/>
+              <w:right w:val="single" w:color="BFC9D6" w:sz="4"/>
+            </w:tcBorders>
+            <w:shd w:fill="F5F8FC" w:color="auto" w:val="clear"/>
+            <w:tcMar>
+              <w:top w:type="dxa" w:w="50"/>
+              <w:left w:type="dxa" w:w="90"/>
+              <w:bottom w:type="dxa" w:w="50"/>
+              <w:right w:type="dxa" w:w="90"/>
+            </w:tcMar>
+            <w:vAlign w:val="top"/>
+          </w:tcPr>
+          <w:p>
+            <w:pPr>
+              <w:keepNext w:val="false"/>
+              <w:bidi/>
+              <w:spacing w:after="30" w:before="30" w:line="264"/>
+            </w:pPr>
+            <w:r>
+              <w:rPr>
+                <w:rFonts w:ascii="Arial" w:cs="Arial" w:eastAsia="Arial" w:hAnsi="Arial"/>
+                <w:b w:val="false"/>
+                <w:bCs w:val="false"/>
+                <w:sz w:val="18"/>
+                <w:szCs w:val="18"/>
+                <w:rtl/>
+              </w:rPr>
+              <w:t xml:space="preserve">34</w:t>
+            </w:r>
+          </w:p>
+        </w:tc>
+        <w:tc>
+          <w:tcPr>
+            <w:tcW w:type="dxa" w:w="2727"/>
+            <w:tcBorders>
+              <w:top w:val="single" w:color="BFC9D6" w:sz="4"/>
+              <w:left w:val="single" w:color="BFC9D6" w:sz="4"/>
+              <w:bottom w:val="single" w:color="BFC9D6" w:sz="4"/>
+              <w:right w:val="single" w:color="BFC9D6" w:sz="4"/>
+            </w:tcBorders>
+            <w:shd w:fill="F5F8FC" w:color="auto" w:val="clear"/>
+            <w:tcMar>
+              <w:top w:type="dxa" w:w="50"/>
+              <w:left w:type="dxa" w:w="90"/>
+              <w:bottom w:type="dxa" w:w="50"/>
+              <w:right w:type="dxa" w:w="90"/>
+            </w:tcMar>
+            <w:vAlign w:val="top"/>
+          </w:tcPr>
+          <w:p>
+            <w:pPr>
+              <w:keepNext w:val="false"/>
+              <w:bidi/>
+              <w:spacing w:after="30" w:before="30" w:line="264"/>
+            </w:pPr>
+            <w:r>
+              <w:rPr>
+                <w:rFonts w:ascii="Arial" w:cs="Arial" w:eastAsia="Arial" w:hAnsi="Arial"/>
+                <w:b/>
+                <w:bCs/>
+                <w:sz w:val="18"/>
+                <w:szCs w:val="18"/>
+                <w:rtl/>
+              </w:rPr>
+              <w:t xml:space="preserve">النظام للشركة لا للبنك (2026-10-20).</w:t>
+            </w:r>
+            <w:r>
+              <w:rPr>
+                <w:rFonts w:ascii="Arial" w:cs="Arial" w:eastAsia="Arial" w:hAnsi="Arial"/>
+                <w:b w:val="false"/>
+                <w:bCs w:val="false"/>
+                <w:sz w:val="18"/>
+                <w:szCs w:val="18"/>
+                <w:rtl/>
+              </w:rPr>
+              <w:t xml:space="preserve"> تدرس الشركة فيه تقييمها من قوائمها وقوتها ومخاطرها وتسهيلاتها والمؤثرات الخارجية، فتعرف وضعها قبل البنك، وتعيد هيكلة قوائمها وتصنيف عناصرها قبل اعتمادها النهائي. واعتمد المالك مقترحات الدراسة: يعتمد نسخة العرض المختارة شخص من الإدارة المالية غير معدّها، والإنذار المبكر 6 أشهر قبل التجديد واختبار التعهدات وتعدّله كل شركة، وتقييم الموازنة بعد المراحل أ إلى د؛ والبدء بالمرحلتين أ وب</w:t>
+            </w:r>
+          </w:p>
+        </w:tc>
+        <w:tc>
+          <w:tcPr>
+            <w:tcW w:type="dxa" w:w="4491"/>
+            <w:tcBorders>
+              <w:top w:val="single" w:color="BFC9D6" w:sz="4"/>
+              <w:left w:val="single" w:color="BFC9D6" w:sz="4"/>
+              <w:bottom w:val="single" w:color="BFC9D6" w:sz="4"/>
+              <w:right w:val="single" w:color="BFC9D6" w:sz="4"/>
+            </w:tcBorders>
+            <w:shd w:fill="F5F8FC" w:color="auto" w:val="clear"/>
+            <w:tcMar>
+              <w:top w:type="dxa" w:w="50"/>
+              <w:left w:type="dxa" w:w="90"/>
+              <w:bottom w:type="dxa" w:w="50"/>
+              <w:right w:type="dxa" w:w="90"/>
+            </w:tcMar>
+            <w:vAlign w:val="top"/>
+          </w:tcPr>
+          <w:p>
+            <w:pPr>
+              <w:keepNext w:val="false"/>
+              <w:bidi/>
+              <w:spacing w:after="30" w:before="30" w:line="264"/>
+            </w:pPr>
+            <w:r>
+              <w:rPr>
+                <w:rFonts w:ascii="Arial" w:cs="Arial" w:eastAsia="Arial" w:hAnsi="Arial"/>
+                <w:b w:val="false"/>
+                <w:bCs w:val="false"/>
+                <w:sz w:val="18"/>
+                <w:szCs w:val="18"/>
+                <w:rtl/>
+              </w:rPr>
+              <w:t xml:space="preserve">دراسة </w:t>
+            </w:r>
+            <w:r>
+              <w:rPr>
+                <w:rFonts w:ascii="Courier New" w:cs="Courier New" w:eastAsia="Courier New" w:hAnsi="Courier New"/>
+                <w:b w:val="false"/>
+                <w:bCs w:val="false"/>
+                <w:color w:val="1F2937"/>
+                <w:sz w:val="16"/>
+                <w:szCs w:val="16"/>
+                <w:shd w:fill="F1F3F5" w:color="auto" w:val="clear"/>
+                <w:rtl/>
+              </w:rPr>
+              <w:t xml:space="preserve">‎docs/36‎</w:t>
+            </w:r>
+            <w:r>
+              <w:rPr>
+                <w:rFonts w:ascii="Arial" w:cs="Arial" w:eastAsia="Arial" w:hAnsi="Arial"/>
+                <w:b w:val="false"/>
+                <w:bCs w:val="false"/>
+                <w:sz w:val="18"/>
+                <w:szCs w:val="18"/>
+                <w:rtl/>
+              </w:rPr>
+              <w:t xml:space="preserve">. المرحلة أ: صُححت لغة المنهجية إلى منظور الشركة (معدّ التقييم بدل المحلل، وتوقع تصرف جهات التمويل بدل موقف البنك، وما تبلغ به جهة التمويل بدل قرار البنك، وقوة الضمانات أمام جهة التمويل). المرحلة ب: التقييم التجريبي على القوائم قبل اعتمادها (ADR 0022)</w:t>
+            </w:r>
+          </w:p>
+        </w:tc>
+        <w:tc>
+          <w:tcPr>
+            <w:tcW w:type="dxa" w:w="1702"/>
+            <w:tcBorders>
+              <w:top w:val="single" w:color="BFC9D6" w:sz="4"/>
+              <w:left w:val="single" w:color="BFC9D6" w:sz="4"/>
+              <w:bottom w:val="single" w:color="BFC9D6" w:sz="4"/>
+              <w:right w:val="single" w:color="BFC9D6" w:sz="4"/>
+            </w:tcBorders>
+            <w:shd w:fill="F5F8FC" w:color="auto" w:val="clear"/>
+            <w:tcMar>
+              <w:top w:type="dxa" w:w="50"/>
+              <w:left w:type="dxa" w:w="90"/>
+              <w:bottom w:type="dxa" w:w="50"/>
+              <w:right w:type="dxa" w:w="90"/>
+            </w:tcMar>
+            <w:vAlign w:val="top"/>
+          </w:tcPr>
+          <w:p>
+            <w:pPr>
+              <w:keepNext w:val="false"/>
+              <w:bidi/>
+              <w:spacing w:after="30" w:before="30" w:line="264"/>
+            </w:pPr>
+            <w:r>
+              <w:rPr>
+                <w:rFonts w:ascii="Arial" w:cs="Arial" w:eastAsia="Arial" w:hAnsi="Arial"/>
+                <w:b w:val="false"/>
+                <w:bCs w:val="false"/>
+                <w:sz w:val="18"/>
+                <w:szCs w:val="18"/>
+                <w:rtl/>
+              </w:rPr>
+              <w:t xml:space="preserve">FR-FIN-035، BR-FIN-036؛ </w:t>
+            </w:r>
+            <w:r>
+              <w:rPr>
+                <w:rFonts w:ascii="Courier New" w:cs="Courier New" w:eastAsia="Courier New" w:hAnsi="Courier New"/>
+                <w:b w:val="false"/>
+                <w:bCs w:val="false"/>
+                <w:color w:val="1F2937"/>
+                <w:sz w:val="16"/>
+                <w:szCs w:val="16"/>
+                <w:shd w:fill="F1F3F5" w:color="auto" w:val="clear"/>
+                <w:rtl/>
+              </w:rPr>
+              <w:t xml:space="preserve">‎docs/36‎</w:t>
+            </w:r>
+          </w:p>
+        </w:tc>
+      </w:tr>
     </w:tbl>
     <w:p>
       <w:pPr>
@@ -43427,7 +43628,7 @@
         <w:szCs w:val="17"/>
         <w:rtl/>
       </w:rPr>
-      <w:t xml:space="preserve">القرارات المعتمدة من المالك · BankFas · 2026-10-19</w:t>
+      <w:t xml:space="preserve">القرارات المعتمدة من المالك · BankFas · 2026-10-20</w:t>
     </w:r>
   </w:p>
 </w:hdr>

</xml_diff>

<commit_message>
Package of 2026-10-21 (phase 2 S0): docs/33, decisions, Word files
docs/33 describes the application, its CI and ADR 0040, with the new test
counts; Word files rebuilt for docs/20, 31, 33 and the new docs/42.

Co-Authored-By: Claude Opus 5.5 <noreply@anthropic.com>
Claude-Session: https://claude.ai/code/session_012HHcRrzuvMBTL2FYxXtsyv
</commit_message>
<xml_diff>
--- a/treasury-platform/docs/31-OWNER-DECISIONS.docx
+++ b/treasury-platform/docs/31-OWNER-DECISIONS.docx
@@ -271,7 +271,7 @@
                 <w:szCs w:val="18"/>
                 <w:rtl/>
               </w:rPr>
-              <w:t xml:space="preserve">2026-10-12 (آخر تحديث 2026-10-18)</w:t>
+              <w:t xml:space="preserve">2026-10-12 (آخر تحديث 2026-10-21)</w:t>
             </w:r>
           </w:p>
         </w:tc>
@@ -7832,6 +7832,203 @@
                 <w:rtl/>
               </w:rPr>
               <w:t xml:space="preserve"> §6؛ CR1 إلى CR6</w:t>
+            </w:r>
+          </w:p>
+        </w:tc>
+      </w:tr>
+      <w:tr>
+        <w:trPr>
+          <w:cantSplit/>
+        </w:trPr>
+        <w:tc>
+          <w:tcPr>
+            <w:tcW w:type="dxa" w:w="943"/>
+            <w:tcBorders>
+              <w:top w:val="single" w:color="BFC9D6" w:sz="4"/>
+              <w:left w:val="single" w:color="BFC9D6" w:sz="4"/>
+              <w:bottom w:val="single" w:color="BFC9D6" w:sz="4"/>
+              <w:right w:val="single" w:color="BFC9D6" w:sz="4"/>
+            </w:tcBorders>
+            <w:tcMar>
+              <w:top w:type="dxa" w:w="50"/>
+              <w:left w:type="dxa" w:w="90"/>
+              <w:bottom w:type="dxa" w:w="50"/>
+              <w:right w:type="dxa" w:w="90"/>
+            </w:tcMar>
+            <w:vAlign w:val="top"/>
+          </w:tcPr>
+          <w:p>
+            <w:pPr>
+              <w:keepNext w:val="false"/>
+              <w:bidi/>
+              <w:spacing w:after="30" w:before="30" w:line="264"/>
+            </w:pPr>
+            <w:r>
+              <w:rPr>
+                <w:rFonts w:ascii="Arial" w:cs="Arial" w:eastAsia="Arial" w:hAnsi="Arial"/>
+                <w:b w:val="false"/>
+                <w:bCs w:val="false"/>
+                <w:sz w:val="18"/>
+                <w:szCs w:val="18"/>
+                <w:rtl/>
+              </w:rPr>
+              <w:t xml:space="preserve">37</w:t>
+            </w:r>
+          </w:p>
+        </w:tc>
+        <w:tc>
+          <w:tcPr>
+            <w:tcW w:type="dxa" w:w="2636"/>
+            <w:tcBorders>
+              <w:top w:val="single" w:color="BFC9D6" w:sz="4"/>
+              <w:left w:val="single" w:color="BFC9D6" w:sz="4"/>
+              <w:bottom w:val="single" w:color="BFC9D6" w:sz="4"/>
+              <w:right w:val="single" w:color="BFC9D6" w:sz="4"/>
+            </w:tcBorders>
+            <w:tcMar>
+              <w:top w:type="dxa" w:w="50"/>
+              <w:left w:type="dxa" w:w="90"/>
+              <w:bottom w:type="dxa" w:w="50"/>
+              <w:right w:type="dxa" w:w="90"/>
+            </w:tcMar>
+            <w:vAlign w:val="top"/>
+          </w:tcPr>
+          <w:p>
+            <w:pPr>
+              <w:keepNext w:val="false"/>
+              <w:bidi/>
+              <w:spacing w:after="30" w:before="30" w:line="264"/>
+            </w:pPr>
+            <w:r>
+              <w:rPr>
+                <w:rFonts w:ascii="Arial" w:cs="Arial" w:eastAsia="Arial" w:hAnsi="Arial"/>
+                <w:b/>
+                <w:bCs/>
+                <w:sz w:val="18"/>
+                <w:szCs w:val="18"/>
+                <w:rtl/>
+              </w:rPr>
+              <w:t xml:space="preserve">بدء المرحلة الثانية: بناء التطبيق (2026-10-21).</w:t>
+            </w:r>
+            <w:r>
+              <w:rPr>
+                <w:rFonts w:ascii="Arial" w:cs="Arial" w:eastAsia="Arial" w:hAnsi="Arial"/>
+                <w:b w:val="false"/>
+                <w:bCs w:val="false"/>
+                <w:sz w:val="18"/>
+                <w:szCs w:val="18"/>
+                <w:rtl/>
+              </w:rPr>
+              <w:t xml:space="preserve"> الواجهة الأمامية React مع TypeScript، والدفعة الأولى S0 كاملة: الدخول بكلمة المرور وMFA وArgon2id، وربط الجلسة، والمستخدمون والأدوار ونطاق الشركات، والإعدادات والترقيم، وسجل التدقيق، وتهيئة المشترك ولوحة المشغّل، وعامل المهام الخلفية، واختبارات التكامل على قاعدة البيانات الحقيقية وCI؛ ثم S1 وما بعدها بالترتيب. واعتُمدت الافتراضات الموثقة للأسئلة المفتوحة في موجز S0: صفحة محايدة للعنوان الفرعي المجهول وللمشترك المؤرشف فقط (Q-1)، ولوحة المشغّل على </w:t>
+            </w:r>
+            <w:r>
+              <w:rPr>
+                <w:rFonts w:ascii="Courier New" w:cs="Courier New" w:eastAsia="Courier New" w:hAnsi="Courier New"/>
+                <w:b w:val="false"/>
+                <w:bCs w:val="false"/>
+                <w:color w:val="1F2937"/>
+                <w:sz w:val="16"/>
+                <w:szCs w:val="16"/>
+                <w:shd w:fill="F1F3F5" w:color="auto" w:val="clear"/>
+                <w:rtl/>
+              </w:rPr>
+              <w:t xml:space="preserve">‎admin.bankfas.com‎</w:t>
+            </w:r>
+            <w:r>
+              <w:rPr>
+                <w:rFonts w:ascii="Arial" w:cs="Arial" w:eastAsia="Arial" w:hAnsi="Arial"/>
+                <w:b w:val="false"/>
+                <w:bCs w:val="false"/>
+                <w:sz w:val="18"/>
+                <w:szCs w:val="18"/>
+                <w:rtl/>
+              </w:rPr>
+              <w:t xml:space="preserve"> (Q-2)، وجلسات الدعم تُعرض في لوحة المشغّل (Q-3)، ولا يُكتب حدث MFA_VERIFIED في S0 (Q-4)، وقناة إشعار S0 هي البريد وحده (Q-5)؛ ومزوّد مفاتيح محلي للتطوير والاختبار إلى أن يُختار منتج KMS (DQ-S02-1)</w:t>
+            </w:r>
+          </w:p>
+        </w:tc>
+        <w:tc>
+          <w:tcPr>
+            <w:tcW w:type="dxa" w:w="4639"/>
+            <w:tcBorders>
+              <w:top w:val="single" w:color="BFC9D6" w:sz="4"/>
+              <w:left w:val="single" w:color="BFC9D6" w:sz="4"/>
+              <w:bottom w:val="single" w:color="BFC9D6" w:sz="4"/>
+              <w:right w:val="single" w:color="BFC9D6" w:sz="4"/>
+            </w:tcBorders>
+            <w:tcMar>
+              <w:top w:type="dxa" w:w="50"/>
+              <w:left w:type="dxa" w:w="90"/>
+              <w:bottom w:type="dxa" w:w="50"/>
+              <w:right w:type="dxa" w:w="90"/>
+            </w:tcMar>
+            <w:vAlign w:val="top"/>
+          </w:tcPr>
+          <w:p>
+            <w:pPr>
+              <w:keepNext w:val="false"/>
+              <w:bidi/>
+              <w:spacing w:after="30" w:before="30" w:line="264"/>
+            </w:pPr>
+            <w:r>
+              <w:rPr>
+                <w:rFonts w:ascii="Arial" w:cs="Arial" w:eastAsia="Arial" w:hAnsi="Arial"/>
+                <w:b w:val="false"/>
+                <w:bCs w:val="false"/>
+                <w:sz w:val="18"/>
+                <w:szCs w:val="18"/>
+                <w:rtl/>
+              </w:rPr>
+              <w:t xml:space="preserve">الهيكل: .NET 10 (واجهة API وعامل مهام ومكتبتا Core وData) وReact 19 مع TypeScript وVite. ونواة الأمن: Argon2id بصيغة PHC مطابقة للتنفيذ المرجعي، وTOTP بمتجهات RFC 6238، والغلاف AES-256-GCM. وسُدّت ثغرات القاعدة GAP-1 وGAP-2 وGAP-3 وGAP-4 وGAP-7 وGAP-8 وGAP-10 وGAP-13. ومسار الخروج من S0 (AC-PLT-5) يمرّ في اختبار تكامل واحد على القاعدة</w:t>
+            </w:r>
+          </w:p>
+        </w:tc>
+        <w:tc>
+          <w:tcPr>
+            <w:tcW w:type="dxa" w:w="1646"/>
+            <w:tcBorders>
+              <w:top w:val="single" w:color="BFC9D6" w:sz="4"/>
+              <w:left w:val="single" w:color="BFC9D6" w:sz="4"/>
+              <w:bottom w:val="single" w:color="BFC9D6" w:sz="4"/>
+              <w:right w:val="single" w:color="BFC9D6" w:sz="4"/>
+            </w:tcBorders>
+            <w:tcMar>
+              <w:top w:type="dxa" w:w="50"/>
+              <w:left w:type="dxa" w:w="90"/>
+              <w:bottom w:type="dxa" w:w="50"/>
+              <w:right w:type="dxa" w:w="90"/>
+            </w:tcMar>
+            <w:vAlign w:val="top"/>
+          </w:tcPr>
+          <w:p>
+            <w:pPr>
+              <w:keepNext w:val="false"/>
+              <w:bidi/>
+              <w:spacing w:after="30" w:before="30" w:line="264"/>
+            </w:pPr>
+            <w:r>
+              <w:rPr>
+                <w:rFonts w:ascii="Arial" w:cs="Arial" w:eastAsia="Arial" w:hAnsi="Arial"/>
+                <w:b w:val="false"/>
+                <w:bCs w:val="false"/>
+                <w:sz w:val="18"/>
+                <w:szCs w:val="18"/>
+                <w:rtl/>
+              </w:rPr>
+              <w:t xml:space="preserve">ADR 0040؛ </w:t>
+            </w:r>
+            <w:r>
+              <w:rPr>
+                <w:rFonts w:ascii="Courier New" w:cs="Courier New" w:eastAsia="Courier New" w:hAnsi="Courier New"/>
+                <w:b w:val="false"/>
+                <w:bCs w:val="false"/>
+                <w:color w:val="1F2937"/>
+                <w:sz w:val="16"/>
+                <w:szCs w:val="16"/>
+                <w:shd w:fill="F1F3F5" w:color="auto" w:val="clear"/>
+                <w:rtl/>
+              </w:rPr>
+              <w:t xml:space="preserve">‎docs/42‎</w:t>
             </w:r>
           </w:p>
         </w:tc>

</xml_diff>

<commit_message>
S1-F: the S1 exit path, the browser flow and the S1 documents
- ExitPathTests: AC-ORG-6 end to end (documents from the company and the
  register, a tenant document type used at once, one alert at 30 days however
  often the job runs, the renewal restarting the thresholds).
- The browser test goes on from the S0 path: a company, then a bank with the
  set-up wizard, whose review warns of the product without a default contact.
- Wizard: accessible names on the matrix; warnings shown in words.
- docs/43 (S1 build report, Arabic) and its Word file; ADR 0041; docs/31 row
  38 with the S1 defaults awaiting the owner; docs/33 and DOC-B01 updated.

Co-Authored-By: Claude Opus 5.5 <noreply@anthropic.com>
Claude-Session: https://claude.ai/code/session_012HHcRrzuvMBTL2FYxXtsyv
</commit_message>
<xml_diff>
--- a/treasury-platform/docs/31-OWNER-DECISIONS.docx
+++ b/treasury-platform/docs/31-OWNER-DECISIONS.docx
@@ -271,7 +271,7 @@
                 <w:szCs w:val="18"/>
                 <w:rtl/>
               </w:rPr>
-              <w:t xml:space="preserve">2026-10-12 (آخر تحديث 2026-10-21)</w:t>
+              <w:t xml:space="preserve">2026-10-12 (آخر تحديث 2026-10-22)</w:t>
             </w:r>
           </w:p>
         </w:tc>
@@ -8033,6 +8033,229 @@
           </w:p>
         </w:tc>
       </w:tr>
+      <w:tr>
+        <w:trPr>
+          <w:cantSplit/>
+        </w:trPr>
+        <w:tc>
+          <w:tcPr>
+            <w:tcW w:type="dxa" w:w="943"/>
+            <w:tcBorders>
+              <w:top w:val="single" w:color="BFC9D6" w:sz="4"/>
+              <w:left w:val="single" w:color="BFC9D6" w:sz="4"/>
+              <w:bottom w:val="single" w:color="BFC9D6" w:sz="4"/>
+              <w:right w:val="single" w:color="BFC9D6" w:sz="4"/>
+            </w:tcBorders>
+            <w:shd w:fill="F5F8FC" w:color="auto" w:val="clear"/>
+            <w:tcMar>
+              <w:top w:type="dxa" w:w="50"/>
+              <w:left w:type="dxa" w:w="90"/>
+              <w:bottom w:type="dxa" w:w="50"/>
+              <w:right w:type="dxa" w:w="90"/>
+            </w:tcMar>
+            <w:vAlign w:val="top"/>
+          </w:tcPr>
+          <w:p>
+            <w:pPr>
+              <w:keepNext w:val="false"/>
+              <w:bidi/>
+              <w:spacing w:after="30" w:before="30" w:line="264"/>
+            </w:pPr>
+            <w:r>
+              <w:rPr>
+                <w:rFonts w:ascii="Arial" w:cs="Arial" w:eastAsia="Arial" w:hAnsi="Arial"/>
+                <w:b w:val="false"/>
+                <w:bCs w:val="false"/>
+                <w:sz w:val="18"/>
+                <w:szCs w:val="18"/>
+                <w:rtl/>
+              </w:rPr>
+              <w:t xml:space="preserve">38</w:t>
+            </w:r>
+          </w:p>
+        </w:tc>
+        <w:tc>
+          <w:tcPr>
+            <w:tcW w:type="dxa" w:w="2636"/>
+            <w:tcBorders>
+              <w:top w:val="single" w:color="BFC9D6" w:sz="4"/>
+              <w:left w:val="single" w:color="BFC9D6" w:sz="4"/>
+              <w:bottom w:val="single" w:color="BFC9D6" w:sz="4"/>
+              <w:right w:val="single" w:color="BFC9D6" w:sz="4"/>
+            </w:tcBorders>
+            <w:shd w:fill="F5F8FC" w:color="auto" w:val="clear"/>
+            <w:tcMar>
+              <w:top w:type="dxa" w:w="50"/>
+              <w:left w:type="dxa" w:w="90"/>
+              <w:bottom w:type="dxa" w:w="50"/>
+              <w:right w:type="dxa" w:w="90"/>
+            </w:tcMar>
+            <w:vAlign w:val="top"/>
+          </w:tcPr>
+          <w:p>
+            <w:pPr>
+              <w:keepNext w:val="false"/>
+              <w:bidi/>
+              <w:spacing w:after="30" w:before="30" w:line="264"/>
+            </w:pPr>
+            <w:r>
+              <w:rPr>
+                <w:rFonts w:ascii="Arial" w:cs="Arial" w:eastAsia="Arial" w:hAnsi="Arial"/>
+                <w:b/>
+                <w:bCs/>
+                <w:sz w:val="18"/>
+                <w:szCs w:val="18"/>
+                <w:rtl/>
+              </w:rPr>
+              <w:t xml:space="preserve">بناء الشريحة S1 (2026-10-22).</w:t>
+            </w:r>
+            <w:r>
+              <w:rPr>
+                <w:rFonts w:ascii="Arial" w:cs="Arial" w:eastAsia="Arial" w:hAnsi="Arial"/>
+                <w:b w:val="false"/>
+                <w:bCs w:val="false"/>
+                <w:sz w:val="18"/>
+                <w:szCs w:val="18"/>
+                <w:rtl/>
+              </w:rPr>
+              <w:t xml:space="preserve"> «ابدأ ببناء S1»، ثم «تابع البناء بعد انتهاء الدراسة». بُنيت على افتراضات الموجز للأسئلة المفتوحة، وهي </w:t>
+            </w:r>
+            <w:r>
+              <w:rPr>
+                <w:rFonts w:ascii="Arial" w:cs="Arial" w:eastAsia="Arial" w:hAnsi="Arial"/>
+                <w:b/>
+                <w:bCs/>
+                <w:sz w:val="18"/>
+                <w:szCs w:val="18"/>
+                <w:rtl/>
+              </w:rPr>
+              <w:t xml:space="preserve">تنتظر تأكيدك</w:t>
+            </w:r>
+            <w:r>
+              <w:rPr>
+                <w:rFonts w:ascii="Arial" w:cs="Arial" w:eastAsia="Arial" w:hAnsi="Arial"/>
+                <w:b w:val="false"/>
+                <w:bCs w:val="false"/>
+                <w:sz w:val="18"/>
+                <w:szCs w:val="18"/>
+                <w:rtl/>
+              </w:rPr>
+              <w:t xml:space="preserve">: فاحص ClamAV (OQ-1)، ورمز الطرف </w:t>
+            </w:r>
+            <w:r>
+              <w:rPr>
+                <w:rFonts w:ascii="Courier New" w:cs="Courier New" w:eastAsia="Courier New" w:hAnsi="Courier New"/>
+                <w:b w:val="false"/>
+                <w:bCs w:val="false"/>
+                <w:color w:val="1F2937"/>
+                <w:sz w:val="16"/>
+                <w:szCs w:val="16"/>
+                <w:shd w:fill="F1F3F5" w:color="auto" w:val="clear"/>
+                <w:rtl/>
+              </w:rPr>
+              <w:t xml:space="preserve">‎P{seq:000000}‎</w:t>
+            </w:r>
+            <w:r>
+              <w:rPr>
+                <w:rFonts w:ascii="Arial" w:cs="Arial" w:eastAsia="Arial" w:hAnsi="Arial"/>
+                <w:b w:val="false"/>
+                <w:bCs w:val="false"/>
+                <w:sz w:val="18"/>
+                <w:szCs w:val="18"/>
+                <w:rtl/>
+              </w:rPr>
+              <w:t xml:space="preserve"> (OQ-2)، وقاعدة انتهاء لكل نوع عام (OQ-3)، والبحث برقم الهوية بالنوع والدولة (OQ-4)، ومزامنة أسماء الجهة المرآة فقط (OQ-6)، وبلا صور مصغّرة (OQ-7)، وفئات التدقيق (OQ-8)، والمنشئ يضعه التطبيق (S1-GAP-12)، وكشف رقم الحساب حدث تدقيق (S1-GAP-15)، والتفضيل فوري أو متوقف إلى أن تُبنى الملخصات</w:t>
+            </w:r>
+          </w:p>
+        </w:tc>
+        <w:tc>
+          <w:tcPr>
+            <w:tcW w:type="dxa" w:w="4639"/>
+            <w:tcBorders>
+              <w:top w:val="single" w:color="BFC9D6" w:sz="4"/>
+              <w:left w:val="single" w:color="BFC9D6" w:sz="4"/>
+              <w:bottom w:val="single" w:color="BFC9D6" w:sz="4"/>
+              <w:right w:val="single" w:color="BFC9D6" w:sz="4"/>
+            </w:tcBorders>
+            <w:shd w:fill="F5F8FC" w:color="auto" w:val="clear"/>
+            <w:tcMar>
+              <w:top w:type="dxa" w:w="50"/>
+              <w:left w:type="dxa" w:w="90"/>
+              <w:bottom w:type="dxa" w:w="50"/>
+              <w:right w:type="dxa" w:w="90"/>
+            </w:tcMar>
+            <w:vAlign w:val="top"/>
+          </w:tcPr>
+          <w:p>
+            <w:pPr>
+              <w:keepNext w:val="false"/>
+              <w:bidi/>
+              <w:spacing w:after="30" w:before="30" w:line="264"/>
+            </w:pPr>
+            <w:r>
+              <w:rPr>
+                <w:rFonts w:ascii="Arial" w:cs="Arial" w:eastAsia="Arial" w:hAnsi="Arial"/>
+                <w:b w:val="false"/>
+                <w:bCs w:val="false"/>
+                <w:sz w:val="18"/>
+                <w:szCs w:val="18"/>
+                <w:rtl/>
+              </w:rPr>
+              <w:t xml:space="preserve">الكتالوجات وحزمها، ومخزن المستندات، والشركات، والأطراف، والبنوك والعلاقات ومعالج البنك، والحسابات، وأسعار الأساس، والإشعارات وتنبيهات الانتهاء والأحداث الأمنية، وحزمة NTF.BASE الإصدار 2. ومسارا الخروج AC-INS-1 وAC-ORG-6 يمرّان في اختبارات التكامل وفي المتصفح</w:t>
+            </w:r>
+          </w:p>
+        </w:tc>
+        <w:tc>
+          <w:tcPr>
+            <w:tcW w:type="dxa" w:w="1646"/>
+            <w:tcBorders>
+              <w:top w:val="single" w:color="BFC9D6" w:sz="4"/>
+              <w:left w:val="single" w:color="BFC9D6" w:sz="4"/>
+              <w:bottom w:val="single" w:color="BFC9D6" w:sz="4"/>
+              <w:right w:val="single" w:color="BFC9D6" w:sz="4"/>
+            </w:tcBorders>
+            <w:shd w:fill="F5F8FC" w:color="auto" w:val="clear"/>
+            <w:tcMar>
+              <w:top w:type="dxa" w:w="50"/>
+              <w:left w:type="dxa" w:w="90"/>
+              <w:bottom w:type="dxa" w:w="50"/>
+              <w:right w:type="dxa" w:w="90"/>
+            </w:tcMar>
+            <w:vAlign w:val="top"/>
+          </w:tcPr>
+          <w:p>
+            <w:pPr>
+              <w:keepNext w:val="false"/>
+              <w:bidi/>
+              <w:spacing w:after="30" w:before="30" w:line="264"/>
+            </w:pPr>
+            <w:r>
+              <w:rPr>
+                <w:rFonts w:ascii="Arial" w:cs="Arial" w:eastAsia="Arial" w:hAnsi="Arial"/>
+                <w:b w:val="false"/>
+                <w:bCs w:val="false"/>
+                <w:sz w:val="18"/>
+                <w:szCs w:val="18"/>
+                <w:rtl/>
+              </w:rPr>
+              <w:t xml:space="preserve">ADR 0041؛ </w:t>
+            </w:r>
+            <w:r>
+              <w:rPr>
+                <w:rFonts w:ascii="Courier New" w:cs="Courier New" w:eastAsia="Courier New" w:hAnsi="Courier New"/>
+                <w:b w:val="false"/>
+                <w:bCs w:val="false"/>
+                <w:color w:val="1F2937"/>
+                <w:sz w:val="16"/>
+                <w:szCs w:val="16"/>
+                <w:shd w:fill="F1F3F5" w:color="auto" w:val="clear"/>
+                <w:rtl/>
+              </w:rPr>
+              <w:t xml:space="preserve">‎docs/43‎</w:t>
+            </w:r>
+          </w:p>
+        </w:tc>
+      </w:tr>
     </w:tbl>
     <w:p>
       <w:pPr>
@@ -44289,7 +44512,7 @@
         <w:szCs w:val="17"/>
         <w:rtl/>
       </w:rPr>
-      <w:t xml:space="preserve">القرارات المعتمدة من المالك · BankFas · 2026-10-21</w:t>
+      <w:t xml:space="preserve">القرارات المعتمدة من المالك · BankFas · 2026-10-22</w:t>
     </w:r>
   </w:p>
 </w:hdr>

</xml_diff>

<commit_message>
The owner approves the S1 defaults (docs/31 row 38, docs/43, ADR 0041)
Co-Authored-By: Claude Opus 5.5 <noreply@anthropic.com>
Claude-Session: https://claude.ai/code/session_012HHcRrzuvMBTL2FYxXtsyv
</commit_message>
<xml_diff>
--- a/treasury-platform/docs/31-OWNER-DECISIONS.docx
+++ b/treasury-platform/docs/31-OWNER-DECISIONS.docx
@@ -8118,7 +8118,7 @@
                 <w:szCs w:val="18"/>
                 <w:rtl/>
               </w:rPr>
-              <w:t xml:space="preserve"> «ابدأ ببناء S1»، ثم «تابع البناء بعد انتهاء الدراسة». بُنيت على افتراضات الموجز للأسئلة المفتوحة، وهي </w:t>
+              <w:t xml:space="preserve"> «ابدأ ببناء S1»، ثم «تابع البناء بعد انتهاء الدراسة». بُنيت على افتراضات الموجز للأسئلة المفتوحة، و</w:t>
             </w:r>
             <w:r>
               <w:rPr>
@@ -8129,18 +8129,18 @@
                 <w:szCs w:val="18"/>
                 <w:rtl/>
               </w:rPr>
-              <w:t xml:space="preserve">تنتظر تأكيدك</w:t>
-            </w:r>
-            <w:r>
-              <w:rPr>
-                <w:rFonts w:ascii="Arial" w:cs="Arial" w:eastAsia="Arial" w:hAnsi="Arial"/>
-                <w:b w:val="false"/>
-                <w:bCs w:val="false"/>
-                <w:sz w:val="18"/>
-                <w:szCs w:val="18"/>
-                <w:rtl/>
-              </w:rPr>
-              <w:t xml:space="preserve">: فاحص ClamAV (OQ-1)، ورمز الطرف </w:t>
+              <w:t xml:space="preserve">اعتمدها المالك في 2026-10-22</w:t>
+            </w:r>
+            <w:r>
+              <w:rPr>
+                <w:rFonts w:ascii="Arial" w:cs="Arial" w:eastAsia="Arial" w:hAnsi="Arial"/>
+                <w:b w:val="false"/>
+                <w:bCs w:val="false"/>
+                <w:sz w:val="18"/>
+                <w:szCs w:val="18"/>
+                <w:rtl/>
+              </w:rPr>
+              <w:t xml:space="preserve"> مع طلب بدء S1-ب: فاحص ClamAV (OQ-1)، ورمز الطرف </w:t>
             </w:r>
             <w:r>
               <w:rPr>

</xml_diff>

<commit_message>
The owner approves four S1-b defaults: OQ-6, OQ-9, OQ-10, OQ-16
Recorded in docs/31 row 39, docs/44 section 4 (with the status of each default) and ADR 0042;
the other fifteen defaults still wait for approval. Word files regenerated.

Co-Authored-By: Claude Opus 5.5 <noreply@anthropic.com>
Claude-Session: https://claude.ai/code/session_012HHcRrzuvMBTL2FYxXtsyv
</commit_message>
<xml_diff>
--- a/treasury-platform/docs/31-OWNER-DECISIONS.docx
+++ b/treasury-platform/docs/31-OWNER-DECISIONS.docx
@@ -8339,7 +8339,7 @@
                 <w:szCs w:val="18"/>
                 <w:rtl/>
               </w:rPr>
-              <w:t xml:space="preserve"> «أعتمد الافتراضات وابدأ ببناء S1-ب»، ثم «تابع البناء بعد انتهاء الدراسة». بُنيت على افتراضات موجز S1-ب للأسئلة OQ-1 إلى OQ-19، وهي </w:t>
+              <w:t xml:space="preserve"> «أعتمد الافتراضات وابدأ ببناء S1-ب»، ثم «تابع البناء بعد انتهاء الدراسة». بُنيت على افتراضات موجز S1-ب للأسئلة OQ-1 إلى OQ-19. </w:t>
             </w:r>
             <w:r>
               <w:rPr>
@@ -8350,18 +8350,40 @@
                 <w:szCs w:val="18"/>
                 <w:rtl/>
               </w:rPr>
-              <w:t xml:space="preserve">بانتظار اعتماد المالك</w:t>
-            </w:r>
-            <w:r>
-              <w:rPr>
-                <w:rFonts w:ascii="Arial" w:cs="Arial" w:eastAsia="Arial" w:hAnsi="Arial"/>
-                <w:b w:val="false"/>
-                <w:bCs w:val="false"/>
-                <w:sz w:val="18"/>
-                <w:szCs w:val="18"/>
-                <w:rtl/>
-              </w:rPr>
-              <w:t xml:space="preserve">: معنى نسبة المسار غير المباشر (OQ-1)، والتصحيح الرجعي بالصلاحية القائمة وسبب (OQ-2)، وتعريف الشغور (OQ-3)، وإغلاق الهيئة ونقل أعضائها (OQ-4)، ومعنى الممثل (OQ-5)، وتغيير البنك تغيير جوهري (OQ-6)، والبصمة وترتيب الرموز (OQ-7 وOQ-8)، والمنح النافذة وحدها (OQ-9)، وقراءة المدقق (OQ-10)، والإشعار الفوري (OQ-11)، ومسار الخروج (OQ-12)، وقرار المجلس في AC-ACC-4 (OQ-13)، وتفعيل المفوَّض بوثيقة نظيفة (OQ-14)، وموافقة مدير الخزينة على الاستثناء (OQ-15)، وسحب المفوَّضين عند إغلاق العلاقة (OQ-16)، والمستندات الأساسية (OQ-17)، واقتراح المستفيد الحقيقي (OQ-18)، وإخفاء الهيكل عن الطالب (OQ-19)</w:t>
+              <w:t xml:space="preserve">اعتمد المالك في 2026-10-22 أربعة منها:</w:t>
+            </w:r>
+            <w:r>
+              <w:rPr>
+                <w:rFonts w:ascii="Arial" w:cs="Arial" w:eastAsia="Arial" w:hAnsi="Arial"/>
+                <w:b w:val="false"/>
+                <w:bCs w:val="false"/>
+                <w:sz w:val="18"/>
+                <w:szCs w:val="18"/>
+                <w:rtl/>
+              </w:rPr>
+              <w:t xml:space="preserve"> تغيير البنك في منحة نافذة تغيير جوهري (OQ-6)، والمنح النافذة وحدها في المقارنة (OQ-9)، والمدقق يقرأ التعارضات ولا يقرّها (OQ-10)، وإغلاق العلاقة يسحب مفوَّضيها الساريين بعد التأكيد (OQ-16). </w:t>
+            </w:r>
+            <w:r>
+              <w:rPr>
+                <w:rFonts w:ascii="Arial" w:cs="Arial" w:eastAsia="Arial" w:hAnsi="Arial"/>
+                <w:b/>
+                <w:bCs/>
+                <w:sz w:val="18"/>
+                <w:szCs w:val="18"/>
+                <w:rtl/>
+              </w:rPr>
+              <w:t xml:space="preserve">وبقية الافتراضات بانتظار اعتماده:</w:t>
+            </w:r>
+            <w:r>
+              <w:rPr>
+                <w:rFonts w:ascii="Arial" w:cs="Arial" w:eastAsia="Arial" w:hAnsi="Arial"/>
+                <w:b w:val="false"/>
+                <w:bCs w:val="false"/>
+                <w:sz w:val="18"/>
+                <w:szCs w:val="18"/>
+                <w:rtl/>
+              </w:rPr>
+              <w:t xml:space="preserve"> معنى نسبة المسار غير المباشر (OQ-1)، والتصحيح الرجعي بالصلاحية القائمة وسبب (OQ-2)، وتعريف الشغور (OQ-3)، وإغلاق الهيئة ونقل أعضائها (OQ-4)، ومعنى الممثل (OQ-5)، وتغيير البنك تغيير جوهري (OQ-6)، والبصمة وترتيب الرموز (OQ-7 وOQ-8)، والمنح النافذة وحدها (OQ-9)، وقراءة المدقق (OQ-10)، والإشعار الفوري (OQ-11)، ومسار الخروج (OQ-12)، وقرار المجلس في AC-ACC-4 (OQ-13)، وتفعيل المفوَّض بوثيقة نظيفة (OQ-14)، وموافقة مدير الخزينة على الاستثناء (OQ-15)، وسحب المفوَّضين عند إغلاق العلاقة (OQ-16)، والمستندات الأساسية (OQ-17)، واقتراح المستفيد الحقيقي (OQ-18)، وإخفاء الهيكل عن الطالب (OQ-19)</w:t>
             </w:r>
           </w:p>
         </w:tc>

</xml_diff>

<commit_message>
The owner approves the S2 defaults OQ-1 to OQ-17 and the S2-b defaults OQ-1 to OQ-17
Recorded in docs/31 (row 40 for S2, new row 41 for the start of S2-b), docs/45 section 4 (each
default approved on 2026-10-23), ADR 0043 and the DOC-B02 S2 addendum (AC-FAC-11 and AC-FAC-12 are
now Must exit criteria). Word files regenerated.

Co-Authored-By: Claude Opus 5.5 <noreply@anthropic.com>
Claude-Session: https://claude.ai/code/session_012HHcRrzuvMBTL2FYxXtsyv
</commit_message>
<xml_diff>
--- a/treasury-platform/docs/31-OWNER-DECISIONS.docx
+++ b/treasury-platform/docs/31-OWNER-DECISIONS.docx
@@ -8569,18 +8569,18 @@
                 <w:szCs w:val="18"/>
                 <w:rtl/>
               </w:rPr>
-              <w:t xml:space="preserve">وكلها بانتظار اعتماد المالك:</w:t>
-            </w:r>
-            <w:r>
-              <w:rPr>
-                <w:rFonts w:ascii="Arial" w:cs="Arial" w:eastAsia="Arial" w:hAnsi="Arial"/>
-                <w:b w:val="false"/>
-                <w:bCs w:val="false"/>
-                <w:sz w:val="18"/>
-                <w:szCs w:val="18"/>
-                <w:rtl/>
-              </w:rPr>
-              <w:t xml:space="preserve"> اختبار المئة حجز في S2 (OQ-1)، وسنة رقم التسهيل (OQ-2)، وتواريخ الضمانات تنبيهات لا بنود أجندة (OQ-3)، والحالة اليدوية للتعهد الوصفي (OQ-4)، واعتماد قوالب الصيغ باسم النظام (OQ-5)، ومعرفة المحررين من التدقيق لفصل المهام (OQ-6)، وتوليد الأجندة داخل الاعتماد (OQ-7)، وعتبة «يقترب» 90 يومًا (OQ-8)، ومهل التنبيه في التسهيل تغلب (OQ-9)، والاستخدام اليدوي يحذّر ولا يُرفض (OQ-10)، وربط الضمان عبر مراجعة التسهيل (OQ-11)، ومستندات الضمان من أنواع التسهيل أو الطرف (OQ-12)، والمتاح من المعتمد وحده (OQ-13)، وأم القرى (OQ-14)، وموعد استبدال السابق (OQ-15)، وحدود S2 وS2-ب في المخالفات (OQ-16)، ومعايير الخروج (OQ-17). والخروج في DOC-B02 §10 نافذ حين يُعتمد OQ-1 وOQ-17</w:t>
+              <w:t xml:space="preserve">واعتمدها المالك كلها في 2026-10-23 («أعتمد الافتراضات وابدأ»):</w:t>
+            </w:r>
+            <w:r>
+              <w:rPr>
+                <w:rFonts w:ascii="Arial" w:cs="Arial" w:eastAsia="Arial" w:hAnsi="Arial"/>
+                <w:b w:val="false"/>
+                <w:bCs w:val="false"/>
+                <w:sz w:val="18"/>
+                <w:szCs w:val="18"/>
+                <w:rtl/>
+              </w:rPr>
+              <w:t xml:space="preserve"> اختبار المئة حجز في S2 (OQ-1)، وسنة رقم التسهيل (OQ-2)، وتواريخ الضمانات تنبيهات لا بنود أجندة (OQ-3)، والحالة اليدوية للتعهد الوصفي (OQ-4)، واعتماد قوالب الصيغ باسم النظام (OQ-5)، ومعرفة المحررين من التدقيق لفصل المهام (OQ-6)، وتوليد الأجندة داخل الاعتماد (OQ-7)، وعتبة «يقترب» 90 يومًا (OQ-8)، ومهل التنبيه في التسهيل تغلب (OQ-9)، والاستخدام اليدوي يحذّر ولا يُرفض (OQ-10)، وربط الضمان عبر مراجعة التسهيل (OQ-11)، ومستندات الضمان من أنواع التسهيل أو الطرف (OQ-12)، والمتاح من المعتمد وحده (OQ-13)، وأم القرى (OQ-14)، وموعد استبدال السابق (OQ-15)، وحدود S2 وS2-ب في المخالفات (OQ-16)، ومعايير الخروج (OQ-17). فصار الخروج في DOC-B02 §10 نافذًا</w:t>
             </w:r>
           </w:p>
         </w:tc>
@@ -8668,6 +8668,166 @@
                 <w:rtl/>
               </w:rPr>
               <w:t xml:space="preserve">‎docs/45‎</w:t>
+            </w:r>
+          </w:p>
+        </w:tc>
+      </w:tr>
+      <w:tr>
+        <w:trPr>
+          <w:cantSplit/>
+        </w:trPr>
+        <w:tc>
+          <w:tcPr>
+            <w:tcW w:type="dxa" w:w="943"/>
+            <w:tcBorders>
+              <w:top w:val="single" w:color="BFC9D6" w:sz="4"/>
+              <w:left w:val="single" w:color="BFC9D6" w:sz="4"/>
+              <w:bottom w:val="single" w:color="BFC9D6" w:sz="4"/>
+              <w:right w:val="single" w:color="BFC9D6" w:sz="4"/>
+            </w:tcBorders>
+            <w:tcMar>
+              <w:top w:type="dxa" w:w="50"/>
+              <w:left w:type="dxa" w:w="90"/>
+              <w:bottom w:type="dxa" w:w="50"/>
+              <w:right w:type="dxa" w:w="90"/>
+            </w:tcMar>
+            <w:vAlign w:val="top"/>
+          </w:tcPr>
+          <w:p>
+            <w:pPr>
+              <w:keepNext w:val="false"/>
+              <w:bidi/>
+              <w:spacing w:after="30" w:before="30" w:line="264"/>
+            </w:pPr>
+            <w:r>
+              <w:rPr>
+                <w:rFonts w:ascii="Arial" w:cs="Arial" w:eastAsia="Arial" w:hAnsi="Arial"/>
+                <w:b w:val="false"/>
+                <w:bCs w:val="false"/>
+                <w:sz w:val="18"/>
+                <w:szCs w:val="18"/>
+                <w:rtl/>
+              </w:rPr>
+              <w:t xml:space="preserve">41</w:t>
+            </w:r>
+          </w:p>
+        </w:tc>
+        <w:tc>
+          <w:tcPr>
+            <w:tcW w:type="dxa" w:w="2636"/>
+            <w:tcBorders>
+              <w:top w:val="single" w:color="BFC9D6" w:sz="4"/>
+              <w:left w:val="single" w:color="BFC9D6" w:sz="4"/>
+              <w:bottom w:val="single" w:color="BFC9D6" w:sz="4"/>
+              <w:right w:val="single" w:color="BFC9D6" w:sz="4"/>
+            </w:tcBorders>
+            <w:tcMar>
+              <w:top w:type="dxa" w:w="50"/>
+              <w:left w:type="dxa" w:w="90"/>
+              <w:bottom w:type="dxa" w:w="50"/>
+              <w:right w:type="dxa" w:w="90"/>
+            </w:tcMar>
+            <w:vAlign w:val="top"/>
+          </w:tcPr>
+          <w:p>
+            <w:pPr>
+              <w:keepNext w:val="false"/>
+              <w:bidi/>
+              <w:spacing w:after="30" w:before="30" w:line="264"/>
+            </w:pPr>
+            <w:r>
+              <w:rPr>
+                <w:rFonts w:ascii="Arial" w:cs="Arial" w:eastAsia="Arial" w:hAnsi="Arial"/>
+                <w:b/>
+                <w:bCs/>
+                <w:sz w:val="18"/>
+                <w:szCs w:val="18"/>
+                <w:rtl/>
+              </w:rPr>
+              <w:t xml:space="preserve">بناء الشريحة S2-ب (2026-10-23).</w:t>
+            </w:r>
+            <w:r>
+              <w:rPr>
+                <w:rFonts w:ascii="Arial" w:cs="Arial" w:eastAsia="Arial" w:hAnsi="Arial"/>
+                <w:b w:val="false"/>
+                <w:bCs w:val="false"/>
+                <w:sz w:val="18"/>
+                <w:szCs w:val="18"/>
+                <w:rtl/>
+              </w:rPr>
+              <w:t xml:space="preserve"> «أعتمد الافتراضات وابدأ». اعتمد المالك افتراضات موجز S2-ب السبعة عشر كلها: حزمة البنود بـ157 بندًا تعرض الشاشة منها 51 (OQ-1)، ومحرك الحساب ومحلل الصيغ في التطبيق (OQ-2)، وأحدث نسخة معتمدة من الصيغة ونسخ القالب المستعمل إلى التسهيل (OQ-3)، وتوليد الاختبارات حتى 24 شهرًا أو انتهاء التسهيل (OQ-4)، وترتيب المهام اليومية (OQ-5)، والإنذار المبكر مخالفةً بدرجة إنذار داخل التطبيق (OQ-6)، وتكرار المخالفة يعلّمها للمراجعة ولا يفتح ثانية (OQ-7)، وقياس تعهدات الإيراد والتدفقات على فترة الاختبار (OQ-8)، وطريقة التجميع إلزامية لمتوسط الرصيد (OQ-9)، والبيانات المالية تحت وحدة التعهدات (OQ-10)، والخروج AC-FAC-7 ولوحة الامتثال (OQ-11)، وموظف الخزينة لا يرى القوائم (OQ-12)، وإعادة التقييم بعد الاعتماد عبر صندوق الصادر (OQ-13)، وأشهر الحساب بلا تاريخ فتح (OQ-14)، و«بيانات ناقصة» بعد الموعد ثم أسبوعيًا (OQ-15)، والتقييم الائتماني داخل الطلب (OQ-16)، وتسهيل الخروج C مع حزمة DS-FIN-C (OQ-17)</w:t>
+            </w:r>
+          </w:p>
+        </w:tc>
+        <w:tc>
+          <w:tcPr>
+            <w:tcW w:type="dxa" w:w="4639"/>
+            <w:tcBorders>
+              <w:top w:val="single" w:color="BFC9D6" w:sz="4"/>
+              <w:left w:val="single" w:color="BFC9D6" w:sz="4"/>
+              <w:bottom w:val="single" w:color="BFC9D6" w:sz="4"/>
+              <w:right w:val="single" w:color="BFC9D6" w:sz="4"/>
+            </w:tcBorders>
+            <w:tcMar>
+              <w:top w:type="dxa" w:w="50"/>
+              <w:left w:type="dxa" w:w="90"/>
+              <w:bottom w:type="dxa" w:w="50"/>
+              <w:right w:type="dxa" w:w="90"/>
+            </w:tcMar>
+            <w:vAlign w:val="top"/>
+          </w:tcPr>
+          <w:p>
+            <w:pPr>
+              <w:keepNext w:val="false"/>
+              <w:bidi/>
+              <w:spacing w:after="30" w:before="30" w:line="264"/>
+            </w:pPr>
+            <w:r>
+              <w:rPr>
+                <w:rFonts w:ascii="Arial" w:cs="Arial" w:eastAsia="Arial" w:hAnsi="Arial"/>
+                <w:b w:val="false"/>
+                <w:bCs w:val="false"/>
+                <w:sz w:val="18"/>
+                <w:szCs w:val="18"/>
+                <w:rtl/>
+              </w:rPr>
+              <w:t xml:space="preserve">البيانات المالية والأرصدة الشهرية والتدفقات ومكتبة الصيغ ومحرك اختبار التعهدات ومخالفاتها، وتغليف التقييم الائتماني والجاهزية، ولوحة الامتثال الكاملة</w:t>
+            </w:r>
+          </w:p>
+        </w:tc>
+        <w:tc>
+          <w:tcPr>
+            <w:tcW w:type="dxa" w:w="1646"/>
+            <w:tcBorders>
+              <w:top w:val="single" w:color="BFC9D6" w:sz="4"/>
+              <w:left w:val="single" w:color="BFC9D6" w:sz="4"/>
+              <w:bottom w:val="single" w:color="BFC9D6" w:sz="4"/>
+              <w:right w:val="single" w:color="BFC9D6" w:sz="4"/>
+            </w:tcBorders>
+            <w:tcMar>
+              <w:top w:type="dxa" w:w="50"/>
+              <w:left w:type="dxa" w:w="90"/>
+              <w:bottom w:type="dxa" w:w="50"/>
+              <w:right w:type="dxa" w:w="90"/>
+            </w:tcMar>
+            <w:vAlign w:val="top"/>
+          </w:tcPr>
+          <w:p>
+            <w:pPr>
+              <w:keepNext w:val="false"/>
+              <w:bidi/>
+              <w:spacing w:after="30" w:before="30" w:line="264"/>
+            </w:pPr>
+            <w:r>
+              <w:rPr>
+                <w:rFonts w:ascii="Arial" w:cs="Arial" w:eastAsia="Arial" w:hAnsi="Arial"/>
+                <w:b w:val="false"/>
+                <w:bCs w:val="false"/>
+                <w:sz w:val="18"/>
+                <w:szCs w:val="18"/>
+                <w:rtl/>
+              </w:rPr>
+              <w:t xml:space="preserve">قيد البناء</w:t>
             </w:r>
           </w:p>
         </w:tc>
@@ -44928,7 +45088,7 @@
         <w:szCs w:val="17"/>
         <w:rtl/>
       </w:rPr>
-      <w:t xml:space="preserve">القرارات المعتمدة من المالك · BankFas · 2026-10-22</w:t>
+      <w:t xml:space="preserve">القرارات المعتمدة من المالك · BankFas · 2026-10-23</w:t>
     </w:r>
   </w:p>
 </w:hdr>

</xml_diff>

<commit_message>
S3: SoD at the reservation point (OQ-9), docs/48, docs/31 row 42, ADR 0045
- The assignee of the last facility-selection stage (or a delegate acting
  for them) does not decide the reservation point unless the template allows
  the same person (tagged); test with a second TM.
- docs/48 (Arabic) on the S3 build; docs/31 row 42 with the nineteen S3
  defaults pending the owner's approval; Word files; ADR 0045 updated.

Co-Authored-By: Claude Opus 5.5 <noreply@anthropic.com>
Claude-Session: https://claude.ai/code/session_012HHcRrzuvMBTL2FYxXtsyv
</commit_message>
<xml_diff>
--- a/treasury-platform/docs/31-OWNER-DECISIONS.docx
+++ b/treasury-platform/docs/31-OWNER-DECISIONS.docx
@@ -8902,6 +8902,286 @@
           </w:p>
         </w:tc>
       </w:tr>
+      <w:tr>
+        <w:trPr>
+          <w:cantSplit/>
+        </w:trPr>
+        <w:tc>
+          <w:tcPr>
+            <w:tcW w:type="dxa" w:w="943"/>
+            <w:tcBorders>
+              <w:top w:val="single" w:color="BFC9D6" w:sz="4"/>
+              <w:left w:val="single" w:color="BFC9D6" w:sz="4"/>
+              <w:bottom w:val="single" w:color="BFC9D6" w:sz="4"/>
+              <w:right w:val="single" w:color="BFC9D6" w:sz="4"/>
+            </w:tcBorders>
+            <w:shd w:fill="F5F8FC" w:color="auto" w:val="clear"/>
+            <w:tcMar>
+              <w:top w:type="dxa" w:w="50"/>
+              <w:left w:type="dxa" w:w="90"/>
+              <w:bottom w:type="dxa" w:w="50"/>
+              <w:right w:type="dxa" w:w="90"/>
+            </w:tcMar>
+            <w:vAlign w:val="top"/>
+          </w:tcPr>
+          <w:p>
+            <w:pPr>
+              <w:keepNext w:val="false"/>
+              <w:bidi/>
+              <w:spacing w:after="30" w:before="30" w:line="264"/>
+            </w:pPr>
+            <w:r>
+              <w:rPr>
+                <w:rFonts w:ascii="Arial" w:cs="Arial" w:eastAsia="Arial" w:hAnsi="Arial"/>
+                <w:b w:val="false"/>
+                <w:bCs w:val="false"/>
+                <w:sz w:val="18"/>
+                <w:szCs w:val="18"/>
+                <w:rtl/>
+              </w:rPr>
+              <w:t xml:space="preserve">42</w:t>
+            </w:r>
+          </w:p>
+        </w:tc>
+        <w:tc>
+          <w:tcPr>
+            <w:tcW w:type="dxa" w:w="2636"/>
+            <w:tcBorders>
+              <w:top w:val="single" w:color="BFC9D6" w:sz="4"/>
+              <w:left w:val="single" w:color="BFC9D6" w:sz="4"/>
+              <w:bottom w:val="single" w:color="BFC9D6" w:sz="4"/>
+              <w:right w:val="single" w:color="BFC9D6" w:sz="4"/>
+            </w:tcBorders>
+            <w:shd w:fill="F5F8FC" w:color="auto" w:val="clear"/>
+            <w:tcMar>
+              <w:top w:type="dxa" w:w="50"/>
+              <w:left w:type="dxa" w:w="90"/>
+              <w:bottom w:type="dxa" w:w="50"/>
+              <w:right w:type="dxa" w:w="90"/>
+            </w:tcMar>
+            <w:vAlign w:val="top"/>
+          </w:tcPr>
+          <w:p>
+            <w:pPr>
+              <w:keepNext w:val="false"/>
+              <w:bidi/>
+              <w:spacing w:after="30" w:before="30" w:line="264"/>
+            </w:pPr>
+            <w:r>
+              <w:rPr>
+                <w:rFonts w:ascii="Arial" w:cs="Arial" w:eastAsia="Arial" w:hAnsi="Arial"/>
+                <w:b/>
+                <w:bCs/>
+                <w:sz w:val="18"/>
+                <w:szCs w:val="18"/>
+                <w:rtl/>
+              </w:rPr>
+              <w:t xml:space="preserve">بناء الشريحة S3 (2026-10-23).</w:t>
+            </w:r>
+            <w:r>
+              <w:rPr>
+                <w:rFonts w:ascii="Arial" w:cs="Arial" w:eastAsia="Arial" w:hAnsi="Arial"/>
+                <w:b w:val="false"/>
+                <w:bCs w:val="false"/>
+                <w:sz w:val="18"/>
+                <w:szCs w:val="18"/>
+                <w:rtl/>
+              </w:rPr>
+              <w:t xml:space="preserve"> «ثم اكمل فورًا بقية النظام» بعد تقرير الخبير. بُنيت على افتراضات موجز S3 للأسئلة OQ-1 إلى OQ-19، </w:t>
+            </w:r>
+            <w:r>
+              <w:rPr>
+                <w:rFonts w:ascii="Arial" w:cs="Arial" w:eastAsia="Arial" w:hAnsi="Arial"/>
+                <w:b/>
+                <w:bCs/>
+                <w:sz w:val="18"/>
+                <w:szCs w:val="18"/>
+                <w:rtl/>
+              </w:rPr>
+              <w:t xml:space="preserve">وهي بانتظار اعتماد المالك</w:t>
+            </w:r>
+            <w:r>
+              <w:rPr>
+                <w:rFonts w:ascii="Arial" w:cs="Arial" w:eastAsia="Arial" w:hAnsi="Arial"/>
+                <w:b w:val="false"/>
+                <w:bCs w:val="false"/>
+                <w:sz w:val="18"/>
+                <w:szCs w:val="18"/>
+                <w:rtl/>
+              </w:rPr>
+              <w:t xml:space="preserve"> (ملخصها في </w:t>
+            </w:r>
+            <w:r>
+              <w:rPr>
+                <w:rFonts w:ascii="Courier New" w:cs="Courier New" w:eastAsia="Courier New" w:hAnsi="Courier New"/>
+                <w:b w:val="false"/>
+                <w:bCs w:val="false"/>
+                <w:color w:val="1F2937"/>
+                <w:sz w:val="16"/>
+                <w:szCs w:val="16"/>
+                <w:shd w:fill="F1F3F5" w:color="auto" w:val="clear"/>
+                <w:rtl/>
+              </w:rPr>
+              <w:t xml:space="preserve">‎docs/48‎</w:t>
+            </w:r>
+            <w:r>
+              <w:rPr>
+                <w:rFonts w:ascii="Arial" w:cs="Arial" w:eastAsia="Arial" w:hAnsi="Arial"/>
+                <w:b w:val="false"/>
+                <w:bCs w:val="false"/>
+                <w:sz w:val="18"/>
+                <w:szCs w:val="18"/>
+                <w:rtl/>
+              </w:rPr>
+              <w:t xml:space="preserve"> §4)، ومنها: المحرك في التطبيق (OQ-1)، ورفض الإصدار فوق المحجوز (OQ-3)، ورقم التعديل من البنك (OQ-4)، وتحرير الحجز عند الرفض والإلغاء (OQ-6)، وفصل المهام عند الحجز (OQ-9)، ومواعيد المهام (OQ-12)، والخروج AC-REQ-1 وAC-WFL-3 وAC-LCI-1 (OQ-19). </w:t>
+            </w:r>
+            <w:r>
+              <w:rPr>
+                <w:rFonts w:ascii="Arial" w:cs="Arial" w:eastAsia="Arial" w:hAnsi="Arial"/>
+                <w:b/>
+                <w:bCs/>
+                <w:sz w:val="18"/>
+                <w:szCs w:val="18"/>
+                <w:rtl/>
+              </w:rPr>
+              <w:t xml:space="preserve">بُنيت الدفعات A إلى D والنواة من E وF وG</w:t>
+            </w:r>
+            <w:r>
+              <w:rPr>
+                <w:rFonts w:ascii="Arial" w:cs="Arial" w:eastAsia="Arial" w:hAnsi="Arial"/>
+                <w:b w:val="false"/>
+                <w:bCs w:val="false"/>
+                <w:sz w:val="18"/>
+                <w:szCs w:val="18"/>
+                <w:rtl/>
+              </w:rPr>
+              <w:t xml:space="preserve"> (</w:t>
+            </w:r>
+            <w:r>
+              <w:rPr>
+                <w:rFonts w:ascii="Courier New" w:cs="Courier New" w:eastAsia="Courier New" w:hAnsi="Courier New"/>
+                <w:b w:val="false"/>
+                <w:bCs w:val="false"/>
+                <w:color w:val="1F2937"/>
+                <w:sz w:val="16"/>
+                <w:szCs w:val="16"/>
+                <w:shd w:fill="F1F3F5" w:color="auto" w:val="clear"/>
+                <w:rtl/>
+              </w:rPr>
+              <w:t xml:space="preserve">‎docs/48‎</w:t>
+            </w:r>
+            <w:r>
+              <w:rPr>
+                <w:rFonts w:ascii="Arial" w:cs="Arial" w:eastAsia="Arial" w:hAnsi="Arial"/>
+                <w:b w:val="false"/>
+                <w:bCs w:val="false"/>
+                <w:sz w:val="18"/>
+                <w:szCs w:val="18"/>
+                <w:rtl/>
+              </w:rPr>
+              <w:t xml:space="preserve">، ADR 0045)، ونجح AC-REQ-1 وAC-WFL-3. وما بقي في </w:t>
+            </w:r>
+            <w:r>
+              <w:rPr>
+                <w:rFonts w:ascii="Courier New" w:cs="Courier New" w:eastAsia="Courier New" w:hAnsi="Courier New"/>
+                <w:b w:val="false"/>
+                <w:bCs w:val="false"/>
+                <w:color w:val="1F2937"/>
+                <w:sz w:val="16"/>
+                <w:szCs w:val="16"/>
+                <w:shd w:fill="F1F3F5" w:color="auto" w:val="clear"/>
+                <w:rtl/>
+              </w:rPr>
+              <w:t xml:space="preserve">‎docs/48‎</w:t>
+            </w:r>
+            <w:r>
+              <w:rPr>
+                <w:rFonts w:ascii="Arial" w:cs="Arial" w:eastAsia="Arial" w:hAnsi="Arial"/>
+                <w:b w:val="false"/>
+                <w:bCs w:val="false"/>
+                <w:sz w:val="18"/>
+                <w:szCs w:val="18"/>
+                <w:rtl/>
+              </w:rPr>
+              <w:t xml:space="preserve"> §5</w:t>
+            </w:r>
+          </w:p>
+        </w:tc>
+        <w:tc>
+          <w:tcPr>
+            <w:tcW w:type="dxa" w:w="4639"/>
+            <w:tcBorders>
+              <w:top w:val="single" w:color="BFC9D6" w:sz="4"/>
+              <w:left w:val="single" w:color="BFC9D6" w:sz="4"/>
+              <w:bottom w:val="single" w:color="BFC9D6" w:sz="4"/>
+              <w:right w:val="single" w:color="BFC9D6" w:sz="4"/>
+            </w:tcBorders>
+            <w:shd w:fill="F5F8FC" w:color="auto" w:val="clear"/>
+            <w:tcMar>
+              <w:top w:type="dxa" w:w="50"/>
+              <w:left w:type="dxa" w:w="90"/>
+              <w:bottom w:type="dxa" w:w="50"/>
+              <w:right w:type="dxa" w:w="90"/>
+            </w:tcMar>
+            <w:vAlign w:val="top"/>
+          </w:tcPr>
+          <w:p>
+            <w:pPr>
+              <w:keepNext w:val="false"/>
+              <w:bidi/>
+              <w:spacing w:after="30" w:before="30" w:line="264"/>
+            </w:pPr>
+            <w:r>
+              <w:rPr>
+                <w:rFonts w:ascii="Arial" w:cs="Arial" w:eastAsia="Arial" w:hAnsi="Arial"/>
+                <w:b w:val="false"/>
+                <w:bCs w:val="false"/>
+                <w:sz w:val="18"/>
+                <w:szCs w:val="18"/>
+                <w:rtl/>
+              </w:rPr>
+              <w:t xml:space="preserve">محرك سير العمل والطلبات، وخدمات التسهيلات، والاعتماد المستندي للمشتريات من شروطه إلى تعديله وإغلاقه</w:t>
+            </w:r>
+          </w:p>
+        </w:tc>
+        <w:tc>
+          <w:tcPr>
+            <w:tcW w:type="dxa" w:w="1646"/>
+            <w:tcBorders>
+              <w:top w:val="single" w:color="BFC9D6" w:sz="4"/>
+              <w:left w:val="single" w:color="BFC9D6" w:sz="4"/>
+              <w:bottom w:val="single" w:color="BFC9D6" w:sz="4"/>
+              <w:right w:val="single" w:color="BFC9D6" w:sz="4"/>
+            </w:tcBorders>
+            <w:shd w:fill="F5F8FC" w:color="auto" w:val="clear"/>
+            <w:tcMar>
+              <w:top w:type="dxa" w:w="50"/>
+              <w:left w:type="dxa" w:w="90"/>
+              <w:bottom w:type="dxa" w:w="50"/>
+              <w:right w:type="dxa" w:w="90"/>
+            </w:tcMar>
+            <w:vAlign w:val="top"/>
+          </w:tcPr>
+          <w:p>
+            <w:pPr>
+              <w:keepNext w:val="false"/>
+              <w:bidi/>
+              <w:spacing w:after="30" w:before="30" w:line="264"/>
+            </w:pPr>
+            <w:r>
+              <w:rPr>
+                <w:rFonts w:ascii="Arial" w:cs="Arial" w:eastAsia="Arial" w:hAnsi="Arial"/>
+                <w:b w:val="false"/>
+                <w:bCs w:val="false"/>
+                <w:sz w:val="18"/>
+                <w:szCs w:val="18"/>
+                <w:rtl/>
+              </w:rPr>
+              <w:t xml:space="preserve">مبني جزئيًا؛ الافتراضات بانتظار الاعتماد</w:t>
+            </w:r>
+          </w:p>
+        </w:tc>
+      </w:tr>
     </w:tbl>
     <w:p>
       <w:pPr>
@@ -45158,7 +45438,7 @@
         <w:szCs w:val="17"/>
         <w:rtl/>
       </w:rPr>
-      <w:t xml:space="preserve">القرارات المعتمدة من المالك · BankFas · 2026-10-23</w:t>
+      <w:t xml:space="preserve">سجل قرارات المالك · BankFas</w:t>
     </w:r>
   </w:p>
 </w:hdr>

</xml_diff>

<commit_message>
docs/31 row 42: S3 batches A to H built; the full check runs next
Co-Authored-By: Claude Opus 5.5 <noreply@anthropic.com>
Claude-Session: https://claude.ai/code/session_012HHcRrzuvMBTL2FYxXtsyv
</commit_message>
<xml_diff>
--- a/treasury-platform/docs/31-OWNER-DECISIONS.docx
+++ b/treasury-platform/docs/31-OWNER-DECISIONS.docx
@@ -9044,7 +9044,7 @@
                 <w:szCs w:val="18"/>
                 <w:rtl/>
               </w:rPr>
-              <w:t xml:space="preserve">بُنيت الدفعات A إلى D والنواة من E وF وG</w:t>
+              <w:t xml:space="preserve">بُنيت الدفعات A إلى H</w:t>
             </w:r>
             <w:r>
               <w:rPr>
@@ -9079,7 +9079,7 @@
                 <w:szCs w:val="18"/>
                 <w:rtl/>
               </w:rPr>
-              <w:t xml:space="preserve">، ADR 0045)، ونجح AC-REQ-1 وAC-WFL-3. وما بقي في </w:t>
+              <w:t xml:space="preserve">، ADR 0045): التنفيذ وإيصاله، وIBAN المختوم، والطباعة، ونماذج البنوك، واللوحات، وحزمة DS-LC-C. ونجح AC-REQ-1 وAC-WFL-3 قبل إضافة الإيصال. وبطلب المالك («اكمل البناء ليتم الفحص لاحقا») كُتبت اختبارات الدفعة الأخيرة دون تشغيل، وتُشغَّل في دورة CI واحدة (ملحق DOC-B02 §12). وما بقي في </w:t>
             </w:r>
             <w:r>
               <w:rPr>
@@ -9177,7 +9177,7 @@
                 <w:szCs w:val="18"/>
                 <w:rtl/>
               </w:rPr>
-              <w:t xml:space="preserve">مبني جزئيًا؛ الافتراضات بانتظار الاعتماد</w:t>
+              <w:t xml:space="preserve">مبني؛ الفحص الكامل لم يُشغَّل بعد؛ الافتراضات بانتظار الاعتماد</w:t>
             </w:r>
           </w:p>
         </w:tc>

</xml_diff>

<commit_message>
docs/31: the owner approves OQ-1..19 and the reference choices; rows 44-47 (timing per request, settings over code, login by tenant and user number, pause until 2026-10-24 21:10)
Co-Authored-By: Claude Opus 5.5 <noreply@anthropic.com>
Claude-Session: https://claude.ai/code/session_012HHcRrzuvMBTL2FYxXtsyv
</commit_message>
<xml_diff>
--- a/treasury-platform/docs/31-OWNER-DECISIONS.docx
+++ b/treasury-platform/docs/31-OWNER-DECISIONS.docx
@@ -5088,10 +5088,10 @@
         </w:tblBorders>
       </w:tblPr>
       <w:tblGrid>
-        <w:gridCol w:w="943"/>
-        <w:gridCol w:w="2636"/>
-        <w:gridCol w:w="4639"/>
-        <w:gridCol w:w="1646"/>
+        <w:gridCol w:w="935"/>
+        <w:gridCol w:w="3843"/>
+        <w:gridCol w:w="3608"/>
+        <w:gridCol w:w="1478"/>
       </w:tblGrid>
       <w:tr>
         <w:trPr>
@@ -5100,7 +5100,7 @@
         </w:trPr>
         <w:tc>
           <w:tcPr>
-            <w:tcW w:type="dxa" w:w="943"/>
+            <w:tcW w:type="dxa" w:w="935"/>
             <w:tcBorders>
               <w:top w:val="single" w:color="BFC9D6" w:sz="4"/>
               <w:left w:val="single" w:color="BFC9D6" w:sz="4"/>
@@ -5138,7 +5138,7 @@
         </w:tc>
         <w:tc>
           <w:tcPr>
-            <w:tcW w:type="dxa" w:w="2636"/>
+            <w:tcW w:type="dxa" w:w="3843"/>
             <w:tcBorders>
               <w:top w:val="single" w:color="BFC9D6" w:sz="4"/>
               <w:left w:val="single" w:color="BFC9D6" w:sz="4"/>
@@ -5176,7 +5176,7 @@
         </w:tc>
         <w:tc>
           <w:tcPr>
-            <w:tcW w:type="dxa" w:w="4639"/>
+            <w:tcW w:type="dxa" w:w="3608"/>
             <w:tcBorders>
               <w:top w:val="single" w:color="BFC9D6" w:sz="4"/>
               <w:left w:val="single" w:color="BFC9D6" w:sz="4"/>
@@ -5214,7 +5214,7 @@
         </w:tc>
         <w:tc>
           <w:tcPr>
-            <w:tcW w:type="dxa" w:w="1646"/>
+            <w:tcW w:type="dxa" w:w="1478"/>
             <w:tcBorders>
               <w:top w:val="single" w:color="BFC9D6" w:sz="4"/>
               <w:left w:val="single" w:color="BFC9D6" w:sz="4"/>
@@ -5257,7 +5257,7 @@
         </w:trPr>
         <w:tc>
           <w:tcPr>
-            <w:tcW w:type="dxa" w:w="943"/>
+            <w:tcW w:type="dxa" w:w="935"/>
             <w:tcBorders>
               <w:top w:val="single" w:color="BFC9D6" w:sz="4"/>
               <w:left w:val="single" w:color="BFC9D6" w:sz="4"/>
@@ -5293,7 +5293,7 @@
         </w:tc>
         <w:tc>
           <w:tcPr>
-            <w:tcW w:type="dxa" w:w="2636"/>
+            <w:tcW w:type="dxa" w:w="3843"/>
             <w:tcBorders>
               <w:top w:val="single" w:color="BFC9D6" w:sz="4"/>
               <w:left w:val="single" w:color="BFC9D6" w:sz="4"/>
@@ -5340,7 +5340,7 @@
         </w:tc>
         <w:tc>
           <w:tcPr>
-            <w:tcW w:type="dxa" w:w="4639"/>
+            <w:tcW w:type="dxa" w:w="3608"/>
             <w:tcBorders>
               <w:top w:val="single" w:color="BFC9D6" w:sz="4"/>
               <w:left w:val="single" w:color="BFC9D6" w:sz="4"/>
@@ -5376,7 +5376,7 @@
         </w:tc>
         <w:tc>
           <w:tcPr>
-            <w:tcW w:type="dxa" w:w="1646"/>
+            <w:tcW w:type="dxa" w:w="1478"/>
             <w:tcBorders>
               <w:top w:val="single" w:color="BFC9D6" w:sz="4"/>
               <w:left w:val="single" w:color="BFC9D6" w:sz="4"/>
@@ -5441,7 +5441,7 @@
         </w:trPr>
         <w:tc>
           <w:tcPr>
-            <w:tcW w:type="dxa" w:w="943"/>
+            <w:tcW w:type="dxa" w:w="935"/>
             <w:tcBorders>
               <w:top w:val="single" w:color="BFC9D6" w:sz="4"/>
               <w:left w:val="single" w:color="BFC9D6" w:sz="4"/>
@@ -5478,7 +5478,7 @@
         </w:tc>
         <w:tc>
           <w:tcPr>
-            <w:tcW w:type="dxa" w:w="2636"/>
+            <w:tcW w:type="dxa" w:w="3843"/>
             <w:tcBorders>
               <w:top w:val="single" w:color="BFC9D6" w:sz="4"/>
               <w:left w:val="single" w:color="BFC9D6" w:sz="4"/>
@@ -5526,7 +5526,7 @@
         </w:tc>
         <w:tc>
           <w:tcPr>
-            <w:tcW w:type="dxa" w:w="4639"/>
+            <w:tcW w:type="dxa" w:w="3608"/>
             <w:tcBorders>
               <w:top w:val="single" w:color="BFC9D6" w:sz="4"/>
               <w:left w:val="single" w:color="BFC9D6" w:sz="4"/>
@@ -5584,7 +5584,7 @@
         </w:tc>
         <w:tc>
           <w:tcPr>
-            <w:tcW w:type="dxa" w:w="1646"/>
+            <w:tcW w:type="dxa" w:w="1478"/>
             <w:tcBorders>
               <w:top w:val="single" w:color="BFC9D6" w:sz="4"/>
               <w:left w:val="single" w:color="BFC9D6" w:sz="4"/>
@@ -5626,7 +5626,7 @@
         </w:trPr>
         <w:tc>
           <w:tcPr>
-            <w:tcW w:type="dxa" w:w="943"/>
+            <w:tcW w:type="dxa" w:w="935"/>
             <w:tcBorders>
               <w:top w:val="single" w:color="BFC9D6" w:sz="4"/>
               <w:left w:val="single" w:color="BFC9D6" w:sz="4"/>
@@ -5662,7 +5662,7 @@
         </w:tc>
         <w:tc>
           <w:tcPr>
-            <w:tcW w:type="dxa" w:w="2636"/>
+            <w:tcW w:type="dxa" w:w="3843"/>
             <w:tcBorders>
               <w:top w:val="single" w:color="BFC9D6" w:sz="4"/>
               <w:left w:val="single" w:color="BFC9D6" w:sz="4"/>
@@ -5709,7 +5709,7 @@
         </w:tc>
         <w:tc>
           <w:tcPr>
-            <w:tcW w:type="dxa" w:w="4639"/>
+            <w:tcW w:type="dxa" w:w="3608"/>
             <w:tcBorders>
               <w:top w:val="single" w:color="BFC9D6" w:sz="4"/>
               <w:left w:val="single" w:color="BFC9D6" w:sz="4"/>
@@ -5791,7 +5791,7 @@
         </w:tc>
         <w:tc>
           <w:tcPr>
-            <w:tcW w:type="dxa" w:w="1646"/>
+            <w:tcW w:type="dxa" w:w="1478"/>
             <w:tcBorders>
               <w:top w:val="single" w:color="BFC9D6" w:sz="4"/>
               <w:left w:val="single" w:color="BFC9D6" w:sz="4"/>
@@ -5880,7 +5880,7 @@
         </w:trPr>
         <w:tc>
           <w:tcPr>
-            <w:tcW w:type="dxa" w:w="943"/>
+            <w:tcW w:type="dxa" w:w="935"/>
             <w:tcBorders>
               <w:top w:val="single" w:color="BFC9D6" w:sz="4"/>
               <w:left w:val="single" w:color="BFC9D6" w:sz="4"/>
@@ -5917,7 +5917,7 @@
         </w:tc>
         <w:tc>
           <w:tcPr>
-            <w:tcW w:type="dxa" w:w="2636"/>
+            <w:tcW w:type="dxa" w:w="3843"/>
             <w:tcBorders>
               <w:top w:val="single" w:color="BFC9D6" w:sz="4"/>
               <w:left w:val="single" w:color="BFC9D6" w:sz="4"/>
@@ -5965,7 +5965,7 @@
         </w:tc>
         <w:tc>
           <w:tcPr>
-            <w:tcW w:type="dxa" w:w="4639"/>
+            <w:tcW w:type="dxa" w:w="3608"/>
             <w:tcBorders>
               <w:top w:val="single" w:color="BFC9D6" w:sz="4"/>
               <w:left w:val="single" w:color="BFC9D6" w:sz="4"/>
@@ -6072,7 +6072,7 @@
         </w:tc>
         <w:tc>
           <w:tcPr>
-            <w:tcW w:type="dxa" w:w="1646"/>
+            <w:tcW w:type="dxa" w:w="1478"/>
             <w:tcBorders>
               <w:top w:val="single" w:color="BFC9D6" w:sz="4"/>
               <w:left w:val="single" w:color="BFC9D6" w:sz="4"/>
@@ -6138,7 +6138,7 @@
         </w:trPr>
         <w:tc>
           <w:tcPr>
-            <w:tcW w:type="dxa" w:w="943"/>
+            <w:tcW w:type="dxa" w:w="935"/>
             <w:tcBorders>
               <w:top w:val="single" w:color="BFC9D6" w:sz="4"/>
               <w:left w:val="single" w:color="BFC9D6" w:sz="4"/>
@@ -6174,7 +6174,7 @@
         </w:tc>
         <w:tc>
           <w:tcPr>
-            <w:tcW w:type="dxa" w:w="2636"/>
+            <w:tcW w:type="dxa" w:w="3843"/>
             <w:tcBorders>
               <w:top w:val="single" w:color="BFC9D6" w:sz="4"/>
               <w:left w:val="single" w:color="BFC9D6" w:sz="4"/>
@@ -6221,7 +6221,7 @@
         </w:tc>
         <w:tc>
           <w:tcPr>
-            <w:tcW w:type="dxa" w:w="4639"/>
+            <w:tcW w:type="dxa" w:w="3608"/>
             <w:tcBorders>
               <w:top w:val="single" w:color="BFC9D6" w:sz="4"/>
               <w:left w:val="single" w:color="BFC9D6" w:sz="4"/>
@@ -6303,7 +6303,7 @@
         </w:tc>
         <w:tc>
           <w:tcPr>
-            <w:tcW w:type="dxa" w:w="1646"/>
+            <w:tcW w:type="dxa" w:w="1478"/>
             <w:tcBorders>
               <w:top w:val="single" w:color="BFC9D6" w:sz="4"/>
               <w:left w:val="single" w:color="BFC9D6" w:sz="4"/>
@@ -6368,7 +6368,7 @@
         </w:trPr>
         <w:tc>
           <w:tcPr>
-            <w:tcW w:type="dxa" w:w="943"/>
+            <w:tcW w:type="dxa" w:w="935"/>
             <w:tcBorders>
               <w:top w:val="single" w:color="BFC9D6" w:sz="4"/>
               <w:left w:val="single" w:color="BFC9D6" w:sz="4"/>
@@ -6405,7 +6405,7 @@
         </w:tc>
         <w:tc>
           <w:tcPr>
-            <w:tcW w:type="dxa" w:w="2636"/>
+            <w:tcW w:type="dxa" w:w="3843"/>
             <w:tcBorders>
               <w:top w:val="single" w:color="BFC9D6" w:sz="4"/>
               <w:left w:val="single" w:color="BFC9D6" w:sz="4"/>
@@ -6453,7 +6453,7 @@
         </w:tc>
         <w:tc>
           <w:tcPr>
-            <w:tcW w:type="dxa" w:w="4639"/>
+            <w:tcW w:type="dxa" w:w="3608"/>
             <w:tcBorders>
               <w:top w:val="single" w:color="BFC9D6" w:sz="4"/>
               <w:left w:val="single" w:color="BFC9D6" w:sz="4"/>
@@ -6514,7 +6514,7 @@
         </w:tc>
         <w:tc>
           <w:tcPr>
-            <w:tcW w:type="dxa" w:w="1646"/>
+            <w:tcW w:type="dxa" w:w="1478"/>
             <w:tcBorders>
               <w:top w:val="single" w:color="BFC9D6" w:sz="4"/>
               <w:left w:val="single" w:color="BFC9D6" w:sz="4"/>
@@ -6569,7 +6569,7 @@
         </w:trPr>
         <w:tc>
           <w:tcPr>
-            <w:tcW w:type="dxa" w:w="943"/>
+            <w:tcW w:type="dxa" w:w="935"/>
             <w:tcBorders>
               <w:top w:val="single" w:color="BFC9D6" w:sz="4"/>
               <w:left w:val="single" w:color="BFC9D6" w:sz="4"/>
@@ -6605,7 +6605,7 @@
         </w:tc>
         <w:tc>
           <w:tcPr>
-            <w:tcW w:type="dxa" w:w="2636"/>
+            <w:tcW w:type="dxa" w:w="3843"/>
             <w:tcBorders>
               <w:top w:val="single" w:color="BFC9D6" w:sz="4"/>
               <w:left w:val="single" w:color="BFC9D6" w:sz="4"/>
@@ -6652,7 +6652,7 @@
         </w:tc>
         <w:tc>
           <w:tcPr>
-            <w:tcW w:type="dxa" w:w="4639"/>
+            <w:tcW w:type="dxa" w:w="3608"/>
             <w:tcBorders>
               <w:top w:val="single" w:color="BFC9D6" w:sz="4"/>
               <w:left w:val="single" w:color="BFC9D6" w:sz="4"/>
@@ -6758,7 +6758,7 @@
         </w:tc>
         <w:tc>
           <w:tcPr>
-            <w:tcW w:type="dxa" w:w="1646"/>
+            <w:tcW w:type="dxa" w:w="1478"/>
             <w:tcBorders>
               <w:top w:val="single" w:color="BFC9D6" w:sz="4"/>
               <w:left w:val="single" w:color="BFC9D6" w:sz="4"/>
@@ -6823,7 +6823,7 @@
         </w:trPr>
         <w:tc>
           <w:tcPr>
-            <w:tcW w:type="dxa" w:w="943"/>
+            <w:tcW w:type="dxa" w:w="935"/>
             <w:tcBorders>
               <w:top w:val="single" w:color="BFC9D6" w:sz="4"/>
               <w:left w:val="single" w:color="BFC9D6" w:sz="4"/>
@@ -6860,7 +6860,7 @@
         </w:tc>
         <w:tc>
           <w:tcPr>
-            <w:tcW w:type="dxa" w:w="2636"/>
+            <w:tcW w:type="dxa" w:w="3843"/>
             <w:tcBorders>
               <w:top w:val="single" w:color="BFC9D6" w:sz="4"/>
               <w:left w:val="single" w:color="BFC9D6" w:sz="4"/>
@@ -6908,7 +6908,7 @@
         </w:tc>
         <w:tc>
           <w:tcPr>
-            <w:tcW w:type="dxa" w:w="4639"/>
+            <w:tcW w:type="dxa" w:w="3608"/>
             <w:tcBorders>
               <w:top w:val="single" w:color="BFC9D6" w:sz="4"/>
               <w:left w:val="single" w:color="BFC9D6" w:sz="4"/>
@@ -6945,7 +6945,7 @@
         </w:tc>
         <w:tc>
           <w:tcPr>
-            <w:tcW w:type="dxa" w:w="1646"/>
+            <w:tcW w:type="dxa" w:w="1478"/>
             <w:tcBorders>
               <w:top w:val="single" w:color="BFC9D6" w:sz="4"/>
               <w:left w:val="single" w:color="BFC9D6" w:sz="4"/>
@@ -7000,7 +7000,7 @@
         </w:trPr>
         <w:tc>
           <w:tcPr>
-            <w:tcW w:type="dxa" w:w="943"/>
+            <w:tcW w:type="dxa" w:w="935"/>
             <w:tcBorders>
               <w:top w:val="single" w:color="BFC9D6" w:sz="4"/>
               <w:left w:val="single" w:color="BFC9D6" w:sz="4"/>
@@ -7036,7 +7036,7 @@
         </w:tc>
         <w:tc>
           <w:tcPr>
-            <w:tcW w:type="dxa" w:w="2636"/>
+            <w:tcW w:type="dxa" w:w="3843"/>
             <w:tcBorders>
               <w:top w:val="single" w:color="BFC9D6" w:sz="4"/>
               <w:left w:val="single" w:color="BFC9D6" w:sz="4"/>
@@ -7083,7 +7083,7 @@
         </w:tc>
         <w:tc>
           <w:tcPr>
-            <w:tcW w:type="dxa" w:w="4639"/>
+            <w:tcW w:type="dxa" w:w="3608"/>
             <w:tcBorders>
               <w:top w:val="single" w:color="BFC9D6" w:sz="4"/>
               <w:left w:val="single" w:color="BFC9D6" w:sz="4"/>
@@ -7132,7 +7132,7 @@
         </w:tc>
         <w:tc>
           <w:tcPr>
-            <w:tcW w:type="dxa" w:w="1646"/>
+            <w:tcW w:type="dxa" w:w="1478"/>
             <w:tcBorders>
               <w:top w:val="single" w:color="BFC9D6" w:sz="4"/>
               <w:left w:val="single" w:color="BFC9D6" w:sz="4"/>
@@ -7197,7 +7197,7 @@
         </w:trPr>
         <w:tc>
           <w:tcPr>
-            <w:tcW w:type="dxa" w:w="943"/>
+            <w:tcW w:type="dxa" w:w="935"/>
             <w:tcBorders>
               <w:top w:val="single" w:color="BFC9D6" w:sz="4"/>
               <w:left w:val="single" w:color="BFC9D6" w:sz="4"/>
@@ -7234,7 +7234,7 @@
         </w:tc>
         <w:tc>
           <w:tcPr>
-            <w:tcW w:type="dxa" w:w="2636"/>
+            <w:tcW w:type="dxa" w:w="3843"/>
             <w:tcBorders>
               <w:top w:val="single" w:color="BFC9D6" w:sz="4"/>
               <w:left w:val="single" w:color="BFC9D6" w:sz="4"/>
@@ -7282,7 +7282,7 @@
         </w:tc>
         <w:tc>
           <w:tcPr>
-            <w:tcW w:type="dxa" w:w="4639"/>
+            <w:tcW w:type="dxa" w:w="3608"/>
             <w:tcBorders>
               <w:top w:val="single" w:color="BFC9D6" w:sz="4"/>
               <w:left w:val="single" w:color="BFC9D6" w:sz="4"/>
@@ -7343,7 +7343,7 @@
         </w:tc>
         <w:tc>
           <w:tcPr>
-            <w:tcW w:type="dxa" w:w="1646"/>
+            <w:tcW w:type="dxa" w:w="1478"/>
             <w:tcBorders>
               <w:top w:val="single" w:color="BFC9D6" w:sz="4"/>
               <w:left w:val="single" w:color="BFC9D6" w:sz="4"/>
@@ -7398,7 +7398,7 @@
         </w:trPr>
         <w:tc>
           <w:tcPr>
-            <w:tcW w:type="dxa" w:w="943"/>
+            <w:tcW w:type="dxa" w:w="935"/>
             <w:tcBorders>
               <w:top w:val="single" w:color="BFC9D6" w:sz="4"/>
               <w:left w:val="single" w:color="BFC9D6" w:sz="4"/>
@@ -7434,7 +7434,7 @@
         </w:tc>
         <w:tc>
           <w:tcPr>
-            <w:tcW w:type="dxa" w:w="2636"/>
+            <w:tcW w:type="dxa" w:w="3843"/>
             <w:tcBorders>
               <w:top w:val="single" w:color="BFC9D6" w:sz="4"/>
               <w:left w:val="single" w:color="BFC9D6" w:sz="4"/>
@@ -7481,7 +7481,7 @@
         </w:tc>
         <w:tc>
           <w:tcPr>
-            <w:tcW w:type="dxa" w:w="4639"/>
+            <w:tcW w:type="dxa" w:w="3608"/>
             <w:tcBorders>
               <w:top w:val="single" w:color="BFC9D6" w:sz="4"/>
               <w:left w:val="single" w:color="BFC9D6" w:sz="4"/>
@@ -7565,7 +7565,7 @@
         </w:tc>
         <w:tc>
           <w:tcPr>
-            <w:tcW w:type="dxa" w:w="1646"/>
+            <w:tcW w:type="dxa" w:w="1478"/>
             <w:tcBorders>
               <w:top w:val="single" w:color="BFC9D6" w:sz="4"/>
               <w:left w:val="single" w:color="BFC9D6" w:sz="4"/>
@@ -7630,7 +7630,7 @@
         </w:trPr>
         <w:tc>
           <w:tcPr>
-            <w:tcW w:type="dxa" w:w="943"/>
+            <w:tcW w:type="dxa" w:w="935"/>
             <w:tcBorders>
               <w:top w:val="single" w:color="BFC9D6" w:sz="4"/>
               <w:left w:val="single" w:color="BFC9D6" w:sz="4"/>
@@ -7667,7 +7667,7 @@
         </w:tc>
         <w:tc>
           <w:tcPr>
-            <w:tcW w:type="dxa" w:w="2636"/>
+            <w:tcW w:type="dxa" w:w="3843"/>
             <w:tcBorders>
               <w:top w:val="single" w:color="BFC9D6" w:sz="4"/>
               <w:left w:val="single" w:color="BFC9D6" w:sz="4"/>
@@ -7739,7 +7739,7 @@
         </w:tc>
         <w:tc>
           <w:tcPr>
-            <w:tcW w:type="dxa" w:w="4639"/>
+            <w:tcW w:type="dxa" w:w="3608"/>
             <w:tcBorders>
               <w:top w:val="single" w:color="BFC9D6" w:sz="4"/>
               <w:left w:val="single" w:color="BFC9D6" w:sz="4"/>
@@ -7776,7 +7776,7 @@
         </w:tc>
         <w:tc>
           <w:tcPr>
-            <w:tcW w:type="dxa" w:w="1646"/>
+            <w:tcW w:type="dxa" w:w="1478"/>
             <w:tcBorders>
               <w:top w:val="single" w:color="BFC9D6" w:sz="4"/>
               <w:left w:val="single" w:color="BFC9D6" w:sz="4"/>
@@ -7842,7 +7842,7 @@
         </w:trPr>
         <w:tc>
           <w:tcPr>
-            <w:tcW w:type="dxa" w:w="943"/>
+            <w:tcW w:type="dxa" w:w="935"/>
             <w:tcBorders>
               <w:top w:val="single" w:color="BFC9D6" w:sz="4"/>
               <w:left w:val="single" w:color="BFC9D6" w:sz="4"/>
@@ -7878,7 +7878,7 @@
         </w:tc>
         <w:tc>
           <w:tcPr>
-            <w:tcW w:type="dxa" w:w="2636"/>
+            <w:tcW w:type="dxa" w:w="3843"/>
             <w:tcBorders>
               <w:top w:val="single" w:color="BFC9D6" w:sz="4"/>
               <w:left w:val="single" w:color="BFC9D6" w:sz="4"/>
@@ -7949,7 +7949,7 @@
         </w:tc>
         <w:tc>
           <w:tcPr>
-            <w:tcW w:type="dxa" w:w="4639"/>
+            <w:tcW w:type="dxa" w:w="3608"/>
             <w:tcBorders>
               <w:top w:val="single" w:color="BFC9D6" w:sz="4"/>
               <w:left w:val="single" w:color="BFC9D6" w:sz="4"/>
@@ -7985,7 +7985,7 @@
         </w:tc>
         <w:tc>
           <w:tcPr>
-            <w:tcW w:type="dxa" w:w="1646"/>
+            <w:tcW w:type="dxa" w:w="1478"/>
             <w:tcBorders>
               <w:top w:val="single" w:color="BFC9D6" w:sz="4"/>
               <w:left w:val="single" w:color="BFC9D6" w:sz="4"/>
@@ -8039,7 +8039,7 @@
         </w:trPr>
         <w:tc>
           <w:tcPr>
-            <w:tcW w:type="dxa" w:w="943"/>
+            <w:tcW w:type="dxa" w:w="935"/>
             <w:tcBorders>
               <w:top w:val="single" w:color="BFC9D6" w:sz="4"/>
               <w:left w:val="single" w:color="BFC9D6" w:sz="4"/>
@@ -8076,7 +8076,7 @@
         </w:tc>
         <w:tc>
           <w:tcPr>
-            <w:tcW w:type="dxa" w:w="2636"/>
+            <w:tcW w:type="dxa" w:w="3843"/>
             <w:tcBorders>
               <w:top w:val="single" w:color="BFC9D6" w:sz="4"/>
               <w:left w:val="single" w:color="BFC9D6" w:sz="4"/>
@@ -8170,7 +8170,7 @@
         </w:tc>
         <w:tc>
           <w:tcPr>
-            <w:tcW w:type="dxa" w:w="4639"/>
+            <w:tcW w:type="dxa" w:w="3608"/>
             <w:tcBorders>
               <w:top w:val="single" w:color="BFC9D6" w:sz="4"/>
               <w:left w:val="single" w:color="BFC9D6" w:sz="4"/>
@@ -8207,7 +8207,7 @@
         </w:tc>
         <w:tc>
           <w:tcPr>
-            <w:tcW w:type="dxa" w:w="1646"/>
+            <w:tcW w:type="dxa" w:w="1478"/>
             <w:tcBorders>
               <w:top w:val="single" w:color="BFC9D6" w:sz="4"/>
               <w:left w:val="single" w:color="BFC9D6" w:sz="4"/>
@@ -8262,7 +8262,7 @@
         </w:trPr>
         <w:tc>
           <w:tcPr>
-            <w:tcW w:type="dxa" w:w="943"/>
+            <w:tcW w:type="dxa" w:w="935"/>
             <w:tcBorders>
               <w:top w:val="single" w:color="BFC9D6" w:sz="4"/>
               <w:left w:val="single" w:color="BFC9D6" w:sz="4"/>
@@ -8298,7 +8298,7 @@
         </w:tc>
         <w:tc>
           <w:tcPr>
-            <w:tcW w:type="dxa" w:w="2636"/>
+            <w:tcW w:type="dxa" w:w="3843"/>
             <w:tcBorders>
               <w:top w:val="single" w:color="BFC9D6" w:sz="4"/>
               <w:left w:val="single" w:color="BFC9D6" w:sz="4"/>
@@ -8389,7 +8389,7 @@
         </w:tc>
         <w:tc>
           <w:tcPr>
-            <w:tcW w:type="dxa" w:w="4639"/>
+            <w:tcW w:type="dxa" w:w="3608"/>
             <w:tcBorders>
               <w:top w:val="single" w:color="BFC9D6" w:sz="4"/>
               <w:left w:val="single" w:color="BFC9D6" w:sz="4"/>
@@ -8425,7 +8425,7 @@
         </w:tc>
         <w:tc>
           <w:tcPr>
-            <w:tcW w:type="dxa" w:w="1646"/>
+            <w:tcW w:type="dxa" w:w="1478"/>
             <w:tcBorders>
               <w:top w:val="single" w:color="BFC9D6" w:sz="4"/>
               <w:left w:val="single" w:color="BFC9D6" w:sz="4"/>
@@ -8479,7 +8479,7 @@
         </w:trPr>
         <w:tc>
           <w:tcPr>
-            <w:tcW w:type="dxa" w:w="943"/>
+            <w:tcW w:type="dxa" w:w="935"/>
             <w:tcBorders>
               <w:top w:val="single" w:color="BFC9D6" w:sz="4"/>
               <w:left w:val="single" w:color="BFC9D6" w:sz="4"/>
@@ -8516,7 +8516,7 @@
         </w:tc>
         <w:tc>
           <w:tcPr>
-            <w:tcW w:type="dxa" w:w="2636"/>
+            <w:tcW w:type="dxa" w:w="3843"/>
             <w:tcBorders>
               <w:top w:val="single" w:color="BFC9D6" w:sz="4"/>
               <w:left w:val="single" w:color="BFC9D6" w:sz="4"/>
@@ -8586,7 +8586,7 @@
         </w:tc>
         <w:tc>
           <w:tcPr>
-            <w:tcW w:type="dxa" w:w="4639"/>
+            <w:tcW w:type="dxa" w:w="3608"/>
             <w:tcBorders>
               <w:top w:val="single" w:color="BFC9D6" w:sz="4"/>
               <w:left w:val="single" w:color="BFC9D6" w:sz="4"/>
@@ -8623,7 +8623,7 @@
         </w:tc>
         <w:tc>
           <w:tcPr>
-            <w:tcW w:type="dxa" w:w="1646"/>
+            <w:tcW w:type="dxa" w:w="1478"/>
             <w:tcBorders>
               <w:top w:val="single" w:color="BFC9D6" w:sz="4"/>
               <w:left w:val="single" w:color="BFC9D6" w:sz="4"/>
@@ -8678,7 +8678,7 @@
         </w:trPr>
         <w:tc>
           <w:tcPr>
-            <w:tcW w:type="dxa" w:w="943"/>
+            <w:tcW w:type="dxa" w:w="935"/>
             <w:tcBorders>
               <w:top w:val="single" w:color="BFC9D6" w:sz="4"/>
               <w:left w:val="single" w:color="BFC9D6" w:sz="4"/>
@@ -8714,7 +8714,7 @@
         </w:tc>
         <w:tc>
           <w:tcPr>
-            <w:tcW w:type="dxa" w:w="2636"/>
+            <w:tcW w:type="dxa" w:w="3843"/>
             <w:tcBorders>
               <w:top w:val="single" w:color="BFC9D6" w:sz="4"/>
               <w:left w:val="single" w:color="BFC9D6" w:sz="4"/>
@@ -8831,7 +8831,7 @@
         </w:tc>
         <w:tc>
           <w:tcPr>
-            <w:tcW w:type="dxa" w:w="4639"/>
+            <w:tcW w:type="dxa" w:w="3608"/>
             <w:tcBorders>
               <w:top w:val="single" w:color="BFC9D6" w:sz="4"/>
               <w:left w:val="single" w:color="BFC9D6" w:sz="4"/>
@@ -8867,7 +8867,7 @@
         </w:tc>
         <w:tc>
           <w:tcPr>
-            <w:tcW w:type="dxa" w:w="1646"/>
+            <w:tcW w:type="dxa" w:w="1478"/>
             <w:tcBorders>
               <w:top w:val="single" w:color="BFC9D6" w:sz="4"/>
               <w:left w:val="single" w:color="BFC9D6" w:sz="4"/>
@@ -8908,7 +8908,7 @@
         </w:trPr>
         <w:tc>
           <w:tcPr>
-            <w:tcW w:type="dxa" w:w="943"/>
+            <w:tcW w:type="dxa" w:w="935"/>
             <w:tcBorders>
               <w:top w:val="single" w:color="BFC9D6" w:sz="4"/>
               <w:left w:val="single" w:color="BFC9D6" w:sz="4"/>
@@ -8945,7 +8945,7 @@
         </w:tc>
         <w:tc>
           <w:tcPr>
-            <w:tcW w:type="dxa" w:w="2636"/>
+            <w:tcW w:type="dxa" w:w="3843"/>
             <w:tcBorders>
               <w:top w:val="single" w:color="BFC9D6" w:sz="4"/>
               <w:left w:val="single" w:color="BFC9D6" w:sz="4"/>
@@ -9109,7 +9109,7 @@
         </w:tc>
         <w:tc>
           <w:tcPr>
-            <w:tcW w:type="dxa" w:w="4639"/>
+            <w:tcW w:type="dxa" w:w="3608"/>
             <w:tcBorders>
               <w:top w:val="single" w:color="BFC9D6" w:sz="4"/>
               <w:left w:val="single" w:color="BFC9D6" w:sz="4"/>
@@ -9146,7 +9146,7 @@
         </w:tc>
         <w:tc>
           <w:tcPr>
-            <w:tcW w:type="dxa" w:w="1646"/>
+            <w:tcW w:type="dxa" w:w="1478"/>
             <w:tcBorders>
               <w:top w:val="single" w:color="BFC9D6" w:sz="4"/>
               <w:left w:val="single" w:color="BFC9D6" w:sz="4"/>
@@ -9177,7 +9177,29 @@
                 <w:szCs w:val="18"/>
                 <w:rtl/>
               </w:rPr>
-              <w:t xml:space="preserve">مبني، والفحص الكامل ناجح (5991dad)؛ الافتراضات بانتظار الاعتماد</w:t>
+              <w:t xml:space="preserve">مبني، والفحص الكامل ناجح (5991dad)؛ </w:t>
+            </w:r>
+            <w:r>
+              <w:rPr>
+                <w:rFonts w:ascii="Arial" w:cs="Arial" w:eastAsia="Arial" w:hAnsi="Arial"/>
+                <w:b/>
+                <w:bCs/>
+                <w:sz w:val="18"/>
+                <w:szCs w:val="18"/>
+                <w:rtl/>
+              </w:rPr>
+              <w:t xml:space="preserve">اعتمد المالك الافتراضات OQ-1 إلى OQ-19 في 2026-10-23</w:t>
+            </w:r>
+            <w:r>
+              <w:rPr>
+                <w:rFonts w:ascii="Arial" w:cs="Arial" w:eastAsia="Arial" w:hAnsi="Arial"/>
+                <w:b w:val="false"/>
+                <w:bCs w:val="false"/>
+                <w:sz w:val="18"/>
+                <w:szCs w:val="18"/>
+                <w:rtl/>
+              </w:rPr>
+              <w:t xml:space="preserve"> («موافق أنا على افتراضاتك»)</w:t>
             </w:r>
           </w:p>
         </w:tc>
@@ -9188,7 +9210,7 @@
         </w:trPr>
         <w:tc>
           <w:tcPr>
-            <w:tcW w:type="dxa" w:w="943"/>
+            <w:tcW w:type="dxa" w:w="935"/>
             <w:tcBorders>
               <w:top w:val="single" w:color="BFC9D6" w:sz="4"/>
               <w:left w:val="single" w:color="BFC9D6" w:sz="4"/>
@@ -9224,7 +9246,7 @@
         </w:tc>
         <w:tc>
           <w:tcPr>
-            <w:tcW w:type="dxa" w:w="2636"/>
+            <w:tcW w:type="dxa" w:w="3843"/>
             <w:tcBorders>
               <w:top w:val="single" w:color="BFC9D6" w:sz="4"/>
               <w:left w:val="single" w:color="BFC9D6" w:sz="4"/>
@@ -9343,7 +9365,7 @@
         </w:tc>
         <w:tc>
           <w:tcPr>
-            <w:tcW w:type="dxa" w:w="4639"/>
+            <w:tcW w:type="dxa" w:w="3608"/>
             <w:tcBorders>
               <w:top w:val="single" w:color="BFC9D6" w:sz="4"/>
               <w:left w:val="single" w:color="BFC9D6" w:sz="4"/>
@@ -9379,37 +9401,696 @@
         </w:tc>
         <w:tc>
           <w:tcPr>
-            <w:tcW w:type="dxa" w:w="1646"/>
-            <w:tcBorders>
-              <w:top w:val="single" w:color="BFC9D6" w:sz="4"/>
-              <w:left w:val="single" w:color="BFC9D6" w:sz="4"/>
-              <w:bottom w:val="single" w:color="BFC9D6" w:sz="4"/>
-              <w:right w:val="single" w:color="BFC9D6" w:sz="4"/>
-            </w:tcBorders>
-            <w:tcMar>
-              <w:top w:type="dxa" w:w="50"/>
-              <w:left w:type="dxa" w:w="90"/>
-              <w:bottom w:type="dxa" w:w="50"/>
-              <w:right w:type="dxa" w:w="90"/>
-            </w:tcMar>
-            <w:vAlign w:val="top"/>
-          </w:tcPr>
-          <w:p>
-            <w:pPr>
-              <w:keepNext w:val="false"/>
-              <w:bidi/>
-              <w:spacing w:after="30" w:before="30" w:line="264"/>
-            </w:pPr>
-            <w:r>
-              <w:rPr>
-                <w:rFonts w:ascii="Arial" w:cs="Arial" w:eastAsia="Arial" w:hAnsi="Arial"/>
-                <w:b w:val="false"/>
-                <w:bCs w:val="false"/>
-                <w:sz w:val="18"/>
-                <w:szCs w:val="18"/>
-                <w:rtl/>
-              </w:rPr>
-              <w:t xml:space="preserve">مبني ومختبر؛ الاختيارات الثلاثة بانتظار تأكيد المالك</w:t>
+            <w:tcW w:type="dxa" w:w="1478"/>
+            <w:tcBorders>
+              <w:top w:val="single" w:color="BFC9D6" w:sz="4"/>
+              <w:left w:val="single" w:color="BFC9D6" w:sz="4"/>
+              <w:bottom w:val="single" w:color="BFC9D6" w:sz="4"/>
+              <w:right w:val="single" w:color="BFC9D6" w:sz="4"/>
+            </w:tcBorders>
+            <w:tcMar>
+              <w:top w:type="dxa" w:w="50"/>
+              <w:left w:type="dxa" w:w="90"/>
+              <w:bottom w:type="dxa" w:w="50"/>
+              <w:right w:type="dxa" w:w="90"/>
+            </w:tcMar>
+            <w:vAlign w:val="top"/>
+          </w:tcPr>
+          <w:p>
+            <w:pPr>
+              <w:keepNext w:val="false"/>
+              <w:bidi/>
+              <w:spacing w:after="30" w:before="30" w:line="264"/>
+            </w:pPr>
+            <w:r>
+              <w:rPr>
+                <w:rFonts w:ascii="Arial" w:cs="Arial" w:eastAsia="Arial" w:hAnsi="Arial"/>
+                <w:b w:val="false"/>
+                <w:bCs w:val="false"/>
+                <w:sz w:val="18"/>
+                <w:szCs w:val="18"/>
+                <w:rtl/>
+              </w:rPr>
+              <w:t xml:space="preserve">مبني ومختبر؛ </w:t>
+            </w:r>
+            <w:r>
+              <w:rPr>
+                <w:rFonts w:ascii="Arial" w:cs="Arial" w:eastAsia="Arial" w:hAnsi="Arial"/>
+                <w:b/>
+                <w:bCs/>
+                <w:sz w:val="18"/>
+                <w:szCs w:val="18"/>
+                <w:rtl/>
+              </w:rPr>
+              <w:t xml:space="preserve">اعتمد المالك الاختيارات الثلاثة في 2026-10-23</w:t>
+            </w:r>
+          </w:p>
+        </w:tc>
+      </w:tr>
+      <w:tr>
+        <w:trPr>
+          <w:cantSplit/>
+        </w:trPr>
+        <w:tc>
+          <w:tcPr>
+            <w:tcW w:type="dxa" w:w="935"/>
+            <w:tcBorders>
+              <w:top w:val="single" w:color="BFC9D6" w:sz="4"/>
+              <w:left w:val="single" w:color="BFC9D6" w:sz="4"/>
+              <w:bottom w:val="single" w:color="BFC9D6" w:sz="4"/>
+              <w:right w:val="single" w:color="BFC9D6" w:sz="4"/>
+            </w:tcBorders>
+            <w:shd w:fill="F5F8FC" w:color="auto" w:val="clear"/>
+            <w:tcMar>
+              <w:top w:type="dxa" w:w="50"/>
+              <w:left w:type="dxa" w:w="90"/>
+              <w:bottom w:type="dxa" w:w="50"/>
+              <w:right w:type="dxa" w:w="90"/>
+            </w:tcMar>
+            <w:vAlign w:val="top"/>
+          </w:tcPr>
+          <w:p>
+            <w:pPr>
+              <w:keepNext w:val="false"/>
+              <w:bidi/>
+              <w:spacing w:after="30" w:before="30" w:line="264"/>
+            </w:pPr>
+            <w:r>
+              <w:rPr>
+                <w:rFonts w:ascii="Arial" w:cs="Arial" w:eastAsia="Arial" w:hAnsi="Arial"/>
+                <w:b w:val="false"/>
+                <w:bCs w:val="false"/>
+                <w:sz w:val="18"/>
+                <w:szCs w:val="18"/>
+                <w:rtl/>
+              </w:rPr>
+              <w:t xml:space="preserve">44</w:t>
+            </w:r>
+          </w:p>
+        </w:tc>
+        <w:tc>
+          <w:tcPr>
+            <w:tcW w:type="dxa" w:w="3843"/>
+            <w:tcBorders>
+              <w:top w:val="single" w:color="BFC9D6" w:sz="4"/>
+              <w:left w:val="single" w:color="BFC9D6" w:sz="4"/>
+              <w:bottom w:val="single" w:color="BFC9D6" w:sz="4"/>
+              <w:right w:val="single" w:color="BFC9D6" w:sz="4"/>
+            </w:tcBorders>
+            <w:shd w:fill="F5F8FC" w:color="auto" w:val="clear"/>
+            <w:tcMar>
+              <w:top w:type="dxa" w:w="50"/>
+              <w:left w:type="dxa" w:w="90"/>
+              <w:bottom w:type="dxa" w:w="50"/>
+              <w:right w:type="dxa" w:w="90"/>
+            </w:tcMar>
+            <w:vAlign w:val="top"/>
+          </w:tcPr>
+          <w:p>
+            <w:pPr>
+              <w:keepNext w:val="false"/>
+              <w:bidi/>
+              <w:spacing w:after="30" w:before="30" w:line="264"/>
+            </w:pPr>
+            <w:r>
+              <w:rPr>
+                <w:rFonts w:ascii="Arial" w:cs="Arial" w:eastAsia="Arial" w:hAnsi="Arial"/>
+                <w:b/>
+                <w:bCs/>
+                <w:sz w:val="18"/>
+                <w:szCs w:val="18"/>
+                <w:rtl/>
+              </w:rPr>
+              <w:t xml:space="preserve">احتساب كل طلب وموافقة من وقت وصوله (2026-10-23).</w:t>
+            </w:r>
+            <w:r>
+              <w:rPr>
+                <w:rFonts w:ascii="Arial" w:cs="Arial" w:eastAsia="Arial" w:hAnsi="Arial"/>
+                <w:b w:val="false"/>
+                <w:bCs w:val="false"/>
+                <w:sz w:val="18"/>
+                <w:szCs w:val="18"/>
+                <w:rtl/>
+              </w:rPr>
+              <w:t xml:space="preserve"> «لكل طلب وموافقة يُحتسب من وقت وصوله، ويُعمل عليه لكل طلب بشكل منفصل». المهلة (SLA) والتذكير والتصعيد تُحسب لكل طلب ولكل خانة موافقة من لحظة وصولها إليها، مستقلة عن غيرها. يُراجَع التنفيذ الحالي عليه عند الاستئناف: المهلة اليوم من دخول المرحلة (RequestStageInstance.EnteredAt)، والتذكير من إشعار كل خانة</w:t>
+            </w:r>
+          </w:p>
+        </w:tc>
+        <w:tc>
+          <w:tcPr>
+            <w:tcW w:type="dxa" w:w="3608"/>
+            <w:tcBorders>
+              <w:top w:val="single" w:color="BFC9D6" w:sz="4"/>
+              <w:left w:val="single" w:color="BFC9D6" w:sz="4"/>
+              <w:bottom w:val="single" w:color="BFC9D6" w:sz="4"/>
+              <w:right w:val="single" w:color="BFC9D6" w:sz="4"/>
+            </w:tcBorders>
+            <w:shd w:fill="F5F8FC" w:color="auto" w:val="clear"/>
+            <w:tcMar>
+              <w:top w:type="dxa" w:w="50"/>
+              <w:left w:type="dxa" w:w="90"/>
+              <w:bottom w:type="dxa" w:w="50"/>
+              <w:right w:type="dxa" w:w="90"/>
+            </w:tcMar>
+            <w:vAlign w:val="top"/>
+          </w:tcPr>
+          <w:p>
+            <w:pPr>
+              <w:keepNext w:val="false"/>
+              <w:bidi/>
+              <w:spacing w:after="30" w:before="30" w:line="264"/>
+            </w:pPr>
+            <w:r>
+              <w:rPr>
+                <w:rFonts w:ascii="Arial" w:cs="Arial" w:eastAsia="Arial" w:hAnsi="Arial"/>
+                <w:b w:val="false"/>
+                <w:bCs w:val="false"/>
+                <w:sz w:val="18"/>
+                <w:szCs w:val="18"/>
+                <w:rtl/>
+              </w:rPr>
+              <w:t xml:space="preserve">محرك سير العمل والمهل والتذكير</w:t>
+            </w:r>
+          </w:p>
+        </w:tc>
+        <w:tc>
+          <w:tcPr>
+            <w:tcW w:type="dxa" w:w="1478"/>
+            <w:tcBorders>
+              <w:top w:val="single" w:color="BFC9D6" w:sz="4"/>
+              <w:left w:val="single" w:color="BFC9D6" w:sz="4"/>
+              <w:bottom w:val="single" w:color="BFC9D6" w:sz="4"/>
+              <w:right w:val="single" w:color="BFC9D6" w:sz="4"/>
+            </w:tcBorders>
+            <w:shd w:fill="F5F8FC" w:color="auto" w:val="clear"/>
+            <w:tcMar>
+              <w:top w:type="dxa" w:w="50"/>
+              <w:left w:type="dxa" w:w="90"/>
+              <w:bottom w:type="dxa" w:w="50"/>
+              <w:right w:type="dxa" w:w="90"/>
+            </w:tcMar>
+            <w:vAlign w:val="top"/>
+          </w:tcPr>
+          <w:p>
+            <w:pPr>
+              <w:keepNext w:val="false"/>
+              <w:bidi/>
+              <w:spacing w:after="30" w:before="30" w:line="264"/>
+            </w:pPr>
+            <w:r>
+              <w:rPr>
+                <w:rFonts w:ascii="Arial" w:cs="Arial" w:eastAsia="Arial" w:hAnsi="Arial"/>
+                <w:b w:val="false"/>
+                <w:bCs w:val="false"/>
+                <w:sz w:val="18"/>
+                <w:szCs w:val="18"/>
+                <w:rtl/>
+              </w:rPr>
+              <w:t xml:space="preserve">يُراجَع ويُختبر عند الاستئناف</w:t>
+            </w:r>
+          </w:p>
+        </w:tc>
+      </w:tr>
+      <w:tr>
+        <w:trPr>
+          <w:cantSplit/>
+        </w:trPr>
+        <w:tc>
+          <w:tcPr>
+            <w:tcW w:type="dxa" w:w="935"/>
+            <w:tcBorders>
+              <w:top w:val="single" w:color="BFC9D6" w:sz="4"/>
+              <w:left w:val="single" w:color="BFC9D6" w:sz="4"/>
+              <w:bottom w:val="single" w:color="BFC9D6" w:sz="4"/>
+              <w:right w:val="single" w:color="BFC9D6" w:sz="4"/>
+            </w:tcBorders>
+            <w:tcMar>
+              <w:top w:type="dxa" w:w="50"/>
+              <w:left w:type="dxa" w:w="90"/>
+              <w:bottom w:type="dxa" w:w="50"/>
+              <w:right w:type="dxa" w:w="90"/>
+            </w:tcMar>
+            <w:vAlign w:val="top"/>
+          </w:tcPr>
+          <w:p>
+            <w:pPr>
+              <w:keepNext w:val="false"/>
+              <w:bidi/>
+              <w:spacing w:after="30" w:before="30" w:line="264"/>
+            </w:pPr>
+            <w:r>
+              <w:rPr>
+                <w:rFonts w:ascii="Arial" w:cs="Arial" w:eastAsia="Arial" w:hAnsi="Arial"/>
+                <w:b w:val="false"/>
+                <w:bCs w:val="false"/>
+                <w:sz w:val="18"/>
+                <w:szCs w:val="18"/>
+                <w:rtl/>
+              </w:rPr>
+              <w:t xml:space="preserve">45</w:t>
+            </w:r>
+          </w:p>
+        </w:tc>
+        <w:tc>
+          <w:tcPr>
+            <w:tcW w:type="dxa" w:w="3843"/>
+            <w:tcBorders>
+              <w:top w:val="single" w:color="BFC9D6" w:sz="4"/>
+              <w:left w:val="single" w:color="BFC9D6" w:sz="4"/>
+              <w:bottom w:val="single" w:color="BFC9D6" w:sz="4"/>
+              <w:right w:val="single" w:color="BFC9D6" w:sz="4"/>
+            </w:tcBorders>
+            <w:tcMar>
+              <w:top w:type="dxa" w:w="50"/>
+              <w:left w:type="dxa" w:w="90"/>
+              <w:bottom w:type="dxa" w:w="50"/>
+              <w:right w:type="dxa" w:w="90"/>
+            </w:tcMar>
+            <w:vAlign w:val="top"/>
+          </w:tcPr>
+          <w:p>
+            <w:pPr>
+              <w:keepNext w:val="false"/>
+              <w:bidi/>
+              <w:spacing w:after="30" w:before="30" w:line="264"/>
+            </w:pPr>
+            <w:r>
+              <w:rPr>
+                <w:rFonts w:ascii="Arial" w:cs="Arial" w:eastAsia="Arial" w:hAnsi="Arial"/>
+                <w:b/>
+                <w:bCs/>
+                <w:sz w:val="18"/>
+                <w:szCs w:val="18"/>
+                <w:rtl/>
+              </w:rPr>
+              <w:t xml:space="preserve">الخيارات عبر الإعدادات لا مقفلة برمجيًا (2026-10-23).</w:t>
+            </w:r>
+            <w:r>
+              <w:rPr>
+                <w:rFonts w:ascii="Arial" w:cs="Arial" w:eastAsia="Arial" w:hAnsi="Arial"/>
+                <w:b w:val="false"/>
+                <w:bCs w:val="false"/>
+                <w:sz w:val="18"/>
+                <w:szCs w:val="18"/>
+                <w:rtl/>
+              </w:rPr>
+              <w:t xml:space="preserve"> «أي خيار يُفضَّل أن يكون بناؤه عبر الإعدادات وليس مقفلًا برمجيًا». مبدأ للبناء كله: كل اختيار سلوك (مدة، حد، تفعيل، صيغة، قائمة) إعداد للمشترك أو بند كتالوج له قيمة افتراضية، لا ثابت في الشيفرة. يُراجَع ما بُني على ذلك عند الاستئناف، ومنه: صيغة مرجع التسهيل وفئاته، وعدد مرات إعادة التشغيل عند الجمود، وقائمة فئات التسهيل في الواجهة</w:t>
+            </w:r>
+          </w:p>
+        </w:tc>
+        <w:tc>
+          <w:tcPr>
+            <w:tcW w:type="dxa" w:w="3608"/>
+            <w:tcBorders>
+              <w:top w:val="single" w:color="BFC9D6" w:sz="4"/>
+              <w:left w:val="single" w:color="BFC9D6" w:sz="4"/>
+              <w:bottom w:val="single" w:color="BFC9D6" w:sz="4"/>
+              <w:right w:val="single" w:color="BFC9D6" w:sz="4"/>
+            </w:tcBorders>
+            <w:tcMar>
+              <w:top w:type="dxa" w:w="50"/>
+              <w:left w:type="dxa" w:w="90"/>
+              <w:bottom w:type="dxa" w:w="50"/>
+              <w:right w:type="dxa" w:w="90"/>
+            </w:tcMar>
+            <w:vAlign w:val="top"/>
+          </w:tcPr>
+          <w:p>
+            <w:pPr>
+              <w:keepNext w:val="false"/>
+              <w:bidi/>
+              <w:spacing w:after="30" w:before="30" w:line="264"/>
+            </w:pPr>
+            <w:r>
+              <w:rPr>
+                <w:rFonts w:ascii="Arial" w:cs="Arial" w:eastAsia="Arial" w:hAnsi="Arial"/>
+                <w:b w:val="false"/>
+                <w:bCs w:val="false"/>
+                <w:sz w:val="18"/>
+                <w:szCs w:val="18"/>
+                <w:rtl/>
+              </w:rPr>
+              <w:t xml:space="preserve">كل الوحدات</w:t>
+            </w:r>
+          </w:p>
+        </w:tc>
+        <w:tc>
+          <w:tcPr>
+            <w:tcW w:type="dxa" w:w="1478"/>
+            <w:tcBorders>
+              <w:top w:val="single" w:color="BFC9D6" w:sz="4"/>
+              <w:left w:val="single" w:color="BFC9D6" w:sz="4"/>
+              <w:bottom w:val="single" w:color="BFC9D6" w:sz="4"/>
+              <w:right w:val="single" w:color="BFC9D6" w:sz="4"/>
+            </w:tcBorders>
+            <w:tcMar>
+              <w:top w:type="dxa" w:w="50"/>
+              <w:left w:type="dxa" w:w="90"/>
+              <w:bottom w:type="dxa" w:w="50"/>
+              <w:right w:type="dxa" w:w="90"/>
+            </w:tcMar>
+            <w:vAlign w:val="top"/>
+          </w:tcPr>
+          <w:p>
+            <w:pPr>
+              <w:keepNext w:val="false"/>
+              <w:bidi/>
+              <w:spacing w:after="30" w:before="30" w:line="264"/>
+            </w:pPr>
+            <w:r>
+              <w:rPr>
+                <w:rFonts w:ascii="Arial" w:cs="Arial" w:eastAsia="Arial" w:hAnsi="Arial"/>
+                <w:b w:val="false"/>
+                <w:bCs w:val="false"/>
+                <w:sz w:val="18"/>
+                <w:szCs w:val="18"/>
+                <w:rtl/>
+              </w:rPr>
+              <w:t xml:space="preserve">مبدأ معتمد؛ المراجعة عند الاستئناف</w:t>
+            </w:r>
+          </w:p>
+        </w:tc>
+      </w:tr>
+      <w:tr>
+        <w:trPr>
+          <w:cantSplit/>
+        </w:trPr>
+        <w:tc>
+          <w:tcPr>
+            <w:tcW w:type="dxa" w:w="935"/>
+            <w:tcBorders>
+              <w:top w:val="single" w:color="BFC9D6" w:sz="4"/>
+              <w:left w:val="single" w:color="BFC9D6" w:sz="4"/>
+              <w:bottom w:val="single" w:color="BFC9D6" w:sz="4"/>
+              <w:right w:val="single" w:color="BFC9D6" w:sz="4"/>
+            </w:tcBorders>
+            <w:shd w:fill="F5F8FC" w:color="auto" w:val="clear"/>
+            <w:tcMar>
+              <w:top w:type="dxa" w:w="50"/>
+              <w:left w:type="dxa" w:w="90"/>
+              <w:bottom w:type="dxa" w:w="50"/>
+              <w:right w:type="dxa" w:w="90"/>
+            </w:tcMar>
+            <w:vAlign w:val="top"/>
+          </w:tcPr>
+          <w:p>
+            <w:pPr>
+              <w:keepNext w:val="false"/>
+              <w:bidi/>
+              <w:spacing w:after="30" w:before="30" w:line="264"/>
+            </w:pPr>
+            <w:r>
+              <w:rPr>
+                <w:rFonts w:ascii="Arial" w:cs="Arial" w:eastAsia="Arial" w:hAnsi="Arial"/>
+                <w:b w:val="false"/>
+                <w:bCs w:val="false"/>
+                <w:sz w:val="18"/>
+                <w:szCs w:val="18"/>
+                <w:rtl/>
+              </w:rPr>
+              <w:t xml:space="preserve">46</w:t>
+            </w:r>
+          </w:p>
+        </w:tc>
+        <w:tc>
+          <w:tcPr>
+            <w:tcW w:type="dxa" w:w="3843"/>
+            <w:tcBorders>
+              <w:top w:val="single" w:color="BFC9D6" w:sz="4"/>
+              <w:left w:val="single" w:color="BFC9D6" w:sz="4"/>
+              <w:bottom w:val="single" w:color="BFC9D6" w:sz="4"/>
+              <w:right w:val="single" w:color="BFC9D6" w:sz="4"/>
+            </w:tcBorders>
+            <w:shd w:fill="F5F8FC" w:color="auto" w:val="clear"/>
+            <w:tcMar>
+              <w:top w:type="dxa" w:w="50"/>
+              <w:left w:type="dxa" w:w="90"/>
+              <w:bottom w:type="dxa" w:w="50"/>
+              <w:right w:type="dxa" w:w="90"/>
+            </w:tcMar>
+            <w:vAlign w:val="top"/>
+          </w:tcPr>
+          <w:p>
+            <w:pPr>
+              <w:keepNext w:val="false"/>
+              <w:bidi/>
+              <w:spacing w:after="30" w:before="30" w:line="264"/>
+            </w:pPr>
+            <w:r>
+              <w:rPr>
+                <w:rFonts w:ascii="Arial" w:cs="Arial" w:eastAsia="Arial" w:hAnsi="Arial"/>
+                <w:b/>
+                <w:bCs/>
+                <w:sz w:val="18"/>
+                <w:szCs w:val="18"/>
+                <w:rtl/>
+              </w:rPr>
+              <w:t xml:space="preserve">الدخول برقم المنشأة ورقم المستخدم وكلمة مرور من المسؤول (2026-10-23).</w:t>
+            </w:r>
+            <w:r>
+              <w:rPr>
+                <w:rFonts w:ascii="Arial" w:cs="Arial" w:eastAsia="Arial" w:hAnsi="Arial"/>
+                <w:b w:val="false"/>
+                <w:bCs w:val="false"/>
+                <w:sz w:val="18"/>
+                <w:szCs w:val="18"/>
+                <w:rtl/>
+              </w:rPr>
+              <w:t xml:space="preserve"> يدخل المستخدم بثلاثة: رقم تعريف الشركة أو المنظمة أو المنشأة (المشترك)، ورقم تعريف المستخدم، وكلمة مرور يرسلها له مسؤول الحساب، ويجب تغييرها عند الدخول أول مرة. وصلاحيات المستخدمين تُدار من المسؤول. يختلف هذا عن المبني في S0 (المشترك بالنطاق الفرعي، والدخول بالبريد، وكلمة المرور يضعها المستخدم من رابط الدعوة، ثم التحقق بخطوتين)؛ فيُبنى عند الاستئناف مع إبقاء التحقق بخطوتين ما لم يقرر المالك غير ذلك</w:t>
+            </w:r>
+          </w:p>
+        </w:tc>
+        <w:tc>
+          <w:tcPr>
+            <w:tcW w:type="dxa" w:w="3608"/>
+            <w:tcBorders>
+              <w:top w:val="single" w:color="BFC9D6" w:sz="4"/>
+              <w:left w:val="single" w:color="BFC9D6" w:sz="4"/>
+              <w:bottom w:val="single" w:color="BFC9D6" w:sz="4"/>
+              <w:right w:val="single" w:color="BFC9D6" w:sz="4"/>
+            </w:tcBorders>
+            <w:shd w:fill="F5F8FC" w:color="auto" w:val="clear"/>
+            <w:tcMar>
+              <w:top w:type="dxa" w:w="50"/>
+              <w:left w:type="dxa" w:w="90"/>
+              <w:bottom w:type="dxa" w:w="50"/>
+              <w:right w:type="dxa" w:w="90"/>
+            </w:tcMar>
+            <w:vAlign w:val="top"/>
+          </w:tcPr>
+          <w:p>
+            <w:pPr>
+              <w:keepNext w:val="false"/>
+              <w:bidi/>
+              <w:spacing w:after="30" w:before="30" w:line="264"/>
+            </w:pPr>
+            <w:r>
+              <w:rPr>
+                <w:rFonts w:ascii="Arial" w:cs="Arial" w:eastAsia="Arial" w:hAnsi="Arial"/>
+                <w:b w:val="false"/>
+                <w:bCs w:val="false"/>
+                <w:sz w:val="18"/>
+                <w:szCs w:val="18"/>
+                <w:rtl/>
+              </w:rPr>
+              <w:t xml:space="preserve">المنصة: الدخول والمستخدمون (S0)</w:t>
+            </w:r>
+          </w:p>
+        </w:tc>
+        <w:tc>
+          <w:tcPr>
+            <w:tcW w:type="dxa" w:w="1478"/>
+            <w:tcBorders>
+              <w:top w:val="single" w:color="BFC9D6" w:sz="4"/>
+              <w:left w:val="single" w:color="BFC9D6" w:sz="4"/>
+              <w:bottom w:val="single" w:color="BFC9D6" w:sz="4"/>
+              <w:right w:val="single" w:color="BFC9D6" w:sz="4"/>
+            </w:tcBorders>
+            <w:shd w:fill="F5F8FC" w:color="auto" w:val="clear"/>
+            <w:tcMar>
+              <w:top w:type="dxa" w:w="50"/>
+              <w:left w:type="dxa" w:w="90"/>
+              <w:bottom w:type="dxa" w:w="50"/>
+              <w:right w:type="dxa" w:w="90"/>
+            </w:tcMar>
+            <w:vAlign w:val="top"/>
+          </w:tcPr>
+          <w:p>
+            <w:pPr>
+              <w:keepNext w:val="false"/>
+              <w:bidi/>
+              <w:spacing w:after="30" w:before="30" w:line="264"/>
+            </w:pPr>
+            <w:r>
+              <w:rPr>
+                <w:rFonts w:ascii="Arial" w:cs="Arial" w:eastAsia="Arial" w:hAnsi="Arial"/>
+                <w:b w:val="false"/>
+                <w:bCs w:val="false"/>
+                <w:sz w:val="18"/>
+                <w:szCs w:val="18"/>
+                <w:rtl/>
+              </w:rPr>
+              <w:t xml:space="preserve">يُبنى عند الاستئناف</w:t>
+            </w:r>
+          </w:p>
+        </w:tc>
+      </w:tr>
+      <w:tr>
+        <w:trPr>
+          <w:cantSplit/>
+        </w:trPr>
+        <w:tc>
+          <w:tcPr>
+            <w:tcW w:type="dxa" w:w="935"/>
+            <w:tcBorders>
+              <w:top w:val="single" w:color="BFC9D6" w:sz="4"/>
+              <w:left w:val="single" w:color="BFC9D6" w:sz="4"/>
+              <w:bottom w:val="single" w:color="BFC9D6" w:sz="4"/>
+              <w:right w:val="single" w:color="BFC9D6" w:sz="4"/>
+            </w:tcBorders>
+            <w:tcMar>
+              <w:top w:type="dxa" w:w="50"/>
+              <w:left w:type="dxa" w:w="90"/>
+              <w:bottom w:type="dxa" w:w="50"/>
+              <w:right w:type="dxa" w:w="90"/>
+            </w:tcMar>
+            <w:vAlign w:val="top"/>
+          </w:tcPr>
+          <w:p>
+            <w:pPr>
+              <w:keepNext w:val="false"/>
+              <w:bidi/>
+              <w:spacing w:after="30" w:before="30" w:line="264"/>
+            </w:pPr>
+            <w:r>
+              <w:rPr>
+                <w:rFonts w:ascii="Arial" w:cs="Arial" w:eastAsia="Arial" w:hAnsi="Arial"/>
+                <w:b w:val="false"/>
+                <w:bCs w:val="false"/>
+                <w:sz w:val="18"/>
+                <w:szCs w:val="18"/>
+                <w:rtl/>
+              </w:rPr>
+              <w:t xml:space="preserve">47</w:t>
+            </w:r>
+          </w:p>
+        </w:tc>
+        <w:tc>
+          <w:tcPr>
+            <w:tcW w:type="dxa" w:w="3843"/>
+            <w:tcBorders>
+              <w:top w:val="single" w:color="BFC9D6" w:sz="4"/>
+              <w:left w:val="single" w:color="BFC9D6" w:sz="4"/>
+              <w:bottom w:val="single" w:color="BFC9D6" w:sz="4"/>
+              <w:right w:val="single" w:color="BFC9D6" w:sz="4"/>
+            </w:tcBorders>
+            <w:tcMar>
+              <w:top w:type="dxa" w:w="50"/>
+              <w:left w:type="dxa" w:w="90"/>
+              <w:bottom w:type="dxa" w:w="50"/>
+              <w:right w:type="dxa" w:w="90"/>
+            </w:tcMar>
+            <w:vAlign w:val="top"/>
+          </w:tcPr>
+          <w:p>
+            <w:pPr>
+              <w:keepNext w:val="false"/>
+              <w:bidi/>
+              <w:spacing w:after="30" w:before="30" w:line="264"/>
+            </w:pPr>
+            <w:r>
+              <w:rPr>
+                <w:rFonts w:ascii="Arial" w:cs="Arial" w:eastAsia="Arial" w:hAnsi="Arial"/>
+                <w:b/>
+                <w:bCs/>
+                <w:sz w:val="18"/>
+                <w:szCs w:val="18"/>
+                <w:rtl/>
+              </w:rPr>
+              <w:t xml:space="preserve">إيقاف البناء والاستئناف (2026-10-23).</w:t>
+            </w:r>
+            <w:r>
+              <w:rPr>
+                <w:rFonts w:ascii="Arial" w:cs="Arial" w:eastAsia="Arial" w:hAnsi="Arial"/>
+                <w:b w:val="false"/>
+                <w:bCs w:val="false"/>
+                <w:sz w:val="18"/>
+                <w:szCs w:val="18"/>
+                <w:rtl/>
+              </w:rPr>
+              <w:t xml:space="preserve"> «توقف عن البناء حاليًا، ويتم إكمال الوثائق والنظام وبناء الشاشات الساعة 21:10 بتاريخ 24/10/2026». يُستأنف في 2026-10-24 الساعة 21:10 بتوقيت الرياض (18:10 UTC): الوثائق، وبقية النظام، والشاشات، والبنود 44 إلى 46</w:t>
+            </w:r>
+          </w:p>
+        </w:tc>
+        <w:tc>
+          <w:tcPr>
+            <w:tcW w:type="dxa" w:w="3608"/>
+            <w:tcBorders>
+              <w:top w:val="single" w:color="BFC9D6" w:sz="4"/>
+              <w:left w:val="single" w:color="BFC9D6" w:sz="4"/>
+              <w:bottom w:val="single" w:color="BFC9D6" w:sz="4"/>
+              <w:right w:val="single" w:color="BFC9D6" w:sz="4"/>
+            </w:tcBorders>
+            <w:tcMar>
+              <w:top w:type="dxa" w:w="50"/>
+              <w:left w:type="dxa" w:w="90"/>
+              <w:bottom w:type="dxa" w:w="50"/>
+              <w:right w:type="dxa" w:w="90"/>
+            </w:tcMar>
+            <w:vAlign w:val="top"/>
+          </w:tcPr>
+          <w:p>
+            <w:pPr>
+              <w:keepNext w:val="false"/>
+              <w:bidi/>
+              <w:spacing w:after="30" w:before="30" w:line="264"/>
+            </w:pPr>
+            <w:r>
+              <w:rPr>
+                <w:rFonts w:ascii="Arial" w:cs="Arial" w:eastAsia="Arial" w:hAnsi="Arial"/>
+                <w:b w:val="false"/>
+                <w:bCs w:val="false"/>
+                <w:sz w:val="18"/>
+                <w:szCs w:val="18"/>
+                <w:rtl/>
+              </w:rPr>
+              <w:t xml:space="preserve">الخطة</w:t>
+            </w:r>
+          </w:p>
+        </w:tc>
+        <w:tc>
+          <w:tcPr>
+            <w:tcW w:type="dxa" w:w="1478"/>
+            <w:tcBorders>
+              <w:top w:val="single" w:color="BFC9D6" w:sz="4"/>
+              <w:left w:val="single" w:color="BFC9D6" w:sz="4"/>
+              <w:bottom w:val="single" w:color="BFC9D6" w:sz="4"/>
+              <w:right w:val="single" w:color="BFC9D6" w:sz="4"/>
+            </w:tcBorders>
+            <w:tcMar>
+              <w:top w:type="dxa" w:w="50"/>
+              <w:left w:type="dxa" w:w="90"/>
+              <w:bottom w:type="dxa" w:w="50"/>
+              <w:right w:type="dxa" w:w="90"/>
+            </w:tcMar>
+            <w:vAlign w:val="top"/>
+          </w:tcPr>
+          <w:p>
+            <w:pPr>
+              <w:keepNext w:val="false"/>
+              <w:bidi/>
+              <w:spacing w:after="30" w:before="30" w:line="264"/>
+            </w:pPr>
+            <w:r>
+              <w:rPr>
+                <w:rFonts w:ascii="Arial" w:cs="Arial" w:eastAsia="Arial" w:hAnsi="Arial"/>
+                <w:b w:val="false"/>
+                <w:bCs w:val="false"/>
+                <w:sz w:val="18"/>
+                <w:szCs w:val="18"/>
+                <w:rtl/>
+              </w:rPr>
+              <w:t xml:space="preserve">موقوف حتى الموعد</w:t>
             </w:r>
           </w:p>
         </w:tc>

</xml_diff>

<commit_message>
docs/31 row 46: sign-in method chosen by the platform then each company; user identifier (employee code, mobile or official e-mail); invitation or pre-defined identity with a forced password change; scope by company and product
Co-Authored-By: Claude Opus 5.5 <noreply@anthropic.com>
Claude-Session: https://claude.ai/code/session_012HHcRrzuvMBTL2FYxXtsyv
</commit_message>
<xml_diff>
--- a/treasury-platform/docs/31-OWNER-DECISIONS.docx
+++ b/treasury-platform/docs/31-OWNER-DECISIONS.docx
@@ -9845,18 +9845,150 @@
                 <w:szCs w:val="18"/>
                 <w:rtl/>
               </w:rPr>
-              <w:t xml:space="preserve">الدخول برقم المنشأة ورقم المستخدم وكلمة مرور من المسؤول (2026-10-23).</w:t>
-            </w:r>
-            <w:r>
-              <w:rPr>
-                <w:rFonts w:ascii="Arial" w:cs="Arial" w:eastAsia="Arial" w:hAnsi="Arial"/>
-                <w:b w:val="false"/>
-                <w:bCs w:val="false"/>
-                <w:sz w:val="18"/>
-                <w:szCs w:val="18"/>
-                <w:rtl/>
-              </w:rPr>
-              <w:t xml:space="preserve"> يدخل المستخدم بثلاثة: رقم تعريف الشركة أو المنظمة أو المنشأة (المشترك)، ورقم تعريف المستخدم، وكلمة مرور يرسلها له مسؤول الحساب، ويجب تغييرها عند الدخول أول مرة. وصلاحيات المستخدمين تُدار من المسؤول. يختلف هذا عن المبني في S0 (المشترك بالنطاق الفرعي، والدخول بالبريد، وكلمة المرور يضعها المستخدم من رابط الدعوة، ثم التحقق بخطوتين)؛ فيُبنى عند الاستئناف مع إبقاء التحقق بخطوتين ما لم يقرر المالك غير ذلك</w:t>
+              <w:t xml:space="preserve">الدخول والصلاحيات المحدودة (2026-10-23، وتوضيح المالك بعده).</w:t>
+            </w:r>
+            <w:r>
+              <w:rPr>
+                <w:rFonts w:ascii="Arial" w:cs="Arial" w:eastAsia="Arial" w:hAnsi="Arial"/>
+                <w:b w:val="false"/>
+                <w:bCs w:val="false"/>
+                <w:sz w:val="18"/>
+                <w:szCs w:val="18"/>
+                <w:rtl/>
+              </w:rPr>
+              <w:t xml:space="preserve"> (1) </w:t>
+            </w:r>
+            <w:r>
+              <w:rPr>
+                <w:rFonts w:ascii="Arial" w:cs="Arial" w:eastAsia="Arial" w:hAnsi="Arial"/>
+                <w:b/>
+                <w:bCs/>
+                <w:sz w:val="18"/>
+                <w:szCs w:val="18"/>
+                <w:rtl/>
+              </w:rPr>
+              <w:t xml:space="preserve">طريقة الدخول إعداد لا ثابت:</w:t>
+            </w:r>
+            <w:r>
+              <w:rPr>
+                <w:rFonts w:ascii="Arial" w:cs="Arial" w:eastAsia="Arial" w:hAnsi="Arial"/>
+                <w:b w:val="false"/>
+                <w:bCs w:val="false"/>
+                <w:sz w:val="18"/>
+                <w:szCs w:val="18"/>
+                <w:rtl/>
+              </w:rPr>
+              <w:t xml:space="preserve"> تختارها المنصة (افتراضيًا) ثم كل شركة لنفسها؛ والمفضَّل رقم تعريف الشركة. (2) </w:t>
+            </w:r>
+            <w:r>
+              <w:rPr>
+                <w:rFonts w:ascii="Arial" w:cs="Arial" w:eastAsia="Arial" w:hAnsi="Arial"/>
+                <w:b/>
+                <w:bCs/>
+                <w:sz w:val="18"/>
+                <w:szCs w:val="18"/>
+                <w:rtl/>
+              </w:rPr>
+              <w:t xml:space="preserve">معرّف المستخدم</w:t>
+            </w:r>
+            <w:r>
+              <w:rPr>
+                <w:rFonts w:ascii="Arial" w:cs="Arial" w:eastAsia="Arial" w:hAnsi="Arial"/>
+                <w:b w:val="false"/>
+                <w:bCs w:val="false"/>
+                <w:sz w:val="18"/>
+                <w:szCs w:val="18"/>
+                <w:rtl/>
+              </w:rPr>
+              <w:t xml:space="preserve"> واحد مما تسمح به الشركة: الكود الوظيفي، أو رقم الجوال، أو البريد الرسمي الذي توافق عليه الشركة؛ ومعه كلمة المرور. (3) </w:t>
+            </w:r>
+            <w:r>
+              <w:rPr>
+                <w:rFonts w:ascii="Arial" w:cs="Arial" w:eastAsia="Arial" w:hAnsi="Arial"/>
+                <w:b/>
+                <w:bCs/>
+                <w:sz w:val="18"/>
+                <w:szCs w:val="18"/>
+                <w:rtl/>
+              </w:rPr>
+              <w:t xml:space="preserve">طريقتا الإنشاء،</w:t>
+            </w:r>
+            <w:r>
+              <w:rPr>
+                <w:rFonts w:ascii="Arial" w:cs="Arial" w:eastAsia="Arial" w:hAnsi="Arial"/>
+                <w:b w:val="false"/>
+                <w:bCs w:val="false"/>
+                <w:sz w:val="18"/>
+                <w:szCs w:val="18"/>
+                <w:rtl/>
+              </w:rPr>
+              <w:t xml:space="preserve"> والقرار للشركة: دعوة عبر البريد برابط، أو تعريف مسبق يضعه المسؤول أثناء الدعوة (رقم تعريف الشركة، وكود المستخدم، ورقم الجوال) مع كلمة مرور مؤقتة يرسلها المسؤول </w:t>
+            </w:r>
+            <w:r>
+              <w:rPr>
+                <w:rFonts w:ascii="Arial" w:cs="Arial" w:eastAsia="Arial" w:hAnsi="Arial"/>
+                <w:b/>
+                <w:bCs/>
+                <w:sz w:val="18"/>
+                <w:szCs w:val="18"/>
+                <w:rtl/>
+              </w:rPr>
+              <w:t xml:space="preserve">وتُغيَّر إلزاميًا عند أول دخول</w:t>
+            </w:r>
+            <w:r>
+              <w:rPr>
+                <w:rFonts w:ascii="Arial" w:cs="Arial" w:eastAsia="Arial" w:hAnsi="Arial"/>
+                <w:b w:val="false"/>
+                <w:bCs w:val="false"/>
+                <w:sz w:val="18"/>
+                <w:szCs w:val="18"/>
+                <w:rtl/>
+              </w:rPr>
+              <w:t xml:space="preserve">. (4) </w:t>
+            </w:r>
+            <w:r>
+              <w:rPr>
+                <w:rFonts w:ascii="Arial" w:cs="Arial" w:eastAsia="Arial" w:hAnsi="Arial"/>
+                <w:b/>
+                <w:bCs/>
+                <w:sz w:val="18"/>
+                <w:szCs w:val="18"/>
+                <w:rtl/>
+              </w:rPr>
+              <w:t xml:space="preserve">الصلاحيات محدودة لكل موظف:</w:t>
+            </w:r>
+            <w:r>
+              <w:rPr>
+                <w:rFonts w:ascii="Arial" w:cs="Arial" w:eastAsia="Arial" w:hAnsi="Arial"/>
+                <w:b w:val="false"/>
+                <w:bCs w:val="false"/>
+                <w:sz w:val="18"/>
+                <w:szCs w:val="18"/>
+                <w:rtl/>
+              </w:rPr>
+              <w:t xml:space="preserve"> شركة واحدة أو أكثر من شركات المجموعة (نطاق الشركات المبني في S0)، </w:t>
+            </w:r>
+            <w:r>
+              <w:rPr>
+                <w:rFonts w:ascii="Arial" w:cs="Arial" w:eastAsia="Arial" w:hAnsi="Arial"/>
+                <w:b/>
+                <w:bCs/>
+                <w:sz w:val="18"/>
+                <w:szCs w:val="18"/>
+                <w:rtl/>
+              </w:rPr>
+              <w:t xml:space="preserve">ومنتج واحد أو أكثر</w:t>
+            </w:r>
+            <w:r>
+              <w:rPr>
+                <w:rFonts w:ascii="Arial" w:cs="Arial" w:eastAsia="Arial" w:hAnsi="Arial"/>
+                <w:b w:val="false"/>
+                <w:bCs w:val="false"/>
+                <w:sz w:val="18"/>
+                <w:szCs w:val="18"/>
+                <w:rtl/>
+              </w:rPr>
+              <w:t xml:space="preserve"> (نطاق المنتجات: لم يُبنَ بعد)، والأدوار؛ كل ذلك لفصل المهام وعدم تداخلها. (5) يبقى التحقق بخطوتين ما لم يقرر المالك غير ذلك. يختلف عن المبني في S0 (المشترك بالنطاق الفرعي، والدخول بالبريد، وكلمة المرور من رابط الدعوة)</w:t>
             </w:r>
           </w:p>
         </w:tc>
@@ -9893,7 +10025,7 @@
                 <w:szCs w:val="18"/>
                 <w:rtl/>
               </w:rPr>
-              <w:t xml:space="preserve">المنصة: الدخول والمستخدمون (S0)</w:t>
+              <w:t xml:space="preserve">المنصة: الدخول والمستخدمون والنطاق (S0)، وكل الوحدات التي تقرأ النطاق</w:t>
             </w:r>
           </w:p>
         </w:tc>

</xml_diff>

<commit_message>
docs/31 row 46: two-step verification deferred to the general launch, switched by the platform administration
Co-Authored-By: Claude Opus 5.5 <noreply@anthropic.com>
Claude-Session: https://claude.ai/code/session_012HHcRrzuvMBTL2FYxXtsyv
</commit_message>
<xml_diff>
--- a/treasury-platform/docs/31-OWNER-DECISIONS.docx
+++ b/treasury-platform/docs/31-OWNER-DECISIONS.docx
@@ -9988,7 +9988,29 @@
                 <w:szCs w:val="18"/>
                 <w:rtl/>
               </w:rPr>
-              <w:t xml:space="preserve"> (نطاق المنتجات: لم يُبنَ بعد)، والأدوار؛ كل ذلك لفصل المهام وعدم تداخلها. (5) يبقى التحقق بخطوتين ما لم يقرر المالك غير ذلك. يختلف عن المبني في S0 (المشترك بالنطاق الفرعي، والدخول بالبريد، وكلمة المرور من رابط الدعوة)</w:t>
+              <w:t xml:space="preserve"> (نطاق المنتجات: لم يُبنَ بعد)، والأدوار؛ كل ذلك لفصل المهام وعدم تداخلها. (5) </w:t>
+            </w:r>
+            <w:r>
+              <w:rPr>
+                <w:rFonts w:ascii="Arial" w:cs="Arial" w:eastAsia="Arial" w:hAnsi="Arial"/>
+                <w:b/>
+                <w:bCs/>
+                <w:sz w:val="18"/>
+                <w:szCs w:val="18"/>
+                <w:rtl/>
+              </w:rPr>
+              <w:t xml:space="preserve">التحقق بخطوتين مؤجَّل إلى الإطلاق العام بعد فترة التجربة:</w:t>
+            </w:r>
+            <w:r>
+              <w:rPr>
+                <w:rFonts w:ascii="Arial" w:cs="Arial" w:eastAsia="Arial" w:hAnsi="Arial"/>
+                <w:b w:val="false"/>
+                <w:bCs w:val="false"/>
+                <w:sz w:val="18"/>
+                <w:szCs w:val="18"/>
+                <w:rtl/>
+              </w:rPr>
+              <w:t xml:space="preserve"> يبقى مبنيًا، ويُفعَّل أو يُعطَّل من إدارة المنصة (إعداد على مستوى المنصة، ويمكن تطبيقه لكل مشترك)، ويكون معطَّلًا افتراضيًا في فترة التجربة. ويبقى الدخول المحمي بكلمة مرور قوية وتغييرها عند أول دخول. يختلف عن المبني في S0 (المشترك بالنطاق الفرعي، والدخول بالبريد، وكلمة المرور من رابط الدعوة)</w:t>
             </w:r>
           </w:p>
         </w:tc>

</xml_diff>

<commit_message>
docs/31 row 48: security hardening, attack blocking and visibility, and the incident response plan (owner's request)
Co-Authored-By: Claude Opus 5.5 <noreply@anthropic.com>
Claude-Session: https://claude.ai/code/session_012HHcRrzuvMBTL2FYxXtsyv
</commit_message>
<xml_diff>
--- a/treasury-platform/docs/31-OWNER-DECISIONS.docx
+++ b/treasury-platform/docs/31-OWNER-DECISIONS.docx
@@ -10125,7 +10125,7 @@
                 <w:szCs w:val="18"/>
                 <w:rtl/>
               </w:rPr>
-              <w:t xml:space="preserve">47</w:t>
+              <w:t xml:space="preserve">48</w:t>
             </w:r>
           </w:p>
         </w:tc>
@@ -10161,6 +10161,278 @@
                 <w:szCs w:val="18"/>
                 <w:rtl/>
               </w:rPr>
+              <w:t xml:space="preserve">الأمن ومنع الاختراق وإظهاره في المنصة (2026-10-23).</w:t>
+            </w:r>
+            <w:r>
+              <w:rPr>
+                <w:rFonts w:ascii="Arial" w:cs="Arial" w:eastAsia="Arial" w:hAnsi="Arial"/>
+                <w:b w:val="false"/>
+                <w:bCs w:val="false"/>
+                <w:sz w:val="18"/>
+                <w:szCs w:val="18"/>
+                <w:rtl/>
+              </w:rPr>
+              <w:t xml:space="preserve"> طلب المالك: (1) </w:t>
+            </w:r>
+            <w:r>
+              <w:rPr>
+                <w:rFonts w:ascii="Arial" w:cs="Arial" w:eastAsia="Arial" w:hAnsi="Arial"/>
+                <w:b/>
+                <w:bCs/>
+                <w:sz w:val="18"/>
+                <w:szCs w:val="18"/>
+                <w:rtl/>
+              </w:rPr>
+              <w:t xml:space="preserve">الواجهة:</w:t>
+            </w:r>
+            <w:r>
+              <w:rPr>
+                <w:rFonts w:ascii="Arial" w:cs="Arial" w:eastAsia="Arial" w:hAnsi="Arial"/>
+                <w:b w:val="false"/>
+                <w:bCs w:val="false"/>
+                <w:sz w:val="18"/>
+                <w:szCs w:val="18"/>
+                <w:rtl/>
+              </w:rPr>
+              <w:t xml:space="preserve"> لا تُنشر الشيفرة المصدرية المقروءة ولا خرائطها (source maps) في الإنتاج، وتُصغَّر، وتُطبع المستندات من الخادم ببصمة SHA-256 تكشف أي تعديل في المتصفح؛ مع ملاحظة أن ما يصل إلى المتصفح لا يمكن إخفاؤه كليًا، فالحماية الحقيقية أن الخادم وحده يقرر ويتحقق. (2) </w:t>
+            </w:r>
+            <w:r>
+              <w:rPr>
+                <w:rFonts w:ascii="Arial" w:cs="Arial" w:eastAsia="Arial" w:hAnsi="Arial"/>
+                <w:b/>
+                <w:bCs/>
+                <w:sz w:val="18"/>
+                <w:szCs w:val="18"/>
+                <w:rtl/>
+              </w:rPr>
+              <w:t xml:space="preserve">حظر العناوين:</w:t>
+            </w:r>
+            <w:r>
+              <w:rPr>
+                <w:rFonts w:ascii="Arial" w:cs="Arial" w:eastAsia="Arial" w:hAnsi="Arial"/>
+                <w:b w:val="false"/>
+                <w:bCs w:val="false"/>
+                <w:sz w:val="18"/>
+                <w:szCs w:val="18"/>
+                <w:rtl/>
+              </w:rPr>
+              <w:t xml:space="preserve"> حظر عنوان IP لمحاولات الاختراق والإغراق (ومنها ping)، بتحديد المعدّل في التطبيق والجدار الناري وFail2ban، دون حظر عناوين الوكيل العكسي أو CDN. (3) </w:t>
+            </w:r>
+            <w:r>
+              <w:rPr>
+                <w:rFonts w:ascii="Arial" w:cs="Arial" w:eastAsia="Arial" w:hAnsi="Arial"/>
+                <w:b/>
+                <w:bCs/>
+                <w:sz w:val="18"/>
+                <w:szCs w:val="18"/>
+                <w:rtl/>
+              </w:rPr>
+              <w:t xml:space="preserve">الخادم:</w:t>
+            </w:r>
+            <w:r>
+              <w:rPr>
+                <w:rFonts w:ascii="Arial" w:cs="Arial" w:eastAsia="Arial" w:hAnsi="Arial"/>
+                <w:b w:val="false"/>
+                <w:bCs w:val="false"/>
+                <w:sz w:val="18"/>
+                <w:szCs w:val="18"/>
+                <w:rtl/>
+              </w:rPr>
+              <w:t xml:space="preserve"> UFW مع journald دائم، وسجلات وصول Caddy بصيغة JSON، وتدوير سجلات Docker، وauditd، وFail2ban لـ SSH، وAIDE، ومراقبة المنافذ والموارد، وتجميع مركزي عبر Wazuh أو Loki/Grafana، وتنبيهات لـ SSH وUFW وCaddy وDocker، ونسخة سجلات خارجية غير قابلة للتعديل. (4) </w:t>
+            </w:r>
+            <w:r>
+              <w:rPr>
+                <w:rFonts w:ascii="Arial" w:cs="Arial" w:eastAsia="Arial" w:hAnsi="Arial"/>
+                <w:b/>
+                <w:bCs/>
+                <w:sz w:val="18"/>
+                <w:szCs w:val="18"/>
+                <w:rtl/>
+              </w:rPr>
+              <w:t xml:space="preserve">في المنصة:</w:t>
+            </w:r>
+            <w:r>
+              <w:rPr>
+                <w:rFonts w:ascii="Arial" w:cs="Arial" w:eastAsia="Arial" w:hAnsi="Arial"/>
+                <w:b w:val="false"/>
+                <w:bCs w:val="false"/>
+                <w:sz w:val="18"/>
+                <w:szCs w:val="18"/>
+                <w:rtl/>
+              </w:rPr>
+              <w:t xml:space="preserve"> لوحة أحداث أمنية في لوحة المشغّل، وقناة إشعار، وسجل حوادث. (5) </w:t>
+            </w:r>
+            <w:r>
+              <w:rPr>
+                <w:rFonts w:ascii="Arial" w:cs="Arial" w:eastAsia="Arial" w:hAnsi="Arial"/>
+                <w:b/>
+                <w:bCs/>
+                <w:sz w:val="18"/>
+                <w:szCs w:val="18"/>
+                <w:rtl/>
+              </w:rPr>
+              <w:t xml:space="preserve">خطة الاستجابة للحوادث</w:t>
+            </w:r>
+            <w:r>
+              <w:rPr>
+                <w:rFonts w:ascii="Arial" w:cs="Arial" w:eastAsia="Arial" w:hAnsi="Arial"/>
+                <w:b w:val="false"/>
+                <w:bCs w:val="false"/>
+                <w:sz w:val="18"/>
+                <w:szCs w:val="18"/>
+                <w:rtl/>
+              </w:rPr>
+              <w:t xml:space="preserve"> (12 خطوة): لا حذف للسجلات ولا إعادة تشغيل فورية؛ حفظ نسخة مختومة بالوقت؛ عزل الحساب أو العنوان إن كان آمنًا؛ عدم حظر الوكيل أو CDN خطأً؛ فحص العمليات والمنافذ والحاويات الجديدة؛ فحص authorized_keys والمستخدمين الجدد؛ إيقاف الأسرار المتأثرة وتدويرها؛ لقطة قرص قبل التغييرات الكبيرة؛ فحص الحاويات والصور وملفات Compose؛ إعادة البناء من مصدر موثوق؛ إعادة اختبار المصادقة والصلاحيات؛ توثيق الحادثة وسببها الجذري والإجراءات التصحيحية. تُكتب عند الاستئناف وثيقة تشغيل أمني وخطة استجابة، وتُحدَّث وثائق الأمن (DOC-S)، ويُبنى ما يخص التطبيق (تحديد المعدّل والحظر ولوحة الأحداث وسجل الحوادث)</w:t>
+            </w:r>
+          </w:p>
+        </w:tc>
+        <w:tc>
+          <w:tcPr>
+            <w:tcW w:type="dxa" w:w="3608"/>
+            <w:tcBorders>
+              <w:top w:val="single" w:color="BFC9D6" w:sz="4"/>
+              <w:left w:val="single" w:color="BFC9D6" w:sz="4"/>
+              <w:bottom w:val="single" w:color="BFC9D6" w:sz="4"/>
+              <w:right w:val="single" w:color="BFC9D6" w:sz="4"/>
+            </w:tcBorders>
+            <w:tcMar>
+              <w:top w:type="dxa" w:w="50"/>
+              <w:left w:type="dxa" w:w="90"/>
+              <w:bottom w:type="dxa" w:w="50"/>
+              <w:right w:type="dxa" w:w="90"/>
+            </w:tcMar>
+            <w:vAlign w:val="top"/>
+          </w:tcPr>
+          <w:p>
+            <w:pPr>
+              <w:keepNext w:val="false"/>
+              <w:bidi/>
+              <w:spacing w:after="30" w:before="30" w:line="264"/>
+            </w:pPr>
+            <w:r>
+              <w:rPr>
+                <w:rFonts w:ascii="Arial" w:cs="Arial" w:eastAsia="Arial" w:hAnsi="Arial"/>
+                <w:b w:val="false"/>
+                <w:bCs w:val="false"/>
+                <w:sz w:val="18"/>
+                <w:szCs w:val="18"/>
+                <w:rtl/>
+              </w:rPr>
+              <w:t xml:space="preserve">الأمن والتشغيل والنشر ولوحة المشغّل</w:t>
+            </w:r>
+          </w:p>
+        </w:tc>
+        <w:tc>
+          <w:tcPr>
+            <w:tcW w:type="dxa" w:w="1478"/>
+            <w:tcBorders>
+              <w:top w:val="single" w:color="BFC9D6" w:sz="4"/>
+              <w:left w:val="single" w:color="BFC9D6" w:sz="4"/>
+              <w:bottom w:val="single" w:color="BFC9D6" w:sz="4"/>
+              <w:right w:val="single" w:color="BFC9D6" w:sz="4"/>
+            </w:tcBorders>
+            <w:tcMar>
+              <w:top w:type="dxa" w:w="50"/>
+              <w:left w:type="dxa" w:w="90"/>
+              <w:bottom w:type="dxa" w:w="50"/>
+              <w:right w:type="dxa" w:w="90"/>
+            </w:tcMar>
+            <w:vAlign w:val="top"/>
+          </w:tcPr>
+          <w:p>
+            <w:pPr>
+              <w:keepNext w:val="false"/>
+              <w:bidi/>
+              <w:spacing w:after="30" w:before="30" w:line="264"/>
+            </w:pPr>
+            <w:r>
+              <w:rPr>
+                <w:rFonts w:ascii="Arial" w:cs="Arial" w:eastAsia="Arial" w:hAnsi="Arial"/>
+                <w:b w:val="false"/>
+                <w:bCs w:val="false"/>
+                <w:sz w:val="18"/>
+                <w:szCs w:val="18"/>
+                <w:rtl/>
+              </w:rPr>
+              <w:t xml:space="preserve">يُكتب ويُبنى عند الاستئناف</w:t>
+            </w:r>
+          </w:p>
+        </w:tc>
+      </w:tr>
+      <w:tr>
+        <w:trPr>
+          <w:cantSplit/>
+        </w:trPr>
+        <w:tc>
+          <w:tcPr>
+            <w:tcW w:type="dxa" w:w="935"/>
+            <w:tcBorders>
+              <w:top w:val="single" w:color="BFC9D6" w:sz="4"/>
+              <w:left w:val="single" w:color="BFC9D6" w:sz="4"/>
+              <w:bottom w:val="single" w:color="BFC9D6" w:sz="4"/>
+              <w:right w:val="single" w:color="BFC9D6" w:sz="4"/>
+            </w:tcBorders>
+            <w:shd w:fill="F5F8FC" w:color="auto" w:val="clear"/>
+            <w:tcMar>
+              <w:top w:type="dxa" w:w="50"/>
+              <w:left w:type="dxa" w:w="90"/>
+              <w:bottom w:type="dxa" w:w="50"/>
+              <w:right w:type="dxa" w:w="90"/>
+            </w:tcMar>
+            <w:vAlign w:val="top"/>
+          </w:tcPr>
+          <w:p>
+            <w:pPr>
+              <w:keepNext w:val="false"/>
+              <w:bidi/>
+              <w:spacing w:after="30" w:before="30" w:line="264"/>
+            </w:pPr>
+            <w:r>
+              <w:rPr>
+                <w:rFonts w:ascii="Arial" w:cs="Arial" w:eastAsia="Arial" w:hAnsi="Arial"/>
+                <w:b w:val="false"/>
+                <w:bCs w:val="false"/>
+                <w:sz w:val="18"/>
+                <w:szCs w:val="18"/>
+                <w:rtl/>
+              </w:rPr>
+              <w:t xml:space="preserve">47</w:t>
+            </w:r>
+          </w:p>
+        </w:tc>
+        <w:tc>
+          <w:tcPr>
+            <w:tcW w:type="dxa" w:w="3843"/>
+            <w:tcBorders>
+              <w:top w:val="single" w:color="BFC9D6" w:sz="4"/>
+              <w:left w:val="single" w:color="BFC9D6" w:sz="4"/>
+              <w:bottom w:val="single" w:color="BFC9D6" w:sz="4"/>
+              <w:right w:val="single" w:color="BFC9D6" w:sz="4"/>
+            </w:tcBorders>
+            <w:shd w:fill="F5F8FC" w:color="auto" w:val="clear"/>
+            <w:tcMar>
+              <w:top w:type="dxa" w:w="50"/>
+              <w:left w:type="dxa" w:w="90"/>
+              <w:bottom w:type="dxa" w:w="50"/>
+              <w:right w:type="dxa" w:w="90"/>
+            </w:tcMar>
+            <w:vAlign w:val="top"/>
+          </w:tcPr>
+          <w:p>
+            <w:pPr>
+              <w:keepNext w:val="false"/>
+              <w:bidi/>
+              <w:spacing w:after="30" w:before="30" w:line="264"/>
+            </w:pPr>
+            <w:r>
+              <w:rPr>
+                <w:rFonts w:ascii="Arial" w:cs="Arial" w:eastAsia="Arial" w:hAnsi="Arial"/>
+                <w:b/>
+                <w:bCs/>
+                <w:sz w:val="18"/>
+                <w:szCs w:val="18"/>
+                <w:rtl/>
+              </w:rPr>
               <w:t xml:space="preserve">إيقاف البناء والاستئناف (2026-10-23).</w:t>
             </w:r>
             <w:r>
@@ -10185,6 +10457,7 @@
               <w:bottom w:val="single" w:color="BFC9D6" w:sz="4"/>
               <w:right w:val="single" w:color="BFC9D6" w:sz="4"/>
             </w:tcBorders>
+            <w:shd w:fill="F5F8FC" w:color="auto" w:val="clear"/>
             <w:tcMar>
               <w:top w:type="dxa" w:w="50"/>
               <w:left w:type="dxa" w:w="90"/>
@@ -10221,6 +10494,7 @@
               <w:bottom w:val="single" w:color="BFC9D6" w:sz="4"/>
               <w:right w:val="single" w:color="BFC9D6" w:sz="4"/>
             </w:tcBorders>
+            <w:shd w:fill="F5F8FC" w:color="auto" w:val="clear"/>
             <w:tcMar>
               <w:top w:type="dxa" w:w="50"/>
               <w:left w:type="dxa" w:w="90"/>

</xml_diff>

<commit_message>
docs/31: row 48 after row 47
Co-Authored-By: Claude Opus 5.5 <noreply@anthropic.com>
Claude-Session: https://claude.ai/code/session_012HHcRrzuvMBTL2FYxXtsyv
</commit_message>
<xml_diff>
--- a/treasury-platform/docs/31-OWNER-DECISIONS.docx
+++ b/treasury-platform/docs/31-OWNER-DECISIONS.docx
@@ -10125,7 +10125,7 @@
                 <w:szCs w:val="18"/>
                 <w:rtl/>
               </w:rPr>
-              <w:t xml:space="preserve">48</w:t>
+              <w:t xml:space="preserve">47</w:t>
             </w:r>
           </w:p>
         </w:tc>
@@ -10161,128 +10161,18 @@
                 <w:szCs w:val="18"/>
                 <w:rtl/>
               </w:rPr>
-              <w:t xml:space="preserve">الأمن ومنع الاختراق وإظهاره في المنصة (2026-10-23).</w:t>
-            </w:r>
-            <w:r>
-              <w:rPr>
-                <w:rFonts w:ascii="Arial" w:cs="Arial" w:eastAsia="Arial" w:hAnsi="Arial"/>
-                <w:b w:val="false"/>
-                <w:bCs w:val="false"/>
-                <w:sz w:val="18"/>
-                <w:szCs w:val="18"/>
-                <w:rtl/>
-              </w:rPr>
-              <w:t xml:space="preserve"> طلب المالك: (1) </w:t>
-            </w:r>
-            <w:r>
-              <w:rPr>
-                <w:rFonts w:ascii="Arial" w:cs="Arial" w:eastAsia="Arial" w:hAnsi="Arial"/>
-                <w:b/>
-                <w:bCs/>
-                <w:sz w:val="18"/>
-                <w:szCs w:val="18"/>
-                <w:rtl/>
-              </w:rPr>
-              <w:t xml:space="preserve">الواجهة:</w:t>
-            </w:r>
-            <w:r>
-              <w:rPr>
-                <w:rFonts w:ascii="Arial" w:cs="Arial" w:eastAsia="Arial" w:hAnsi="Arial"/>
-                <w:b w:val="false"/>
-                <w:bCs w:val="false"/>
-                <w:sz w:val="18"/>
-                <w:szCs w:val="18"/>
-                <w:rtl/>
-              </w:rPr>
-              <w:t xml:space="preserve"> لا تُنشر الشيفرة المصدرية المقروءة ولا خرائطها (source maps) في الإنتاج، وتُصغَّر، وتُطبع المستندات من الخادم ببصمة SHA-256 تكشف أي تعديل في المتصفح؛ مع ملاحظة أن ما يصل إلى المتصفح لا يمكن إخفاؤه كليًا، فالحماية الحقيقية أن الخادم وحده يقرر ويتحقق. (2) </w:t>
-            </w:r>
-            <w:r>
-              <w:rPr>
-                <w:rFonts w:ascii="Arial" w:cs="Arial" w:eastAsia="Arial" w:hAnsi="Arial"/>
-                <w:b/>
-                <w:bCs/>
-                <w:sz w:val="18"/>
-                <w:szCs w:val="18"/>
-                <w:rtl/>
-              </w:rPr>
-              <w:t xml:space="preserve">حظر العناوين:</w:t>
-            </w:r>
-            <w:r>
-              <w:rPr>
-                <w:rFonts w:ascii="Arial" w:cs="Arial" w:eastAsia="Arial" w:hAnsi="Arial"/>
-                <w:b w:val="false"/>
-                <w:bCs w:val="false"/>
-                <w:sz w:val="18"/>
-                <w:szCs w:val="18"/>
-                <w:rtl/>
-              </w:rPr>
-              <w:t xml:space="preserve"> حظر عنوان IP لمحاولات الاختراق والإغراق (ومنها ping)، بتحديد المعدّل في التطبيق والجدار الناري وFail2ban، دون حظر عناوين الوكيل العكسي أو CDN. (3) </w:t>
-            </w:r>
-            <w:r>
-              <w:rPr>
-                <w:rFonts w:ascii="Arial" w:cs="Arial" w:eastAsia="Arial" w:hAnsi="Arial"/>
-                <w:b/>
-                <w:bCs/>
-                <w:sz w:val="18"/>
-                <w:szCs w:val="18"/>
-                <w:rtl/>
-              </w:rPr>
-              <w:t xml:space="preserve">الخادم:</w:t>
-            </w:r>
-            <w:r>
-              <w:rPr>
-                <w:rFonts w:ascii="Arial" w:cs="Arial" w:eastAsia="Arial" w:hAnsi="Arial"/>
-                <w:b w:val="false"/>
-                <w:bCs w:val="false"/>
-                <w:sz w:val="18"/>
-                <w:szCs w:val="18"/>
-                <w:rtl/>
-              </w:rPr>
-              <w:t xml:space="preserve"> UFW مع journald دائم، وسجلات وصول Caddy بصيغة JSON، وتدوير سجلات Docker، وauditd، وFail2ban لـ SSH، وAIDE، ومراقبة المنافذ والموارد، وتجميع مركزي عبر Wazuh أو Loki/Grafana، وتنبيهات لـ SSH وUFW وCaddy وDocker، ونسخة سجلات خارجية غير قابلة للتعديل. (4) </w:t>
-            </w:r>
-            <w:r>
-              <w:rPr>
-                <w:rFonts w:ascii="Arial" w:cs="Arial" w:eastAsia="Arial" w:hAnsi="Arial"/>
-                <w:b/>
-                <w:bCs/>
-                <w:sz w:val="18"/>
-                <w:szCs w:val="18"/>
-                <w:rtl/>
-              </w:rPr>
-              <w:t xml:space="preserve">في المنصة:</w:t>
-            </w:r>
-            <w:r>
-              <w:rPr>
-                <w:rFonts w:ascii="Arial" w:cs="Arial" w:eastAsia="Arial" w:hAnsi="Arial"/>
-                <w:b w:val="false"/>
-                <w:bCs w:val="false"/>
-                <w:sz w:val="18"/>
-                <w:szCs w:val="18"/>
-                <w:rtl/>
-              </w:rPr>
-              <w:t xml:space="preserve"> لوحة أحداث أمنية في لوحة المشغّل، وقناة إشعار، وسجل حوادث. (5) </w:t>
-            </w:r>
-            <w:r>
-              <w:rPr>
-                <w:rFonts w:ascii="Arial" w:cs="Arial" w:eastAsia="Arial" w:hAnsi="Arial"/>
-                <w:b/>
-                <w:bCs/>
-                <w:sz w:val="18"/>
-                <w:szCs w:val="18"/>
-                <w:rtl/>
-              </w:rPr>
-              <w:t xml:space="preserve">خطة الاستجابة للحوادث</w:t>
-            </w:r>
-            <w:r>
-              <w:rPr>
-                <w:rFonts w:ascii="Arial" w:cs="Arial" w:eastAsia="Arial" w:hAnsi="Arial"/>
-                <w:b w:val="false"/>
-                <w:bCs w:val="false"/>
-                <w:sz w:val="18"/>
-                <w:szCs w:val="18"/>
-                <w:rtl/>
-              </w:rPr>
-              <w:t xml:space="preserve"> (12 خطوة): لا حذف للسجلات ولا إعادة تشغيل فورية؛ حفظ نسخة مختومة بالوقت؛ عزل الحساب أو العنوان إن كان آمنًا؛ عدم حظر الوكيل أو CDN خطأً؛ فحص العمليات والمنافذ والحاويات الجديدة؛ فحص authorized_keys والمستخدمين الجدد؛ إيقاف الأسرار المتأثرة وتدويرها؛ لقطة قرص قبل التغييرات الكبيرة؛ فحص الحاويات والصور وملفات Compose؛ إعادة البناء من مصدر موثوق؛ إعادة اختبار المصادقة والصلاحيات؛ توثيق الحادثة وسببها الجذري والإجراءات التصحيحية. تُكتب عند الاستئناف وثيقة تشغيل أمني وخطة استجابة، وتُحدَّث وثائق الأمن (DOC-S)، ويُبنى ما يخص التطبيق (تحديد المعدّل والحظر ولوحة الأحداث وسجل الحوادث)</w:t>
+              <w:t xml:space="preserve">إيقاف البناء والاستئناف (2026-10-23).</w:t>
+            </w:r>
+            <w:r>
+              <w:rPr>
+                <w:rFonts w:ascii="Arial" w:cs="Arial" w:eastAsia="Arial" w:hAnsi="Arial"/>
+                <w:b w:val="false"/>
+                <w:bCs w:val="false"/>
+                <w:sz w:val="18"/>
+                <w:szCs w:val="18"/>
+                <w:rtl/>
+              </w:rPr>
+              <w:t xml:space="preserve"> «توقف عن البناء حاليًا، ويتم إكمال الوثائق والنظام وبناء الشاشات الساعة 21:10 بتاريخ 24/10/2026». يُستأنف في 2026-10-24 الساعة 21:10 بتوقيت الرياض (18:10 UTC): الوثائق، وبقية النظام، والشاشات، والبنود 44 إلى 46</w:t>
             </w:r>
           </w:p>
         </w:tc>
@@ -10318,7 +10208,7 @@
                 <w:szCs w:val="18"/>
                 <w:rtl/>
               </w:rPr>
-              <w:t xml:space="preserve">الأمن والتشغيل والنشر ولوحة المشغّل</w:t>
+              <w:t xml:space="preserve">الخطة</w:t>
             </w:r>
           </w:p>
         </w:tc>
@@ -10354,7 +10244,7 @@
                 <w:szCs w:val="18"/>
                 <w:rtl/>
               </w:rPr>
-              <w:t xml:space="preserve">يُكتب ويُبنى عند الاستئناف</w:t>
+              <w:t xml:space="preserve">موقوف حتى الموعد</w:t>
             </w:r>
           </w:p>
         </w:tc>
@@ -10396,7 +10286,7 @@
                 <w:szCs w:val="18"/>
                 <w:rtl/>
               </w:rPr>
-              <w:t xml:space="preserve">47</w:t>
+              <w:t xml:space="preserve">48</w:t>
             </w:r>
           </w:p>
         </w:tc>
@@ -10433,18 +10323,128 @@
                 <w:szCs w:val="18"/>
                 <w:rtl/>
               </w:rPr>
-              <w:t xml:space="preserve">إيقاف البناء والاستئناف (2026-10-23).</w:t>
-            </w:r>
-            <w:r>
-              <w:rPr>
-                <w:rFonts w:ascii="Arial" w:cs="Arial" w:eastAsia="Arial" w:hAnsi="Arial"/>
-                <w:b w:val="false"/>
-                <w:bCs w:val="false"/>
-                <w:sz w:val="18"/>
-                <w:szCs w:val="18"/>
-                <w:rtl/>
-              </w:rPr>
-              <w:t xml:space="preserve"> «توقف عن البناء حاليًا، ويتم إكمال الوثائق والنظام وبناء الشاشات الساعة 21:10 بتاريخ 24/10/2026». يُستأنف في 2026-10-24 الساعة 21:10 بتوقيت الرياض (18:10 UTC): الوثائق، وبقية النظام، والشاشات، والبنود 44 إلى 46</w:t>
+              <w:t xml:space="preserve">الأمن ومنع الاختراق وإظهاره في المنصة (2026-10-23).</w:t>
+            </w:r>
+            <w:r>
+              <w:rPr>
+                <w:rFonts w:ascii="Arial" w:cs="Arial" w:eastAsia="Arial" w:hAnsi="Arial"/>
+                <w:b w:val="false"/>
+                <w:bCs w:val="false"/>
+                <w:sz w:val="18"/>
+                <w:szCs w:val="18"/>
+                <w:rtl/>
+              </w:rPr>
+              <w:t xml:space="preserve"> طلب المالك: (1) </w:t>
+            </w:r>
+            <w:r>
+              <w:rPr>
+                <w:rFonts w:ascii="Arial" w:cs="Arial" w:eastAsia="Arial" w:hAnsi="Arial"/>
+                <w:b/>
+                <w:bCs/>
+                <w:sz w:val="18"/>
+                <w:szCs w:val="18"/>
+                <w:rtl/>
+              </w:rPr>
+              <w:t xml:space="preserve">الواجهة:</w:t>
+            </w:r>
+            <w:r>
+              <w:rPr>
+                <w:rFonts w:ascii="Arial" w:cs="Arial" w:eastAsia="Arial" w:hAnsi="Arial"/>
+                <w:b w:val="false"/>
+                <w:bCs w:val="false"/>
+                <w:sz w:val="18"/>
+                <w:szCs w:val="18"/>
+                <w:rtl/>
+              </w:rPr>
+              <w:t xml:space="preserve"> لا تُنشر الشيفرة المصدرية المقروءة ولا خرائطها (source maps) في الإنتاج، وتُصغَّر، وتُطبع المستندات من الخادم ببصمة SHA-256 تكشف أي تعديل في المتصفح؛ مع ملاحظة أن ما يصل إلى المتصفح لا يمكن إخفاؤه كليًا، فالحماية الحقيقية أن الخادم وحده يقرر ويتحقق. (2) </w:t>
+            </w:r>
+            <w:r>
+              <w:rPr>
+                <w:rFonts w:ascii="Arial" w:cs="Arial" w:eastAsia="Arial" w:hAnsi="Arial"/>
+                <w:b/>
+                <w:bCs/>
+                <w:sz w:val="18"/>
+                <w:szCs w:val="18"/>
+                <w:rtl/>
+              </w:rPr>
+              <w:t xml:space="preserve">حظر العناوين:</w:t>
+            </w:r>
+            <w:r>
+              <w:rPr>
+                <w:rFonts w:ascii="Arial" w:cs="Arial" w:eastAsia="Arial" w:hAnsi="Arial"/>
+                <w:b w:val="false"/>
+                <w:bCs w:val="false"/>
+                <w:sz w:val="18"/>
+                <w:szCs w:val="18"/>
+                <w:rtl/>
+              </w:rPr>
+              <w:t xml:space="preserve"> حظر عنوان IP لمحاولات الاختراق والإغراق (ومنها ping)، بتحديد المعدّل في التطبيق والجدار الناري وFail2ban، دون حظر عناوين الوكيل العكسي أو CDN. (3) </w:t>
+            </w:r>
+            <w:r>
+              <w:rPr>
+                <w:rFonts w:ascii="Arial" w:cs="Arial" w:eastAsia="Arial" w:hAnsi="Arial"/>
+                <w:b/>
+                <w:bCs/>
+                <w:sz w:val="18"/>
+                <w:szCs w:val="18"/>
+                <w:rtl/>
+              </w:rPr>
+              <w:t xml:space="preserve">الخادم:</w:t>
+            </w:r>
+            <w:r>
+              <w:rPr>
+                <w:rFonts w:ascii="Arial" w:cs="Arial" w:eastAsia="Arial" w:hAnsi="Arial"/>
+                <w:b w:val="false"/>
+                <w:bCs w:val="false"/>
+                <w:sz w:val="18"/>
+                <w:szCs w:val="18"/>
+                <w:rtl/>
+              </w:rPr>
+              <w:t xml:space="preserve"> UFW مع journald دائم، وسجلات وصول Caddy بصيغة JSON، وتدوير سجلات Docker، وauditd، وFail2ban لـ SSH، وAIDE، ومراقبة المنافذ والموارد، وتجميع مركزي عبر Wazuh أو Loki/Grafana، وتنبيهات لـ SSH وUFW وCaddy وDocker، ونسخة سجلات خارجية غير قابلة للتعديل. (4) </w:t>
+            </w:r>
+            <w:r>
+              <w:rPr>
+                <w:rFonts w:ascii="Arial" w:cs="Arial" w:eastAsia="Arial" w:hAnsi="Arial"/>
+                <w:b/>
+                <w:bCs/>
+                <w:sz w:val="18"/>
+                <w:szCs w:val="18"/>
+                <w:rtl/>
+              </w:rPr>
+              <w:t xml:space="preserve">في المنصة:</w:t>
+            </w:r>
+            <w:r>
+              <w:rPr>
+                <w:rFonts w:ascii="Arial" w:cs="Arial" w:eastAsia="Arial" w:hAnsi="Arial"/>
+                <w:b w:val="false"/>
+                <w:bCs w:val="false"/>
+                <w:sz w:val="18"/>
+                <w:szCs w:val="18"/>
+                <w:rtl/>
+              </w:rPr>
+              <w:t xml:space="preserve"> لوحة أحداث أمنية في لوحة المشغّل، وقناة إشعار، وسجل حوادث. (5) </w:t>
+            </w:r>
+            <w:r>
+              <w:rPr>
+                <w:rFonts w:ascii="Arial" w:cs="Arial" w:eastAsia="Arial" w:hAnsi="Arial"/>
+                <w:b/>
+                <w:bCs/>
+                <w:sz w:val="18"/>
+                <w:szCs w:val="18"/>
+                <w:rtl/>
+              </w:rPr>
+              <w:t xml:space="preserve">خطة الاستجابة للحوادث</w:t>
+            </w:r>
+            <w:r>
+              <w:rPr>
+                <w:rFonts w:ascii="Arial" w:cs="Arial" w:eastAsia="Arial" w:hAnsi="Arial"/>
+                <w:b w:val="false"/>
+                <w:bCs w:val="false"/>
+                <w:sz w:val="18"/>
+                <w:szCs w:val="18"/>
+                <w:rtl/>
+              </w:rPr>
+              <w:t xml:space="preserve"> (12 خطوة): لا حذف للسجلات ولا إعادة تشغيل فورية؛ حفظ نسخة مختومة بالوقت؛ عزل الحساب أو العنوان إن كان آمنًا؛ عدم حظر الوكيل أو CDN خطأً؛ فحص العمليات والمنافذ والحاويات الجديدة؛ فحص authorized_keys والمستخدمين الجدد؛ إيقاف الأسرار المتأثرة وتدويرها؛ لقطة قرص قبل التغييرات الكبيرة؛ فحص الحاويات والصور وملفات Compose؛ إعادة البناء من مصدر موثوق؛ إعادة اختبار المصادقة والصلاحيات؛ توثيق الحادثة وسببها الجذري والإجراءات التصحيحية. تُكتب عند الاستئناف وثيقة تشغيل أمني وخطة استجابة، وتُحدَّث وثائق الأمن (DOC-S)، ويُبنى ما يخص التطبيق (تحديد المعدّل والحظر ولوحة الأحداث وسجل الحوادث)</w:t>
             </w:r>
           </w:p>
         </w:tc>
@@ -10481,7 +10481,7 @@
                 <w:szCs w:val="18"/>
                 <w:rtl/>
               </w:rPr>
-              <w:t xml:space="preserve">الخطة</w:t>
+              <w:t xml:space="preserve">الأمن والتشغيل والنشر ولوحة المشغّل</w:t>
             </w:r>
           </w:p>
         </w:tc>
@@ -10518,7 +10518,7 @@
                 <w:szCs w:val="18"/>
                 <w:rtl/>
               </w:rPr>
-              <w:t xml:space="preserve">موقوف حتى الموعد</w:t>
+              <w:t xml:space="preserve">يُكتب ويُبنى عند الاستئناف</w:t>
             </w:r>
           </w:p>
         </w:tc>

</xml_diff>

<commit_message>
docs/31 row 48: the security list evaluated into P0 (before the trial) and P1 (before the general launch)
Co-Authored-By: Claude Opus 5.5 <noreply@anthropic.com>
Claude-Session: https://claude.ai/code/session_012HHcRrzuvMBTL2FYxXtsyv
</commit_message>
<xml_diff>
--- a/treasury-platform/docs/31-OWNER-DECISIONS.docx
+++ b/treasury-platform/docs/31-OWNER-DECISIONS.docx
@@ -10323,18 +10323,18 @@
                 <w:szCs w:val="18"/>
                 <w:rtl/>
               </w:rPr>
-              <w:t xml:space="preserve">الأمن ومنع الاختراق وإظهاره في المنصة (2026-10-23).</w:t>
-            </w:r>
-            <w:r>
-              <w:rPr>
-                <w:rFonts w:ascii="Arial" w:cs="Arial" w:eastAsia="Arial" w:hAnsi="Arial"/>
-                <w:b w:val="false"/>
-                <w:bCs w:val="false"/>
-                <w:sz w:val="18"/>
-                <w:szCs w:val="18"/>
-                <w:rtl/>
-              </w:rPr>
-              <w:t xml:space="preserve"> طلب المالك: (1) </w:t>
+              <w:t xml:space="preserve">الأمن ومنع الاختراق وإظهاره في المنصة (2026-10-23)، بعد التقييم.</w:t>
+            </w:r>
+            <w:r>
+              <w:rPr>
+                <w:rFonts w:ascii="Arial" w:cs="Arial" w:eastAsia="Arial" w:hAnsi="Arial"/>
+                <w:b w:val="false"/>
+                <w:bCs w:val="false"/>
+                <w:sz w:val="18"/>
+                <w:szCs w:val="18"/>
+                <w:rtl/>
+              </w:rPr>
+              <w:t xml:space="preserve"> طلب المالك قائمة إجراءات، وطلب إضافة المفيد منها بعد التقييم. </w:t>
             </w:r>
             <w:r>
               <w:rPr>
@@ -10345,18 +10345,18 @@
                 <w:szCs w:val="18"/>
                 <w:rtl/>
               </w:rPr>
-              <w:t xml:space="preserve">الواجهة:</w:t>
-            </w:r>
-            <w:r>
-              <w:rPr>
-                <w:rFonts w:ascii="Arial" w:cs="Arial" w:eastAsia="Arial" w:hAnsi="Arial"/>
-                <w:b w:val="false"/>
-                <w:bCs w:val="false"/>
-                <w:sz w:val="18"/>
-                <w:szCs w:val="18"/>
-                <w:rtl/>
-              </w:rPr>
-              <w:t xml:space="preserve"> لا تُنشر الشيفرة المصدرية المقروءة ولا خرائطها (source maps) في الإنتاج، وتُصغَّر، وتُطبع المستندات من الخادم ببصمة SHA-256 تكشف أي تعديل في المتصفح؛ مع ملاحظة أن ما يصل إلى المتصفح لا يمكن إخفاؤه كليًا، فالحماية الحقيقية أن الخادم وحده يقرر ويتحقق. (2) </w:t>
+              <w:t xml:space="preserve">موجود أصلًا ويُستكمل:</w:t>
+            </w:r>
+            <w:r>
+              <w:rPr>
+                <w:rFonts w:ascii="Arial" w:cs="Arial" w:eastAsia="Arial" w:hAnsi="Arial"/>
+                <w:b w:val="false"/>
+                <w:bCs w:val="false"/>
+                <w:sz w:val="18"/>
+                <w:szCs w:val="18"/>
+                <w:rtl/>
+              </w:rPr>
+              <w:t xml:space="preserve"> UFW وjournald وauditd ونسخة السجلات غير القابلة للتعديل وفحص authorized_keys واللقطات (DOC-S10 وDOC-S12)، وخطة الاستجابة (DOC-S15)، وتحديد معدّل الدخول وإعادة التعيين في التطبيق. </w:t>
             </w:r>
             <w:r>
               <w:rPr>
@@ -10367,18 +10367,42 @@
                 <w:szCs w:val="18"/>
                 <w:rtl/>
               </w:rPr>
-              <w:t xml:space="preserve">حظر العناوين:</w:t>
-            </w:r>
-            <w:r>
-              <w:rPr>
-                <w:rFonts w:ascii="Arial" w:cs="Arial" w:eastAsia="Arial" w:hAnsi="Arial"/>
-                <w:b w:val="false"/>
-                <w:bCs w:val="false"/>
-                <w:sz w:val="18"/>
-                <w:szCs w:val="18"/>
-                <w:rtl/>
-              </w:rPr>
-              <w:t xml:space="preserve"> حظر عنوان IP لمحاولات الاختراق والإغراق (ومنها ping)، بتحديد المعدّل في التطبيق والجدار الناري وFail2ban، دون حظر عناوين الوكيل العكسي أو CDN. (3) </w:t>
+              <w:t xml:space="preserve">يُضاف قبل التجربة (P0):</w:t>
+            </w:r>
+            <w:r>
+              <w:rPr>
+                <w:rFonts w:ascii="Arial" w:cs="Arial" w:eastAsia="Arial" w:hAnsi="Arial"/>
+                <w:b w:val="false"/>
+                <w:bCs w:val="false"/>
+                <w:sz w:val="18"/>
+                <w:szCs w:val="18"/>
+                <w:rtl/>
+              </w:rPr>
+              <w:t xml:space="preserve"> (1) إيقاف خرائط الشيفرة في بناء الإنتاج: البناء الحالي ينشرها (</w:t>
+            </w:r>
+            <w:r>
+              <w:rPr>
+                <w:rFonts w:ascii="Courier New" w:cs="Courier New" w:eastAsia="Courier New" w:hAnsi="Courier New"/>
+                <w:b w:val="false"/>
+                <w:bCs w:val="false"/>
+                <w:color w:val="1F2937"/>
+                <w:sz w:val="16"/>
+                <w:szCs w:val="16"/>
+                <w:shd w:fill="F1F3F5" w:color="auto" w:val="clear"/>
+                <w:rtl/>
+              </w:rPr>
+              <w:t xml:space="preserve">‎sourcemap: true‎</w:t>
+            </w:r>
+            <w:r>
+              <w:rPr>
+                <w:rFonts w:ascii="Arial" w:cs="Arial" w:eastAsia="Arial" w:hAnsi="Arial"/>
+                <w:b w:val="false"/>
+                <w:bCs w:val="false"/>
+                <w:sz w:val="18"/>
+                <w:szCs w:val="18"/>
+                <w:rtl/>
+              </w:rPr>
+              <w:t xml:space="preserve"> في app/web/vite.config.ts)، وهذا خلل حقيقي؛ (2) تحديد المعدّل لكل عنوان على كل الواجهة البرمجية لا الدخول وحده، وحظر مؤقت للعنوان بعد تكرار الرفض، وقيمه إعدادات للمنصة، ويقرأ العنوان الحقيقي من X-Forwarded-For من الوكيل الموثوق وحده حتى لا يُحظر الوكيل أو CDN؛ (3) لوحة أحداث أمنية وسجل حوادث في لوحة المشغّل (المحاولات المرفوضة، والعناوين المحظورة، والكشوف غير المعتادة، والحوادث بحالتها)، وقناة تنبيه؛ (4) على الخادم: Caddy وكيلًا عكسيًا بشهادات تلقائية وسجلات JSON، وتدوير سجلات Docker، وFail2ban لـ SSH ولسجلات Caddy، وتحديد معدّل ICMP (ping) في UFW، ومراقبة المنافذ والموارد والتنبيه لـ SSH وUFW وCaddy وDocker؛ (5) دمج الخطوات الاثنتي عشرة في DOC-S15 دليلًا تقنيًا للاستجابة. </w:t>
             </w:r>
             <w:r>
               <w:rPr>
@@ -10389,18 +10413,18 @@
                 <w:szCs w:val="18"/>
                 <w:rtl/>
               </w:rPr>
-              <w:t xml:space="preserve">الخادم:</w:t>
-            </w:r>
-            <w:r>
-              <w:rPr>
-                <w:rFonts w:ascii="Arial" w:cs="Arial" w:eastAsia="Arial" w:hAnsi="Arial"/>
-                <w:b w:val="false"/>
-                <w:bCs w:val="false"/>
-                <w:sz w:val="18"/>
-                <w:szCs w:val="18"/>
-                <w:rtl/>
-              </w:rPr>
-              <w:t xml:space="preserve"> UFW مع journald دائم، وسجلات وصول Caddy بصيغة JSON، وتدوير سجلات Docker، وauditd، وFail2ban لـ SSH، وAIDE، ومراقبة المنافذ والموارد، وتجميع مركزي عبر Wazuh أو Loki/Grafana، وتنبيهات لـ SSH وUFW وCaddy وDocker، ونسخة سجلات خارجية غير قابلة للتعديل. (4) </w:t>
+              <w:t xml:space="preserve">قبل الإطلاق العام (P1):</w:t>
+            </w:r>
+            <w:r>
+              <w:rPr>
+                <w:rFonts w:ascii="Arial" w:cs="Arial" w:eastAsia="Arial" w:hAnsi="Arial"/>
+                <w:b w:val="false"/>
+                <w:bCs w:val="false"/>
+                <w:sz w:val="18"/>
+                <w:szCs w:val="18"/>
+                <w:rtl/>
+              </w:rPr>
+              <w:t xml:space="preserve"> Wazuh للتجميع المركزي وكشف التغيّر في الملفات (يغني عن AIDE، فلا يُشغَّلان معًا)، وGrafana/Loki اختياريًا لسجلات التشغيل، وتفعيل التحقق بخطوتين (الصف 46). </w:t>
             </w:r>
             <w:r>
               <w:rPr>
@@ -10411,18 +10435,18 @@
                 <w:szCs w:val="18"/>
                 <w:rtl/>
               </w:rPr>
-              <w:t xml:space="preserve">في المنصة:</w:t>
-            </w:r>
-            <w:r>
-              <w:rPr>
-                <w:rFonts w:ascii="Arial" w:cs="Arial" w:eastAsia="Arial" w:hAnsi="Arial"/>
-                <w:b w:val="false"/>
-                <w:bCs w:val="false"/>
-                <w:sz w:val="18"/>
-                <w:szCs w:val="18"/>
-                <w:rtl/>
-              </w:rPr>
-              <w:t xml:space="preserve"> لوحة أحداث أمنية في لوحة المشغّل، وقناة إشعار، وسجل حوادث. (5) </w:t>
+              <w:t xml:space="preserve">لا يُنصح به:</w:t>
+            </w:r>
+            <w:r>
+              <w:rPr>
+                <w:rFonts w:ascii="Arial" w:cs="Arial" w:eastAsia="Arial" w:hAnsi="Arial"/>
+                <w:b w:val="false"/>
+                <w:bCs w:val="false"/>
+                <w:sz w:val="18"/>
+                <w:szCs w:val="18"/>
+                <w:rtl/>
+              </w:rPr>
+              <w:t xml:space="preserve"> تعطيل أدوات المطوّر أو الزر الأيمن في المتصفح، لأنه يُتجاوز بسهولة ويضر الاستخدام؛ والبديل أن الخادم يتحقق من كل عملية وأن المطبوع يحمل بصمته. </w:t>
             </w:r>
             <w:r>
               <w:rPr>
@@ -10433,18 +10457,18 @@
                 <w:szCs w:val="18"/>
                 <w:rtl/>
               </w:rPr>
-              <w:t xml:space="preserve">خطة الاستجابة للحوادث</w:t>
-            </w:r>
-            <w:r>
-              <w:rPr>
-                <w:rFonts w:ascii="Arial" w:cs="Arial" w:eastAsia="Arial" w:hAnsi="Arial"/>
-                <w:b w:val="false"/>
-                <w:bCs w:val="false"/>
-                <w:sz w:val="18"/>
-                <w:szCs w:val="18"/>
-                <w:rtl/>
-              </w:rPr>
-              <w:t xml:space="preserve"> (12 خطوة): لا حذف للسجلات ولا إعادة تشغيل فورية؛ حفظ نسخة مختومة بالوقت؛ عزل الحساب أو العنوان إن كان آمنًا؛ عدم حظر الوكيل أو CDN خطأً؛ فحص العمليات والمنافذ والحاويات الجديدة؛ فحص authorized_keys والمستخدمين الجدد؛ إيقاف الأسرار المتأثرة وتدويرها؛ لقطة قرص قبل التغييرات الكبيرة؛ فحص الحاويات والصور وملفات Compose؛ إعادة البناء من مصدر موثوق؛ إعادة اختبار المصادقة والصلاحيات؛ توثيق الحادثة وسببها الجذري والإجراءات التصحيحية. تُكتب عند الاستئناف وثيقة تشغيل أمني وخطة استجابة، وتُحدَّث وثائق الأمن (DOC-S)، ويُبنى ما يخص التطبيق (تحديد المعدّل والحظر ولوحة الأحداث وسجل الحوادث)</w:t>
+              <w:t xml:space="preserve">ملاحظتان:</w:t>
+            </w:r>
+            <w:r>
+              <w:rPr>
+                <w:rFonts w:ascii="Arial" w:cs="Arial" w:eastAsia="Arial" w:hAnsi="Arial"/>
+                <w:b w:val="false"/>
+                <w:bCs w:val="false"/>
+                <w:sz w:val="18"/>
+                <w:szCs w:val="18"/>
+                <w:rtl/>
+              </w:rPr>
+              <w:t xml:space="preserve"> الإغراق الكبير (DDoS) لا يوقفه الخادم وحده، فيلزم مزوّد استضافة أو CDN بحماية منه؛ وCaddy وDocker يفترضان تشغيل التطبيق على Linux في حاويات، ووثيقة التشغيل الحالية تفترض Windows Server للتطبيق ولم يُحسم، فيُعتمد Linux مع هذا الصف ما لم يقرر المالك غير ذلك</w:t>
             </w:r>
           </w:p>
         </w:tc>
@@ -10518,7 +10542,7 @@
                 <w:szCs w:val="18"/>
                 <w:rtl/>
               </w:rPr>
-              <w:t xml:space="preserve">يُكتب ويُبنى عند الاستئناف</w:t>
+              <w:t xml:space="preserve">P0 يُبنى ويُكتب عند الاستئناف؛ P1 قبل الإطلاق العام</w:t>
             </w:r>
           </w:p>
         </w:tc>

</xml_diff>

<commit_message>
docs/31 row 48: Linux for the application layer; layered DDoS protection (edge CDN/WAF with origin locked to it, host, application, operations)
Co-Authored-By: Claude Opus 5.5 <noreply@anthropic.com>
Claude-Session: https://claude.ai/code/session_012HHcRrzuvMBTL2FYxXtsyv
</commit_message>
<xml_diff>
--- a/treasury-platform/docs/31-OWNER-DECISIONS.docx
+++ b/treasury-platform/docs/31-OWNER-DECISIONS.docx
@@ -10468,7 +10468,139 @@
                 <w:szCs w:val="18"/>
                 <w:rtl/>
               </w:rPr>
-              <w:t xml:space="preserve"> الإغراق الكبير (DDoS) لا يوقفه الخادم وحده، فيلزم مزوّد استضافة أو CDN بحماية منه؛ وCaddy وDocker يفترضان تشغيل التطبيق على Linux في حاويات، ووثيقة التشغيل الحالية تفترض Windows Server للتطبيق ولم يُحسم، فيُعتمد Linux مع هذا الصف ما لم يقرر المالك غير ذلك</w:t>
+              <w:t xml:space="preserve"> الإغراق الكبير (DDoS) لا يوقفه الخادم وحده، فيلزم مزوّد استضافة أو CDN بحماية منه؛ </w:t>
+            </w:r>
+            <w:r>
+              <w:rPr>
+                <w:rFonts w:ascii="Arial" w:cs="Arial" w:eastAsia="Arial" w:hAnsi="Arial"/>
+                <w:b/>
+                <w:bCs/>
+                <w:sz w:val="18"/>
+                <w:szCs w:val="18"/>
+                <w:rtl/>
+              </w:rPr>
+              <w:t xml:space="preserve">اعتمد المالك Linux (2026-10-24)</w:t>
+            </w:r>
+            <w:r>
+              <w:rPr>
+                <w:rFonts w:ascii="Arial" w:cs="Arial" w:eastAsia="Arial" w:hAnsi="Arial"/>
+                <w:b w:val="false"/>
+                <w:bCs w:val="false"/>
+                <w:sz w:val="18"/>
+                <w:szCs w:val="18"/>
+                <w:rtl/>
+              </w:rPr>
+              <w:t xml:space="preserve"> لطبقة التطبيق في حاويات Docker خلف Caddy، فتُحدَّث الوثائق التي تفترض Windows Server. </w:t>
+            </w:r>
+            <w:r>
+              <w:rPr>
+                <w:rFonts w:ascii="Arial" w:cs="Arial" w:eastAsia="Arial" w:hAnsi="Arial"/>
+                <w:b/>
+                <w:bCs/>
+                <w:sz w:val="18"/>
+                <w:szCs w:val="18"/>
+                <w:rtl/>
+              </w:rPr>
+              <w:t xml:space="preserve">حماية الإغراق (DDoS) المعتمدة، بطبقات:</w:t>
+            </w:r>
+            <w:r>
+              <w:rPr>
+                <w:rFonts w:ascii="Arial" w:cs="Arial" w:eastAsia="Arial" w:hAnsi="Arial"/>
+                <w:b w:val="false"/>
+                <w:bCs w:val="false"/>
+                <w:sz w:val="18"/>
+                <w:szCs w:val="18"/>
+                <w:rtl/>
+              </w:rPr>
+              <w:t xml:space="preserve"> (أ) </w:t>
+            </w:r>
+            <w:r>
+              <w:rPr>
+                <w:rFonts w:ascii="Arial" w:cs="Arial" w:eastAsia="Arial" w:hAnsi="Arial"/>
+                <w:b/>
+                <w:bCs/>
+                <w:sz w:val="18"/>
+                <w:szCs w:val="18"/>
+                <w:rtl/>
+              </w:rPr>
+              <w:t xml:space="preserve">الحافة:</w:t>
+            </w:r>
+            <w:r>
+              <w:rPr>
+                <w:rFonts w:ascii="Arial" w:cs="Arial" w:eastAsia="Arial" w:hAnsi="Arial"/>
+                <w:b w:val="false"/>
+                <w:bCs w:val="false"/>
+                <w:sz w:val="18"/>
+                <w:szCs w:val="18"/>
+                <w:rtl/>
+              </w:rPr>
+              <w:t xml:space="preserve"> شبكة توصيل بحماية من الإغراق وجدار تطبيقات (WAF)، والمقترح Cloudflare، ويقبل الخادم الأصلي الاتصال من عناوينها وحدها مع التحقق من مصدر الاتصال (Authenticated Origin Pulls)، فلا يُعرف عنوانه ولا يُضرب مباشرة؛ وإن اشترطت متطلبات الإقامة النظامية للبيانات المالية إنهاء التشفير داخل المملكة، تُستعمل حماية مزوّد سحابي محلي بدلًا منها، ويُتحقق من ذلك مع مستشار الامتثال قبل الإطلاق؛ (ب) </w:t>
+            </w:r>
+            <w:r>
+              <w:rPr>
+                <w:rFonts w:ascii="Arial" w:cs="Arial" w:eastAsia="Arial" w:hAnsi="Arial"/>
+                <w:b/>
+                <w:bCs/>
+                <w:sz w:val="18"/>
+                <w:szCs w:val="18"/>
+                <w:rtl/>
+              </w:rPr>
+              <w:t xml:space="preserve">الخادم:</w:t>
+            </w:r>
+            <w:r>
+              <w:rPr>
+                <w:rFonts w:ascii="Arial" w:cs="Arial" w:eastAsia="Arial" w:hAnsi="Arial"/>
+                <w:b w:val="false"/>
+                <w:bCs w:val="false"/>
+                <w:sz w:val="18"/>
+                <w:szCs w:val="18"/>
+                <w:rtl/>
+              </w:rPr>
+              <w:t xml:space="preserve"> UFW يفتح 443 لعناوين الحافة وحدها وSSH لعناوين الإدارة وحدها، وتحديد معدّل ICMP، وSYN cookies، وحد للاتصالات المتزامنة لكل عنوان في Caddy؛ (ج) </w:t>
+            </w:r>
+            <w:r>
+              <w:rPr>
+                <w:rFonts w:ascii="Arial" w:cs="Arial" w:eastAsia="Arial" w:hAnsi="Arial"/>
+                <w:b/>
+                <w:bCs/>
+                <w:sz w:val="18"/>
+                <w:szCs w:val="18"/>
+                <w:rtl/>
+              </w:rPr>
+              <w:t xml:space="preserve">التطبيق:</w:t>
+            </w:r>
+            <w:r>
+              <w:rPr>
+                <w:rFonts w:ascii="Arial" w:cs="Arial" w:eastAsia="Arial" w:hAnsi="Arial"/>
+                <w:b w:val="false"/>
+                <w:bCs w:val="false"/>
+                <w:sz w:val="18"/>
+                <w:szCs w:val="18"/>
+                <w:rtl/>
+              </w:rPr>
+              <w:t xml:space="preserve"> تحديد المعدّل والحظر المؤقت (P0 أعلاه)؛ (د) </w:t>
+            </w:r>
+            <w:r>
+              <w:rPr>
+                <w:rFonts w:ascii="Arial" w:cs="Arial" w:eastAsia="Arial" w:hAnsi="Arial"/>
+                <w:b/>
+                <w:bCs/>
+                <w:sz w:val="18"/>
+                <w:szCs w:val="18"/>
+                <w:rtl/>
+              </w:rPr>
+              <w:t xml:space="preserve">التشغيل:</w:t>
+            </w:r>
+            <w:r>
+              <w:rPr>
+                <w:rFonts w:ascii="Arial" w:cs="Arial" w:eastAsia="Arial" w:hAnsi="Arial"/>
+                <w:b w:val="false"/>
+                <w:bCs w:val="false"/>
+                <w:sz w:val="18"/>
+                <w:szCs w:val="18"/>
+                <w:rtl/>
+              </w:rPr>
+              <w:t xml:space="preserve"> تنبيه عند ارتفاع الطلبات، وإجراء «تحت الهجوم» في دليل الاستجابة (تشديد قواعد الحافة، وتعليق التسجيل والدعوات مؤقتًا)</w:t>
             </w:r>
           </w:p>
         </w:tc>

</xml_diff>

<commit_message>
docs/31 row 48: build without the Cloudflare edge; Caddy the only trusted proxy, the trusted proxy list a setting
Co-Authored-By: Claude Opus 5.5 <noreply@anthropic.com>
Claude-Session: https://claude.ai/code/session_012HHcRrzuvMBTL2FYxXtsyv
</commit_message>
<xml_diff>
--- a/treasury-platform/docs/31-OWNER-DECISIONS.docx
+++ b/treasury-platform/docs/31-OWNER-DECISIONS.docx
@@ -10501,18 +10501,18 @@
                 <w:szCs w:val="18"/>
                 <w:rtl/>
               </w:rPr>
-              <w:t xml:space="preserve">حماية الإغراق (DDoS) المعتمدة، بطبقات:</w:t>
-            </w:r>
-            <w:r>
-              <w:rPr>
-                <w:rFonts w:ascii="Arial" w:cs="Arial" w:eastAsia="Arial" w:hAnsi="Arial"/>
-                <w:b w:val="false"/>
-                <w:bCs w:val="false"/>
-                <w:sz w:val="18"/>
-                <w:szCs w:val="18"/>
-                <w:rtl/>
-              </w:rPr>
-              <w:t xml:space="preserve"> (أ) </w:t>
+              <w:t xml:space="preserve">قرار المالك (2026-10-24): يُبنى النظام دون طبقة Cloudflare.</w:t>
+            </w:r>
+            <w:r>
+              <w:rPr>
+                <w:rFonts w:ascii="Arial" w:cs="Arial" w:eastAsia="Arial" w:hAnsi="Arial"/>
+                <w:b w:val="false"/>
+                <w:bCs w:val="false"/>
+                <w:sz w:val="18"/>
+                <w:szCs w:val="18"/>
+                <w:rtl/>
+              </w:rPr>
+              <w:t xml:space="preserve"> فتُبنى الطبقات (ب) و(ج) و(د) أدناه، ويكون Caddy هو الوكيل الموثوق الوحيد، وقائمة الوكلاء الموثوقين إعداد، فتُضاف حافة لاحقًا (CDN أو حماية مزوّد سحابي محلي) دون تغيير في الشيفرة. ويبقى الإغراق الكبير خارج طاقة الخادم وحده، فيُطلب من مزوّد الاستضافة حماية الشبكة التي يقدمها. </w:t>
             </w:r>
             <w:r>
               <w:rPr>
@@ -10523,18 +10523,18 @@
                 <w:szCs w:val="18"/>
                 <w:rtl/>
               </w:rPr>
-              <w:t xml:space="preserve">الحافة:</w:t>
-            </w:r>
-            <w:r>
-              <w:rPr>
-                <w:rFonts w:ascii="Arial" w:cs="Arial" w:eastAsia="Arial" w:hAnsi="Arial"/>
-                <w:b w:val="false"/>
-                <w:bCs w:val="false"/>
-                <w:sz w:val="18"/>
-                <w:szCs w:val="18"/>
-                <w:rtl/>
-              </w:rPr>
-              <w:t xml:space="preserve"> شبكة توصيل بحماية من الإغراق وجدار تطبيقات (WAF)، والمقترح Cloudflare، ويقبل الخادم الأصلي الاتصال من عناوينها وحدها مع التحقق من مصدر الاتصال (Authenticated Origin Pulls)، فلا يُعرف عنوانه ولا يُضرب مباشرة؛ وإن اشترطت متطلبات الإقامة النظامية للبيانات المالية إنهاء التشفير داخل المملكة، تُستعمل حماية مزوّد سحابي محلي بدلًا منها، ويُتحقق من ذلك مع مستشار الامتثال قبل الإطلاق؛ (ب) </w:t>
+              <w:t xml:space="preserve">حماية الإغراق (DDoS)، بطبقات:</w:t>
+            </w:r>
+            <w:r>
+              <w:rPr>
+                <w:rFonts w:ascii="Arial" w:cs="Arial" w:eastAsia="Arial" w:hAnsi="Arial"/>
+                <w:b w:val="false"/>
+                <w:bCs w:val="false"/>
+                <w:sz w:val="18"/>
+                <w:szCs w:val="18"/>
+                <w:rtl/>
+              </w:rPr>
+              <w:t xml:space="preserve"> (أ) </w:t>
             </w:r>
             <w:r>
               <w:rPr>
@@ -10545,6 +10545,28 @@
                 <w:szCs w:val="18"/>
                 <w:rtl/>
               </w:rPr>
+              <w:t xml:space="preserve">الحافة (مؤجَّلة بقرار المالك):</w:t>
+            </w:r>
+            <w:r>
+              <w:rPr>
+                <w:rFonts w:ascii="Arial" w:cs="Arial" w:eastAsia="Arial" w:hAnsi="Arial"/>
+                <w:b w:val="false"/>
+                <w:bCs w:val="false"/>
+                <w:sz w:val="18"/>
+                <w:szCs w:val="18"/>
+                <w:rtl/>
+              </w:rPr>
+              <w:t xml:space="preserve"> شبكة توصيل بحماية من الإغراق وجدار تطبيقات (WAF)، والمقترح Cloudflare، ويقبل الخادم الأصلي الاتصال من عناوينها وحدها مع التحقق من مصدر الاتصال (Authenticated Origin Pulls)، فلا يُعرف عنوانه ولا يُضرب مباشرة؛ وإن اشترطت متطلبات الإقامة النظامية للبيانات المالية إنهاء التشفير داخل المملكة، تُستعمل حماية مزوّد سحابي محلي بدلًا منها، ويُتحقق من ذلك مع مستشار الامتثال قبل الإطلاق؛ (ب) </w:t>
+            </w:r>
+            <w:r>
+              <w:rPr>
+                <w:rFonts w:ascii="Arial" w:cs="Arial" w:eastAsia="Arial" w:hAnsi="Arial"/>
+                <w:b/>
+                <w:bCs/>
+                <w:sz w:val="18"/>
+                <w:szCs w:val="18"/>
+                <w:rtl/>
+              </w:rPr>
               <w:t xml:space="preserve">الخادم:</w:t>
             </w:r>
             <w:r>
@@ -10556,7 +10578,7 @@
                 <w:szCs w:val="18"/>
                 <w:rtl/>
               </w:rPr>
-              <w:t xml:space="preserve"> UFW يفتح 443 لعناوين الحافة وحدها وSSH لعناوين الإدارة وحدها، وتحديد معدّل ICMP، وSYN cookies، وحد للاتصالات المتزامنة لكل عنوان في Caddy؛ (ج) </w:t>
+              <w:t xml:space="preserve"> UFW يفتح 443 للجميع ما دامت لا حافة (ولعناوين الحافة وحدها إن أُضيفت) وSSH لعناوين الإدارة وحدها، وتحديد معدّل ICMP، وSYN cookies، وحد للاتصالات المتزامنة لكل عنوان في Caddy؛ (ج) </w:t>
             </w:r>
             <w:r>
               <w:rPr>

</xml_diff>

<commit_message>
Word files: docs/31 and docs/48
Co-Authored-By: Claude Opus 5.5 <noreply@anthropic.com>
Claude-Session: https://claude.ai/code/session_012HHcRrzuvMBTL2FYxXtsyv
</commit_message>
<xml_diff>
--- a/treasury-platform/docs/31-OWNER-DECISIONS.docx
+++ b/treasury-platform/docs/31-OWNER-DECISIONS.docx
@@ -5088,10 +5088,10 @@
         </w:tblBorders>
       </w:tblPr>
       <w:tblGrid>
-        <w:gridCol w:w="933"/>
-        <w:gridCol w:w="3613"/>
-        <w:gridCol w:w="3391"/>
-        <w:gridCol w:w="1927"/>
+        <w:gridCol w:w="925"/>
+        <w:gridCol w:w="2437"/>
+        <w:gridCol w:w="2290"/>
+        <w:gridCol w:w="4212"/>
       </w:tblGrid>
       <w:tr>
         <w:trPr>
@@ -5100,7 +5100,7 @@
         </w:trPr>
         <w:tc>
           <w:tcPr>
-            <w:tcW w:type="dxa" w:w="933"/>
+            <w:tcW w:type="dxa" w:w="925"/>
             <w:tcBorders>
               <w:top w:val="single" w:color="BFC9D6" w:sz="4"/>
               <w:left w:val="single" w:color="BFC9D6" w:sz="4"/>
@@ -5138,7 +5138,7 @@
         </w:tc>
         <w:tc>
           <w:tcPr>
-            <w:tcW w:type="dxa" w:w="3613"/>
+            <w:tcW w:type="dxa" w:w="2437"/>
             <w:tcBorders>
               <w:top w:val="single" w:color="BFC9D6" w:sz="4"/>
               <w:left w:val="single" w:color="BFC9D6" w:sz="4"/>
@@ -5176,7 +5176,7 @@
         </w:tc>
         <w:tc>
           <w:tcPr>
-            <w:tcW w:type="dxa" w:w="3391"/>
+            <w:tcW w:type="dxa" w:w="2290"/>
             <w:tcBorders>
               <w:top w:val="single" w:color="BFC9D6" w:sz="4"/>
               <w:left w:val="single" w:color="BFC9D6" w:sz="4"/>
@@ -5214,7 +5214,7 @@
         </w:tc>
         <w:tc>
           <w:tcPr>
-            <w:tcW w:type="dxa" w:w="1927"/>
+            <w:tcW w:type="dxa" w:w="4212"/>
             <w:tcBorders>
               <w:top w:val="single" w:color="BFC9D6" w:sz="4"/>
               <w:left w:val="single" w:color="BFC9D6" w:sz="4"/>
@@ -5257,7 +5257,7 @@
         </w:trPr>
         <w:tc>
           <w:tcPr>
-            <w:tcW w:type="dxa" w:w="933"/>
+            <w:tcW w:type="dxa" w:w="925"/>
             <w:tcBorders>
               <w:top w:val="single" w:color="BFC9D6" w:sz="4"/>
               <w:left w:val="single" w:color="BFC9D6" w:sz="4"/>
@@ -5293,7 +5293,7 @@
         </w:tc>
         <w:tc>
           <w:tcPr>
-            <w:tcW w:type="dxa" w:w="3613"/>
+            <w:tcW w:type="dxa" w:w="2437"/>
             <w:tcBorders>
               <w:top w:val="single" w:color="BFC9D6" w:sz="4"/>
               <w:left w:val="single" w:color="BFC9D6" w:sz="4"/>
@@ -5340,7 +5340,7 @@
         </w:tc>
         <w:tc>
           <w:tcPr>
-            <w:tcW w:type="dxa" w:w="3391"/>
+            <w:tcW w:type="dxa" w:w="2290"/>
             <w:tcBorders>
               <w:top w:val="single" w:color="BFC9D6" w:sz="4"/>
               <w:left w:val="single" w:color="BFC9D6" w:sz="4"/>
@@ -5376,7 +5376,7 @@
         </w:tc>
         <w:tc>
           <w:tcPr>
-            <w:tcW w:type="dxa" w:w="1927"/>
+            <w:tcW w:type="dxa" w:w="4212"/>
             <w:tcBorders>
               <w:top w:val="single" w:color="BFC9D6" w:sz="4"/>
               <w:left w:val="single" w:color="BFC9D6" w:sz="4"/>
@@ -5441,7 +5441,7 @@
         </w:trPr>
         <w:tc>
           <w:tcPr>
-            <w:tcW w:type="dxa" w:w="933"/>
+            <w:tcW w:type="dxa" w:w="925"/>
             <w:tcBorders>
               <w:top w:val="single" w:color="BFC9D6" w:sz="4"/>
               <w:left w:val="single" w:color="BFC9D6" w:sz="4"/>
@@ -5478,7 +5478,7 @@
         </w:tc>
         <w:tc>
           <w:tcPr>
-            <w:tcW w:type="dxa" w:w="3613"/>
+            <w:tcW w:type="dxa" w:w="2437"/>
             <w:tcBorders>
               <w:top w:val="single" w:color="BFC9D6" w:sz="4"/>
               <w:left w:val="single" w:color="BFC9D6" w:sz="4"/>
@@ -5526,7 +5526,7 @@
         </w:tc>
         <w:tc>
           <w:tcPr>
-            <w:tcW w:type="dxa" w:w="3391"/>
+            <w:tcW w:type="dxa" w:w="2290"/>
             <w:tcBorders>
               <w:top w:val="single" w:color="BFC9D6" w:sz="4"/>
               <w:left w:val="single" w:color="BFC9D6" w:sz="4"/>
@@ -5584,7 +5584,7 @@
         </w:tc>
         <w:tc>
           <w:tcPr>
-            <w:tcW w:type="dxa" w:w="1927"/>
+            <w:tcW w:type="dxa" w:w="4212"/>
             <w:tcBorders>
               <w:top w:val="single" w:color="BFC9D6" w:sz="4"/>
               <w:left w:val="single" w:color="BFC9D6" w:sz="4"/>
@@ -5626,7 +5626,7 @@
         </w:trPr>
         <w:tc>
           <w:tcPr>
-            <w:tcW w:type="dxa" w:w="933"/>
+            <w:tcW w:type="dxa" w:w="925"/>
             <w:tcBorders>
               <w:top w:val="single" w:color="BFC9D6" w:sz="4"/>
               <w:left w:val="single" w:color="BFC9D6" w:sz="4"/>
@@ -5662,7 +5662,7 @@
         </w:tc>
         <w:tc>
           <w:tcPr>
-            <w:tcW w:type="dxa" w:w="3613"/>
+            <w:tcW w:type="dxa" w:w="2437"/>
             <w:tcBorders>
               <w:top w:val="single" w:color="BFC9D6" w:sz="4"/>
               <w:left w:val="single" w:color="BFC9D6" w:sz="4"/>
@@ -5709,7 +5709,7 @@
         </w:tc>
         <w:tc>
           <w:tcPr>
-            <w:tcW w:type="dxa" w:w="3391"/>
+            <w:tcW w:type="dxa" w:w="2290"/>
             <w:tcBorders>
               <w:top w:val="single" w:color="BFC9D6" w:sz="4"/>
               <w:left w:val="single" w:color="BFC9D6" w:sz="4"/>
@@ -5791,7 +5791,7 @@
         </w:tc>
         <w:tc>
           <w:tcPr>
-            <w:tcW w:type="dxa" w:w="1927"/>
+            <w:tcW w:type="dxa" w:w="4212"/>
             <w:tcBorders>
               <w:top w:val="single" w:color="BFC9D6" w:sz="4"/>
               <w:left w:val="single" w:color="BFC9D6" w:sz="4"/>
@@ -5880,7 +5880,7 @@
         </w:trPr>
         <w:tc>
           <w:tcPr>
-            <w:tcW w:type="dxa" w:w="933"/>
+            <w:tcW w:type="dxa" w:w="925"/>
             <w:tcBorders>
               <w:top w:val="single" w:color="BFC9D6" w:sz="4"/>
               <w:left w:val="single" w:color="BFC9D6" w:sz="4"/>
@@ -5917,7 +5917,7 @@
         </w:tc>
         <w:tc>
           <w:tcPr>
-            <w:tcW w:type="dxa" w:w="3613"/>
+            <w:tcW w:type="dxa" w:w="2437"/>
             <w:tcBorders>
               <w:top w:val="single" w:color="BFC9D6" w:sz="4"/>
               <w:left w:val="single" w:color="BFC9D6" w:sz="4"/>
@@ -5965,7 +5965,7 @@
         </w:tc>
         <w:tc>
           <w:tcPr>
-            <w:tcW w:type="dxa" w:w="3391"/>
+            <w:tcW w:type="dxa" w:w="2290"/>
             <w:tcBorders>
               <w:top w:val="single" w:color="BFC9D6" w:sz="4"/>
               <w:left w:val="single" w:color="BFC9D6" w:sz="4"/>
@@ -6072,7 +6072,7 @@
         </w:tc>
         <w:tc>
           <w:tcPr>
-            <w:tcW w:type="dxa" w:w="1927"/>
+            <w:tcW w:type="dxa" w:w="4212"/>
             <w:tcBorders>
               <w:top w:val="single" w:color="BFC9D6" w:sz="4"/>
               <w:left w:val="single" w:color="BFC9D6" w:sz="4"/>
@@ -6138,7 +6138,7 @@
         </w:trPr>
         <w:tc>
           <w:tcPr>
-            <w:tcW w:type="dxa" w:w="933"/>
+            <w:tcW w:type="dxa" w:w="925"/>
             <w:tcBorders>
               <w:top w:val="single" w:color="BFC9D6" w:sz="4"/>
               <w:left w:val="single" w:color="BFC9D6" w:sz="4"/>
@@ -6174,7 +6174,7 @@
         </w:tc>
         <w:tc>
           <w:tcPr>
-            <w:tcW w:type="dxa" w:w="3613"/>
+            <w:tcW w:type="dxa" w:w="2437"/>
             <w:tcBorders>
               <w:top w:val="single" w:color="BFC9D6" w:sz="4"/>
               <w:left w:val="single" w:color="BFC9D6" w:sz="4"/>
@@ -6221,7 +6221,7 @@
         </w:tc>
         <w:tc>
           <w:tcPr>
-            <w:tcW w:type="dxa" w:w="3391"/>
+            <w:tcW w:type="dxa" w:w="2290"/>
             <w:tcBorders>
               <w:top w:val="single" w:color="BFC9D6" w:sz="4"/>
               <w:left w:val="single" w:color="BFC9D6" w:sz="4"/>
@@ -6303,7 +6303,7 @@
         </w:tc>
         <w:tc>
           <w:tcPr>
-            <w:tcW w:type="dxa" w:w="1927"/>
+            <w:tcW w:type="dxa" w:w="4212"/>
             <w:tcBorders>
               <w:top w:val="single" w:color="BFC9D6" w:sz="4"/>
               <w:left w:val="single" w:color="BFC9D6" w:sz="4"/>
@@ -6368,7 +6368,7 @@
         </w:trPr>
         <w:tc>
           <w:tcPr>
-            <w:tcW w:type="dxa" w:w="933"/>
+            <w:tcW w:type="dxa" w:w="925"/>
             <w:tcBorders>
               <w:top w:val="single" w:color="BFC9D6" w:sz="4"/>
               <w:left w:val="single" w:color="BFC9D6" w:sz="4"/>
@@ -6405,7 +6405,7 @@
         </w:tc>
         <w:tc>
           <w:tcPr>
-            <w:tcW w:type="dxa" w:w="3613"/>
+            <w:tcW w:type="dxa" w:w="2437"/>
             <w:tcBorders>
               <w:top w:val="single" w:color="BFC9D6" w:sz="4"/>
               <w:left w:val="single" w:color="BFC9D6" w:sz="4"/>
@@ -6453,7 +6453,7 @@
         </w:tc>
         <w:tc>
           <w:tcPr>
-            <w:tcW w:type="dxa" w:w="3391"/>
+            <w:tcW w:type="dxa" w:w="2290"/>
             <w:tcBorders>
               <w:top w:val="single" w:color="BFC9D6" w:sz="4"/>
               <w:left w:val="single" w:color="BFC9D6" w:sz="4"/>
@@ -6514,7 +6514,7 @@
         </w:tc>
         <w:tc>
           <w:tcPr>
-            <w:tcW w:type="dxa" w:w="1927"/>
+            <w:tcW w:type="dxa" w:w="4212"/>
             <w:tcBorders>
               <w:top w:val="single" w:color="BFC9D6" w:sz="4"/>
               <w:left w:val="single" w:color="BFC9D6" w:sz="4"/>
@@ -6569,7 +6569,7 @@
         </w:trPr>
         <w:tc>
           <w:tcPr>
-            <w:tcW w:type="dxa" w:w="933"/>
+            <w:tcW w:type="dxa" w:w="925"/>
             <w:tcBorders>
               <w:top w:val="single" w:color="BFC9D6" w:sz="4"/>
               <w:left w:val="single" w:color="BFC9D6" w:sz="4"/>
@@ -6605,7 +6605,7 @@
         </w:tc>
         <w:tc>
           <w:tcPr>
-            <w:tcW w:type="dxa" w:w="3613"/>
+            <w:tcW w:type="dxa" w:w="2437"/>
             <w:tcBorders>
               <w:top w:val="single" w:color="BFC9D6" w:sz="4"/>
               <w:left w:val="single" w:color="BFC9D6" w:sz="4"/>
@@ -6652,7 +6652,7 @@
         </w:tc>
         <w:tc>
           <w:tcPr>
-            <w:tcW w:type="dxa" w:w="3391"/>
+            <w:tcW w:type="dxa" w:w="2290"/>
             <w:tcBorders>
               <w:top w:val="single" w:color="BFC9D6" w:sz="4"/>
               <w:left w:val="single" w:color="BFC9D6" w:sz="4"/>
@@ -6758,7 +6758,7 @@
         </w:tc>
         <w:tc>
           <w:tcPr>
-            <w:tcW w:type="dxa" w:w="1927"/>
+            <w:tcW w:type="dxa" w:w="4212"/>
             <w:tcBorders>
               <w:top w:val="single" w:color="BFC9D6" w:sz="4"/>
               <w:left w:val="single" w:color="BFC9D6" w:sz="4"/>
@@ -6823,7 +6823,7 @@
         </w:trPr>
         <w:tc>
           <w:tcPr>
-            <w:tcW w:type="dxa" w:w="933"/>
+            <w:tcW w:type="dxa" w:w="925"/>
             <w:tcBorders>
               <w:top w:val="single" w:color="BFC9D6" w:sz="4"/>
               <w:left w:val="single" w:color="BFC9D6" w:sz="4"/>
@@ -6860,7 +6860,7 @@
         </w:tc>
         <w:tc>
           <w:tcPr>
-            <w:tcW w:type="dxa" w:w="3613"/>
+            <w:tcW w:type="dxa" w:w="2437"/>
             <w:tcBorders>
               <w:top w:val="single" w:color="BFC9D6" w:sz="4"/>
               <w:left w:val="single" w:color="BFC9D6" w:sz="4"/>
@@ -6908,7 +6908,7 @@
         </w:tc>
         <w:tc>
           <w:tcPr>
-            <w:tcW w:type="dxa" w:w="3391"/>
+            <w:tcW w:type="dxa" w:w="2290"/>
             <w:tcBorders>
               <w:top w:val="single" w:color="BFC9D6" w:sz="4"/>
               <w:left w:val="single" w:color="BFC9D6" w:sz="4"/>
@@ -6945,7 +6945,7 @@
         </w:tc>
         <w:tc>
           <w:tcPr>
-            <w:tcW w:type="dxa" w:w="1927"/>
+            <w:tcW w:type="dxa" w:w="4212"/>
             <w:tcBorders>
               <w:top w:val="single" w:color="BFC9D6" w:sz="4"/>
               <w:left w:val="single" w:color="BFC9D6" w:sz="4"/>
@@ -7000,7 +7000,7 @@
         </w:trPr>
         <w:tc>
           <w:tcPr>
-            <w:tcW w:type="dxa" w:w="933"/>
+            <w:tcW w:type="dxa" w:w="925"/>
             <w:tcBorders>
               <w:top w:val="single" w:color="BFC9D6" w:sz="4"/>
               <w:left w:val="single" w:color="BFC9D6" w:sz="4"/>
@@ -7036,7 +7036,7 @@
         </w:tc>
         <w:tc>
           <w:tcPr>
-            <w:tcW w:type="dxa" w:w="3613"/>
+            <w:tcW w:type="dxa" w:w="2437"/>
             <w:tcBorders>
               <w:top w:val="single" w:color="BFC9D6" w:sz="4"/>
               <w:left w:val="single" w:color="BFC9D6" w:sz="4"/>
@@ -7083,7 +7083,7 @@
         </w:tc>
         <w:tc>
           <w:tcPr>
-            <w:tcW w:type="dxa" w:w="3391"/>
+            <w:tcW w:type="dxa" w:w="2290"/>
             <w:tcBorders>
               <w:top w:val="single" w:color="BFC9D6" w:sz="4"/>
               <w:left w:val="single" w:color="BFC9D6" w:sz="4"/>
@@ -7132,7 +7132,7 @@
         </w:tc>
         <w:tc>
           <w:tcPr>
-            <w:tcW w:type="dxa" w:w="1927"/>
+            <w:tcW w:type="dxa" w:w="4212"/>
             <w:tcBorders>
               <w:top w:val="single" w:color="BFC9D6" w:sz="4"/>
               <w:left w:val="single" w:color="BFC9D6" w:sz="4"/>
@@ -7197,7 +7197,7 @@
         </w:trPr>
         <w:tc>
           <w:tcPr>
-            <w:tcW w:type="dxa" w:w="933"/>
+            <w:tcW w:type="dxa" w:w="925"/>
             <w:tcBorders>
               <w:top w:val="single" w:color="BFC9D6" w:sz="4"/>
               <w:left w:val="single" w:color="BFC9D6" w:sz="4"/>
@@ -7234,7 +7234,7 @@
         </w:tc>
         <w:tc>
           <w:tcPr>
-            <w:tcW w:type="dxa" w:w="3613"/>
+            <w:tcW w:type="dxa" w:w="2437"/>
             <w:tcBorders>
               <w:top w:val="single" w:color="BFC9D6" w:sz="4"/>
               <w:left w:val="single" w:color="BFC9D6" w:sz="4"/>
@@ -7282,7 +7282,7 @@
         </w:tc>
         <w:tc>
           <w:tcPr>
-            <w:tcW w:type="dxa" w:w="3391"/>
+            <w:tcW w:type="dxa" w:w="2290"/>
             <w:tcBorders>
               <w:top w:val="single" w:color="BFC9D6" w:sz="4"/>
               <w:left w:val="single" w:color="BFC9D6" w:sz="4"/>
@@ -7343,7 +7343,7 @@
         </w:tc>
         <w:tc>
           <w:tcPr>
-            <w:tcW w:type="dxa" w:w="1927"/>
+            <w:tcW w:type="dxa" w:w="4212"/>
             <w:tcBorders>
               <w:top w:val="single" w:color="BFC9D6" w:sz="4"/>
               <w:left w:val="single" w:color="BFC9D6" w:sz="4"/>
@@ -7398,7 +7398,7 @@
         </w:trPr>
         <w:tc>
           <w:tcPr>
-            <w:tcW w:type="dxa" w:w="933"/>
+            <w:tcW w:type="dxa" w:w="925"/>
             <w:tcBorders>
               <w:top w:val="single" w:color="BFC9D6" w:sz="4"/>
               <w:left w:val="single" w:color="BFC9D6" w:sz="4"/>
@@ -7434,7 +7434,7 @@
         </w:tc>
         <w:tc>
           <w:tcPr>
-            <w:tcW w:type="dxa" w:w="3613"/>
+            <w:tcW w:type="dxa" w:w="2437"/>
             <w:tcBorders>
               <w:top w:val="single" w:color="BFC9D6" w:sz="4"/>
               <w:left w:val="single" w:color="BFC9D6" w:sz="4"/>
@@ -7481,7 +7481,7 @@
         </w:tc>
         <w:tc>
           <w:tcPr>
-            <w:tcW w:type="dxa" w:w="3391"/>
+            <w:tcW w:type="dxa" w:w="2290"/>
             <w:tcBorders>
               <w:top w:val="single" w:color="BFC9D6" w:sz="4"/>
               <w:left w:val="single" w:color="BFC9D6" w:sz="4"/>
@@ -7565,7 +7565,7 @@
         </w:tc>
         <w:tc>
           <w:tcPr>
-            <w:tcW w:type="dxa" w:w="1927"/>
+            <w:tcW w:type="dxa" w:w="4212"/>
             <w:tcBorders>
               <w:top w:val="single" w:color="BFC9D6" w:sz="4"/>
               <w:left w:val="single" w:color="BFC9D6" w:sz="4"/>
@@ -7630,7 +7630,7 @@
         </w:trPr>
         <w:tc>
           <w:tcPr>
-            <w:tcW w:type="dxa" w:w="933"/>
+            <w:tcW w:type="dxa" w:w="925"/>
             <w:tcBorders>
               <w:top w:val="single" w:color="BFC9D6" w:sz="4"/>
               <w:left w:val="single" w:color="BFC9D6" w:sz="4"/>
@@ -7667,7 +7667,7 @@
         </w:tc>
         <w:tc>
           <w:tcPr>
-            <w:tcW w:type="dxa" w:w="3613"/>
+            <w:tcW w:type="dxa" w:w="2437"/>
             <w:tcBorders>
               <w:top w:val="single" w:color="BFC9D6" w:sz="4"/>
               <w:left w:val="single" w:color="BFC9D6" w:sz="4"/>
@@ -7739,7 +7739,7 @@
         </w:tc>
         <w:tc>
           <w:tcPr>
-            <w:tcW w:type="dxa" w:w="3391"/>
+            <w:tcW w:type="dxa" w:w="2290"/>
             <w:tcBorders>
               <w:top w:val="single" w:color="BFC9D6" w:sz="4"/>
               <w:left w:val="single" w:color="BFC9D6" w:sz="4"/>
@@ -7776,7 +7776,7 @@
         </w:tc>
         <w:tc>
           <w:tcPr>
-            <w:tcW w:type="dxa" w:w="1927"/>
+            <w:tcW w:type="dxa" w:w="4212"/>
             <w:tcBorders>
               <w:top w:val="single" w:color="BFC9D6" w:sz="4"/>
               <w:left w:val="single" w:color="BFC9D6" w:sz="4"/>
@@ -7842,7 +7842,7 @@
         </w:trPr>
         <w:tc>
           <w:tcPr>
-            <w:tcW w:type="dxa" w:w="933"/>
+            <w:tcW w:type="dxa" w:w="925"/>
             <w:tcBorders>
               <w:top w:val="single" w:color="BFC9D6" w:sz="4"/>
               <w:left w:val="single" w:color="BFC9D6" w:sz="4"/>
@@ -7878,7 +7878,7 @@
         </w:tc>
         <w:tc>
           <w:tcPr>
-            <w:tcW w:type="dxa" w:w="3613"/>
+            <w:tcW w:type="dxa" w:w="2437"/>
             <w:tcBorders>
               <w:top w:val="single" w:color="BFC9D6" w:sz="4"/>
               <w:left w:val="single" w:color="BFC9D6" w:sz="4"/>
@@ -7949,7 +7949,7 @@
         </w:tc>
         <w:tc>
           <w:tcPr>
-            <w:tcW w:type="dxa" w:w="3391"/>
+            <w:tcW w:type="dxa" w:w="2290"/>
             <w:tcBorders>
               <w:top w:val="single" w:color="BFC9D6" w:sz="4"/>
               <w:left w:val="single" w:color="BFC9D6" w:sz="4"/>
@@ -7985,7 +7985,7 @@
         </w:tc>
         <w:tc>
           <w:tcPr>
-            <w:tcW w:type="dxa" w:w="1927"/>
+            <w:tcW w:type="dxa" w:w="4212"/>
             <w:tcBorders>
               <w:top w:val="single" w:color="BFC9D6" w:sz="4"/>
               <w:left w:val="single" w:color="BFC9D6" w:sz="4"/>
@@ -8039,7 +8039,7 @@
         </w:trPr>
         <w:tc>
           <w:tcPr>
-            <w:tcW w:type="dxa" w:w="933"/>
+            <w:tcW w:type="dxa" w:w="925"/>
             <w:tcBorders>
               <w:top w:val="single" w:color="BFC9D6" w:sz="4"/>
               <w:left w:val="single" w:color="BFC9D6" w:sz="4"/>
@@ -8076,7 +8076,7 @@
         </w:tc>
         <w:tc>
           <w:tcPr>
-            <w:tcW w:type="dxa" w:w="3613"/>
+            <w:tcW w:type="dxa" w:w="2437"/>
             <w:tcBorders>
               <w:top w:val="single" w:color="BFC9D6" w:sz="4"/>
               <w:left w:val="single" w:color="BFC9D6" w:sz="4"/>
@@ -8170,7 +8170,7 @@
         </w:tc>
         <w:tc>
           <w:tcPr>
-            <w:tcW w:type="dxa" w:w="3391"/>
+            <w:tcW w:type="dxa" w:w="2290"/>
             <w:tcBorders>
               <w:top w:val="single" w:color="BFC9D6" w:sz="4"/>
               <w:left w:val="single" w:color="BFC9D6" w:sz="4"/>
@@ -8207,7 +8207,7 @@
         </w:tc>
         <w:tc>
           <w:tcPr>
-            <w:tcW w:type="dxa" w:w="1927"/>
+            <w:tcW w:type="dxa" w:w="4212"/>
             <w:tcBorders>
               <w:top w:val="single" w:color="BFC9D6" w:sz="4"/>
               <w:left w:val="single" w:color="BFC9D6" w:sz="4"/>
@@ -8262,7 +8262,7 @@
         </w:trPr>
         <w:tc>
           <w:tcPr>
-            <w:tcW w:type="dxa" w:w="933"/>
+            <w:tcW w:type="dxa" w:w="925"/>
             <w:tcBorders>
               <w:top w:val="single" w:color="BFC9D6" w:sz="4"/>
               <w:left w:val="single" w:color="BFC9D6" w:sz="4"/>
@@ -8298,7 +8298,7 @@
         </w:tc>
         <w:tc>
           <w:tcPr>
-            <w:tcW w:type="dxa" w:w="3613"/>
+            <w:tcW w:type="dxa" w:w="2437"/>
             <w:tcBorders>
               <w:top w:val="single" w:color="BFC9D6" w:sz="4"/>
               <w:left w:val="single" w:color="BFC9D6" w:sz="4"/>
@@ -8389,7 +8389,7 @@
         </w:tc>
         <w:tc>
           <w:tcPr>
-            <w:tcW w:type="dxa" w:w="3391"/>
+            <w:tcW w:type="dxa" w:w="2290"/>
             <w:tcBorders>
               <w:top w:val="single" w:color="BFC9D6" w:sz="4"/>
               <w:left w:val="single" w:color="BFC9D6" w:sz="4"/>
@@ -8425,7 +8425,7 @@
         </w:tc>
         <w:tc>
           <w:tcPr>
-            <w:tcW w:type="dxa" w:w="1927"/>
+            <w:tcW w:type="dxa" w:w="4212"/>
             <w:tcBorders>
               <w:top w:val="single" w:color="BFC9D6" w:sz="4"/>
               <w:left w:val="single" w:color="BFC9D6" w:sz="4"/>
@@ -8479,7 +8479,7 @@
         </w:trPr>
         <w:tc>
           <w:tcPr>
-            <w:tcW w:type="dxa" w:w="933"/>
+            <w:tcW w:type="dxa" w:w="925"/>
             <w:tcBorders>
               <w:top w:val="single" w:color="BFC9D6" w:sz="4"/>
               <w:left w:val="single" w:color="BFC9D6" w:sz="4"/>
@@ -8516,7 +8516,7 @@
         </w:tc>
         <w:tc>
           <w:tcPr>
-            <w:tcW w:type="dxa" w:w="3613"/>
+            <w:tcW w:type="dxa" w:w="2437"/>
             <w:tcBorders>
               <w:top w:val="single" w:color="BFC9D6" w:sz="4"/>
               <w:left w:val="single" w:color="BFC9D6" w:sz="4"/>
@@ -8586,7 +8586,7 @@
         </w:tc>
         <w:tc>
           <w:tcPr>
-            <w:tcW w:type="dxa" w:w="3391"/>
+            <w:tcW w:type="dxa" w:w="2290"/>
             <w:tcBorders>
               <w:top w:val="single" w:color="BFC9D6" w:sz="4"/>
               <w:left w:val="single" w:color="BFC9D6" w:sz="4"/>
@@ -8623,7 +8623,7 @@
         </w:tc>
         <w:tc>
           <w:tcPr>
-            <w:tcW w:type="dxa" w:w="1927"/>
+            <w:tcW w:type="dxa" w:w="4212"/>
             <w:tcBorders>
               <w:top w:val="single" w:color="BFC9D6" w:sz="4"/>
               <w:left w:val="single" w:color="BFC9D6" w:sz="4"/>
@@ -8678,7 +8678,7 @@
         </w:trPr>
         <w:tc>
           <w:tcPr>
-            <w:tcW w:type="dxa" w:w="933"/>
+            <w:tcW w:type="dxa" w:w="925"/>
             <w:tcBorders>
               <w:top w:val="single" w:color="BFC9D6" w:sz="4"/>
               <w:left w:val="single" w:color="BFC9D6" w:sz="4"/>
@@ -8714,7 +8714,7 @@
         </w:tc>
         <w:tc>
           <w:tcPr>
-            <w:tcW w:type="dxa" w:w="3613"/>
+            <w:tcW w:type="dxa" w:w="2437"/>
             <w:tcBorders>
               <w:top w:val="single" w:color="BFC9D6" w:sz="4"/>
               <w:left w:val="single" w:color="BFC9D6" w:sz="4"/>
@@ -8831,7 +8831,7 @@
         </w:tc>
         <w:tc>
           <w:tcPr>
-            <w:tcW w:type="dxa" w:w="3391"/>
+            <w:tcW w:type="dxa" w:w="2290"/>
             <w:tcBorders>
               <w:top w:val="single" w:color="BFC9D6" w:sz="4"/>
               <w:left w:val="single" w:color="BFC9D6" w:sz="4"/>
@@ -8867,7 +8867,7 @@
         </w:tc>
         <w:tc>
           <w:tcPr>
-            <w:tcW w:type="dxa" w:w="1927"/>
+            <w:tcW w:type="dxa" w:w="4212"/>
             <w:tcBorders>
               <w:top w:val="single" w:color="BFC9D6" w:sz="4"/>
               <w:left w:val="single" w:color="BFC9D6" w:sz="4"/>
@@ -8908,7 +8908,7 @@
         </w:trPr>
         <w:tc>
           <w:tcPr>
-            <w:tcW w:type="dxa" w:w="933"/>
+            <w:tcW w:type="dxa" w:w="925"/>
             <w:tcBorders>
               <w:top w:val="single" w:color="BFC9D6" w:sz="4"/>
               <w:left w:val="single" w:color="BFC9D6" w:sz="4"/>
@@ -8945,7 +8945,7 @@
         </w:tc>
         <w:tc>
           <w:tcPr>
-            <w:tcW w:type="dxa" w:w="3613"/>
+            <w:tcW w:type="dxa" w:w="2437"/>
             <w:tcBorders>
               <w:top w:val="single" w:color="BFC9D6" w:sz="4"/>
               <w:left w:val="single" w:color="BFC9D6" w:sz="4"/>
@@ -9109,7 +9109,7 @@
         </w:tc>
         <w:tc>
           <w:tcPr>
-            <w:tcW w:type="dxa" w:w="3391"/>
+            <w:tcW w:type="dxa" w:w="2290"/>
             <w:tcBorders>
               <w:top w:val="single" w:color="BFC9D6" w:sz="4"/>
               <w:left w:val="single" w:color="BFC9D6" w:sz="4"/>
@@ -9146,7 +9146,7 @@
         </w:tc>
         <w:tc>
           <w:tcPr>
-            <w:tcW w:type="dxa" w:w="1927"/>
+            <w:tcW w:type="dxa" w:w="4212"/>
             <w:tcBorders>
               <w:top w:val="single" w:color="BFC9D6" w:sz="4"/>
               <w:left w:val="single" w:color="BFC9D6" w:sz="4"/>
@@ -9210,7 +9210,7 @@
         </w:trPr>
         <w:tc>
           <w:tcPr>
-            <w:tcW w:type="dxa" w:w="933"/>
+            <w:tcW w:type="dxa" w:w="925"/>
             <w:tcBorders>
               <w:top w:val="single" w:color="BFC9D6" w:sz="4"/>
               <w:left w:val="single" w:color="BFC9D6" w:sz="4"/>
@@ -9246,7 +9246,7 @@
         </w:tc>
         <w:tc>
           <w:tcPr>
-            <w:tcW w:type="dxa" w:w="3613"/>
+            <w:tcW w:type="dxa" w:w="2437"/>
             <w:tcBorders>
               <w:top w:val="single" w:color="BFC9D6" w:sz="4"/>
               <w:left w:val="single" w:color="BFC9D6" w:sz="4"/>
@@ -9365,7 +9365,7 @@
         </w:tc>
         <w:tc>
           <w:tcPr>
-            <w:tcW w:type="dxa" w:w="3391"/>
+            <w:tcW w:type="dxa" w:w="2290"/>
             <w:tcBorders>
               <w:top w:val="single" w:color="BFC9D6" w:sz="4"/>
               <w:left w:val="single" w:color="BFC9D6" w:sz="4"/>
@@ -9401,7 +9401,7 @@
         </w:tc>
         <w:tc>
           <w:tcPr>
-            <w:tcW w:type="dxa" w:w="1927"/>
+            <w:tcW w:type="dxa" w:w="4212"/>
             <w:tcBorders>
               <w:top w:val="single" w:color="BFC9D6" w:sz="4"/>
               <w:left w:val="single" w:color="BFC9D6" w:sz="4"/>
@@ -9453,7 +9453,7 @@
         </w:trPr>
         <w:tc>
           <w:tcPr>
-            <w:tcW w:type="dxa" w:w="933"/>
+            <w:tcW w:type="dxa" w:w="925"/>
             <w:tcBorders>
               <w:top w:val="single" w:color="BFC9D6" w:sz="4"/>
               <w:left w:val="single" w:color="BFC9D6" w:sz="4"/>
@@ -9490,7 +9490,7 @@
         </w:tc>
         <w:tc>
           <w:tcPr>
-            <w:tcW w:type="dxa" w:w="3613"/>
+            <w:tcW w:type="dxa" w:w="2437"/>
             <w:tcBorders>
               <w:top w:val="single" w:color="BFC9D6" w:sz="4"/>
               <w:left w:val="single" w:color="BFC9D6" w:sz="4"/>
@@ -9538,7 +9538,7 @@
         </w:tc>
         <w:tc>
           <w:tcPr>
-            <w:tcW w:type="dxa" w:w="3391"/>
+            <w:tcW w:type="dxa" w:w="2290"/>
             <w:tcBorders>
               <w:top w:val="single" w:color="BFC9D6" w:sz="4"/>
               <w:left w:val="single" w:color="BFC9D6" w:sz="4"/>
@@ -9575,7 +9575,7 @@
         </w:tc>
         <w:tc>
           <w:tcPr>
-            <w:tcW w:type="dxa" w:w="1927"/>
+            <w:tcW w:type="dxa" w:w="4212"/>
             <w:tcBorders>
               <w:top w:val="single" w:color="BFC9D6" w:sz="4"/>
               <w:left w:val="single" w:color="BFC9D6" w:sz="4"/>
@@ -9599,14 +9599,45 @@
             </w:pPr>
             <w:r>
               <w:rPr>
-                <w:rFonts w:ascii="Arial" w:cs="Arial" w:eastAsia="Arial" w:hAnsi="Arial"/>
-                <w:b w:val="false"/>
-                <w:bCs w:val="false"/>
-                <w:sz w:val="18"/>
-                <w:szCs w:val="18"/>
-                <w:rtl/>
-              </w:rPr>
-              <w:t xml:space="preserve">يُراجَع ويُختبر عند الاستئناف</w:t>
+                <w:rFonts w:ascii="Segoe UI Emoji" w:cs="Segoe UI Emoji" w:eastAsia="Segoe UI Emoji" w:hAnsi="Segoe UI Emoji"/>
+                <w:sz w:val="18"/>
+                <w:szCs w:val="18"/>
+                <w:rtl/>
+              </w:rPr>
+              <w:t xml:space="preserve">✅</w:t>
+            </w:r>
+            <w:r>
+              <w:rPr>
+                <w:rFonts w:ascii="Arial" w:cs="Arial" w:eastAsia="Arial" w:hAnsi="Arial"/>
+                <w:b w:val="false"/>
+                <w:bCs w:val="false"/>
+                <w:sz w:val="18"/>
+                <w:szCs w:val="18"/>
+                <w:rtl/>
+              </w:rPr>
+              <w:t xml:space="preserve"> </w:t>
+            </w:r>
+            <w:r>
+              <w:rPr>
+                <w:rFonts w:ascii="Arial" w:cs="Arial" w:eastAsia="Arial" w:hAnsi="Arial"/>
+                <w:b/>
+                <w:bCs/>
+                <w:sz w:val="18"/>
+                <w:szCs w:val="18"/>
+                <w:rtl/>
+              </w:rPr>
+              <w:t xml:space="preserve">روجع واختُبر (2026-10-24):</w:t>
+            </w:r>
+            <w:r>
+              <w:rPr>
+                <w:rFonts w:ascii="Arial" w:cs="Arial" w:eastAsia="Arial" w:hAnsi="Arial"/>
+                <w:b w:val="false"/>
+                <w:bCs w:val="false"/>
+                <w:sz w:val="18"/>
+                <w:szCs w:val="18"/>
+                <w:rtl/>
+              </w:rPr>
+              <w:t xml:space="preserve"> المهلة ومهلة السحب تُحسبان لكل طلب من لحظة دخوله مرحلته (EnteredAt وQueuedAt)، ولكل خانة موافقة من وصولها مع دخول المرحلة، ودورة جديدة بعد الإرجاع تبدأ مهلتها من جديد، والتذكير لكل إشعار من وقت إنشائه؛ وما يجري على طلب لا يغيّر ساعة غيره. اختبار التكامل Each_request_is_timed_from_its_own_arrival_and_on_its_own</w:t>
             </w:r>
           </w:p>
         </w:tc>
@@ -9617,7 +9648,7 @@
         </w:trPr>
         <w:tc>
           <w:tcPr>
-            <w:tcW w:type="dxa" w:w="933"/>
+            <w:tcW w:type="dxa" w:w="925"/>
             <w:tcBorders>
               <w:top w:val="single" w:color="BFC9D6" w:sz="4"/>
               <w:left w:val="single" w:color="BFC9D6" w:sz="4"/>
@@ -9653,7 +9684,7 @@
         </w:tc>
         <w:tc>
           <w:tcPr>
-            <w:tcW w:type="dxa" w:w="3613"/>
+            <w:tcW w:type="dxa" w:w="2437"/>
             <w:tcBorders>
               <w:top w:val="single" w:color="BFC9D6" w:sz="4"/>
               <w:left w:val="single" w:color="BFC9D6" w:sz="4"/>
@@ -9700,7 +9731,7 @@
         </w:tc>
         <w:tc>
           <w:tcPr>
-            <w:tcW w:type="dxa" w:w="3391"/>
+            <w:tcW w:type="dxa" w:w="2290"/>
             <w:tcBorders>
               <w:top w:val="single" w:color="BFC9D6" w:sz="4"/>
               <w:left w:val="single" w:color="BFC9D6" w:sz="4"/>
@@ -9736,37 +9767,59 @@
         </w:tc>
         <w:tc>
           <w:tcPr>
-            <w:tcW w:type="dxa" w:w="1927"/>
-            <w:tcBorders>
-              <w:top w:val="single" w:color="BFC9D6" w:sz="4"/>
-              <w:left w:val="single" w:color="BFC9D6" w:sz="4"/>
-              <w:bottom w:val="single" w:color="BFC9D6" w:sz="4"/>
-              <w:right w:val="single" w:color="BFC9D6" w:sz="4"/>
-            </w:tcBorders>
-            <w:tcMar>
-              <w:top w:type="dxa" w:w="50"/>
-              <w:left w:type="dxa" w:w="90"/>
-              <w:bottom w:type="dxa" w:w="50"/>
-              <w:right w:type="dxa" w:w="90"/>
-            </w:tcMar>
-            <w:vAlign w:val="top"/>
-          </w:tcPr>
-          <w:p>
-            <w:pPr>
-              <w:keepNext w:val="false"/>
-              <w:bidi/>
-              <w:spacing w:after="30" w:before="30" w:line="264"/>
-            </w:pPr>
-            <w:r>
-              <w:rPr>
-                <w:rFonts w:ascii="Arial" w:cs="Arial" w:eastAsia="Arial" w:hAnsi="Arial"/>
-                <w:b w:val="false"/>
-                <w:bCs w:val="false"/>
-                <w:sz w:val="18"/>
-                <w:szCs w:val="18"/>
-                <w:rtl/>
-              </w:rPr>
-              <w:t xml:space="preserve">مبدأ معتمد؛ المراجعة عند الاستئناف</w:t>
+            <w:tcW w:type="dxa" w:w="4212"/>
+            <w:tcBorders>
+              <w:top w:val="single" w:color="BFC9D6" w:sz="4"/>
+              <w:left w:val="single" w:color="BFC9D6" w:sz="4"/>
+              <w:bottom w:val="single" w:color="BFC9D6" w:sz="4"/>
+              <w:right w:val="single" w:color="BFC9D6" w:sz="4"/>
+            </w:tcBorders>
+            <w:tcMar>
+              <w:top w:type="dxa" w:w="50"/>
+              <w:left w:type="dxa" w:w="90"/>
+              <w:bottom w:type="dxa" w:w="50"/>
+              <w:right w:type="dxa" w:w="90"/>
+            </w:tcMar>
+            <w:vAlign w:val="top"/>
+          </w:tcPr>
+          <w:p>
+            <w:pPr>
+              <w:keepNext w:val="false"/>
+              <w:bidi/>
+              <w:spacing w:after="30" w:before="30" w:line="264"/>
+            </w:pPr>
+            <w:r>
+              <w:rPr>
+                <w:rFonts w:ascii="Arial" w:cs="Arial" w:eastAsia="Arial" w:hAnsi="Arial"/>
+                <w:b w:val="false"/>
+                <w:bCs w:val="false"/>
+                <w:sz w:val="18"/>
+                <w:szCs w:val="18"/>
+                <w:rtl/>
+              </w:rPr>
+              <w:t xml:space="preserve">مبدأ معتمد. </w:t>
+            </w:r>
+            <w:r>
+              <w:rPr>
+                <w:rFonts w:ascii="Arial" w:cs="Arial" w:eastAsia="Arial" w:hAnsi="Arial"/>
+                <w:b/>
+                <w:bCs/>
+                <w:sz w:val="18"/>
+                <w:szCs w:val="18"/>
+                <w:rtl/>
+              </w:rPr>
+              <w:t xml:space="preserve">روجع (2026-10-24):</w:t>
+            </w:r>
+            <w:r>
+              <w:rPr>
+                <w:rFonts w:ascii="Arial" w:cs="Arial" w:eastAsia="Arial" w:hAnsi="Arial"/>
+                <w:b w:val="false"/>
+                <w:bCs w:val="false"/>
+                <w:sz w:val="18"/>
+                <w:szCs w:val="18"/>
+                <w:rtl/>
+              </w:rPr>
+              <w:t xml:space="preserve"> فئات مرجع التسهيل تُقرأ في الشاشة من قائمة FACILITY_CLASS في الكتالوج بدل قائمة ثابتة، فتظهر أي فئة يضيفها المشترك؛ وعدد مرات إعادة المحاولة عند تعارض قاعدة البيانات إعداد (Database:DeadlockRuns)؛ وأُضيفت إعدادات الدخول وطريقة الإنشاء والتحقق بخطوتين (ADR 0048). وتبقى صيغة المرجع COMPANY-BANK-CLASS-YY كما قررها المالك في الصف 43، ورموز الشركات والبنوك والفئات إعدادات لكل مشترك</w:t>
             </w:r>
           </w:p>
         </w:tc>
@@ -9777,7 +9830,7 @@
         </w:trPr>
         <w:tc>
           <w:tcPr>
-            <w:tcW w:type="dxa" w:w="933"/>
+            <w:tcW w:type="dxa" w:w="925"/>
             <w:tcBorders>
               <w:top w:val="single" w:color="BFC9D6" w:sz="4"/>
               <w:left w:val="single" w:color="BFC9D6" w:sz="4"/>
@@ -9814,7 +9867,7 @@
         </w:tc>
         <w:tc>
           <w:tcPr>
-            <w:tcW w:type="dxa" w:w="3613"/>
+            <w:tcW w:type="dxa" w:w="2437"/>
             <w:tcBorders>
               <w:top w:val="single" w:color="BFC9D6" w:sz="4"/>
               <w:left w:val="single" w:color="BFC9D6" w:sz="4"/>
@@ -10016,7 +10069,7 @@
         </w:tc>
         <w:tc>
           <w:tcPr>
-            <w:tcW w:type="dxa" w:w="3391"/>
+            <w:tcW w:type="dxa" w:w="2290"/>
             <w:tcBorders>
               <w:top w:val="single" w:color="BFC9D6" w:sz="4"/>
               <w:left w:val="single" w:color="BFC9D6" w:sz="4"/>
@@ -10053,7 +10106,7 @@
         </w:tc>
         <w:tc>
           <w:tcPr>
-            <w:tcW w:type="dxa" w:w="1927"/>
+            <w:tcW w:type="dxa" w:w="4212"/>
             <w:tcBorders>
               <w:top w:val="single" w:color="BFC9D6" w:sz="4"/>
               <w:left w:val="single" w:color="BFC9D6" w:sz="4"/>
@@ -10077,14 +10130,45 @@
             </w:pPr>
             <w:r>
               <w:rPr>
-                <w:rFonts w:ascii="Arial" w:cs="Arial" w:eastAsia="Arial" w:hAnsi="Arial"/>
-                <w:b w:val="false"/>
-                <w:bCs w:val="false"/>
-                <w:sz w:val="18"/>
-                <w:szCs w:val="18"/>
-                <w:rtl/>
-              </w:rPr>
-              <w:t xml:space="preserve">يُبنى عند الاستئناف</w:t>
+                <w:rFonts w:ascii="Segoe UI Emoji" w:cs="Segoe UI Emoji" w:eastAsia="Segoe UI Emoji" w:hAnsi="Segoe UI Emoji"/>
+                <w:sz w:val="18"/>
+                <w:szCs w:val="18"/>
+                <w:rtl/>
+              </w:rPr>
+              <w:t xml:space="preserve">✅</w:t>
+            </w:r>
+            <w:r>
+              <w:rPr>
+                <w:rFonts w:ascii="Arial" w:cs="Arial" w:eastAsia="Arial" w:hAnsi="Arial"/>
+                <w:b w:val="false"/>
+                <w:bCs w:val="false"/>
+                <w:sz w:val="18"/>
+                <w:szCs w:val="18"/>
+                <w:rtl/>
+              </w:rPr>
+              <w:t xml:space="preserve"> </w:t>
+            </w:r>
+            <w:r>
+              <w:rPr>
+                <w:rFonts w:ascii="Arial" w:cs="Arial" w:eastAsia="Arial" w:hAnsi="Arial"/>
+                <w:b/>
+                <w:bCs/>
+                <w:sz w:val="18"/>
+                <w:szCs w:val="18"/>
+                <w:rtl/>
+              </w:rPr>
+              <w:t xml:space="preserve">منفّذ (2026-10-24، ADR 0048):</w:t>
+            </w:r>
+            <w:r>
+              <w:rPr>
+                <w:rFonts w:ascii="Arial" w:cs="Arial" w:eastAsia="Arial" w:hAnsi="Arial"/>
+                <w:b w:val="false"/>
+                <w:bCs w:val="false"/>
+                <w:sz w:val="18"/>
+                <w:szCs w:val="18"/>
+                <w:rtl/>
+              </w:rPr>
+              <w:t xml:space="preserve"> رمز الشركة هو العنوان الفرعي مع صفحة دخول عامة تسأل عنه؛ والدخول بالبريد أو الكود الوظيفي أو الجوال حسب إعداد الشركة security.login.identifiers؛ وطريقة الإنشاء إعداد security.user.creation (دعوة أو كلمة مرور مؤقتة تُعرض للمسؤول مرة واحدة وتُغيَّر إلزاميًا قبل أي عمل)؛ ونطاق المنتجات لكل موظف؛ والتحقق بخطوتين إعداد للمنصة (معطّل للتجربة) ولكل مشترك من لوحة المشغّل، ومن أعدّ المصادقة يُسأل دائمًا، ومن لم يُعدّها يؤكد العمليات الحساسة بكلمة المرور</w:t>
             </w:r>
           </w:p>
         </w:tc>
@@ -10095,7 +10179,7 @@
         </w:trPr>
         <w:tc>
           <w:tcPr>
-            <w:tcW w:type="dxa" w:w="933"/>
+            <w:tcW w:type="dxa" w:w="925"/>
             <w:tcBorders>
               <w:top w:val="single" w:color="BFC9D6" w:sz="4"/>
               <w:left w:val="single" w:color="BFC9D6" w:sz="4"/>
@@ -10131,7 +10215,7 @@
         </w:tc>
         <w:tc>
           <w:tcPr>
-            <w:tcW w:type="dxa" w:w="3613"/>
+            <w:tcW w:type="dxa" w:w="2437"/>
             <w:tcBorders>
               <w:top w:val="single" w:color="BFC9D6" w:sz="4"/>
               <w:left w:val="single" w:color="BFC9D6" w:sz="4"/>
@@ -10178,7 +10262,7 @@
         </w:tc>
         <w:tc>
           <w:tcPr>
-            <w:tcW w:type="dxa" w:w="3391"/>
+            <w:tcW w:type="dxa" w:w="2290"/>
             <w:tcBorders>
               <w:top w:val="single" w:color="BFC9D6" w:sz="4"/>
               <w:left w:val="single" w:color="BFC9D6" w:sz="4"/>
@@ -10214,7 +10298,7 @@
         </w:tc>
         <w:tc>
           <w:tcPr>
-            <w:tcW w:type="dxa" w:w="1927"/>
+            <w:tcW w:type="dxa" w:w="4212"/>
             <w:tcBorders>
               <w:top w:val="single" w:color="BFC9D6" w:sz="4"/>
               <w:left w:val="single" w:color="BFC9D6" w:sz="4"/>
@@ -10255,7 +10339,7 @@
         </w:trPr>
         <w:tc>
           <w:tcPr>
-            <w:tcW w:type="dxa" w:w="933"/>
+            <w:tcW w:type="dxa" w:w="925"/>
             <w:tcBorders>
               <w:top w:val="single" w:color="BFC9D6" w:sz="4"/>
               <w:left w:val="single" w:color="BFC9D6" w:sz="4"/>
@@ -10292,7 +10376,7 @@
         </w:tc>
         <w:tc>
           <w:tcPr>
-            <w:tcW w:type="dxa" w:w="3613"/>
+            <w:tcW w:type="dxa" w:w="2437"/>
             <w:tcBorders>
               <w:top w:val="single" w:color="BFC9D6" w:sz="4"/>
               <w:left w:val="single" w:color="BFC9D6" w:sz="4"/>
@@ -10628,7 +10712,7 @@
         </w:tc>
         <w:tc>
           <w:tcPr>
-            <w:tcW w:type="dxa" w:w="3391"/>
+            <w:tcW w:type="dxa" w:w="2290"/>
             <w:tcBorders>
               <w:top w:val="single" w:color="BFC9D6" w:sz="4"/>
               <w:left w:val="single" w:color="BFC9D6" w:sz="4"/>
@@ -10665,7 +10749,7 @@
         </w:tc>
         <w:tc>
           <w:tcPr>
-            <w:tcW w:type="dxa" w:w="1927"/>
+            <w:tcW w:type="dxa" w:w="4212"/>
             <w:tcBorders>
               <w:top w:val="single" w:color="BFC9D6" w:sz="4"/>
               <w:left w:val="single" w:color="BFC9D6" w:sz="4"/>
@@ -10728,6 +10812,197 @@
                 <w:rtl/>
               </w:rPr>
               <w:t xml:space="preserve"> خرائط الشيفرة موقوفة، والوكيل الموثوق إعداد، وحد لكل عنوان على كل الواجهة، وحظر مؤقت مع حدث أمني وتنبيه، وصفحتا الأمن والحوادث في لوحة المشغّل، واختبارات تكامل؛ وقوالب المضيف في tools/host/ ودليلها DOC-S16، والخطوات الاثنتا عشرة في DOC-S15 §9.1. يبقى تطبيق القوالب على الخادم. P1 قبل الإطلاق العام</w:t>
+            </w:r>
+          </w:p>
+        </w:tc>
+      </w:tr>
+      <w:tr>
+        <w:trPr>
+          <w:cantSplit/>
+        </w:trPr>
+        <w:tc>
+          <w:tcPr>
+            <w:tcW w:type="dxa" w:w="925"/>
+            <w:tcBorders>
+              <w:top w:val="single" w:color="BFC9D6" w:sz="4"/>
+              <w:left w:val="single" w:color="BFC9D6" w:sz="4"/>
+              <w:bottom w:val="single" w:color="BFC9D6" w:sz="4"/>
+              <w:right w:val="single" w:color="BFC9D6" w:sz="4"/>
+            </w:tcBorders>
+            <w:tcMar>
+              <w:top w:type="dxa" w:w="50"/>
+              <w:left w:type="dxa" w:w="90"/>
+              <w:bottom w:type="dxa" w:w="50"/>
+              <w:right w:type="dxa" w:w="90"/>
+            </w:tcMar>
+            <w:vAlign w:val="top"/>
+          </w:tcPr>
+          <w:p>
+            <w:pPr>
+              <w:keepNext w:val="false"/>
+              <w:bidi/>
+              <w:spacing w:after="30" w:before="30" w:line="264"/>
+            </w:pPr>
+            <w:r>
+              <w:rPr>
+                <w:rFonts w:ascii="Arial" w:cs="Arial" w:eastAsia="Arial" w:hAnsi="Arial"/>
+                <w:b w:val="false"/>
+                <w:bCs w:val="false"/>
+                <w:sz w:val="18"/>
+                <w:szCs w:val="18"/>
+                <w:rtl/>
+              </w:rPr>
+              <w:t xml:space="preserve">49</w:t>
+            </w:r>
+          </w:p>
+        </w:tc>
+        <w:tc>
+          <w:tcPr>
+            <w:tcW w:type="dxa" w:w="2437"/>
+            <w:tcBorders>
+              <w:top w:val="single" w:color="BFC9D6" w:sz="4"/>
+              <w:left w:val="single" w:color="BFC9D6" w:sz="4"/>
+              <w:bottom w:val="single" w:color="BFC9D6" w:sz="4"/>
+              <w:right w:val="single" w:color="BFC9D6" w:sz="4"/>
+            </w:tcBorders>
+            <w:tcMar>
+              <w:top w:type="dxa" w:w="50"/>
+              <w:left w:type="dxa" w:w="90"/>
+              <w:bottom w:type="dxa" w:w="50"/>
+              <w:right w:type="dxa" w:w="90"/>
+            </w:tcMar>
+            <w:vAlign w:val="top"/>
+          </w:tcPr>
+          <w:p>
+            <w:pPr>
+              <w:keepNext w:val="false"/>
+              <w:bidi/>
+              <w:spacing w:after="30" w:before="30" w:line="264"/>
+            </w:pPr>
+            <w:r>
+              <w:rPr>
+                <w:rFonts w:ascii="Arial" w:cs="Arial" w:eastAsia="Arial" w:hAnsi="Arial"/>
+                <w:b/>
+                <w:bCs/>
+                <w:sz w:val="18"/>
+                <w:szCs w:val="18"/>
+                <w:rtl/>
+              </w:rPr>
+              <w:t xml:space="preserve">إخراج المستخدم الخامل تلقائيًا (2026-10-24).</w:t>
+            </w:r>
+            <w:r>
+              <w:rPr>
+                <w:rFonts w:ascii="Arial" w:cs="Arial" w:eastAsia="Arial" w:hAnsi="Arial"/>
+                <w:b w:val="false"/>
+                <w:bCs w:val="false"/>
+                <w:sz w:val="18"/>
+                <w:szCs w:val="18"/>
+                <w:rtl/>
+              </w:rPr>
+              <w:t xml:space="preserve"> «المستخدم الذي لا يعمل ويبقى في حالة سبات يتم إخراجه من النظام تلقائيًا». كانت الجلسة تنتهي في الخادم بعد 30 دقيقة دون نشاط (إعداد security.session.idle_minutes من 5 إلى 30، و12 ساعة حدًا مطلقًا)، لكن جرس الإشعارات كان يسأل الخادم كل دقيقة فيمدّد الجلسة، فلا يخرج المستخدم الخامل أبدًا، وكانت الشاشة تبقى مفتوحة. </w:t>
+            </w:r>
+            <w:r>
+              <w:rPr>
+                <w:rFonts w:ascii="Arial" w:cs="Arial" w:eastAsia="Arial" w:hAnsi="Arial"/>
+                <w:b/>
+                <w:bCs/>
+                <w:sz w:val="18"/>
+                <w:szCs w:val="18"/>
+                <w:rtl/>
+              </w:rPr>
+              <w:t xml:space="preserve">نُفّذ:</w:t>
+            </w:r>
+            <w:r>
+              <w:rPr>
+                <w:rFonts w:ascii="Arial" w:cs="Arial" w:eastAsia="Arial" w:hAnsi="Arial"/>
+                <w:b w:val="false"/>
+                <w:bCs w:val="false"/>
+                <w:sz w:val="18"/>
+                <w:szCs w:val="18"/>
+                <w:rtl/>
+              </w:rPr>
+              <w:t xml:space="preserve"> الطلب الذي تجريه الشاشة وحدها (X-Background-Request) يتحقق من الجلسة ولا يمدّدها؛ والشاشة تحسب الخمول من حركة المستخدم (لوحة المفاتيح والفأرة واللمس والتمرير)، فتنبّهه قبل دقيقة مع زر «البقاء متصلًا»، ثم تُخرجه وتعرض سبب الخروج في صفحة الدخول؛ وكل جلسة ينهيها الخادم تنقل الشاشة إلى الدخول فورًا؛ ولوحة المشغّل كذلك بعد 15 دقيقة. ومدة الخمول إعداد للشركة. اختبار تكامل واختبارات وحدة للواجهة</w:t>
+            </w:r>
+          </w:p>
+        </w:tc>
+        <w:tc>
+          <w:tcPr>
+            <w:tcW w:type="dxa" w:w="2290"/>
+            <w:tcBorders>
+              <w:top w:val="single" w:color="BFC9D6" w:sz="4"/>
+              <w:left w:val="single" w:color="BFC9D6" w:sz="4"/>
+              <w:bottom w:val="single" w:color="BFC9D6" w:sz="4"/>
+              <w:right w:val="single" w:color="BFC9D6" w:sz="4"/>
+            </w:tcBorders>
+            <w:tcMar>
+              <w:top w:type="dxa" w:w="50"/>
+              <w:left w:type="dxa" w:w="90"/>
+              <w:bottom w:type="dxa" w:w="50"/>
+              <w:right w:type="dxa" w:w="90"/>
+            </w:tcMar>
+            <w:vAlign w:val="top"/>
+          </w:tcPr>
+          <w:p>
+            <w:pPr>
+              <w:keepNext w:val="false"/>
+              <w:bidi/>
+              <w:spacing w:after="30" w:before="30" w:line="264"/>
+            </w:pPr>
+            <w:r>
+              <w:rPr>
+                <w:rFonts w:ascii="Arial" w:cs="Arial" w:eastAsia="Arial" w:hAnsi="Arial"/>
+                <w:b w:val="false"/>
+                <w:bCs w:val="false"/>
+                <w:sz w:val="18"/>
+                <w:szCs w:val="18"/>
+                <w:rtl/>
+              </w:rPr>
+              <w:t xml:space="preserve">المنصة: الجلسات، والبوابة، ولوحة المشغّل</w:t>
+            </w:r>
+          </w:p>
+        </w:tc>
+        <w:tc>
+          <w:tcPr>
+            <w:tcW w:type="dxa" w:w="4212"/>
+            <w:tcBorders>
+              <w:top w:val="single" w:color="BFC9D6" w:sz="4"/>
+              <w:left w:val="single" w:color="BFC9D6" w:sz="4"/>
+              <w:bottom w:val="single" w:color="BFC9D6" w:sz="4"/>
+              <w:right w:val="single" w:color="BFC9D6" w:sz="4"/>
+            </w:tcBorders>
+            <w:tcMar>
+              <w:top w:type="dxa" w:w="50"/>
+              <w:left w:type="dxa" w:w="90"/>
+              <w:bottom w:type="dxa" w:w="50"/>
+              <w:right w:type="dxa" w:w="90"/>
+            </w:tcMar>
+            <w:vAlign w:val="top"/>
+          </w:tcPr>
+          <w:p>
+            <w:pPr>
+              <w:keepNext w:val="false"/>
+              <w:bidi/>
+              <w:spacing w:after="30" w:before="30" w:line="264"/>
+            </w:pPr>
+            <w:r>
+              <w:rPr>
+                <w:rFonts w:ascii="Segoe UI Emoji" w:cs="Segoe UI Emoji" w:eastAsia="Segoe UI Emoji" w:hAnsi="Segoe UI Emoji"/>
+                <w:sz w:val="18"/>
+                <w:szCs w:val="18"/>
+                <w:rtl/>
+              </w:rPr>
+              <w:t xml:space="preserve">✅</w:t>
+            </w:r>
+            <w:r>
+              <w:rPr>
+                <w:rFonts w:ascii="Arial" w:cs="Arial" w:eastAsia="Arial" w:hAnsi="Arial"/>
+                <w:b w:val="false"/>
+                <w:bCs w:val="false"/>
+                <w:sz w:val="18"/>
+                <w:szCs w:val="18"/>
+                <w:rtl/>
+              </w:rPr>
+              <w:t xml:space="preserve"> منفّذ</w:t>
             </w:r>
           </w:p>
         </w:tc>

</xml_diff>

<commit_message>
Docs: S5 completion (docs/52, ADR 0052, docs/31 row 53), docs/50 section 5 updated, Word files
Co-Authored-By: Claude Opus 5.5 <noreply@anthropic.com>
Claude-Session: https://claude.ai/code/session_012HHcRrzuvMBTL2FYxXtsyv
</commit_message>
<xml_diff>
--- a/treasury-platform/docs/31-OWNER-DECISIONS.docx
+++ b/treasury-platform/docs/31-OWNER-DECISIONS.docx
@@ -11846,6 +11846,245 @@
                 <w:rtl/>
               </w:rPr>
               <w:t xml:space="preserve"> PDF في الخادم للبروفورما (تُحفظ نسختها PDF) والشروط والطلب (يُحفظ مع الطلب) والتقارير؛ ورفع المرفقات من شاشة الطلب إلى خاناتها أو مرفقًا إضافيًا؛ وملفات الاعتماد (السويفت والتعديلات والإشعارات والموافقات)؛ وملفات الاتفاقيات من شاشة التسهيل؛ وثلاثة أنواع مستندات جديدة</w:t>
+            </w:r>
+          </w:p>
+        </w:tc>
+      </w:tr>
+      <w:tr>
+        <w:trPr>
+          <w:cantSplit/>
+        </w:trPr>
+        <w:tc>
+          <w:tcPr>
+            <w:tcW w:type="dxa" w:w="925"/>
+            <w:tcBorders>
+              <w:top w:val="single" w:color="BFC9D6" w:sz="4"/>
+              <w:left w:val="single" w:color="BFC9D6" w:sz="4"/>
+              <w:bottom w:val="single" w:color="BFC9D6" w:sz="4"/>
+              <w:right w:val="single" w:color="BFC9D6" w:sz="4"/>
+            </w:tcBorders>
+            <w:tcMar>
+              <w:top w:type="dxa" w:w="50"/>
+              <w:left w:type="dxa" w:w="90"/>
+              <w:bottom w:type="dxa" w:w="50"/>
+              <w:right w:type="dxa" w:w="90"/>
+            </w:tcMar>
+            <w:vAlign w:val="top"/>
+          </w:tcPr>
+          <w:p>
+            <w:pPr>
+              <w:keepNext w:val="false"/>
+              <w:bidi/>
+              <w:spacing w:after="30" w:before="30" w:line="264"/>
+            </w:pPr>
+            <w:r>
+              <w:rPr>
+                <w:rFonts w:ascii="Arial" w:cs="Arial" w:eastAsia="Arial" w:hAnsi="Arial"/>
+                <w:b w:val="false"/>
+                <w:bCs w:val="false"/>
+                <w:sz w:val="18"/>
+                <w:szCs w:val="18"/>
+                <w:rtl/>
+              </w:rPr>
+              <w:t xml:space="preserve">53</w:t>
+            </w:r>
+          </w:p>
+        </w:tc>
+        <w:tc>
+          <w:tcPr>
+            <w:tcW w:type="dxa" w:w="2437"/>
+            <w:tcBorders>
+              <w:top w:val="single" w:color="BFC9D6" w:sz="4"/>
+              <w:left w:val="single" w:color="BFC9D6" w:sz="4"/>
+              <w:bottom w:val="single" w:color="BFC9D6" w:sz="4"/>
+              <w:right w:val="single" w:color="BFC9D6" w:sz="4"/>
+            </w:tcBorders>
+            <w:tcMar>
+              <w:top w:type="dxa" w:w="50"/>
+              <w:left w:type="dxa" w:w="90"/>
+              <w:bottom w:type="dxa" w:w="50"/>
+              <w:right w:type="dxa" w:w="90"/>
+            </w:tcMar>
+            <w:vAlign w:val="top"/>
+          </w:tcPr>
+          <w:p>
+            <w:pPr>
+              <w:keepNext w:val="false"/>
+              <w:bidi/>
+              <w:spacing w:after="30" w:before="30" w:line="264"/>
+            </w:pPr>
+            <w:r>
+              <w:rPr>
+                <w:rFonts w:ascii="Arial" w:cs="Arial" w:eastAsia="Arial" w:hAnsi="Arial"/>
+                <w:b/>
+                <w:bCs/>
+                <w:sz w:val="18"/>
+                <w:szCs w:val="18"/>
+                <w:rtl/>
+              </w:rPr>
+              <w:t xml:space="preserve">إكمال S5 (2026-10-25).</w:t>
+            </w:r>
+            <w:r>
+              <w:rPr>
+                <w:rFonts w:ascii="Arial" w:cs="Arial" w:eastAsia="Arial" w:hAnsi="Arial"/>
+                <w:b w:val="false"/>
+                <w:bCs w:val="false"/>
+                <w:sz w:val="18"/>
+                <w:szCs w:val="18"/>
+                <w:rtl/>
+              </w:rPr>
+              <w:t xml:space="preserve"> «اكمل الى نهاية الاعداد للنظام كاملا بدون تقارير و دون سؤالي عن اي مقترحات او طلب». بُني ما بقي في </w:t>
+            </w:r>
+            <w:r>
+              <w:rPr>
+                <w:rFonts w:ascii="Courier New" w:cs="Courier New" w:eastAsia="Courier New" w:hAnsi="Courier New"/>
+                <w:b w:val="false"/>
+                <w:bCs w:val="false"/>
+                <w:color w:val="1F2937"/>
+                <w:sz w:val="16"/>
+                <w:szCs w:val="16"/>
+                <w:shd w:fill="F1F3F5" w:color="auto" w:val="clear"/>
+                <w:rtl/>
+              </w:rPr>
+              <w:t xml:space="preserve">‎docs/50‎</w:t>
+            </w:r>
+            <w:r>
+              <w:rPr>
+                <w:rFonts w:ascii="Arial" w:cs="Arial" w:eastAsia="Arial" w:hAnsi="Arial"/>
+                <w:b w:val="false"/>
+                <w:bCs w:val="false"/>
+                <w:sz w:val="18"/>
+                <w:szCs w:val="18"/>
+                <w:rtl/>
+              </w:rPr>
+              <w:t xml:space="preserve"> §5 على افتراضات موصى بها: تصدير بيانات الحساب كاملًا في حزمة مختومة بكلمة مرور (FR-PLT-039)، والإعدادات الافتراضية للإشعارات (FR-NTF-011)، ومعاينة القالب والإرسال التجريبي (FR-NTF-025)، وتصدير الكتالوجات واستيرادها CSV (FR-CAT-024)</w:t>
+            </w:r>
+          </w:p>
+        </w:tc>
+        <w:tc>
+          <w:tcPr>
+            <w:tcW w:type="dxa" w:w="2290"/>
+            <w:tcBorders>
+              <w:top w:val="single" w:color="BFC9D6" w:sz="4"/>
+              <w:left w:val="single" w:color="BFC9D6" w:sz="4"/>
+              <w:bottom w:val="single" w:color="BFC9D6" w:sz="4"/>
+              <w:right w:val="single" w:color="BFC9D6" w:sz="4"/>
+            </w:tcBorders>
+            <w:tcMar>
+              <w:top w:type="dxa" w:w="50"/>
+              <w:left w:type="dxa" w:w="90"/>
+              <w:bottom w:type="dxa" w:w="50"/>
+              <w:right w:type="dxa" w:w="90"/>
+            </w:tcMar>
+            <w:vAlign w:val="top"/>
+          </w:tcPr>
+          <w:p>
+            <w:pPr>
+              <w:keepNext w:val="false"/>
+              <w:bidi/>
+              <w:spacing w:after="30" w:before="30" w:line="264"/>
+            </w:pPr>
+            <w:r>
+              <w:rPr>
+                <w:rFonts w:ascii="Arial" w:cs="Arial" w:eastAsia="Arial" w:hAnsi="Arial"/>
+                <w:b w:val="false"/>
+                <w:bCs w:val="false"/>
+                <w:sz w:val="18"/>
+                <w:szCs w:val="18"/>
+                <w:rtl/>
+              </w:rPr>
+              <w:t xml:space="preserve">المنصة، والإشعارات، والكتالوجات</w:t>
+            </w:r>
+          </w:p>
+        </w:tc>
+        <w:tc>
+          <w:tcPr>
+            <w:tcW w:type="dxa" w:w="4212"/>
+            <w:tcBorders>
+              <w:top w:val="single" w:color="BFC9D6" w:sz="4"/>
+              <w:left w:val="single" w:color="BFC9D6" w:sz="4"/>
+              <w:bottom w:val="single" w:color="BFC9D6" w:sz="4"/>
+              <w:right w:val="single" w:color="BFC9D6" w:sz="4"/>
+            </w:tcBorders>
+            <w:tcMar>
+              <w:top w:type="dxa" w:w="50"/>
+              <w:left w:type="dxa" w:w="90"/>
+              <w:bottom w:type="dxa" w:w="50"/>
+              <w:right w:type="dxa" w:w="90"/>
+            </w:tcMar>
+            <w:vAlign w:val="top"/>
+          </w:tcPr>
+          <w:p>
+            <w:pPr>
+              <w:keepNext w:val="false"/>
+              <w:bidi/>
+              <w:spacing w:after="30" w:before="30" w:line="264"/>
+            </w:pPr>
+            <w:r>
+              <w:rPr>
+                <w:rFonts w:ascii="Segoe UI Emoji" w:cs="Segoe UI Emoji" w:eastAsia="Segoe UI Emoji" w:hAnsi="Segoe UI Emoji"/>
+                <w:sz w:val="18"/>
+                <w:szCs w:val="18"/>
+                <w:rtl/>
+              </w:rPr>
+              <w:t xml:space="preserve">✅</w:t>
+            </w:r>
+            <w:r>
+              <w:rPr>
+                <w:rFonts w:ascii="Arial" w:cs="Arial" w:eastAsia="Arial" w:hAnsi="Arial"/>
+                <w:b w:val="false"/>
+                <w:bCs w:val="false"/>
+                <w:sz w:val="18"/>
+                <w:szCs w:val="18"/>
+                <w:rtl/>
+              </w:rPr>
+              <w:t xml:space="preserve"> </w:t>
+            </w:r>
+            <w:r>
+              <w:rPr>
+                <w:rFonts w:ascii="Arial" w:cs="Arial" w:eastAsia="Arial" w:hAnsi="Arial"/>
+                <w:b/>
+                <w:bCs/>
+                <w:sz w:val="18"/>
+                <w:szCs w:val="18"/>
+                <w:rtl/>
+              </w:rPr>
+              <w:t xml:space="preserve">منفّذ (2026-10-25، </w:t>
+            </w:r>
+            <w:r>
+              <w:rPr>
+                <w:rFonts w:ascii="Courier New" w:cs="Courier New" w:eastAsia="Courier New" w:hAnsi="Courier New"/>
+                <w:b/>
+                <w:bCs/>
+                <w:color w:val="1F2937"/>
+                <w:sz w:val="16"/>
+                <w:szCs w:val="16"/>
+                <w:shd w:fill="F1F3F5" w:color="auto" w:val="clear"/>
+                <w:rtl/>
+              </w:rPr>
+              <w:t xml:space="preserve">‎docs/52‎</w:t>
+            </w:r>
+            <w:r>
+              <w:rPr>
+                <w:rFonts w:ascii="Arial" w:cs="Arial" w:eastAsia="Arial" w:hAnsi="Arial"/>
+                <w:b/>
+                <w:bCs/>
+                <w:sz w:val="18"/>
+                <w:szCs w:val="18"/>
+                <w:rtl/>
+              </w:rPr>
+              <w:t xml:space="preserve">، ADR 0052)</w:t>
+            </w:r>
+            <w:r>
+              <w:rPr>
+                <w:rFonts w:ascii="Arial" w:cs="Arial" w:eastAsia="Arial" w:hAnsi="Arial"/>
+                <w:b w:val="false"/>
+                <w:bCs w:val="false"/>
+                <w:sz w:val="18"/>
+                <w:szCs w:val="18"/>
+                <w:rtl/>
+              </w:rPr>
+              <w:t xml:space="preserve">؛ الافتراضيات معروضة على المالك في التقرير الشامل</w:t>
             </w:r>
           </w:p>
         </w:tc>

</xml_diff>

<commit_message>
Pilot run of the release images (docs/31 row 54): file master keys, persisted data protection keys, Chromium in the image
The owner approved the S5 completion assumptions and asked to start the pilot run. Running the images as the host
runs them showed a production host could not start (no master key provider but the development one), lost the data
protection keys at every restart, had no working Chromium (Ubuntu's is a snap stub), and could not build behind a
TLS-inspecting proxy. Fixed: Keys:Provider=file (owner-only key files, interim until DQ-S02-1), data protection keys
persisted and wrapped by the master key, Playwright's Chromium in the API image, an optional build-only CA secret.
tools/ci/image_pilot.sh runs the browser tests against the containers; tools/host/download_breached.sh fetches the
leaked-password list.

Co-Authored-By: Claude Opus 5.5 <noreply@anthropic.com>
Claude-Session: https://claude.ai/code/session_012HHcRrzuvMBTL2FYxXtsyv
</commit_message>
<xml_diff>
--- a/treasury-platform/docs/31-OWNER-DECISIONS.docx
+++ b/treasury-platform/docs/31-OWNER-DECISIONS.docx
@@ -12084,7 +12084,318 @@
                 <w:szCs w:val="18"/>
                 <w:rtl/>
               </w:rPr>
-              <w:t xml:space="preserve">؛ الافتراضيات معروضة على المالك في التقرير الشامل</w:t>
+              <w:t xml:space="preserve">؛ </w:t>
+            </w:r>
+            <w:r>
+              <w:rPr>
+                <w:rFonts w:ascii="Arial" w:cs="Arial" w:eastAsia="Arial" w:hAnsi="Arial"/>
+                <w:b/>
+                <w:bCs/>
+                <w:sz w:val="18"/>
+                <w:szCs w:val="18"/>
+                <w:rtl/>
+              </w:rPr>
+              <w:t xml:space="preserve">اعتمد المالك الافتراضات في 2026-10-25</w:t>
+            </w:r>
+            <w:r>
+              <w:rPr>
+                <w:rFonts w:ascii="Arial" w:cs="Arial" w:eastAsia="Arial" w:hAnsi="Arial"/>
+                <w:b w:val="false"/>
+                <w:bCs w:val="false"/>
+                <w:sz w:val="18"/>
+                <w:szCs w:val="18"/>
+                <w:rtl/>
+              </w:rPr>
+              <w:t xml:space="preserve"> («موافق على افتراضاتك، ابدأ بالتشغيل التجريبي»): حفظ الحزمة 7 أيام وكلمة مرورها 12 حرفًا على الأقل، والإرسال التجريبي إلى بريد المدير وحده، وحد الاستيراد 2,000 سطر و2 ميغابايت، وافتراضيات الإشعارات بيد مدير الحساب</w:t>
+            </w:r>
+          </w:p>
+        </w:tc>
+      </w:tr>
+      <w:tr>
+        <w:trPr>
+          <w:cantSplit/>
+        </w:trPr>
+        <w:tc>
+          <w:tcPr>
+            <w:tcW w:type="dxa" w:w="925"/>
+            <w:tcBorders>
+              <w:top w:val="single" w:color="BFC9D6" w:sz="4"/>
+              <w:left w:val="single" w:color="BFC9D6" w:sz="4"/>
+              <w:bottom w:val="single" w:color="BFC9D6" w:sz="4"/>
+              <w:right w:val="single" w:color="BFC9D6" w:sz="4"/>
+            </w:tcBorders>
+            <w:shd w:fill="F5F8FC" w:color="auto" w:val="clear"/>
+            <w:tcMar>
+              <w:top w:type="dxa" w:w="50"/>
+              <w:left w:type="dxa" w:w="90"/>
+              <w:bottom w:type="dxa" w:w="50"/>
+              <w:right w:type="dxa" w:w="90"/>
+            </w:tcMar>
+            <w:vAlign w:val="top"/>
+          </w:tcPr>
+          <w:p>
+            <w:pPr>
+              <w:keepNext w:val="false"/>
+              <w:bidi/>
+              <w:spacing w:after="30" w:before="30" w:line="264"/>
+            </w:pPr>
+            <w:r>
+              <w:rPr>
+                <w:rFonts w:ascii="Arial" w:cs="Arial" w:eastAsia="Arial" w:hAnsi="Arial"/>
+                <w:b w:val="false"/>
+                <w:bCs w:val="false"/>
+                <w:sz w:val="18"/>
+                <w:szCs w:val="18"/>
+                <w:rtl/>
+              </w:rPr>
+              <w:t xml:space="preserve">54</w:t>
+            </w:r>
+          </w:p>
+        </w:tc>
+        <w:tc>
+          <w:tcPr>
+            <w:tcW w:type="dxa" w:w="2437"/>
+            <w:tcBorders>
+              <w:top w:val="single" w:color="BFC9D6" w:sz="4"/>
+              <w:left w:val="single" w:color="BFC9D6" w:sz="4"/>
+              <w:bottom w:val="single" w:color="BFC9D6" w:sz="4"/>
+              <w:right w:val="single" w:color="BFC9D6" w:sz="4"/>
+            </w:tcBorders>
+            <w:shd w:fill="F5F8FC" w:color="auto" w:val="clear"/>
+            <w:tcMar>
+              <w:top w:type="dxa" w:w="50"/>
+              <w:left w:type="dxa" w:w="90"/>
+              <w:bottom w:type="dxa" w:w="50"/>
+              <w:right w:type="dxa" w:w="90"/>
+            </w:tcMar>
+            <w:vAlign w:val="top"/>
+          </w:tcPr>
+          <w:p>
+            <w:pPr>
+              <w:keepNext w:val="false"/>
+              <w:bidi/>
+              <w:spacing w:after="30" w:before="30" w:line="264"/>
+            </w:pPr>
+            <w:r>
+              <w:rPr>
+                <w:rFonts w:ascii="Arial" w:cs="Arial" w:eastAsia="Arial" w:hAnsi="Arial"/>
+                <w:b/>
+                <w:bCs/>
+                <w:sz w:val="18"/>
+                <w:szCs w:val="18"/>
+                <w:rtl/>
+              </w:rPr>
+              <w:t xml:space="preserve">التشغيل التجريبي (2026-10-25).</w:t>
+            </w:r>
+            <w:r>
+              <w:rPr>
+                <w:rFonts w:ascii="Arial" w:cs="Arial" w:eastAsia="Arial" w:hAnsi="Arial"/>
+                <w:b w:val="false"/>
+                <w:bCs w:val="false"/>
+                <w:sz w:val="18"/>
+                <w:szCs w:val="18"/>
+                <w:rtl/>
+              </w:rPr>
+              <w:t xml:space="preserve"> «موافق على افتراضاتك، ابدأ بالتشغيل التجريبي». بُنيت صورتا النشر وشُغّلتا كما يشغّلهما الخادم، ونجح عليهما اختبار المتصفح الكامل. وكشف التشغيل أربعة أمور أُصلحت: لا مزوّد للمفتاح الرئيسي في الإنتاج، ومفاتيح حماية البيانات تضيع عند إعادة التشغيل، وChromium في Ubuntu لا يعمل في الحاويات، وتعثّر البناء خلف وكيل الشبكة</w:t>
+            </w:r>
+          </w:p>
+        </w:tc>
+        <w:tc>
+          <w:tcPr>
+            <w:tcW w:type="dxa" w:w="2290"/>
+            <w:tcBorders>
+              <w:top w:val="single" w:color="BFC9D6" w:sz="4"/>
+              <w:left w:val="single" w:color="BFC9D6" w:sz="4"/>
+              <w:bottom w:val="single" w:color="BFC9D6" w:sz="4"/>
+              <w:right w:val="single" w:color="BFC9D6" w:sz="4"/>
+            </w:tcBorders>
+            <w:shd w:fill="F5F8FC" w:color="auto" w:val="clear"/>
+            <w:tcMar>
+              <w:top w:type="dxa" w:w="50"/>
+              <w:left w:type="dxa" w:w="90"/>
+              <w:bottom w:type="dxa" w:w="50"/>
+              <w:right w:type="dxa" w:w="90"/>
+            </w:tcMar>
+            <w:vAlign w:val="top"/>
+          </w:tcPr>
+          <w:p>
+            <w:pPr>
+              <w:keepNext w:val="false"/>
+              <w:bidi/>
+              <w:spacing w:after="30" w:before="30" w:line="264"/>
+            </w:pPr>
+            <w:r>
+              <w:rPr>
+                <w:rFonts w:ascii="Arial" w:cs="Arial" w:eastAsia="Arial" w:hAnsi="Arial"/>
+                <w:b w:val="false"/>
+                <w:bCs w:val="false"/>
+                <w:sz w:val="18"/>
+                <w:szCs w:val="18"/>
+                <w:rtl/>
+              </w:rPr>
+              <w:t xml:space="preserve">النشر والتشغيل</w:t>
+            </w:r>
+          </w:p>
+        </w:tc>
+        <w:tc>
+          <w:tcPr>
+            <w:tcW w:type="dxa" w:w="4212"/>
+            <w:tcBorders>
+              <w:top w:val="single" w:color="BFC9D6" w:sz="4"/>
+              <w:left w:val="single" w:color="BFC9D6" w:sz="4"/>
+              <w:bottom w:val="single" w:color="BFC9D6" w:sz="4"/>
+              <w:right w:val="single" w:color="BFC9D6" w:sz="4"/>
+            </w:tcBorders>
+            <w:shd w:fill="F5F8FC" w:color="auto" w:val="clear"/>
+            <w:tcMar>
+              <w:top w:type="dxa" w:w="50"/>
+              <w:left w:type="dxa" w:w="90"/>
+              <w:bottom w:type="dxa" w:w="50"/>
+              <w:right w:type="dxa" w:w="90"/>
+            </w:tcMar>
+            <w:vAlign w:val="top"/>
+          </w:tcPr>
+          <w:p>
+            <w:pPr>
+              <w:keepNext w:val="false"/>
+              <w:bidi/>
+              <w:spacing w:after="30" w:before="30" w:line="264"/>
+            </w:pPr>
+            <w:r>
+              <w:rPr>
+                <w:rFonts w:ascii="Segoe UI Emoji" w:cs="Segoe UI Emoji" w:eastAsia="Segoe UI Emoji" w:hAnsi="Segoe UI Emoji"/>
+                <w:sz w:val="18"/>
+                <w:szCs w:val="18"/>
+                <w:rtl/>
+              </w:rPr>
+              <w:t xml:space="preserve">✅</w:t>
+            </w:r>
+            <w:r>
+              <w:rPr>
+                <w:rFonts w:ascii="Arial" w:cs="Arial" w:eastAsia="Arial" w:hAnsi="Arial"/>
+                <w:b w:val="false"/>
+                <w:bCs w:val="false"/>
+                <w:sz w:val="18"/>
+                <w:szCs w:val="18"/>
+                <w:rtl/>
+              </w:rPr>
+              <w:t xml:space="preserve"> </w:t>
+            </w:r>
+            <w:r>
+              <w:rPr>
+                <w:rFonts w:ascii="Arial" w:cs="Arial" w:eastAsia="Arial" w:hAnsi="Arial"/>
+                <w:b/>
+                <w:bCs/>
+                <w:sz w:val="18"/>
+                <w:szCs w:val="18"/>
+                <w:rtl/>
+              </w:rPr>
+              <w:t xml:space="preserve">منفّذ (</w:t>
+            </w:r>
+            <w:r>
+              <w:rPr>
+                <w:rFonts w:ascii="Courier New" w:cs="Courier New" w:eastAsia="Courier New" w:hAnsi="Courier New"/>
+                <w:b/>
+                <w:bCs/>
+                <w:color w:val="1F2937"/>
+                <w:sz w:val="16"/>
+                <w:szCs w:val="16"/>
+                <w:shd w:fill="F1F3F5" w:color="auto" w:val="clear"/>
+                <w:rtl/>
+              </w:rPr>
+              <w:t xml:space="preserve">‎docs/53‎</w:t>
+            </w:r>
+            <w:r>
+              <w:rPr>
+                <w:rFonts w:ascii="Arial" w:cs="Arial" w:eastAsia="Arial" w:hAnsi="Arial"/>
+                <w:b/>
+                <w:bCs/>
+                <w:sz w:val="18"/>
+                <w:szCs w:val="18"/>
+                <w:rtl/>
+              </w:rPr>
+              <w:t xml:space="preserve">، ADR 0053)</w:t>
+            </w:r>
+            <w:r>
+              <w:rPr>
+                <w:rFonts w:ascii="Arial" w:cs="Arial" w:eastAsia="Arial" w:hAnsi="Arial"/>
+                <w:b w:val="false"/>
+                <w:bCs w:val="false"/>
+                <w:sz w:val="18"/>
+                <w:szCs w:val="18"/>
+                <w:rtl/>
+              </w:rPr>
+              <w:t xml:space="preserve">: مزوّد المفتاح الرئيسي من ملف محمي (مؤقت حتى DQ-S02-1)، ومفاتيح حماية البيانات محفوظة ومشفّرة، وChromium من Playwright، وسكربت </w:t>
+            </w:r>
+            <w:r>
+              <w:rPr>
+                <w:rFonts w:ascii="Courier New" w:cs="Courier New" w:eastAsia="Courier New" w:hAnsi="Courier New"/>
+                <w:b w:val="false"/>
+                <w:bCs w:val="false"/>
+                <w:color w:val="1F2937"/>
+                <w:sz w:val="16"/>
+                <w:szCs w:val="16"/>
+                <w:shd w:fill="F1F3F5" w:color="auto" w:val="clear"/>
+                <w:rtl/>
+              </w:rPr>
+              <w:t xml:space="preserve">‎tools/ci/image_pilot.sh‎</w:t>
+            </w:r>
+            <w:r>
+              <w:rPr>
+                <w:rFonts w:ascii="Arial" w:cs="Arial" w:eastAsia="Arial" w:hAnsi="Arial"/>
+                <w:b w:val="false"/>
+                <w:bCs w:val="false"/>
+                <w:sz w:val="18"/>
+                <w:szCs w:val="18"/>
+                <w:rtl/>
+              </w:rPr>
+              <w:t xml:space="preserve">، وسكربت قائمة كلمات المرور المسرّبة. </w:t>
+            </w:r>
+            <w:r>
+              <w:rPr>
+                <w:rFonts w:ascii="Arial" w:cs="Arial" w:eastAsia="Arial" w:hAnsi="Arial"/>
+                <w:b/>
+                <w:bCs/>
+                <w:sz w:val="18"/>
+                <w:szCs w:val="18"/>
+                <w:rtl/>
+              </w:rPr>
+              <w:t xml:space="preserve">ما بقي مدخلات تشغيلية على الخادم الحقيقي</w:t>
+            </w:r>
+            <w:r>
+              <w:rPr>
+                <w:rFonts w:ascii="Arial" w:cs="Arial" w:eastAsia="Arial" w:hAnsi="Arial"/>
+                <w:b w:val="false"/>
+                <w:bCs w:val="false"/>
+                <w:sz w:val="18"/>
+                <w:szCs w:val="18"/>
+                <w:rtl/>
+              </w:rPr>
+              <w:t xml:space="preserve"> (</w:t>
+            </w:r>
+            <w:r>
+              <w:rPr>
+                <w:rFonts w:ascii="Courier New" w:cs="Courier New" w:eastAsia="Courier New" w:hAnsi="Courier New"/>
+                <w:b w:val="false"/>
+                <w:bCs w:val="false"/>
+                <w:color w:val="1F2937"/>
+                <w:sz w:val="16"/>
+                <w:szCs w:val="16"/>
+                <w:shd w:fill="F1F3F5" w:color="auto" w:val="clear"/>
+                <w:rtl/>
+              </w:rPr>
+              <w:t xml:space="preserve">‎docs/53‎</w:t>
+            </w:r>
+            <w:r>
+              <w:rPr>
+                <w:rFonts w:ascii="Arial" w:cs="Arial" w:eastAsia="Arial" w:hAnsi="Arial"/>
+                <w:b w:val="false"/>
+                <w:bCs w:val="false"/>
+                <w:sz w:val="18"/>
+                <w:szCs w:val="18"/>
+                <w:rtl/>
+              </w:rPr>
+              <w:t xml:space="preserve"> §4)</w:t>
             </w:r>
           </w:p>
         </w:tc>

</xml_diff>

<commit_message>
Deployment runbook (docs/54, docs/31 row 55): both servers step by step, first operator script, env templates, ClamAV
The owner asked for the deployment steps on the Linux server, step by step. docs/54 puts the existing runbooks
(DOC-S10, S11, S16, S02, S09) in one order for the two approved servers, with the commands of tools/deploy and
tools/host. What a production deployment still lacked is added: tools/deploy/bootstrap_operator.sh (the first operator
as the deployment login inside the window, the token never on a command line, the link shown once), api.env and
worker.env templates with only each process's own database logins (the pilot now runs with that split), and a ClamAV
service in compose.yml.

Co-Authored-By: Claude Opus 5.5 <noreply@anthropic.com>
Claude-Session: https://claude.ai/code/session_012HHcRrzuvMBTL2FYxXtsyv
</commit_message>
<xml_diff>
--- a/treasury-platform/docs/31-OWNER-DECISIONS.docx
+++ b/treasury-platform/docs/31-OWNER-DECISIONS.docx
@@ -12396,6 +12396,282 @@
                 <w:rtl/>
               </w:rPr>
               <w:t xml:space="preserve"> §4)</w:t>
+            </w:r>
+          </w:p>
+        </w:tc>
+      </w:tr>
+      <w:tr>
+        <w:trPr>
+          <w:cantSplit/>
+        </w:trPr>
+        <w:tc>
+          <w:tcPr>
+            <w:tcW w:type="dxa" w:w="925"/>
+            <w:tcBorders>
+              <w:top w:val="single" w:color="BFC9D6" w:sz="4"/>
+              <w:left w:val="single" w:color="BFC9D6" w:sz="4"/>
+              <w:bottom w:val="single" w:color="BFC9D6" w:sz="4"/>
+              <w:right w:val="single" w:color="BFC9D6" w:sz="4"/>
+            </w:tcBorders>
+            <w:tcMar>
+              <w:top w:type="dxa" w:w="50"/>
+              <w:left w:type="dxa" w:w="90"/>
+              <w:bottom w:type="dxa" w:w="50"/>
+              <w:right w:type="dxa" w:w="90"/>
+            </w:tcMar>
+            <w:vAlign w:val="top"/>
+          </w:tcPr>
+          <w:p>
+            <w:pPr>
+              <w:keepNext w:val="false"/>
+              <w:bidi/>
+              <w:spacing w:after="30" w:before="30" w:line="264"/>
+            </w:pPr>
+            <w:r>
+              <w:rPr>
+                <w:rFonts w:ascii="Arial" w:cs="Arial" w:eastAsia="Arial" w:hAnsi="Arial"/>
+                <w:b w:val="false"/>
+                <w:bCs w:val="false"/>
+                <w:sz w:val="18"/>
+                <w:szCs w:val="18"/>
+                <w:rtl/>
+              </w:rPr>
+              <w:t xml:space="preserve">55</w:t>
+            </w:r>
+          </w:p>
+        </w:tc>
+        <w:tc>
+          <w:tcPr>
+            <w:tcW w:type="dxa" w:w="2437"/>
+            <w:tcBorders>
+              <w:top w:val="single" w:color="BFC9D6" w:sz="4"/>
+              <w:left w:val="single" w:color="BFC9D6" w:sz="4"/>
+              <w:bottom w:val="single" w:color="BFC9D6" w:sz="4"/>
+              <w:right w:val="single" w:color="BFC9D6" w:sz="4"/>
+            </w:tcBorders>
+            <w:tcMar>
+              <w:top w:type="dxa" w:w="50"/>
+              <w:left w:type="dxa" w:w="90"/>
+              <w:bottom w:type="dxa" w:w="50"/>
+              <w:right w:type="dxa" w:w="90"/>
+            </w:tcMar>
+            <w:vAlign w:val="top"/>
+          </w:tcPr>
+          <w:p>
+            <w:pPr>
+              <w:keepNext w:val="false"/>
+              <w:bidi/>
+              <w:spacing w:after="30" w:before="30" w:line="264"/>
+            </w:pPr>
+            <w:r>
+              <w:rPr>
+                <w:rFonts w:ascii="Arial" w:cs="Arial" w:eastAsia="Arial" w:hAnsi="Arial"/>
+                <w:b/>
+                <w:bCs/>
+                <w:sz w:val="18"/>
+                <w:szCs w:val="18"/>
+                <w:rtl/>
+              </w:rPr>
+              <w:t xml:space="preserve">دليل النشر على الخادم خطوة بخطوة (2026-10-25).</w:t>
+            </w:r>
+            <w:r>
+              <w:rPr>
+                <w:rFonts w:ascii="Arial" w:cs="Arial" w:eastAsia="Arial" w:hAnsi="Arial"/>
+                <w:b w:val="false"/>
+                <w:bCs w:val="false"/>
+                <w:sz w:val="18"/>
+                <w:szCs w:val="18"/>
+                <w:rtl/>
+              </w:rPr>
+              <w:t xml:space="preserve"> «جهّز خطوات النشر على الخادم خطوة بخطوة، السيرفر لينوكس». دليل واحد بالترتيب للخادمين المعتمدين (القرار 6): التحضير، وخادم القاعدة، ونشر القاعدة في نافذة، وخادم التطبيق، والتشغيل وأول استعمال، والأعمال الدورية. وأُضيف ما كان ناقصًا للنشر: سكربت دعوة المشغّل الأول في الإنتاج، وقالبا ملفي الإعداد بحساب قاعدة لكل عملية، وخدمة ClamAV في </w:t>
+            </w:r>
+            <w:r>
+              <w:rPr>
+                <w:rFonts w:ascii="Courier New" w:cs="Courier New" w:eastAsia="Courier New" w:hAnsi="Courier New"/>
+                <w:b w:val="false"/>
+                <w:bCs w:val="false"/>
+                <w:color w:val="1F2937"/>
+                <w:sz w:val="16"/>
+                <w:szCs w:val="16"/>
+                <w:shd w:fill="F1F3F5" w:color="auto" w:val="clear"/>
+                <w:rtl/>
+              </w:rPr>
+              <w:t xml:space="preserve">‎compose.yml‎</w:t>
+            </w:r>
+          </w:p>
+        </w:tc>
+        <w:tc>
+          <w:tcPr>
+            <w:tcW w:type="dxa" w:w="2290"/>
+            <w:tcBorders>
+              <w:top w:val="single" w:color="BFC9D6" w:sz="4"/>
+              <w:left w:val="single" w:color="BFC9D6" w:sz="4"/>
+              <w:bottom w:val="single" w:color="BFC9D6" w:sz="4"/>
+              <w:right w:val="single" w:color="BFC9D6" w:sz="4"/>
+            </w:tcBorders>
+            <w:tcMar>
+              <w:top w:type="dxa" w:w="50"/>
+              <w:left w:type="dxa" w:w="90"/>
+              <w:bottom w:type="dxa" w:w="50"/>
+              <w:right w:type="dxa" w:w="90"/>
+            </w:tcMar>
+            <w:vAlign w:val="top"/>
+          </w:tcPr>
+          <w:p>
+            <w:pPr>
+              <w:keepNext w:val="false"/>
+              <w:bidi/>
+              <w:spacing w:after="30" w:before="30" w:line="264"/>
+            </w:pPr>
+            <w:r>
+              <w:rPr>
+                <w:rFonts w:ascii="Arial" w:cs="Arial" w:eastAsia="Arial" w:hAnsi="Arial"/>
+                <w:b w:val="false"/>
+                <w:bCs w:val="false"/>
+                <w:sz w:val="18"/>
+                <w:szCs w:val="18"/>
+                <w:rtl/>
+              </w:rPr>
+              <w:t xml:space="preserve">النشر والتشغيل</w:t>
+            </w:r>
+          </w:p>
+        </w:tc>
+        <w:tc>
+          <w:tcPr>
+            <w:tcW w:type="dxa" w:w="4212"/>
+            <w:tcBorders>
+              <w:top w:val="single" w:color="BFC9D6" w:sz="4"/>
+              <w:left w:val="single" w:color="BFC9D6" w:sz="4"/>
+              <w:bottom w:val="single" w:color="BFC9D6" w:sz="4"/>
+              <w:right w:val="single" w:color="BFC9D6" w:sz="4"/>
+            </w:tcBorders>
+            <w:tcMar>
+              <w:top w:type="dxa" w:w="50"/>
+              <w:left w:type="dxa" w:w="90"/>
+              <w:bottom w:type="dxa" w:w="50"/>
+              <w:right w:type="dxa" w:w="90"/>
+            </w:tcMar>
+            <w:vAlign w:val="top"/>
+          </w:tcPr>
+          <w:p>
+            <w:pPr>
+              <w:keepNext w:val="false"/>
+              <w:bidi/>
+              <w:spacing w:after="30" w:before="30" w:line="264"/>
+            </w:pPr>
+            <w:r>
+              <w:rPr>
+                <w:rFonts w:ascii="Segoe UI Emoji" w:cs="Segoe UI Emoji" w:eastAsia="Segoe UI Emoji" w:hAnsi="Segoe UI Emoji"/>
+                <w:sz w:val="18"/>
+                <w:szCs w:val="18"/>
+                <w:rtl/>
+              </w:rPr>
+              <w:t xml:space="preserve">✅</w:t>
+            </w:r>
+            <w:r>
+              <w:rPr>
+                <w:rFonts w:ascii="Arial" w:cs="Arial" w:eastAsia="Arial" w:hAnsi="Arial"/>
+                <w:b w:val="false"/>
+                <w:bCs w:val="false"/>
+                <w:sz w:val="18"/>
+                <w:szCs w:val="18"/>
+                <w:rtl/>
+              </w:rPr>
+              <w:t xml:space="preserve"> </w:t>
+            </w:r>
+            <w:r>
+              <w:rPr>
+                <w:rFonts w:ascii="Arial" w:cs="Arial" w:eastAsia="Arial" w:hAnsi="Arial"/>
+                <w:b/>
+                <w:bCs/>
+                <w:sz w:val="18"/>
+                <w:szCs w:val="18"/>
+                <w:rtl/>
+              </w:rPr>
+              <w:t xml:space="preserve">منفّذ (</w:t>
+            </w:r>
+            <w:r>
+              <w:rPr>
+                <w:rFonts w:ascii="Courier New" w:cs="Courier New" w:eastAsia="Courier New" w:hAnsi="Courier New"/>
+                <w:b/>
+                <w:bCs/>
+                <w:color w:val="1F2937"/>
+                <w:sz w:val="16"/>
+                <w:szCs w:val="16"/>
+                <w:shd w:fill="F1F3F5" w:color="auto" w:val="clear"/>
+                <w:rtl/>
+              </w:rPr>
+              <w:t xml:space="preserve">‎docs/54‎</w:t>
+            </w:r>
+            <w:r>
+              <w:rPr>
+                <w:rFonts w:ascii="Arial" w:cs="Arial" w:eastAsia="Arial" w:hAnsi="Arial"/>
+                <w:b/>
+                <w:bCs/>
+                <w:sz w:val="18"/>
+                <w:szCs w:val="18"/>
+                <w:rtl/>
+              </w:rPr>
+              <w:t xml:space="preserve">)</w:t>
+            </w:r>
+            <w:r>
+              <w:rPr>
+                <w:rFonts w:ascii="Arial" w:cs="Arial" w:eastAsia="Arial" w:hAnsi="Arial"/>
+                <w:b w:val="false"/>
+                <w:bCs w:val="false"/>
+                <w:sz w:val="18"/>
+                <w:szCs w:val="18"/>
+                <w:rtl/>
+              </w:rPr>
+              <w:t xml:space="preserve">: </w:t>
+            </w:r>
+            <w:r>
+              <w:rPr>
+                <w:rFonts w:ascii="Courier New" w:cs="Courier New" w:eastAsia="Courier New" w:hAnsi="Courier New"/>
+                <w:b w:val="false"/>
+                <w:bCs w:val="false"/>
+                <w:color w:val="1F2937"/>
+                <w:sz w:val="16"/>
+                <w:szCs w:val="16"/>
+                <w:shd w:fill="F1F3F5" w:color="auto" w:val="clear"/>
+                <w:rtl/>
+              </w:rPr>
+              <w:t xml:space="preserve">‎tools/deploy/bootstrap_operator.sh‎</w:t>
+            </w:r>
+            <w:r>
+              <w:rPr>
+                <w:rFonts w:ascii="Arial" w:cs="Arial" w:eastAsia="Arial" w:hAnsi="Arial"/>
+                <w:b w:val="false"/>
+                <w:bCs w:val="false"/>
+                <w:sz w:val="18"/>
+                <w:szCs w:val="18"/>
+                <w:rtl/>
+              </w:rPr>
+              <w:t xml:space="preserve"> مختبر على قاعدة محلية؛ والتشغيل التجريبي يمرّ بفصل الحسابات بين العمليتين؛ و</w:t>
+            </w:r>
+            <w:r>
+              <w:rPr>
+                <w:rFonts w:ascii="Courier New" w:cs="Courier New" w:eastAsia="Courier New" w:hAnsi="Courier New"/>
+                <w:b w:val="false"/>
+                <w:bCs w:val="false"/>
+                <w:color w:val="1F2937"/>
+                <w:sz w:val="16"/>
+                <w:szCs w:val="16"/>
+                <w:shd w:fill="F1F3F5" w:color="auto" w:val="clear"/>
+                <w:rtl/>
+              </w:rPr>
+              <w:t xml:space="preserve">‎compose.yml‎</w:t>
+            </w:r>
+            <w:r>
+              <w:rPr>
+                <w:rFonts w:ascii="Arial" w:cs="Arial" w:eastAsia="Arial" w:hAnsi="Arial"/>
+                <w:b w:val="false"/>
+                <w:bCs w:val="false"/>
+                <w:sz w:val="18"/>
+                <w:szCs w:val="18"/>
+                <w:rtl/>
+              </w:rPr>
+              <w:t xml:space="preserve"> صالح</w:t>
             </w:r>
           </w:p>
         </w:tc>

</xml_diff>

<commit_message>
Docs: before choosing the server (docs/55, docs/31 row 56), the runbook uses the provisioning and readiness scripts
Co-Authored-By: Claude Opus 5.5 <noreply@anthropic.com>
Claude-Session: https://claude.ai/code/session_012HHcRrzuvMBTL2FYxXtsyv
</commit_message>
<xml_diff>
--- a/treasury-platform/docs/31-OWNER-DECISIONS.docx
+++ b/treasury-platform/docs/31-OWNER-DECISIONS.docx
@@ -12672,6 +12672,249 @@
                 <w:rtl/>
               </w:rPr>
               <w:t xml:space="preserve"> صالح</w:t>
+            </w:r>
+          </w:p>
+        </w:tc>
+      </w:tr>
+      <w:tr>
+        <w:trPr>
+          <w:cantSplit/>
+        </w:trPr>
+        <w:tc>
+          <w:tcPr>
+            <w:tcW w:type="dxa" w:w="925"/>
+            <w:tcBorders>
+              <w:top w:val="single" w:color="BFC9D6" w:sz="4"/>
+              <w:left w:val="single" w:color="BFC9D6" w:sz="4"/>
+              <w:bottom w:val="single" w:color="BFC9D6" w:sz="4"/>
+              <w:right w:val="single" w:color="BFC9D6" w:sz="4"/>
+            </w:tcBorders>
+            <w:shd w:fill="F5F8FC" w:color="auto" w:val="clear"/>
+            <w:tcMar>
+              <w:top w:type="dxa" w:w="50"/>
+              <w:left w:type="dxa" w:w="90"/>
+              <w:bottom w:type="dxa" w:w="50"/>
+              <w:right w:type="dxa" w:w="90"/>
+            </w:tcMar>
+            <w:vAlign w:val="top"/>
+          </w:tcPr>
+          <w:p>
+            <w:pPr>
+              <w:keepNext w:val="false"/>
+              <w:bidi/>
+              <w:spacing w:after="30" w:before="30" w:line="264"/>
+            </w:pPr>
+            <w:r>
+              <w:rPr>
+                <w:rFonts w:ascii="Arial" w:cs="Arial" w:eastAsia="Arial" w:hAnsi="Arial"/>
+                <w:b w:val="false"/>
+                <w:bCs w:val="false"/>
+                <w:sz w:val="18"/>
+                <w:szCs w:val="18"/>
+                <w:rtl/>
+              </w:rPr>
+              <w:t xml:space="preserve">56</w:t>
+            </w:r>
+          </w:p>
+        </w:tc>
+        <w:tc>
+          <w:tcPr>
+            <w:tcW w:type="dxa" w:w="2437"/>
+            <w:tcBorders>
+              <w:top w:val="single" w:color="BFC9D6" w:sz="4"/>
+              <w:left w:val="single" w:color="BFC9D6" w:sz="4"/>
+              <w:bottom w:val="single" w:color="BFC9D6" w:sz="4"/>
+              <w:right w:val="single" w:color="BFC9D6" w:sz="4"/>
+            </w:tcBorders>
+            <w:shd w:fill="F5F8FC" w:color="auto" w:val="clear"/>
+            <w:tcMar>
+              <w:top w:type="dxa" w:w="50"/>
+              <w:left w:type="dxa" w:w="90"/>
+              <w:bottom w:type="dxa" w:w="50"/>
+              <w:right w:type="dxa" w:w="90"/>
+            </w:tcMar>
+            <w:vAlign w:val="top"/>
+          </w:tcPr>
+          <w:p>
+            <w:pPr>
+              <w:keepNext w:val="false"/>
+              <w:bidi/>
+              <w:spacing w:after="30" w:before="30" w:line="264"/>
+            </w:pPr>
+            <w:r>
+              <w:rPr>
+                <w:rFonts w:ascii="Arial" w:cs="Arial" w:eastAsia="Arial" w:hAnsi="Arial"/>
+                <w:b/>
+                <w:bCs/>
+                <w:sz w:val="18"/>
+                <w:szCs w:val="18"/>
+                <w:rtl/>
+              </w:rPr>
+              <w:t xml:space="preserve">التجهيز قبل اختيار الخادم (2026-10-25).</w:t>
+            </w:r>
+            <w:r>
+              <w:rPr>
+                <w:rFonts w:ascii="Arial" w:cs="Arial" w:eastAsia="Arial" w:hAnsi="Arial"/>
+                <w:b w:val="false"/>
+                <w:bCs w:val="false"/>
+                <w:sz w:val="18"/>
+                <w:szCs w:val="18"/>
+                <w:rtl/>
+              </w:rPr>
+              <w:t xml:space="preserve"> «اكمل وجهّز ما يمكن تجهيزه قبل اختيار الخادم». ملف قيم واحد للخادم، وسكربت تجهيز خادم التطبيق منه، وفحصا جاهزية للقراءة فقط للخادمين، ومعايير اختيار المزوّد ونموذج القيم المطلوبة (</w:t>
+            </w:r>
+            <w:r>
+              <w:rPr>
+                <w:rFonts w:ascii="Courier New" w:cs="Courier New" w:eastAsia="Courier New" w:hAnsi="Courier New"/>
+                <w:b w:val="false"/>
+                <w:bCs w:val="false"/>
+                <w:color w:val="1F2937"/>
+                <w:sz w:val="16"/>
+                <w:szCs w:val="16"/>
+                <w:shd w:fill="F1F3F5" w:color="auto" w:val="clear"/>
+                <w:rtl/>
+              </w:rPr>
+              <w:t xml:space="preserve">‎docs/55‎</w:t>
+            </w:r>
+            <w:r>
+              <w:rPr>
+                <w:rFonts w:ascii="Arial" w:cs="Arial" w:eastAsia="Arial" w:hAnsi="Arial"/>
+                <w:b w:val="false"/>
+                <w:bCs w:val="false"/>
+                <w:sz w:val="18"/>
+                <w:szCs w:val="18"/>
+                <w:rtl/>
+              </w:rPr>
+              <w:t xml:space="preserve">)، ومهمة في GitHub تبني الصورتين بشبكة حقيقية وتشغّل التشغيل التجريبي في كل تعديل</w:t>
+            </w:r>
+          </w:p>
+        </w:tc>
+        <w:tc>
+          <w:tcPr>
+            <w:tcW w:type="dxa" w:w="2290"/>
+            <w:tcBorders>
+              <w:top w:val="single" w:color="BFC9D6" w:sz="4"/>
+              <w:left w:val="single" w:color="BFC9D6" w:sz="4"/>
+              <w:bottom w:val="single" w:color="BFC9D6" w:sz="4"/>
+              <w:right w:val="single" w:color="BFC9D6" w:sz="4"/>
+            </w:tcBorders>
+            <w:shd w:fill="F5F8FC" w:color="auto" w:val="clear"/>
+            <w:tcMar>
+              <w:top w:type="dxa" w:w="50"/>
+              <w:left w:type="dxa" w:w="90"/>
+              <w:bottom w:type="dxa" w:w="50"/>
+              <w:right w:type="dxa" w:w="90"/>
+            </w:tcMar>
+            <w:vAlign w:val="top"/>
+          </w:tcPr>
+          <w:p>
+            <w:pPr>
+              <w:keepNext w:val="false"/>
+              <w:bidi/>
+              <w:spacing w:after="30" w:before="30" w:line="264"/>
+            </w:pPr>
+            <w:r>
+              <w:rPr>
+                <w:rFonts w:ascii="Arial" w:cs="Arial" w:eastAsia="Arial" w:hAnsi="Arial"/>
+                <w:b w:val="false"/>
+                <w:bCs w:val="false"/>
+                <w:sz w:val="18"/>
+                <w:szCs w:val="18"/>
+                <w:rtl/>
+              </w:rPr>
+              <w:t xml:space="preserve">النشر والتشغيل</w:t>
+            </w:r>
+          </w:p>
+        </w:tc>
+        <w:tc>
+          <w:tcPr>
+            <w:tcW w:type="dxa" w:w="4212"/>
+            <w:tcBorders>
+              <w:top w:val="single" w:color="BFC9D6" w:sz="4"/>
+              <w:left w:val="single" w:color="BFC9D6" w:sz="4"/>
+              <w:bottom w:val="single" w:color="BFC9D6" w:sz="4"/>
+              <w:right w:val="single" w:color="BFC9D6" w:sz="4"/>
+            </w:tcBorders>
+            <w:shd w:fill="F5F8FC" w:color="auto" w:val="clear"/>
+            <w:tcMar>
+              <w:top w:type="dxa" w:w="50"/>
+              <w:left w:type="dxa" w:w="90"/>
+              <w:bottom w:type="dxa" w:w="50"/>
+              <w:right w:type="dxa" w:w="90"/>
+            </w:tcMar>
+            <w:vAlign w:val="top"/>
+          </w:tcPr>
+          <w:p>
+            <w:pPr>
+              <w:keepNext w:val="false"/>
+              <w:bidi/>
+              <w:spacing w:after="30" w:before="30" w:line="264"/>
+            </w:pPr>
+            <w:r>
+              <w:rPr>
+                <w:rFonts w:ascii="Segoe UI Emoji" w:cs="Segoe UI Emoji" w:eastAsia="Segoe UI Emoji" w:hAnsi="Segoe UI Emoji"/>
+                <w:sz w:val="18"/>
+                <w:szCs w:val="18"/>
+                <w:rtl/>
+              </w:rPr>
+              <w:t xml:space="preserve">✅</w:t>
+            </w:r>
+            <w:r>
+              <w:rPr>
+                <w:rFonts w:ascii="Arial" w:cs="Arial" w:eastAsia="Arial" w:hAnsi="Arial"/>
+                <w:b w:val="false"/>
+                <w:bCs w:val="false"/>
+                <w:sz w:val="18"/>
+                <w:szCs w:val="18"/>
+                <w:rtl/>
+              </w:rPr>
+              <w:t xml:space="preserve"> </w:t>
+            </w:r>
+            <w:r>
+              <w:rPr>
+                <w:rFonts w:ascii="Arial" w:cs="Arial" w:eastAsia="Arial" w:hAnsi="Arial"/>
+                <w:b/>
+                <w:bCs/>
+                <w:sz w:val="18"/>
+                <w:szCs w:val="18"/>
+                <w:rtl/>
+              </w:rPr>
+              <w:t xml:space="preserve">منفّذ (</w:t>
+            </w:r>
+            <w:r>
+              <w:rPr>
+                <w:rFonts w:ascii="Courier New" w:cs="Courier New" w:eastAsia="Courier New" w:hAnsi="Courier New"/>
+                <w:b/>
+                <w:bCs/>
+                <w:color w:val="1F2937"/>
+                <w:sz w:val="16"/>
+                <w:szCs w:val="16"/>
+                <w:shd w:fill="F1F3F5" w:color="auto" w:val="clear"/>
+                <w:rtl/>
+              </w:rPr>
+              <w:t xml:space="preserve">‎docs/55‎</w:t>
+            </w:r>
+            <w:r>
+              <w:rPr>
+                <w:rFonts w:ascii="Arial" w:cs="Arial" w:eastAsia="Arial" w:hAnsi="Arial"/>
+                <w:b/>
+                <w:bCs/>
+                <w:sz w:val="18"/>
+                <w:szCs w:val="18"/>
+                <w:rtl/>
+              </w:rPr>
+              <w:t xml:space="preserve">)</w:t>
+            </w:r>
+            <w:r>
+              <w:rPr>
+                <w:rFonts w:ascii="Arial" w:cs="Arial" w:eastAsia="Arial" w:hAnsi="Arial"/>
+                <w:b w:val="false"/>
+                <w:bCs w:val="false"/>
+                <w:sz w:val="18"/>
+                <w:szCs w:val="18"/>
+                <w:rtl/>
+              </w:rPr>
+              <w:t xml:space="preserve">. وكشفت مهمة GitHub خللًا كان سيوقف بناء صورة الخادم على أي خادم بلا وكيل شبكة، فأُصلح</w:t>
             </w:r>
           </w:p>
         </w:tc>

</xml_diff>

<commit_message>
New catalogue defaults by kind (FR-CAT-003, ADR 0054, docs/31 row 57)
The owner chose to split by kind: the upgrade of an onboarded tenant (SeedUpgradeJob, SeedMode.HoldOptional) adds at
once what the platform needs (rows outside the catalogues, system and locked catalogue rows) and holds an optional
catalogue row with what refers to it. GET /catalogs/defaults offers the held rows, read live from the packs, and
POST /catalogs/defaults/apply adds the chosen ones and their links, insert only, audited. The catalogue screen shows
'New defaults available'. Onboarding still seeds everything. S5RestTests simulates a release.

Co-Authored-By: Claude Opus 5.5 <noreply@anthropic.com>
Claude-Session: https://claude.ai/code/session_012HHcRrzuvMBTL2FYxXtsyv
</commit_message>
<xml_diff>
--- a/treasury-platform/docs/31-OWNER-DECISIONS.docx
+++ b/treasury-platform/docs/31-OWNER-DECISIONS.docx
@@ -12915,6 +12915,221 @@
                 <w:rtl/>
               </w:rPr>
               <w:t xml:space="preserve">. وكشفت مهمة GitHub خللًا كان سيوقف بناء صورة الخادم على أي خادم بلا وكيل شبكة، فأُصلح</w:t>
+            </w:r>
+          </w:p>
+        </w:tc>
+      </w:tr>
+      <w:tr>
+        <w:trPr>
+          <w:cantSplit/>
+        </w:trPr>
+        <w:tc>
+          <w:tcPr>
+            <w:tcW w:type="dxa" w:w="925"/>
+            <w:tcBorders>
+              <w:top w:val="single" w:color="BFC9D6" w:sz="4"/>
+              <w:left w:val="single" w:color="BFC9D6" w:sz="4"/>
+              <w:bottom w:val="single" w:color="BFC9D6" w:sz="4"/>
+              <w:right w:val="single" w:color="BFC9D6" w:sz="4"/>
+            </w:tcBorders>
+            <w:tcMar>
+              <w:top w:type="dxa" w:w="50"/>
+              <w:left w:type="dxa" w:w="90"/>
+              <w:bottom w:type="dxa" w:w="50"/>
+              <w:right w:type="dxa" w:w="90"/>
+            </w:tcMar>
+            <w:vAlign w:val="top"/>
+          </w:tcPr>
+          <w:p>
+            <w:pPr>
+              <w:keepNext w:val="false"/>
+              <w:bidi/>
+              <w:spacing w:after="30" w:before="30" w:line="264"/>
+            </w:pPr>
+            <w:r>
+              <w:rPr>
+                <w:rFonts w:ascii="Arial" w:cs="Arial" w:eastAsia="Arial" w:hAnsi="Arial"/>
+                <w:b w:val="false"/>
+                <w:bCs w:val="false"/>
+                <w:sz w:val="18"/>
+                <w:szCs w:val="18"/>
+                <w:rtl/>
+              </w:rPr>
+              <w:t xml:space="preserve">57</w:t>
+            </w:r>
+          </w:p>
+        </w:tc>
+        <w:tc>
+          <w:tcPr>
+            <w:tcW w:type="dxa" w:w="2437"/>
+            <w:tcBorders>
+              <w:top w:val="single" w:color="BFC9D6" w:sz="4"/>
+              <w:left w:val="single" w:color="BFC9D6" w:sz="4"/>
+              <w:bottom w:val="single" w:color="BFC9D6" w:sz="4"/>
+              <w:right w:val="single" w:color="BFC9D6" w:sz="4"/>
+            </w:tcBorders>
+            <w:tcMar>
+              <w:top w:type="dxa" w:w="50"/>
+              <w:left w:type="dxa" w:w="90"/>
+              <w:bottom w:type="dxa" w:w="50"/>
+              <w:right w:type="dxa" w:w="90"/>
+            </w:tcMar>
+            <w:vAlign w:val="top"/>
+          </w:tcPr>
+          <w:p>
+            <w:pPr>
+              <w:keepNext w:val="false"/>
+              <w:bidi/>
+              <w:spacing w:after="30" w:before="30" w:line="264"/>
+            </w:pPr>
+            <w:r>
+              <w:rPr>
+                <w:rFonts w:ascii="Arial" w:cs="Arial" w:eastAsia="Arial" w:hAnsi="Arial"/>
+                <w:b/>
+                <w:bCs/>
+                <w:sz w:val="18"/>
+                <w:szCs w:val="18"/>
+                <w:rtl/>
+              </w:rPr>
+              <w:t xml:space="preserve">وصول الافتراضيات الجديدة إلى المشتركين القائمين (2026-10-25).</w:t>
+            </w:r>
+            <w:r>
+              <w:rPr>
+                <w:rFonts w:ascii="Arial" w:cs="Arial" w:eastAsia="Arial" w:hAnsi="Arial"/>
+                <w:b w:val="false"/>
+                <w:bCs w:val="false"/>
+                <w:sz w:val="18"/>
+                <w:szCs w:val="18"/>
+                <w:rtl/>
+              </w:rPr>
+              <w:t xml:space="preserve"> اختار المالك «التقسيم حسب النوع». السبب تعارض بين أمرين: قرار Q-CAT-02 «إشعار وتطبيق اختياري»، ومهمة الترقية اليومية </w:t>
+            </w:r>
+            <w:r>
+              <w:rPr>
+                <w:rFonts w:ascii="Courier New" w:cs="Courier New" w:eastAsia="Courier New" w:hAnsi="Courier New"/>
+                <w:b w:val="false"/>
+                <w:bCs w:val="false"/>
+                <w:color w:val="1F2937"/>
+                <w:sz w:val="16"/>
+                <w:szCs w:val="16"/>
+                <w:shd w:fill="F1F3F5" w:color="auto" w:val="clear"/>
+                <w:rtl/>
+              </w:rPr>
+              <w:t xml:space="preserve">‎SeedUpgradeJob‎</w:t>
+            </w:r>
+            <w:r>
+              <w:rPr>
+                <w:rFonts w:ascii="Arial" w:cs="Arial" w:eastAsia="Arial" w:hAnsi="Arial"/>
+                <w:b w:val="false"/>
+                <w:bCs w:val="false"/>
+                <w:sz w:val="18"/>
+                <w:szCs w:val="18"/>
+                <w:rtl/>
+              </w:rPr>
+              <w:t xml:space="preserve"> التي كانت تضيف كل جديد دون موافقة. وبعض البنود الجديدة يحتاجها النظام ليعمل، مثل نوع المستند «نسخة الطلب المطبوعة»</w:t>
+            </w:r>
+          </w:p>
+        </w:tc>
+        <w:tc>
+          <w:tcPr>
+            <w:tcW w:type="dxa" w:w="2290"/>
+            <w:tcBorders>
+              <w:top w:val="single" w:color="BFC9D6" w:sz="4"/>
+              <w:left w:val="single" w:color="BFC9D6" w:sz="4"/>
+              <w:bottom w:val="single" w:color="BFC9D6" w:sz="4"/>
+              <w:right w:val="single" w:color="BFC9D6" w:sz="4"/>
+            </w:tcBorders>
+            <w:tcMar>
+              <w:top w:type="dxa" w:w="50"/>
+              <w:left w:type="dxa" w:w="90"/>
+              <w:bottom w:type="dxa" w:w="50"/>
+              <w:right w:type="dxa" w:w="90"/>
+            </w:tcMar>
+            <w:vAlign w:val="top"/>
+          </w:tcPr>
+          <w:p>
+            <w:pPr>
+              <w:keepNext w:val="false"/>
+              <w:bidi/>
+              <w:spacing w:after="30" w:before="30" w:line="264"/>
+            </w:pPr>
+            <w:r>
+              <w:rPr>
+                <w:rFonts w:ascii="Arial" w:cs="Arial" w:eastAsia="Arial" w:hAnsi="Arial"/>
+                <w:b w:val="false"/>
+                <w:bCs w:val="false"/>
+                <w:sz w:val="18"/>
+                <w:szCs w:val="18"/>
+                <w:rtl/>
+              </w:rPr>
+              <w:t xml:space="preserve">الكتالوجات (FR-CAT-003)</w:t>
+            </w:r>
+          </w:p>
+        </w:tc>
+        <w:tc>
+          <w:tcPr>
+            <w:tcW w:type="dxa" w:w="4212"/>
+            <w:tcBorders>
+              <w:top w:val="single" w:color="BFC9D6" w:sz="4"/>
+              <w:left w:val="single" w:color="BFC9D6" w:sz="4"/>
+              <w:bottom w:val="single" w:color="BFC9D6" w:sz="4"/>
+              <w:right w:val="single" w:color="BFC9D6" w:sz="4"/>
+            </w:tcBorders>
+            <w:tcMar>
+              <w:top w:type="dxa" w:w="50"/>
+              <w:left w:type="dxa" w:w="90"/>
+              <w:bottom w:type="dxa" w:w="50"/>
+              <w:right w:type="dxa" w:w="90"/>
+            </w:tcMar>
+            <w:vAlign w:val="top"/>
+          </w:tcPr>
+          <w:p>
+            <w:pPr>
+              <w:keepNext w:val="false"/>
+              <w:bidi/>
+              <w:spacing w:after="30" w:before="30" w:line="264"/>
+            </w:pPr>
+            <w:r>
+              <w:rPr>
+                <w:rFonts w:ascii="Segoe UI Emoji" w:cs="Segoe UI Emoji" w:eastAsia="Segoe UI Emoji" w:hAnsi="Segoe UI Emoji"/>
+                <w:sz w:val="18"/>
+                <w:szCs w:val="18"/>
+                <w:rtl/>
+              </w:rPr>
+              <w:t xml:space="preserve">✅</w:t>
+            </w:r>
+            <w:r>
+              <w:rPr>
+                <w:rFonts w:ascii="Arial" w:cs="Arial" w:eastAsia="Arial" w:hAnsi="Arial"/>
+                <w:b w:val="false"/>
+                <w:bCs w:val="false"/>
+                <w:sz w:val="18"/>
+                <w:szCs w:val="18"/>
+                <w:rtl/>
+              </w:rPr>
+              <w:t xml:space="preserve"> </w:t>
+            </w:r>
+            <w:r>
+              <w:rPr>
+                <w:rFonts w:ascii="Arial" w:cs="Arial" w:eastAsia="Arial" w:hAnsi="Arial"/>
+                <w:b/>
+                <w:bCs/>
+                <w:sz w:val="18"/>
+                <w:szCs w:val="18"/>
+                <w:rtl/>
+              </w:rPr>
+              <w:t xml:space="preserve">منفّذ (ADR 0054):</w:t>
+            </w:r>
+            <w:r>
+              <w:rPr>
+                <w:rFonts w:ascii="Arial" w:cs="Arial" w:eastAsia="Arial" w:hAnsi="Arial"/>
+                <w:b w:val="false"/>
+                <w:bCs w:val="false"/>
+                <w:sz w:val="18"/>
+                <w:szCs w:val="18"/>
+                <w:rtl/>
+              </w:rPr>
+              <w:t xml:space="preserve"> ما يحتاجه النظام، أي البنود النظامية والمقفلة وكل ما خارج الكتالوجات، يُضاف تلقائيًا. والبند الاختياري في الكتالوج يُعرض على مدير الحساب في شاشة الكتالوجات، فيضيف ما يريد. ولا يُستبدل شيء عدّله المشترك. والمشترك الجديد يأخذ كل شيء عند تهيئته كما كان</w:t>
             </w:r>
           </w:p>
         </w:tc>

</xml_diff>

<commit_message>
Apply the BankFas visual identity to the site (ADR 0055, docs/56, docs/31 row 58)
The identity guide v2.0 on the portal and the operator panel: the logo drawn from
its geometry (tools/brand/logo.js), IBM Plex Sans Arabic, Sans and Mono bundled
with the site, the brand, platform and status colours as tokens, the vault-green
side bar, the sign-in pages with the slant pattern, and status chips (colour,
mark and word) in the Status columns.

Co-Authored-By: Claude Opus 5.5 <noreply@anthropic.com>
Claude-Session: https://claude.ai/code/session_012HHcRrzuvMBTL2FYxXtsyv
</commit_message>
<xml_diff>
--- a/treasury-platform/docs/31-OWNER-DECISIONS.docx
+++ b/treasury-platform/docs/31-OWNER-DECISIONS.docx
@@ -13130,6 +13130,225 @@
                 <w:rtl/>
               </w:rPr>
               <w:t xml:space="preserve"> ما يحتاجه النظام، أي البنود النظامية والمقفلة وكل ما خارج الكتالوجات، يُضاف تلقائيًا. والبند الاختياري في الكتالوج يُعرض على مدير الحساب في شاشة الكتالوجات، فيضيف ما يريد. ولا يُستبدل شيء عدّله المشترك. والمشترك الجديد يأخذ كل شيء عند تهيئته كما كان</w:t>
+            </w:r>
+          </w:p>
+        </w:tc>
+      </w:tr>
+      <w:tr>
+        <w:trPr>
+          <w:cantSplit/>
+        </w:trPr>
+        <w:tc>
+          <w:tcPr>
+            <w:tcW w:type="dxa" w:w="925"/>
+            <w:tcBorders>
+              <w:top w:val="single" w:color="BFC9D6" w:sz="4"/>
+              <w:left w:val="single" w:color="BFC9D6" w:sz="4"/>
+              <w:bottom w:val="single" w:color="BFC9D6" w:sz="4"/>
+              <w:right w:val="single" w:color="BFC9D6" w:sz="4"/>
+            </w:tcBorders>
+            <w:shd w:fill="F5F8FC" w:color="auto" w:val="clear"/>
+            <w:tcMar>
+              <w:top w:type="dxa" w:w="50"/>
+              <w:left w:type="dxa" w:w="90"/>
+              <w:bottom w:type="dxa" w:w="50"/>
+              <w:right w:type="dxa" w:w="90"/>
+            </w:tcMar>
+            <w:vAlign w:val="top"/>
+          </w:tcPr>
+          <w:p>
+            <w:pPr>
+              <w:keepNext w:val="false"/>
+              <w:bidi/>
+              <w:spacing w:after="30" w:before="30" w:line="264"/>
+            </w:pPr>
+            <w:r>
+              <w:rPr>
+                <w:rFonts w:ascii="Arial" w:cs="Arial" w:eastAsia="Arial" w:hAnsi="Arial"/>
+                <w:b w:val="false"/>
+                <w:bCs w:val="false"/>
+                <w:sz w:val="18"/>
+                <w:szCs w:val="18"/>
+                <w:rtl/>
+              </w:rPr>
+              <w:t xml:space="preserve">58</w:t>
+            </w:r>
+          </w:p>
+        </w:tc>
+        <w:tc>
+          <w:tcPr>
+            <w:tcW w:type="dxa" w:w="2437"/>
+            <w:tcBorders>
+              <w:top w:val="single" w:color="BFC9D6" w:sz="4"/>
+              <w:left w:val="single" w:color="BFC9D6" w:sz="4"/>
+              <w:bottom w:val="single" w:color="BFC9D6" w:sz="4"/>
+              <w:right w:val="single" w:color="BFC9D6" w:sz="4"/>
+            </w:tcBorders>
+            <w:shd w:fill="F5F8FC" w:color="auto" w:val="clear"/>
+            <w:tcMar>
+              <w:top w:type="dxa" w:w="50"/>
+              <w:left w:type="dxa" w:w="90"/>
+              <w:bottom w:type="dxa" w:w="50"/>
+              <w:right w:type="dxa" w:w="90"/>
+            </w:tcMar>
+            <w:vAlign w:val="top"/>
+          </w:tcPr>
+          <w:p>
+            <w:pPr>
+              <w:keepNext w:val="false"/>
+              <w:bidi/>
+              <w:spacing w:after="30" w:before="30" w:line="264"/>
+            </w:pPr>
+            <w:r>
+              <w:rPr>
+                <w:rFonts w:ascii="Arial" w:cs="Arial" w:eastAsia="Arial" w:hAnsi="Arial"/>
+                <w:b/>
+                <w:bCs/>
+                <w:sz w:val="18"/>
+                <w:szCs w:val="18"/>
+                <w:rtl/>
+              </w:rPr>
+              <w:t xml:space="preserve">الهوية البصرية للموقع (2026-10-25).</w:t>
+            </w:r>
+            <w:r>
+              <w:rPr>
+                <w:rFonts w:ascii="Arial" w:cs="Arial" w:eastAsia="Arial" w:hAnsi="Arial"/>
+                <w:b w:val="false"/>
+                <w:bCs w:val="false"/>
+                <w:sz w:val="18"/>
+                <w:szCs w:val="18"/>
+                <w:rtl/>
+              </w:rPr>
+              <w:t xml:space="preserve"> «في تصميم الموقع اعتمد الهوية البصرية المرفقة»، ثم «الان اعمل التصميم كاملا للموقع اذا كانت المعمارية و النظام جاهزا للاطلاق التجريبي». المرجع دليل الهوية البصرية، الإصدار 2.0</w:t>
+            </w:r>
+          </w:p>
+        </w:tc>
+        <w:tc>
+          <w:tcPr>
+            <w:tcW w:type="dxa" w:w="2290"/>
+            <w:tcBorders>
+              <w:top w:val="single" w:color="BFC9D6" w:sz="4"/>
+              <w:left w:val="single" w:color="BFC9D6" w:sz="4"/>
+              <w:bottom w:val="single" w:color="BFC9D6" w:sz="4"/>
+              <w:right w:val="single" w:color="BFC9D6" w:sz="4"/>
+            </w:tcBorders>
+            <w:shd w:fill="F5F8FC" w:color="auto" w:val="clear"/>
+            <w:tcMar>
+              <w:top w:type="dxa" w:w="50"/>
+              <w:left w:type="dxa" w:w="90"/>
+              <w:bottom w:type="dxa" w:w="50"/>
+              <w:right w:type="dxa" w:w="90"/>
+            </w:tcMar>
+            <w:vAlign w:val="top"/>
+          </w:tcPr>
+          <w:p>
+            <w:pPr>
+              <w:keepNext w:val="false"/>
+              <w:bidi/>
+              <w:spacing w:after="30" w:before="30" w:line="264"/>
+            </w:pPr>
+            <w:r>
+              <w:rPr>
+                <w:rFonts w:ascii="Arial" w:cs="Arial" w:eastAsia="Arial" w:hAnsi="Arial"/>
+                <w:b w:val="false"/>
+                <w:bCs w:val="false"/>
+                <w:sz w:val="18"/>
+                <w:szCs w:val="18"/>
+                <w:rtl/>
+              </w:rPr>
+              <w:t xml:space="preserve">الواجهة كلها (البوابة ولوحة المشغّل)</w:t>
+            </w:r>
+          </w:p>
+        </w:tc>
+        <w:tc>
+          <w:tcPr>
+            <w:tcW w:type="dxa" w:w="4212"/>
+            <w:tcBorders>
+              <w:top w:val="single" w:color="BFC9D6" w:sz="4"/>
+              <w:left w:val="single" w:color="BFC9D6" w:sz="4"/>
+              <w:bottom w:val="single" w:color="BFC9D6" w:sz="4"/>
+              <w:right w:val="single" w:color="BFC9D6" w:sz="4"/>
+            </w:tcBorders>
+            <w:shd w:fill="F5F8FC" w:color="auto" w:val="clear"/>
+            <w:tcMar>
+              <w:top w:type="dxa" w:w="50"/>
+              <w:left w:type="dxa" w:w="90"/>
+              <w:bottom w:type="dxa" w:w="50"/>
+              <w:right w:type="dxa" w:w="90"/>
+            </w:tcMar>
+            <w:vAlign w:val="top"/>
+          </w:tcPr>
+          <w:p>
+            <w:pPr>
+              <w:keepNext w:val="false"/>
+              <w:bidi/>
+              <w:spacing w:after="30" w:before="30" w:line="264"/>
+            </w:pPr>
+            <w:r>
+              <w:rPr>
+                <w:rFonts w:ascii="Segoe UI Emoji" w:cs="Segoe UI Emoji" w:eastAsia="Segoe UI Emoji" w:hAnsi="Segoe UI Emoji"/>
+                <w:sz w:val="18"/>
+                <w:szCs w:val="18"/>
+                <w:rtl/>
+              </w:rPr>
+              <w:t xml:space="preserve">✅</w:t>
+            </w:r>
+            <w:r>
+              <w:rPr>
+                <w:rFonts w:ascii="Arial" w:cs="Arial" w:eastAsia="Arial" w:hAnsi="Arial"/>
+                <w:b w:val="false"/>
+                <w:bCs w:val="false"/>
+                <w:sz w:val="18"/>
+                <w:szCs w:val="18"/>
+                <w:rtl/>
+              </w:rPr>
+              <w:t xml:space="preserve"> </w:t>
+            </w:r>
+            <w:r>
+              <w:rPr>
+                <w:rFonts w:ascii="Arial" w:cs="Arial" w:eastAsia="Arial" w:hAnsi="Arial"/>
+                <w:b/>
+                <w:bCs/>
+                <w:sz w:val="18"/>
+                <w:szCs w:val="18"/>
+                <w:rtl/>
+              </w:rPr>
+              <w:t xml:space="preserve">منفّذ (ADR 0055، </w:t>
+            </w:r>
+            <w:r>
+              <w:rPr>
+                <w:rFonts w:ascii="Courier New" w:cs="Courier New" w:eastAsia="Courier New" w:hAnsi="Courier New"/>
+                <w:b/>
+                <w:bCs/>
+                <w:color w:val="1F2937"/>
+                <w:sz w:val="16"/>
+                <w:szCs w:val="16"/>
+                <w:shd w:fill="F1F3F5" w:color="auto" w:val="clear"/>
+                <w:rtl/>
+              </w:rPr>
+              <w:t xml:space="preserve">‎docs/56‎</w:t>
+            </w:r>
+            <w:r>
+              <w:rPr>
+                <w:rFonts w:ascii="Arial" w:cs="Arial" w:eastAsia="Arial" w:hAnsi="Arial"/>
+                <w:b/>
+                <w:bCs/>
+                <w:sz w:val="18"/>
+                <w:szCs w:val="18"/>
+                <w:rtl/>
+              </w:rPr>
+              <w:t xml:space="preserve">):</w:t>
+            </w:r>
+            <w:r>
+              <w:rPr>
+                <w:rFonts w:ascii="Arial" w:cs="Arial" w:eastAsia="Arial" w:hAnsi="Arial"/>
+                <w:b w:val="false"/>
+                <w:bCs w:val="false"/>
+                <w:sz w:val="18"/>
+                <w:szCs w:val="18"/>
+                <w:rtl/>
+              </w:rPr>
+              <w:t xml:space="preserve"> الشعار والألوان والخطوط والشق المائل وشارات الحالات، والشريط الجانبي وصفحات الدخول، بالعربية والإنجليزية وعلى الجوال. والمطبوعات وقوالب البريد خطوة لاحقة</w:t>
             </w:r>
           </w:p>
         </w:tc>

</xml_diff>

<commit_message>
Portal menu grouped by module (docs/31 row 59, docs/56 §6)
The daily work at the top, then seven groups in the owner's order: credit
facilities, treasury requests, credit and risk, companies and parties, banks and
accounts, employees and access, settings. A group opens on a click and on its own
pages, remembers how it was left, and is not shown when the user has no screen in
it. The browser test opens the groups before following their links.

Co-Authored-By: Claude Opus 5.5 <noreply@anthropic.com>
Claude-Session: https://claude.ai/code/session_012HHcRrzuvMBTL2FYxXtsyv
</commit_message>
<xml_diff>
--- a/treasury-platform/docs/31-OWNER-DECISIONS.docx
+++ b/treasury-platform/docs/31-OWNER-DECISIONS.docx
@@ -13349,6 +13349,221 @@
                 <w:rtl/>
               </w:rPr>
               <w:t xml:space="preserve"> الشعار والألوان والخطوط والشق المائل وشارات الحالات، والشريط الجانبي وصفحات الدخول، بالعربية والإنجليزية وعلى الجوال. والمطبوعات وقوالب البريد خطوة لاحقة</w:t>
+            </w:r>
+          </w:p>
+        </w:tc>
+      </w:tr>
+      <w:tr>
+        <w:trPr>
+          <w:cantSplit/>
+        </w:trPr>
+        <w:tc>
+          <w:tcPr>
+            <w:tcW w:type="dxa" w:w="925"/>
+            <w:tcBorders>
+              <w:top w:val="single" w:color="BFC9D6" w:sz="4"/>
+              <w:left w:val="single" w:color="BFC9D6" w:sz="4"/>
+              <w:bottom w:val="single" w:color="BFC9D6" w:sz="4"/>
+              <w:right w:val="single" w:color="BFC9D6" w:sz="4"/>
+            </w:tcBorders>
+            <w:tcMar>
+              <w:top w:type="dxa" w:w="50"/>
+              <w:left w:type="dxa" w:w="90"/>
+              <w:bottom w:type="dxa" w:w="50"/>
+              <w:right w:type="dxa" w:w="90"/>
+            </w:tcMar>
+            <w:vAlign w:val="top"/>
+          </w:tcPr>
+          <w:p>
+            <w:pPr>
+              <w:keepNext w:val="false"/>
+              <w:bidi/>
+              <w:spacing w:after="30" w:before="30" w:line="264"/>
+            </w:pPr>
+            <w:r>
+              <w:rPr>
+                <w:rFonts w:ascii="Arial" w:cs="Arial" w:eastAsia="Arial" w:hAnsi="Arial"/>
+                <w:b w:val="false"/>
+                <w:bCs w:val="false"/>
+                <w:sz w:val="18"/>
+                <w:szCs w:val="18"/>
+                <w:rtl/>
+              </w:rPr>
+              <w:t xml:space="preserve">59</w:t>
+            </w:r>
+          </w:p>
+        </w:tc>
+        <w:tc>
+          <w:tcPr>
+            <w:tcW w:type="dxa" w:w="2437"/>
+            <w:tcBorders>
+              <w:top w:val="single" w:color="BFC9D6" w:sz="4"/>
+              <w:left w:val="single" w:color="BFC9D6" w:sz="4"/>
+              <w:bottom w:val="single" w:color="BFC9D6" w:sz="4"/>
+              <w:right w:val="single" w:color="BFC9D6" w:sz="4"/>
+            </w:tcBorders>
+            <w:tcMar>
+              <w:top w:type="dxa" w:w="50"/>
+              <w:left w:type="dxa" w:w="90"/>
+              <w:bottom w:type="dxa" w:w="50"/>
+              <w:right w:type="dxa" w:w="90"/>
+            </w:tcMar>
+            <w:vAlign w:val="top"/>
+          </w:tcPr>
+          <w:p>
+            <w:pPr>
+              <w:keepNext w:val="false"/>
+              <w:bidi/>
+              <w:spacing w:after="30" w:before="30" w:line="264"/>
+            </w:pPr>
+            <w:r>
+              <w:rPr>
+                <w:rFonts w:ascii="Arial" w:cs="Arial" w:eastAsia="Arial" w:hAnsi="Arial"/>
+                <w:b/>
+                <w:bCs/>
+                <w:sz w:val="18"/>
+                <w:szCs w:val="18"/>
+                <w:rtl/>
+              </w:rPr>
+              <w:t xml:space="preserve">تنظيم القائمة حسب الوحدات (2026-10-25).</w:t>
+            </w:r>
+            <w:r>
+              <w:rPr>
+                <w:rFonts w:ascii="Arial" w:cs="Arial" w:eastAsia="Arial" w:hAnsi="Arial"/>
+                <w:b w:val="false"/>
+                <w:bCs w:val="false"/>
+                <w:sz w:val="18"/>
+                <w:szCs w:val="18"/>
+                <w:rtl/>
+              </w:rPr>
+              <w:t xml:space="preserve"> «في القائمة يجب ان تكون منظمة… التسهيلات الائتمانية، طلبات الخزينة، الائتمان و المخاطر، الشركات، الموظفين، الاعدادات»، ثم «اعطني افضل اجراء باعتبارك خبير انظمة»</w:t>
+            </w:r>
+          </w:p>
+        </w:tc>
+        <w:tc>
+          <w:tcPr>
+            <w:tcW w:type="dxa" w:w="2290"/>
+            <w:tcBorders>
+              <w:top w:val="single" w:color="BFC9D6" w:sz="4"/>
+              <w:left w:val="single" w:color="BFC9D6" w:sz="4"/>
+              <w:bottom w:val="single" w:color="BFC9D6" w:sz="4"/>
+              <w:right w:val="single" w:color="BFC9D6" w:sz="4"/>
+            </w:tcBorders>
+            <w:tcMar>
+              <w:top w:type="dxa" w:w="50"/>
+              <w:left w:type="dxa" w:w="90"/>
+              <w:bottom w:type="dxa" w:w="50"/>
+              <w:right w:type="dxa" w:w="90"/>
+            </w:tcMar>
+            <w:vAlign w:val="top"/>
+          </w:tcPr>
+          <w:p>
+            <w:pPr>
+              <w:keepNext w:val="false"/>
+              <w:bidi/>
+              <w:spacing w:after="30" w:before="30" w:line="264"/>
+            </w:pPr>
+            <w:r>
+              <w:rPr>
+                <w:rFonts w:ascii="Arial" w:cs="Arial" w:eastAsia="Arial" w:hAnsi="Arial"/>
+                <w:b w:val="false"/>
+                <w:bCs w:val="false"/>
+                <w:sz w:val="18"/>
+                <w:szCs w:val="18"/>
+                <w:rtl/>
+              </w:rPr>
+              <w:t xml:space="preserve">الواجهة (البوابة)</w:t>
+            </w:r>
+          </w:p>
+        </w:tc>
+        <w:tc>
+          <w:tcPr>
+            <w:tcW w:type="dxa" w:w="4212"/>
+            <w:tcBorders>
+              <w:top w:val="single" w:color="BFC9D6" w:sz="4"/>
+              <w:left w:val="single" w:color="BFC9D6" w:sz="4"/>
+              <w:bottom w:val="single" w:color="BFC9D6" w:sz="4"/>
+              <w:right w:val="single" w:color="BFC9D6" w:sz="4"/>
+            </w:tcBorders>
+            <w:tcMar>
+              <w:top w:type="dxa" w:w="50"/>
+              <w:left w:type="dxa" w:w="90"/>
+              <w:bottom w:type="dxa" w:w="50"/>
+              <w:right w:type="dxa" w:w="90"/>
+            </w:tcMar>
+            <w:vAlign w:val="top"/>
+          </w:tcPr>
+          <w:p>
+            <w:pPr>
+              <w:keepNext w:val="false"/>
+              <w:bidi/>
+              <w:spacing w:after="30" w:before="30" w:line="264"/>
+            </w:pPr>
+            <w:r>
+              <w:rPr>
+                <w:rFonts w:ascii="Segoe UI Emoji" w:cs="Segoe UI Emoji" w:eastAsia="Segoe UI Emoji" w:hAnsi="Segoe UI Emoji"/>
+                <w:sz w:val="18"/>
+                <w:szCs w:val="18"/>
+                <w:rtl/>
+              </w:rPr>
+              <w:t xml:space="preserve">✅</w:t>
+            </w:r>
+            <w:r>
+              <w:rPr>
+                <w:rFonts w:ascii="Arial" w:cs="Arial" w:eastAsia="Arial" w:hAnsi="Arial"/>
+                <w:b w:val="false"/>
+                <w:bCs w:val="false"/>
+                <w:sz w:val="18"/>
+                <w:szCs w:val="18"/>
+                <w:rtl/>
+              </w:rPr>
+              <w:t xml:space="preserve"> </w:t>
+            </w:r>
+            <w:r>
+              <w:rPr>
+                <w:rFonts w:ascii="Arial" w:cs="Arial" w:eastAsia="Arial" w:hAnsi="Arial"/>
+                <w:b/>
+                <w:bCs/>
+                <w:sz w:val="18"/>
+                <w:szCs w:val="18"/>
+                <w:rtl/>
+              </w:rPr>
+              <w:t xml:space="preserve">منفّذ (</w:t>
+            </w:r>
+            <w:r>
+              <w:rPr>
+                <w:rFonts w:ascii="Courier New" w:cs="Courier New" w:eastAsia="Courier New" w:hAnsi="Courier New"/>
+                <w:b/>
+                <w:bCs/>
+                <w:color w:val="1F2937"/>
+                <w:sz w:val="16"/>
+                <w:szCs w:val="16"/>
+                <w:shd w:fill="F1F3F5" w:color="auto" w:val="clear"/>
+                <w:rtl/>
+              </w:rPr>
+              <w:t xml:space="preserve">‎docs/56‎</w:t>
+            </w:r>
+            <w:r>
+              <w:rPr>
+                <w:rFonts w:ascii="Arial" w:cs="Arial" w:eastAsia="Arial" w:hAnsi="Arial"/>
+                <w:b/>
+                <w:bCs/>
+                <w:sz w:val="18"/>
+                <w:szCs w:val="18"/>
+                <w:rtl/>
+              </w:rPr>
+              <w:t xml:space="preserve"> §6):</w:t>
+            </w:r>
+            <w:r>
+              <w:rPr>
+                <w:rFonts w:ascii="Arial" w:cs="Arial" w:eastAsia="Arial" w:hAnsi="Arial"/>
+                <w:b w:val="false"/>
+                <w:bCs w:val="false"/>
+                <w:sz w:val="18"/>
+                <w:szCs w:val="18"/>
+                <w:rtl/>
+              </w:rPr>
+              <w:t xml:space="preserve"> العمل اليومي في الأعلى، ثم سبع مجموعات تُفتح بنقرة، بترتيب المالك. وأُضيفت مجموعة «البنوك والحسابات» لأنها تخدم التسهيلات والطلبات معًا. ولا تظهر مجموعة ليس للمستخدم فيها شاشة</w:t>
             </w:r>
           </w:p>
         </w:tc>

</xml_diff>

<commit_message>
Release 1.0.0 for the pilot: operator menu groups and the release package [release]
The operator panel's menu in groups like the portal's (tenants, security, platform).
The release package (docs/57, tools/release/make_release.sh): both images as files,
the source of the release, the install guide and SHA-256 sums. The images job makes
it from the images its pilot run passed and publishes the pre-release
bankfas-v<RELEASE> when a pushed commit message says [release].

Co-Authored-By: Claude Opus 5.5 <noreply@anthropic.com>
Claude-Session: https://claude.ai/code/session_012HHcRrzuvMBTL2FYxXtsyv
</commit_message>
<xml_diff>
--- a/treasury-platform/docs/31-OWNER-DECISIONS.docx
+++ b/treasury-platform/docs/31-OWNER-DECISIONS.docx
@@ -13564,6 +13564,225 @@
                 <w:rtl/>
               </w:rPr>
               <w:t xml:space="preserve"> العمل اليومي في الأعلى، ثم سبع مجموعات تُفتح بنقرة، بترتيب المالك. وأُضيفت مجموعة «البنوك والحسابات» لأنها تخدم التسهيلات والطلبات معًا. ولا تظهر مجموعة ليس للمستخدم فيها شاشة</w:t>
+            </w:r>
+          </w:p>
+        </w:tc>
+      </w:tr>
+      <w:tr>
+        <w:trPr>
+          <w:cantSplit/>
+        </w:trPr>
+        <w:tc>
+          <w:tcPr>
+            <w:tcW w:type="dxa" w:w="925"/>
+            <w:tcBorders>
+              <w:top w:val="single" w:color="BFC9D6" w:sz="4"/>
+              <w:left w:val="single" w:color="BFC9D6" w:sz="4"/>
+              <w:bottom w:val="single" w:color="BFC9D6" w:sz="4"/>
+              <w:right w:val="single" w:color="BFC9D6" w:sz="4"/>
+            </w:tcBorders>
+            <w:shd w:fill="F5F8FC" w:color="auto" w:val="clear"/>
+            <w:tcMar>
+              <w:top w:type="dxa" w:w="50"/>
+              <w:left w:type="dxa" w:w="90"/>
+              <w:bottom w:type="dxa" w:w="50"/>
+              <w:right w:type="dxa" w:w="90"/>
+            </w:tcMar>
+            <w:vAlign w:val="top"/>
+          </w:tcPr>
+          <w:p>
+            <w:pPr>
+              <w:keepNext w:val="false"/>
+              <w:bidi/>
+              <w:spacing w:after="30" w:before="30" w:line="264"/>
+            </w:pPr>
+            <w:r>
+              <w:rPr>
+                <w:rFonts w:ascii="Arial" w:cs="Arial" w:eastAsia="Arial" w:hAnsi="Arial"/>
+                <w:b w:val="false"/>
+                <w:bCs w:val="false"/>
+                <w:sz w:val="18"/>
+                <w:szCs w:val="18"/>
+                <w:rtl/>
+              </w:rPr>
+              <w:t xml:space="preserve">60</w:t>
+            </w:r>
+          </w:p>
+        </w:tc>
+        <w:tc>
+          <w:tcPr>
+            <w:tcW w:type="dxa" w:w="2437"/>
+            <w:tcBorders>
+              <w:top w:val="single" w:color="BFC9D6" w:sz="4"/>
+              <w:left w:val="single" w:color="BFC9D6" w:sz="4"/>
+              <w:bottom w:val="single" w:color="BFC9D6" w:sz="4"/>
+              <w:right w:val="single" w:color="BFC9D6" w:sz="4"/>
+            </w:tcBorders>
+            <w:shd w:fill="F5F8FC" w:color="auto" w:val="clear"/>
+            <w:tcMar>
+              <w:top w:type="dxa" w:w="50"/>
+              <w:left w:type="dxa" w:w="90"/>
+              <w:bottom w:type="dxa" w:w="50"/>
+              <w:right w:type="dxa" w:w="90"/>
+            </w:tcMar>
+            <w:vAlign w:val="top"/>
+          </w:tcPr>
+          <w:p>
+            <w:pPr>
+              <w:keepNext w:val="false"/>
+              <w:bidi/>
+              <w:spacing w:after="30" w:before="30" w:line="264"/>
+            </w:pPr>
+            <w:r>
+              <w:rPr>
+                <w:rFonts w:ascii="Arial" w:cs="Arial" w:eastAsia="Arial" w:hAnsi="Arial"/>
+                <w:b/>
+                <w:bCs/>
+                <w:sz w:val="18"/>
+                <w:szCs w:val="18"/>
+                <w:rtl/>
+              </w:rPr>
+              <w:t xml:space="preserve">الإصدار الأول للتجربة (2026-10-25).</w:t>
+            </w:r>
+            <w:r>
+              <w:rPr>
+                <w:rFonts w:ascii="Arial" w:cs="Arial" w:eastAsia="Arial" w:hAnsi="Arial"/>
+                <w:b w:val="false"/>
+                <w:bCs w:val="false"/>
+                <w:sz w:val="18"/>
+                <w:szCs w:val="18"/>
+                <w:rtl/>
+              </w:rPr>
+              <w:t xml:space="preserve"> «نظم كل القوائم لكل الموديول و الشاشات ضمن القوائم… اعتمد و اكمل و اعطني الاصدار الاول ليتم رفعه على السيرفر للتجربة»</w:t>
+            </w:r>
+          </w:p>
+        </w:tc>
+        <w:tc>
+          <w:tcPr>
+            <w:tcW w:type="dxa" w:w="2290"/>
+            <w:tcBorders>
+              <w:top w:val="single" w:color="BFC9D6" w:sz="4"/>
+              <w:left w:val="single" w:color="BFC9D6" w:sz="4"/>
+              <w:bottom w:val="single" w:color="BFC9D6" w:sz="4"/>
+              <w:right w:val="single" w:color="BFC9D6" w:sz="4"/>
+            </w:tcBorders>
+            <w:shd w:fill="F5F8FC" w:color="auto" w:val="clear"/>
+            <w:tcMar>
+              <w:top w:type="dxa" w:w="50"/>
+              <w:left w:type="dxa" w:w="90"/>
+              <w:bottom w:type="dxa" w:w="50"/>
+              <w:right w:type="dxa" w:w="90"/>
+            </w:tcMar>
+            <w:vAlign w:val="top"/>
+          </w:tcPr>
+          <w:p>
+            <w:pPr>
+              <w:keepNext w:val="false"/>
+              <w:bidi/>
+              <w:spacing w:after="30" w:before="30" w:line="264"/>
+            </w:pPr>
+            <w:r>
+              <w:rPr>
+                <w:rFonts w:ascii="Arial" w:cs="Arial" w:eastAsia="Arial" w:hAnsi="Arial"/>
+                <w:b w:val="false"/>
+                <w:bCs w:val="false"/>
+                <w:sz w:val="18"/>
+                <w:szCs w:val="18"/>
+                <w:rtl/>
+              </w:rPr>
+              <w:t xml:space="preserve">القوائم، والنشر</w:t>
+            </w:r>
+          </w:p>
+        </w:tc>
+        <w:tc>
+          <w:tcPr>
+            <w:tcW w:type="dxa" w:w="4212"/>
+            <w:tcBorders>
+              <w:top w:val="single" w:color="BFC9D6" w:sz="4"/>
+              <w:left w:val="single" w:color="BFC9D6" w:sz="4"/>
+              <w:bottom w:val="single" w:color="BFC9D6" w:sz="4"/>
+              <w:right w:val="single" w:color="BFC9D6" w:sz="4"/>
+            </w:tcBorders>
+            <w:shd w:fill="F5F8FC" w:color="auto" w:val="clear"/>
+            <w:tcMar>
+              <w:top w:type="dxa" w:w="50"/>
+              <w:left w:type="dxa" w:w="90"/>
+              <w:bottom w:type="dxa" w:w="50"/>
+              <w:right w:type="dxa" w:w="90"/>
+            </w:tcMar>
+            <w:vAlign w:val="top"/>
+          </w:tcPr>
+          <w:p>
+            <w:pPr>
+              <w:keepNext w:val="false"/>
+              <w:bidi/>
+              <w:spacing w:after="30" w:before="30" w:line="264"/>
+            </w:pPr>
+            <w:r>
+              <w:rPr>
+                <w:rFonts w:ascii="Segoe UI Emoji" w:cs="Segoe UI Emoji" w:eastAsia="Segoe UI Emoji" w:hAnsi="Segoe UI Emoji"/>
+                <w:sz w:val="18"/>
+                <w:szCs w:val="18"/>
+                <w:rtl/>
+              </w:rPr>
+              <w:t xml:space="preserve">✅</w:t>
+            </w:r>
+            <w:r>
+              <w:rPr>
+                <w:rFonts w:ascii="Arial" w:cs="Arial" w:eastAsia="Arial" w:hAnsi="Arial"/>
+                <w:b w:val="false"/>
+                <w:bCs w:val="false"/>
+                <w:sz w:val="18"/>
+                <w:szCs w:val="18"/>
+                <w:rtl/>
+              </w:rPr>
+              <w:t xml:space="preserve"> </w:t>
+            </w:r>
+            <w:r>
+              <w:rPr>
+                <w:rFonts w:ascii="Arial" w:cs="Arial" w:eastAsia="Arial" w:hAnsi="Arial"/>
+                <w:b/>
+                <w:bCs/>
+                <w:sz w:val="18"/>
+                <w:szCs w:val="18"/>
+                <w:rtl/>
+              </w:rPr>
+              <w:t xml:space="preserve">منفّذ (</w:t>
+            </w:r>
+            <w:r>
+              <w:rPr>
+                <w:rFonts w:ascii="Courier New" w:cs="Courier New" w:eastAsia="Courier New" w:hAnsi="Courier New"/>
+                <w:b/>
+                <w:bCs/>
+                <w:color w:val="1F2937"/>
+                <w:sz w:val="16"/>
+                <w:szCs w:val="16"/>
+                <w:shd w:fill="F1F3F5" w:color="auto" w:val="clear"/>
+                <w:rtl/>
+              </w:rPr>
+              <w:t xml:space="preserve">‎docs/57‎</w:t>
+            </w:r>
+            <w:r>
+              <w:rPr>
+                <w:rFonts w:ascii="Arial" w:cs="Arial" w:eastAsia="Arial" w:hAnsi="Arial"/>
+                <w:b/>
+                <w:bCs/>
+                <w:sz w:val="18"/>
+                <w:szCs w:val="18"/>
+                <w:rtl/>
+              </w:rPr>
+              <w:t xml:space="preserve">):</w:t>
+            </w:r>
+            <w:r>
+              <w:rPr>
+                <w:rFonts w:ascii="Arial" w:cs="Arial" w:eastAsia="Arial" w:hAnsi="Arial"/>
+                <w:b w:val="false"/>
+                <w:bCs w:val="false"/>
+                <w:sz w:val="18"/>
+                <w:szCs w:val="18"/>
+                <w:rtl/>
+              </w:rPr>
+              <w:t xml:space="preserve"> قائمة لوحة المشغّل صارت مجموعات أيضًا: المشتركون، والأمان، والمنصة. والإصدار 1.0.0 حزمة فيها الصورتان والمصدر ودليل التثبيت والبصمات، تُبنى وتُنشر في GitHub من الصورتين اللتين اجتازتا اختبار التشغيل التجريبي</w:t>
             </w:r>
           </w:p>
         </w:tc>

</xml_diff>

<commit_message>
The printed credit assessment report with its cover (docs/31 row 61, docs/56 §7)
GET /fin/assessments/{id}/print (html or pdf, ar or en), on the identity guide's p.24:
a vault cover with the inverse logo, the slant pattern, the company and the final
grade; the summary with the grade steps and the recommendation in its risk band's
box; the factors and findings; the disclaimer. Not approved or trial: the draft mark
on every page. Audited as CREDIT_REPORT_PRINTED. Print and PDF links on the screen.

Co-Authored-By: Claude Opus 5.5 <noreply@anthropic.com>
Claude-Session: https://claude.ai/code/session_012HHcRrzuvMBTL2FYxXtsyv
</commit_message>
<xml_diff>
--- a/treasury-platform/docs/31-OWNER-DECISIONS.docx
+++ b/treasury-platform/docs/31-OWNER-DECISIONS.docx
@@ -13783,6 +13783,221 @@
                 <w:rtl/>
               </w:rPr>
               <w:t xml:space="preserve"> قائمة لوحة المشغّل صارت مجموعات أيضًا: المشتركون، والأمان، والمنصة. والإصدار 1.0.0 حزمة فيها الصورتان والمصدر ودليل التثبيت والبصمات، تُبنى وتُنشر في GitHub من الصورتين اللتين اجتازتا اختبار التشغيل التجريبي</w:t>
+            </w:r>
+          </w:p>
+        </w:tc>
+      </w:tr>
+      <w:tr>
+        <w:trPr>
+          <w:cantSplit/>
+        </w:trPr>
+        <w:tc>
+          <w:tcPr>
+            <w:tcW w:type="dxa" w:w="925"/>
+            <w:tcBorders>
+              <w:top w:val="single" w:color="BFC9D6" w:sz="4"/>
+              <w:left w:val="single" w:color="BFC9D6" w:sz="4"/>
+              <w:bottom w:val="single" w:color="BFC9D6" w:sz="4"/>
+              <w:right w:val="single" w:color="BFC9D6" w:sz="4"/>
+            </w:tcBorders>
+            <w:tcMar>
+              <w:top w:type="dxa" w:w="50"/>
+              <w:left w:type="dxa" w:w="90"/>
+              <w:bottom w:type="dxa" w:w="50"/>
+              <w:right w:type="dxa" w:w="90"/>
+            </w:tcMar>
+            <w:vAlign w:val="top"/>
+          </w:tcPr>
+          <w:p>
+            <w:pPr>
+              <w:keepNext w:val="false"/>
+              <w:bidi/>
+              <w:spacing w:after="30" w:before="30" w:line="264"/>
+            </w:pPr>
+            <w:r>
+              <w:rPr>
+                <w:rFonts w:ascii="Arial" w:cs="Arial" w:eastAsia="Arial" w:hAnsi="Arial"/>
+                <w:b w:val="false"/>
+                <w:bCs w:val="false"/>
+                <w:sz w:val="18"/>
+                <w:szCs w:val="18"/>
+                <w:rtl/>
+              </w:rPr>
+              <w:t xml:space="preserve">61</w:t>
+            </w:r>
+          </w:p>
+        </w:tc>
+        <w:tc>
+          <w:tcPr>
+            <w:tcW w:type="dxa" w:w="2437"/>
+            <w:tcBorders>
+              <w:top w:val="single" w:color="BFC9D6" w:sz="4"/>
+              <w:left w:val="single" w:color="BFC9D6" w:sz="4"/>
+              <w:bottom w:val="single" w:color="BFC9D6" w:sz="4"/>
+              <w:right w:val="single" w:color="BFC9D6" w:sz="4"/>
+            </w:tcBorders>
+            <w:tcMar>
+              <w:top w:type="dxa" w:w="50"/>
+              <w:left w:type="dxa" w:w="90"/>
+              <w:bottom w:type="dxa" w:w="50"/>
+              <w:right w:type="dxa" w:w="90"/>
+            </w:tcMar>
+            <w:vAlign w:val="top"/>
+          </w:tcPr>
+          <w:p>
+            <w:pPr>
+              <w:keepNext w:val="false"/>
+              <w:bidi/>
+              <w:spacing w:after="30" w:before="30" w:line="264"/>
+            </w:pPr>
+            <w:r>
+              <w:rPr>
+                <w:rFonts w:ascii="Arial" w:cs="Arial" w:eastAsia="Arial" w:hAnsi="Arial"/>
+                <w:b/>
+                <w:bCs/>
+                <w:sz w:val="18"/>
+                <w:szCs w:val="18"/>
+                <w:rtl/>
+              </w:rPr>
+              <w:t xml:space="preserve">غلاف تقرير التقييم الائتماني (2026-10-25).</w:t>
+            </w:r>
+            <w:r>
+              <w:rPr>
+                <w:rFonts w:ascii="Arial" w:cs="Arial" w:eastAsia="Arial" w:hAnsi="Arial"/>
+                <w:b w:val="false"/>
+                <w:bCs w:val="false"/>
+                <w:sz w:val="18"/>
+                <w:szCs w:val="18"/>
+                <w:rtl/>
+              </w:rPr>
+              <w:t xml:space="preserve"> «اكمل غلاف تقرير التقييم الائتماني»</w:t>
+            </w:r>
+          </w:p>
+        </w:tc>
+        <w:tc>
+          <w:tcPr>
+            <w:tcW w:type="dxa" w:w="2290"/>
+            <w:tcBorders>
+              <w:top w:val="single" w:color="BFC9D6" w:sz="4"/>
+              <w:left w:val="single" w:color="BFC9D6" w:sz="4"/>
+              <w:bottom w:val="single" w:color="BFC9D6" w:sz="4"/>
+              <w:right w:val="single" w:color="BFC9D6" w:sz="4"/>
+            </w:tcBorders>
+            <w:tcMar>
+              <w:top w:type="dxa" w:w="50"/>
+              <w:left w:type="dxa" w:w="90"/>
+              <w:bottom w:type="dxa" w:w="50"/>
+              <w:right w:type="dxa" w:w="90"/>
+            </w:tcMar>
+            <w:vAlign w:val="top"/>
+          </w:tcPr>
+          <w:p>
+            <w:pPr>
+              <w:keepNext w:val="false"/>
+              <w:bidi/>
+              <w:spacing w:after="30" w:before="30" w:line="264"/>
+            </w:pPr>
+            <w:r>
+              <w:rPr>
+                <w:rFonts w:ascii="Arial" w:cs="Arial" w:eastAsia="Arial" w:hAnsi="Arial"/>
+                <w:b w:val="false"/>
+                <w:bCs w:val="false"/>
+                <w:sz w:val="18"/>
+                <w:szCs w:val="18"/>
+                <w:rtl/>
+              </w:rPr>
+              <w:t xml:space="preserve">الائتمان والمخاطر</w:t>
+            </w:r>
+          </w:p>
+        </w:tc>
+        <w:tc>
+          <w:tcPr>
+            <w:tcW w:type="dxa" w:w="4212"/>
+            <w:tcBorders>
+              <w:top w:val="single" w:color="BFC9D6" w:sz="4"/>
+              <w:left w:val="single" w:color="BFC9D6" w:sz="4"/>
+              <w:bottom w:val="single" w:color="BFC9D6" w:sz="4"/>
+              <w:right w:val="single" w:color="BFC9D6" w:sz="4"/>
+            </w:tcBorders>
+            <w:tcMar>
+              <w:top w:type="dxa" w:w="50"/>
+              <w:left w:type="dxa" w:w="90"/>
+              <w:bottom w:type="dxa" w:w="50"/>
+              <w:right w:type="dxa" w:w="90"/>
+            </w:tcMar>
+            <w:vAlign w:val="top"/>
+          </w:tcPr>
+          <w:p>
+            <w:pPr>
+              <w:keepNext w:val="false"/>
+              <w:bidi/>
+              <w:spacing w:after="30" w:before="30" w:line="264"/>
+            </w:pPr>
+            <w:r>
+              <w:rPr>
+                <w:rFonts w:ascii="Segoe UI Emoji" w:cs="Segoe UI Emoji" w:eastAsia="Segoe UI Emoji" w:hAnsi="Segoe UI Emoji"/>
+                <w:sz w:val="18"/>
+                <w:szCs w:val="18"/>
+                <w:rtl/>
+              </w:rPr>
+              <w:t xml:space="preserve">✅</w:t>
+            </w:r>
+            <w:r>
+              <w:rPr>
+                <w:rFonts w:ascii="Arial" w:cs="Arial" w:eastAsia="Arial" w:hAnsi="Arial"/>
+                <w:b w:val="false"/>
+                <w:bCs w:val="false"/>
+                <w:sz w:val="18"/>
+                <w:szCs w:val="18"/>
+                <w:rtl/>
+              </w:rPr>
+              <w:t xml:space="preserve"> </w:t>
+            </w:r>
+            <w:r>
+              <w:rPr>
+                <w:rFonts w:ascii="Arial" w:cs="Arial" w:eastAsia="Arial" w:hAnsi="Arial"/>
+                <w:b/>
+                <w:bCs/>
+                <w:sz w:val="18"/>
+                <w:szCs w:val="18"/>
+                <w:rtl/>
+              </w:rPr>
+              <w:t xml:space="preserve">منفّذ (</w:t>
+            </w:r>
+            <w:r>
+              <w:rPr>
+                <w:rFonts w:ascii="Courier New" w:cs="Courier New" w:eastAsia="Courier New" w:hAnsi="Courier New"/>
+                <w:b/>
+                <w:bCs/>
+                <w:color w:val="1F2937"/>
+                <w:sz w:val="16"/>
+                <w:szCs w:val="16"/>
+                <w:shd w:fill="F1F3F5" w:color="auto" w:val="clear"/>
+                <w:rtl/>
+              </w:rPr>
+              <w:t xml:space="preserve">‎docs/56‎</w:t>
+            </w:r>
+            <w:r>
+              <w:rPr>
+                <w:rFonts w:ascii="Arial" w:cs="Arial" w:eastAsia="Arial" w:hAnsi="Arial"/>
+                <w:b/>
+                <w:bCs/>
+                <w:sz w:val="18"/>
+                <w:szCs w:val="18"/>
+                <w:rtl/>
+              </w:rPr>
+              <w:t xml:space="preserve"> §7):</w:t>
+            </w:r>
+            <w:r>
+              <w:rPr>
+                <w:rFonts w:ascii="Arial" w:cs="Arial" w:eastAsia="Arial" w:hAnsi="Arial"/>
+                <w:b w:val="false"/>
+                <w:bCs w:val="false"/>
+                <w:sz w:val="18"/>
+                <w:szCs w:val="18"/>
+                <w:rtl/>
+              </w:rPr>
+              <w:t xml:space="preserve"> تقرير مطبوع بغلاف أخضر الخزنة ونمط الشقوق والدرجة النهائية، ثم صفحة الملخص بالتوصية في صندوق بلون المخاطر، ثم العوامل والنتائج. بالعربية والإنجليزية وبصيغتي HTML وPDF، وعلامة المسودة على غير المعتمد، والطباعة مسجّلة في التدقيق</w:t>
             </w:r>
           </w:p>
         </w:tc>

</xml_diff>

<commit_message>
Release 1.0.1: the printed credit assessment report [release]
The pilot release 1.0.1 adds the printed credit assessment report (docs/56 §7).
The install guide has a fixed name (docs/57-release.md) and is updated for each
release, with the list of releases and the upgrade from 1.0.0 (the two images, no
database change); make_release.sh refuses a guide that does not name its files.

Co-Authored-By: Claude Opus 5.5 <noreply@anthropic.com>
Claude-Session: https://claude.ai/code/session_012HHcRrzuvMBTL2FYxXtsyv
</commit_message>
<xml_diff>
--- a/treasury-platform/docs/31-OWNER-DECISIONS.docx
+++ b/treasury-platform/docs/31-OWNER-DECISIONS.docx
@@ -13998,6 +13998,249 @@
                 <w:rtl/>
               </w:rPr>
               <w:t xml:space="preserve"> تقرير مطبوع بغلاف أخضر الخزنة ونمط الشقوق والدرجة النهائية، ثم صفحة الملخص بالتوصية في صندوق بلون المخاطر، ثم العوامل والنتائج. بالعربية والإنجليزية وبصيغتي HTML وPDF، وعلامة المسودة على غير المعتمد، والطباعة مسجّلة في التدقيق</w:t>
+            </w:r>
+          </w:p>
+        </w:tc>
+      </w:tr>
+      <w:tr>
+        <w:trPr>
+          <w:cantSplit/>
+        </w:trPr>
+        <w:tc>
+          <w:tcPr>
+            <w:tcW w:type="dxa" w:w="925"/>
+            <w:tcBorders>
+              <w:top w:val="single" w:color="BFC9D6" w:sz="4"/>
+              <w:left w:val="single" w:color="BFC9D6" w:sz="4"/>
+              <w:bottom w:val="single" w:color="BFC9D6" w:sz="4"/>
+              <w:right w:val="single" w:color="BFC9D6" w:sz="4"/>
+            </w:tcBorders>
+            <w:shd w:fill="F5F8FC" w:color="auto" w:val="clear"/>
+            <w:tcMar>
+              <w:top w:type="dxa" w:w="50"/>
+              <w:left w:type="dxa" w:w="90"/>
+              <w:bottom w:type="dxa" w:w="50"/>
+              <w:right w:type="dxa" w:w="90"/>
+            </w:tcMar>
+            <w:vAlign w:val="top"/>
+          </w:tcPr>
+          <w:p>
+            <w:pPr>
+              <w:keepNext w:val="false"/>
+              <w:bidi/>
+              <w:spacing w:after="30" w:before="30" w:line="264"/>
+            </w:pPr>
+            <w:r>
+              <w:rPr>
+                <w:rFonts w:ascii="Arial" w:cs="Arial" w:eastAsia="Arial" w:hAnsi="Arial"/>
+                <w:b w:val="false"/>
+                <w:bCs w:val="false"/>
+                <w:sz w:val="18"/>
+                <w:szCs w:val="18"/>
+                <w:rtl/>
+              </w:rPr>
+              <w:t xml:space="preserve">62</w:t>
+            </w:r>
+          </w:p>
+        </w:tc>
+        <w:tc>
+          <w:tcPr>
+            <w:tcW w:type="dxa" w:w="2437"/>
+            <w:tcBorders>
+              <w:top w:val="single" w:color="BFC9D6" w:sz="4"/>
+              <w:left w:val="single" w:color="BFC9D6" w:sz="4"/>
+              <w:bottom w:val="single" w:color="BFC9D6" w:sz="4"/>
+              <w:right w:val="single" w:color="BFC9D6" w:sz="4"/>
+            </w:tcBorders>
+            <w:shd w:fill="F5F8FC" w:color="auto" w:val="clear"/>
+            <w:tcMar>
+              <w:top w:type="dxa" w:w="50"/>
+              <w:left w:type="dxa" w:w="90"/>
+              <w:bottom w:type="dxa" w:w="50"/>
+              <w:right w:type="dxa" w:w="90"/>
+            </w:tcMar>
+            <w:vAlign w:val="top"/>
+          </w:tcPr>
+          <w:p>
+            <w:pPr>
+              <w:keepNext w:val="false"/>
+              <w:bidi/>
+              <w:spacing w:after="30" w:before="30" w:line="264"/>
+            </w:pPr>
+            <w:r>
+              <w:rPr>
+                <w:rFonts w:ascii="Arial" w:cs="Arial" w:eastAsia="Arial" w:hAnsi="Arial"/>
+                <w:b/>
+                <w:bCs/>
+                <w:sz w:val="18"/>
+                <w:szCs w:val="18"/>
+                <w:rtl/>
+              </w:rPr>
+              <w:t xml:space="preserve">الإصدار 1.0.1 (2026-10-25).</w:t>
+            </w:r>
+            <w:r>
+              <w:rPr>
+                <w:rFonts w:ascii="Arial" w:cs="Arial" w:eastAsia="Arial" w:hAnsi="Arial"/>
+                <w:b w:val="false"/>
+                <w:bCs w:val="false"/>
+                <w:sz w:val="18"/>
+                <w:szCs w:val="18"/>
+                <w:rtl/>
+              </w:rPr>
+              <w:t xml:space="preserve"> «نعم أصدر 1.0.1»</w:t>
+            </w:r>
+          </w:p>
+        </w:tc>
+        <w:tc>
+          <w:tcPr>
+            <w:tcW w:type="dxa" w:w="2290"/>
+            <w:tcBorders>
+              <w:top w:val="single" w:color="BFC9D6" w:sz="4"/>
+              <w:left w:val="single" w:color="BFC9D6" w:sz="4"/>
+              <w:bottom w:val="single" w:color="BFC9D6" w:sz="4"/>
+              <w:right w:val="single" w:color="BFC9D6" w:sz="4"/>
+            </w:tcBorders>
+            <w:shd w:fill="F5F8FC" w:color="auto" w:val="clear"/>
+            <w:tcMar>
+              <w:top w:type="dxa" w:w="50"/>
+              <w:left w:type="dxa" w:w="90"/>
+              <w:bottom w:type="dxa" w:w="50"/>
+              <w:right w:type="dxa" w:w="90"/>
+            </w:tcMar>
+            <w:vAlign w:val="top"/>
+          </w:tcPr>
+          <w:p>
+            <w:pPr>
+              <w:keepNext w:val="false"/>
+              <w:bidi/>
+              <w:spacing w:after="30" w:before="30" w:line="264"/>
+            </w:pPr>
+            <w:r>
+              <w:rPr>
+                <w:rFonts w:ascii="Arial" w:cs="Arial" w:eastAsia="Arial" w:hAnsi="Arial"/>
+                <w:b w:val="false"/>
+                <w:bCs w:val="false"/>
+                <w:sz w:val="18"/>
+                <w:szCs w:val="18"/>
+                <w:rtl/>
+              </w:rPr>
+              <w:t xml:space="preserve">النشر</w:t>
+            </w:r>
+          </w:p>
+        </w:tc>
+        <w:tc>
+          <w:tcPr>
+            <w:tcW w:type="dxa" w:w="4212"/>
+            <w:tcBorders>
+              <w:top w:val="single" w:color="BFC9D6" w:sz="4"/>
+              <w:left w:val="single" w:color="BFC9D6" w:sz="4"/>
+              <w:bottom w:val="single" w:color="BFC9D6" w:sz="4"/>
+              <w:right w:val="single" w:color="BFC9D6" w:sz="4"/>
+            </w:tcBorders>
+            <w:shd w:fill="F5F8FC" w:color="auto" w:val="clear"/>
+            <w:tcMar>
+              <w:top w:type="dxa" w:w="50"/>
+              <w:left w:type="dxa" w:w="90"/>
+              <w:bottom w:type="dxa" w:w="50"/>
+              <w:right w:type="dxa" w:w="90"/>
+            </w:tcMar>
+            <w:vAlign w:val="top"/>
+          </w:tcPr>
+          <w:p>
+            <w:pPr>
+              <w:keepNext w:val="false"/>
+              <w:bidi/>
+              <w:spacing w:after="30" w:before="30" w:line="264"/>
+            </w:pPr>
+            <w:r>
+              <w:rPr>
+                <w:rFonts w:ascii="Segoe UI Emoji" w:cs="Segoe UI Emoji" w:eastAsia="Segoe UI Emoji" w:hAnsi="Segoe UI Emoji"/>
+                <w:sz w:val="18"/>
+                <w:szCs w:val="18"/>
+                <w:rtl/>
+              </w:rPr>
+              <w:t xml:space="preserve">✅</w:t>
+            </w:r>
+            <w:r>
+              <w:rPr>
+                <w:rFonts w:ascii="Arial" w:cs="Arial" w:eastAsia="Arial" w:hAnsi="Arial"/>
+                <w:b w:val="false"/>
+                <w:bCs w:val="false"/>
+                <w:sz w:val="18"/>
+                <w:szCs w:val="18"/>
+                <w:rtl/>
+              </w:rPr>
+              <w:t xml:space="preserve"> </w:t>
+            </w:r>
+            <w:r>
+              <w:rPr>
+                <w:rFonts w:ascii="Arial" w:cs="Arial" w:eastAsia="Arial" w:hAnsi="Arial"/>
+                <w:b/>
+                <w:bCs/>
+                <w:sz w:val="18"/>
+                <w:szCs w:val="18"/>
+                <w:rtl/>
+              </w:rPr>
+              <w:t xml:space="preserve">منفّذ (</w:t>
+            </w:r>
+            <w:r>
+              <w:rPr>
+                <w:rFonts w:ascii="Courier New" w:cs="Courier New" w:eastAsia="Courier New" w:hAnsi="Courier New"/>
+                <w:b/>
+                <w:bCs/>
+                <w:color w:val="1F2937"/>
+                <w:sz w:val="16"/>
+                <w:szCs w:val="16"/>
+                <w:shd w:fill="F1F3F5" w:color="auto" w:val="clear"/>
+                <w:rtl/>
+              </w:rPr>
+              <w:t xml:space="preserve">‎docs/57‎</w:t>
+            </w:r>
+            <w:r>
+              <w:rPr>
+                <w:rFonts w:ascii="Arial" w:cs="Arial" w:eastAsia="Arial" w:hAnsi="Arial"/>
+                <w:b/>
+                <w:bCs/>
+                <w:sz w:val="18"/>
+                <w:szCs w:val="18"/>
+                <w:rtl/>
+              </w:rPr>
+              <w:t xml:space="preserve">):</w:t>
+            </w:r>
+            <w:r>
+              <w:rPr>
+                <w:rFonts w:ascii="Arial" w:cs="Arial" w:eastAsia="Arial" w:hAnsi="Arial"/>
+                <w:b w:val="false"/>
+                <w:bCs w:val="false"/>
+                <w:sz w:val="18"/>
+                <w:szCs w:val="18"/>
+                <w:rtl/>
+              </w:rPr>
+              <w:t xml:space="preserve"> الإصدار يضم تقرير التقييم الائتماني المطبوع. ودليل التثبيت صار باسم ثابت (</w:t>
+            </w:r>
+            <w:r>
+              <w:rPr>
+                <w:rFonts w:ascii="Courier New" w:cs="Courier New" w:eastAsia="Courier New" w:hAnsi="Courier New"/>
+                <w:b w:val="false"/>
+                <w:bCs w:val="false"/>
+                <w:color w:val="1F2937"/>
+                <w:sz w:val="16"/>
+                <w:szCs w:val="16"/>
+                <w:shd w:fill="F1F3F5" w:color="auto" w:val="clear"/>
+                <w:rtl/>
+              </w:rPr>
+              <w:t xml:space="preserve">‎docs/57-release.md‎</w:t>
+            </w:r>
+            <w:r>
+              <w:rPr>
+                <w:rFonts w:ascii="Arial" w:cs="Arial" w:eastAsia="Arial" w:hAnsi="Arial"/>
+                <w:b w:val="false"/>
+                <w:bCs w:val="false"/>
+                <w:sz w:val="18"/>
+                <w:szCs w:val="18"/>
+                <w:rtl/>
+              </w:rPr>
+              <w:t xml:space="preserve">) يُحدَّث لكل إصدار، والسكربت يتحقق منه. والترقية من 1.0.0 تحميل الصورتين فقط، بلا تغيير في القاعدة</w:t>
             </w:r>
           </w:p>
         </w:tc>

</xml_diff>

<commit_message>
The single-server trial guide (docs/58, docs/31 row 63)
SQL Server and the application on one host, for a trial with demo data: swap, a
3 GB memory cap for SQL Server, Developer edition, the certificate's name mapped to
the loopback on the host and to the containers' gateway in compose.yml, and 1433
open to the containers' network only. site.conf takes DB_ADDRESS (empty with two
servers); provision_app_host.sh adds the mappings once, ufw.sh takes
DB_ON_THIS_HOST=1, and check_ready.sh checks the mapping, the firewall and memory.

Co-Authored-By: Claude Opus 5.5 <noreply@anthropic.com>
Claude-Session: https://claude.ai/code/session_012HHcRrzuvMBTL2FYxXtsyv
</commit_message>
<xml_diff>
--- a/treasury-platform/docs/31-OWNER-DECISIONS.docx
+++ b/treasury-platform/docs/31-OWNER-DECISIONS.docx
@@ -14241,6 +14241,245 @@
                 <w:rtl/>
               </w:rPr>
               <w:t xml:space="preserve">) يُحدَّث لكل إصدار، والسكربت يتحقق منه. والترقية من 1.0.0 تحميل الصورتين فقط، بلا تغيير في القاعدة</w:t>
+            </w:r>
+          </w:p>
+        </w:tc>
+      </w:tr>
+      <w:tr>
+        <w:trPr>
+          <w:cantSplit/>
+        </w:trPr>
+        <w:tc>
+          <w:tcPr>
+            <w:tcW w:type="dxa" w:w="925"/>
+            <w:tcBorders>
+              <w:top w:val="single" w:color="BFC9D6" w:sz="4"/>
+              <w:left w:val="single" w:color="BFC9D6" w:sz="4"/>
+              <w:bottom w:val="single" w:color="BFC9D6" w:sz="4"/>
+              <w:right w:val="single" w:color="BFC9D6" w:sz="4"/>
+            </w:tcBorders>
+            <w:tcMar>
+              <w:top w:type="dxa" w:w="50"/>
+              <w:left w:type="dxa" w:w="90"/>
+              <w:bottom w:type="dxa" w:w="50"/>
+              <w:right w:type="dxa" w:w="90"/>
+            </w:tcMar>
+            <w:vAlign w:val="top"/>
+          </w:tcPr>
+          <w:p>
+            <w:pPr>
+              <w:keepNext w:val="false"/>
+              <w:bidi/>
+              <w:spacing w:after="30" w:before="30" w:line="264"/>
+            </w:pPr>
+            <w:r>
+              <w:rPr>
+                <w:rFonts w:ascii="Arial" w:cs="Arial" w:eastAsia="Arial" w:hAnsi="Arial"/>
+                <w:b w:val="false"/>
+                <w:bCs w:val="false"/>
+                <w:sz w:val="18"/>
+                <w:szCs w:val="18"/>
+                <w:rtl/>
+              </w:rPr>
+              <w:t xml:space="preserve">63</w:t>
+            </w:r>
+          </w:p>
+        </w:tc>
+        <w:tc>
+          <w:tcPr>
+            <w:tcW w:type="dxa" w:w="2437"/>
+            <w:tcBorders>
+              <w:top w:val="single" w:color="BFC9D6" w:sz="4"/>
+              <w:left w:val="single" w:color="BFC9D6" w:sz="4"/>
+              <w:bottom w:val="single" w:color="BFC9D6" w:sz="4"/>
+              <w:right w:val="single" w:color="BFC9D6" w:sz="4"/>
+            </w:tcBorders>
+            <w:tcMar>
+              <w:top w:type="dxa" w:w="50"/>
+              <w:left w:type="dxa" w:w="90"/>
+              <w:bottom w:type="dxa" w:w="50"/>
+              <w:right w:type="dxa" w:w="90"/>
+            </w:tcMar>
+            <w:vAlign w:val="top"/>
+          </w:tcPr>
+          <w:p>
+            <w:pPr>
+              <w:keepNext w:val="false"/>
+              <w:bidi/>
+              <w:spacing w:after="30" w:before="30" w:line="264"/>
+            </w:pPr>
+            <w:r>
+              <w:rPr>
+                <w:rFonts w:ascii="Arial" w:cs="Arial" w:eastAsia="Arial" w:hAnsi="Arial"/>
+                <w:b/>
+                <w:bCs/>
+                <w:sz w:val="18"/>
+                <w:szCs w:val="18"/>
+                <w:rtl/>
+              </w:rPr>
+              <w:t xml:space="preserve">دليل الخادم الواحد للتجربة (2026-10-25).</w:t>
+            </w:r>
+            <w:r>
+              <w:rPr>
+                <w:rFonts w:ascii="Arial" w:cs="Arial" w:eastAsia="Arial" w:hAnsi="Arial"/>
+                <w:b w:val="false"/>
+                <w:bCs w:val="false"/>
+                <w:sz w:val="18"/>
+                <w:szCs w:val="18"/>
+                <w:rtl/>
+              </w:rPr>
+              <w:t xml:space="preserve"> «نعم جهّز دليل الخادم الواحد للتجربة»، بعد عرض خادم بمعالجين و8 غيغابايت و150 غيغابايت</w:t>
+            </w:r>
+          </w:p>
+        </w:tc>
+        <w:tc>
+          <w:tcPr>
+            <w:tcW w:type="dxa" w:w="2290"/>
+            <w:tcBorders>
+              <w:top w:val="single" w:color="BFC9D6" w:sz="4"/>
+              <w:left w:val="single" w:color="BFC9D6" w:sz="4"/>
+              <w:bottom w:val="single" w:color="BFC9D6" w:sz="4"/>
+              <w:right w:val="single" w:color="BFC9D6" w:sz="4"/>
+            </w:tcBorders>
+            <w:tcMar>
+              <w:top w:type="dxa" w:w="50"/>
+              <w:left w:type="dxa" w:w="90"/>
+              <w:bottom w:type="dxa" w:w="50"/>
+              <w:right w:type="dxa" w:w="90"/>
+            </w:tcMar>
+            <w:vAlign w:val="top"/>
+          </w:tcPr>
+          <w:p>
+            <w:pPr>
+              <w:keepNext w:val="false"/>
+              <w:bidi/>
+              <w:spacing w:after="30" w:before="30" w:line="264"/>
+            </w:pPr>
+            <w:r>
+              <w:rPr>
+                <w:rFonts w:ascii="Arial" w:cs="Arial" w:eastAsia="Arial" w:hAnsi="Arial"/>
+                <w:b w:val="false"/>
+                <w:bCs w:val="false"/>
+                <w:sz w:val="18"/>
+                <w:szCs w:val="18"/>
+                <w:rtl/>
+              </w:rPr>
+              <w:t xml:space="preserve">النشر</w:t>
+            </w:r>
+          </w:p>
+        </w:tc>
+        <w:tc>
+          <w:tcPr>
+            <w:tcW w:type="dxa" w:w="4212"/>
+            <w:tcBorders>
+              <w:top w:val="single" w:color="BFC9D6" w:sz="4"/>
+              <w:left w:val="single" w:color="BFC9D6" w:sz="4"/>
+              <w:bottom w:val="single" w:color="BFC9D6" w:sz="4"/>
+              <w:right w:val="single" w:color="BFC9D6" w:sz="4"/>
+            </w:tcBorders>
+            <w:tcMar>
+              <w:top w:type="dxa" w:w="50"/>
+              <w:left w:type="dxa" w:w="90"/>
+              <w:bottom w:type="dxa" w:w="50"/>
+              <w:right w:type="dxa" w:w="90"/>
+            </w:tcMar>
+            <w:vAlign w:val="top"/>
+          </w:tcPr>
+          <w:p>
+            <w:pPr>
+              <w:keepNext w:val="false"/>
+              <w:bidi/>
+              <w:spacing w:after="30" w:before="30" w:line="264"/>
+            </w:pPr>
+            <w:r>
+              <w:rPr>
+                <w:rFonts w:ascii="Segoe UI Emoji" w:cs="Segoe UI Emoji" w:eastAsia="Segoe UI Emoji" w:hAnsi="Segoe UI Emoji"/>
+                <w:sz w:val="18"/>
+                <w:szCs w:val="18"/>
+                <w:rtl/>
+              </w:rPr>
+              <w:t xml:space="preserve">✅</w:t>
+            </w:r>
+            <w:r>
+              <w:rPr>
+                <w:rFonts w:ascii="Arial" w:cs="Arial" w:eastAsia="Arial" w:hAnsi="Arial"/>
+                <w:b w:val="false"/>
+                <w:bCs w:val="false"/>
+                <w:sz w:val="18"/>
+                <w:szCs w:val="18"/>
+                <w:rtl/>
+              </w:rPr>
+              <w:t xml:space="preserve"> </w:t>
+            </w:r>
+            <w:r>
+              <w:rPr>
+                <w:rFonts w:ascii="Arial" w:cs="Arial" w:eastAsia="Arial" w:hAnsi="Arial"/>
+                <w:b/>
+                <w:bCs/>
+                <w:sz w:val="18"/>
+                <w:szCs w:val="18"/>
+                <w:rtl/>
+              </w:rPr>
+              <w:t xml:space="preserve">منفّذ (</w:t>
+            </w:r>
+            <w:r>
+              <w:rPr>
+                <w:rFonts w:ascii="Courier New" w:cs="Courier New" w:eastAsia="Courier New" w:hAnsi="Courier New"/>
+                <w:b/>
+                <w:bCs/>
+                <w:color w:val="1F2937"/>
+                <w:sz w:val="16"/>
+                <w:szCs w:val="16"/>
+                <w:shd w:fill="F1F3F5" w:color="auto" w:val="clear"/>
+                <w:rtl/>
+              </w:rPr>
+              <w:t xml:space="preserve">‎docs/58‎</w:t>
+            </w:r>
+            <w:r>
+              <w:rPr>
+                <w:rFonts w:ascii="Arial" w:cs="Arial" w:eastAsia="Arial" w:hAnsi="Arial"/>
+                <w:b/>
+                <w:bCs/>
+                <w:sz w:val="18"/>
+                <w:szCs w:val="18"/>
+                <w:rtl/>
+              </w:rPr>
+              <w:t xml:space="preserve">):</w:t>
+            </w:r>
+            <w:r>
+              <w:rPr>
+                <w:rFonts w:ascii="Arial" w:cs="Arial" w:eastAsia="Arial" w:hAnsi="Arial"/>
+                <w:b w:val="false"/>
+                <w:bCs w:val="false"/>
+                <w:sz w:val="18"/>
+                <w:szCs w:val="18"/>
+                <w:rtl/>
+              </w:rPr>
+              <w:t xml:space="preserve"> القاعدة والتطبيق على خادم واحد، ببيانات توضيحية وإصدار Developer. وفيه ذاكرة تبديل 4 غيغابايت، وسقف 3 غيغابايت لـ SQL Server، و1433 مفتوح لشبكة الحاويات وحدها. وأُضيف </w:t>
+            </w:r>
+            <w:r>
+              <w:rPr>
+                <w:rFonts w:ascii="Courier New" w:cs="Courier New" w:eastAsia="Courier New" w:hAnsi="Courier New"/>
+                <w:b w:val="false"/>
+                <w:bCs w:val="false"/>
+                <w:color w:val="1F2937"/>
+                <w:sz w:val="16"/>
+                <w:szCs w:val="16"/>
+                <w:shd w:fill="F1F3F5" w:color="auto" w:val="clear"/>
+                <w:rtl/>
+              </w:rPr>
+              <w:t xml:space="preserve">‎DB_ADDRESS‎</w:t>
+            </w:r>
+            <w:r>
+              <w:rPr>
+                <w:rFonts w:ascii="Arial" w:cs="Arial" w:eastAsia="Arial" w:hAnsi="Arial"/>
+                <w:b w:val="false"/>
+                <w:bCs w:val="false"/>
+                <w:sz w:val="18"/>
+                <w:szCs w:val="18"/>
+                <w:rtl/>
+              </w:rPr>
+              <w:t xml:space="preserve"> إلى أدوات التجهيز وفحص جاهزية له</w:t>
             </w:r>
           </w:p>
         </w:tc>

</xml_diff>

<commit_message>
UCP 600 on the letter-of-credit terms, and the system's screens (docs/60, docs/59)
The terms screen shows beside each field and document the UCP 600 articles it refers
to (GET /lc/ucp-references; unverified articles marked), and the terms checks add
articles 28 (insurance cover and CIF/CIP), 31-32 (instalments need partial
shipments), 29 (expiry on a non-working day) and 19-24 (transhipment), with unit
and integration tests. The browser test takes the screenshots of docs/59 when
E2E_SHOTS names a folder.

Co-Authored-By: Claude Opus 5.5 <noreply@anthropic.com>
Claude-Session: https://claude.ai/code/session_012HHcRrzuvMBTL2FYxXtsyv
</commit_message>
<xml_diff>
--- a/treasury-platform/docs/31-OWNER-DECISIONS.docx
+++ b/treasury-platform/docs/31-OWNER-DECISIONS.docx
@@ -14480,6 +14480,440 @@
                 <w:rtl/>
               </w:rPr>
               <w:t xml:space="preserve"> إلى أدوات التجهيز وفحص جاهزية له</w:t>
+            </w:r>
+          </w:p>
+        </w:tc>
+      </w:tr>
+      <w:tr>
+        <w:trPr>
+          <w:cantSplit/>
+        </w:trPr>
+        <w:tc>
+          <w:tcPr>
+            <w:tcW w:type="dxa" w:w="925"/>
+            <w:tcBorders>
+              <w:top w:val="single" w:color="BFC9D6" w:sz="4"/>
+              <w:left w:val="single" w:color="BFC9D6" w:sz="4"/>
+              <w:bottom w:val="single" w:color="BFC9D6" w:sz="4"/>
+              <w:right w:val="single" w:color="BFC9D6" w:sz="4"/>
+            </w:tcBorders>
+            <w:shd w:fill="F5F8FC" w:color="auto" w:val="clear"/>
+            <w:tcMar>
+              <w:top w:type="dxa" w:w="50"/>
+              <w:left w:type="dxa" w:w="90"/>
+              <w:bottom w:type="dxa" w:w="50"/>
+              <w:right w:type="dxa" w:w="90"/>
+            </w:tcMar>
+            <w:vAlign w:val="top"/>
+          </w:tcPr>
+          <w:p>
+            <w:pPr>
+              <w:keepNext w:val="false"/>
+              <w:bidi/>
+              <w:spacing w:after="30" w:before="30" w:line="264"/>
+            </w:pPr>
+            <w:r>
+              <w:rPr>
+                <w:rFonts w:ascii="Arial" w:cs="Arial" w:eastAsia="Arial" w:hAnsi="Arial"/>
+                <w:b w:val="false"/>
+                <w:bCs w:val="false"/>
+                <w:sz w:val="18"/>
+                <w:szCs w:val="18"/>
+                <w:rtl/>
+              </w:rPr>
+              <w:t xml:space="preserve">64</w:t>
+            </w:r>
+          </w:p>
+        </w:tc>
+        <w:tc>
+          <w:tcPr>
+            <w:tcW w:type="dxa" w:w="2437"/>
+            <w:tcBorders>
+              <w:top w:val="single" w:color="BFC9D6" w:sz="4"/>
+              <w:left w:val="single" w:color="BFC9D6" w:sz="4"/>
+              <w:bottom w:val="single" w:color="BFC9D6" w:sz="4"/>
+              <w:right w:val="single" w:color="BFC9D6" w:sz="4"/>
+            </w:tcBorders>
+            <w:shd w:fill="F5F8FC" w:color="auto" w:val="clear"/>
+            <w:tcMar>
+              <w:top w:type="dxa" w:w="50"/>
+              <w:left w:type="dxa" w:w="90"/>
+              <w:bottom w:type="dxa" w:w="50"/>
+              <w:right w:type="dxa" w:w="90"/>
+            </w:tcMar>
+            <w:vAlign w:val="top"/>
+          </w:tcPr>
+          <w:p>
+            <w:pPr>
+              <w:keepNext w:val="false"/>
+              <w:bidi/>
+              <w:spacing w:after="30" w:before="30" w:line="264"/>
+            </w:pPr>
+            <w:r>
+              <w:rPr>
+                <w:rFonts w:ascii="Arial" w:cs="Arial" w:eastAsia="Arial" w:hAnsi="Arial"/>
+                <w:b/>
+                <w:bCs/>
+                <w:sz w:val="18"/>
+                <w:szCs w:val="18"/>
+                <w:rtl/>
+              </w:rPr>
+              <w:t xml:space="preserve">لقطات شاشات النظام (2026-10-25).</w:t>
+            </w:r>
+            <w:r>
+              <w:rPr>
+                <w:rFonts w:ascii="Arial" w:cs="Arial" w:eastAsia="Arial" w:hAnsi="Arial"/>
+                <w:b w:val="false"/>
+                <w:bCs w:val="false"/>
+                <w:sz w:val="18"/>
+                <w:szCs w:val="18"/>
+                <w:rtl/>
+              </w:rPr>
+              <w:t xml:space="preserve"> «اعطني صورة من الشاشات للنظام»، ثم «لم يظهر في الشاشات انشاء او تعريف تسهيلات جديدة»</w:t>
+            </w:r>
+          </w:p>
+        </w:tc>
+        <w:tc>
+          <w:tcPr>
+            <w:tcW w:type="dxa" w:w="2290"/>
+            <w:tcBorders>
+              <w:top w:val="single" w:color="BFC9D6" w:sz="4"/>
+              <w:left w:val="single" w:color="BFC9D6" w:sz="4"/>
+              <w:bottom w:val="single" w:color="BFC9D6" w:sz="4"/>
+              <w:right w:val="single" w:color="BFC9D6" w:sz="4"/>
+            </w:tcBorders>
+            <w:shd w:fill="F5F8FC" w:color="auto" w:val="clear"/>
+            <w:tcMar>
+              <w:top w:type="dxa" w:w="50"/>
+              <w:left w:type="dxa" w:w="90"/>
+              <w:bottom w:type="dxa" w:w="50"/>
+              <w:right w:type="dxa" w:w="90"/>
+            </w:tcMar>
+            <w:vAlign w:val="top"/>
+          </w:tcPr>
+          <w:p>
+            <w:pPr>
+              <w:keepNext w:val="false"/>
+              <w:bidi/>
+              <w:spacing w:after="30" w:before="30" w:line="264"/>
+            </w:pPr>
+            <w:r>
+              <w:rPr>
+                <w:rFonts w:ascii="Arial" w:cs="Arial" w:eastAsia="Arial" w:hAnsi="Arial"/>
+                <w:b w:val="false"/>
+                <w:bCs w:val="false"/>
+                <w:sz w:val="18"/>
+                <w:szCs w:val="18"/>
+                <w:rtl/>
+              </w:rPr>
+              <w:t xml:space="preserve">الواجهة</w:t>
+            </w:r>
+          </w:p>
+        </w:tc>
+        <w:tc>
+          <w:tcPr>
+            <w:tcW w:type="dxa" w:w="4212"/>
+            <w:tcBorders>
+              <w:top w:val="single" w:color="BFC9D6" w:sz="4"/>
+              <w:left w:val="single" w:color="BFC9D6" w:sz="4"/>
+              <w:bottom w:val="single" w:color="BFC9D6" w:sz="4"/>
+              <w:right w:val="single" w:color="BFC9D6" w:sz="4"/>
+            </w:tcBorders>
+            <w:shd w:fill="F5F8FC" w:color="auto" w:val="clear"/>
+            <w:tcMar>
+              <w:top w:type="dxa" w:w="50"/>
+              <w:left w:type="dxa" w:w="90"/>
+              <w:bottom w:type="dxa" w:w="50"/>
+              <w:right w:type="dxa" w:w="90"/>
+            </w:tcMar>
+            <w:vAlign w:val="top"/>
+          </w:tcPr>
+          <w:p>
+            <w:pPr>
+              <w:keepNext w:val="false"/>
+              <w:bidi/>
+              <w:spacing w:after="30" w:before="30" w:line="264"/>
+            </w:pPr>
+            <w:r>
+              <w:rPr>
+                <w:rFonts w:ascii="Segoe UI Emoji" w:cs="Segoe UI Emoji" w:eastAsia="Segoe UI Emoji" w:hAnsi="Segoe UI Emoji"/>
+                <w:sz w:val="18"/>
+                <w:szCs w:val="18"/>
+                <w:rtl/>
+              </w:rPr>
+              <w:t xml:space="preserve">✅</w:t>
+            </w:r>
+            <w:r>
+              <w:rPr>
+                <w:rFonts w:ascii="Arial" w:cs="Arial" w:eastAsia="Arial" w:hAnsi="Arial"/>
+                <w:b w:val="false"/>
+                <w:bCs w:val="false"/>
+                <w:sz w:val="18"/>
+                <w:szCs w:val="18"/>
+                <w:rtl/>
+              </w:rPr>
+              <w:t xml:space="preserve"> </w:t>
+            </w:r>
+            <w:r>
+              <w:rPr>
+                <w:rFonts w:ascii="Arial" w:cs="Arial" w:eastAsia="Arial" w:hAnsi="Arial"/>
+                <w:b/>
+                <w:bCs/>
+                <w:sz w:val="18"/>
+                <w:szCs w:val="18"/>
+                <w:rtl/>
+              </w:rPr>
+              <w:t xml:space="preserve">منفّذ (</w:t>
+            </w:r>
+            <w:r>
+              <w:rPr>
+                <w:rFonts w:ascii="Courier New" w:cs="Courier New" w:eastAsia="Courier New" w:hAnsi="Courier New"/>
+                <w:b/>
+                <w:bCs/>
+                <w:color w:val="1F2937"/>
+                <w:sz w:val="16"/>
+                <w:szCs w:val="16"/>
+                <w:shd w:fill="F1F3F5" w:color="auto" w:val="clear"/>
+                <w:rtl/>
+              </w:rPr>
+              <w:t xml:space="preserve">‎docs/59‎</w:t>
+            </w:r>
+            <w:r>
+              <w:rPr>
+                <w:rFonts w:ascii="Arial" w:cs="Arial" w:eastAsia="Arial" w:hAnsi="Arial"/>
+                <w:b/>
+                <w:bCs/>
+                <w:sz w:val="18"/>
+                <w:szCs w:val="18"/>
+                <w:rtl/>
+              </w:rPr>
+              <w:t xml:space="preserve">):</w:t>
+            </w:r>
+            <w:r>
+              <w:rPr>
+                <w:rFonts w:ascii="Arial" w:cs="Arial" w:eastAsia="Arial" w:hAnsi="Arial"/>
+                <w:b w:val="false"/>
+                <w:bCs w:val="false"/>
+                <w:sz w:val="18"/>
+                <w:szCs w:val="18"/>
+                <w:rtl/>
+              </w:rPr>
+              <w:t xml:space="preserve"> 18 لقطة من النظام الحقيقي أُخذت أثناء اختبار المتصفح. وشاشة إنشاء التسهيل موجودة (اللقطة 29)، لكنها لا تظهر في قائمة مدير المشترك لأن دوره لا يشمل صلاحيات التسهيلات</w:t>
+            </w:r>
+          </w:p>
+        </w:tc>
+      </w:tr>
+      <w:tr>
+        <w:trPr>
+          <w:cantSplit/>
+        </w:trPr>
+        <w:tc>
+          <w:tcPr>
+            <w:tcW w:type="dxa" w:w="925"/>
+            <w:tcBorders>
+              <w:top w:val="single" w:color="BFC9D6" w:sz="4"/>
+              <w:left w:val="single" w:color="BFC9D6" w:sz="4"/>
+              <w:bottom w:val="single" w:color="BFC9D6" w:sz="4"/>
+              <w:right w:val="single" w:color="BFC9D6" w:sz="4"/>
+            </w:tcBorders>
+            <w:tcMar>
+              <w:top w:type="dxa" w:w="50"/>
+              <w:left w:type="dxa" w:w="90"/>
+              <w:bottom w:type="dxa" w:w="50"/>
+              <w:right w:type="dxa" w:w="90"/>
+            </w:tcMar>
+            <w:vAlign w:val="top"/>
+          </w:tcPr>
+          <w:p>
+            <w:pPr>
+              <w:keepNext w:val="false"/>
+              <w:bidi/>
+              <w:spacing w:after="30" w:before="30" w:line="264"/>
+            </w:pPr>
+            <w:r>
+              <w:rPr>
+                <w:rFonts w:ascii="Arial" w:cs="Arial" w:eastAsia="Arial" w:hAnsi="Arial"/>
+                <w:b w:val="false"/>
+                <w:bCs w:val="false"/>
+                <w:sz w:val="18"/>
+                <w:szCs w:val="18"/>
+                <w:rtl/>
+              </w:rPr>
+              <w:t xml:space="preserve">65</w:t>
+            </w:r>
+          </w:p>
+        </w:tc>
+        <w:tc>
+          <w:tcPr>
+            <w:tcW w:type="dxa" w:w="2437"/>
+            <w:tcBorders>
+              <w:top w:val="single" w:color="BFC9D6" w:sz="4"/>
+              <w:left w:val="single" w:color="BFC9D6" w:sz="4"/>
+              <w:bottom w:val="single" w:color="BFC9D6" w:sz="4"/>
+              <w:right w:val="single" w:color="BFC9D6" w:sz="4"/>
+            </w:tcBorders>
+            <w:tcMar>
+              <w:top w:type="dxa" w:w="50"/>
+              <w:left w:type="dxa" w:w="90"/>
+              <w:bottom w:type="dxa" w:w="50"/>
+              <w:right w:type="dxa" w:w="90"/>
+            </w:tcMar>
+            <w:vAlign w:val="top"/>
+          </w:tcPr>
+          <w:p>
+            <w:pPr>
+              <w:keepNext w:val="false"/>
+              <w:bidi/>
+              <w:spacing w:after="30" w:before="30" w:line="264"/>
+            </w:pPr>
+            <w:r>
+              <w:rPr>
+                <w:rFonts w:ascii="Arial" w:cs="Arial" w:eastAsia="Arial" w:hAnsi="Arial"/>
+                <w:b/>
+                <w:bCs/>
+                <w:sz w:val="18"/>
+                <w:szCs w:val="18"/>
+                <w:rtl/>
+              </w:rPr>
+              <w:t xml:space="preserve">قواعد UCP 600 في شروط الاعتماد (2026-10-25).</w:t>
+            </w:r>
+            <w:r>
+              <w:rPr>
+                <w:rFonts w:ascii="Arial" w:cs="Arial" w:eastAsia="Arial" w:hAnsi="Arial"/>
+                <w:b w:val="false"/>
+                <w:bCs w:val="false"/>
+                <w:sz w:val="18"/>
+                <w:szCs w:val="18"/>
+                <w:rtl/>
+              </w:rPr>
+              <w:t xml:space="preserve"> «هل تم تطبيق معايير UCP600»، ثم «ابدأ أ و ب، اظهر مراجع ucp»</w:t>
+            </w:r>
+          </w:p>
+        </w:tc>
+        <w:tc>
+          <w:tcPr>
+            <w:tcW w:type="dxa" w:w="2290"/>
+            <w:tcBorders>
+              <w:top w:val="single" w:color="BFC9D6" w:sz="4"/>
+              <w:left w:val="single" w:color="BFC9D6" w:sz="4"/>
+              <w:bottom w:val="single" w:color="BFC9D6" w:sz="4"/>
+              <w:right w:val="single" w:color="BFC9D6" w:sz="4"/>
+            </w:tcBorders>
+            <w:tcMar>
+              <w:top w:type="dxa" w:w="50"/>
+              <w:left w:type="dxa" w:w="90"/>
+              <w:bottom w:type="dxa" w:w="50"/>
+              <w:right w:type="dxa" w:w="90"/>
+            </w:tcMar>
+            <w:vAlign w:val="top"/>
+          </w:tcPr>
+          <w:p>
+            <w:pPr>
+              <w:keepNext w:val="false"/>
+              <w:bidi/>
+              <w:spacing w:after="30" w:before="30" w:line="264"/>
+            </w:pPr>
+            <w:r>
+              <w:rPr>
+                <w:rFonts w:ascii="Arial" w:cs="Arial" w:eastAsia="Arial" w:hAnsi="Arial"/>
+                <w:b w:val="false"/>
+                <w:bCs w:val="false"/>
+                <w:sz w:val="18"/>
+                <w:szCs w:val="18"/>
+                <w:rtl/>
+              </w:rPr>
+              <w:t xml:space="preserve">طلبات الخزينة</w:t>
+            </w:r>
+          </w:p>
+        </w:tc>
+        <w:tc>
+          <w:tcPr>
+            <w:tcW w:type="dxa" w:w="4212"/>
+            <w:tcBorders>
+              <w:top w:val="single" w:color="BFC9D6" w:sz="4"/>
+              <w:left w:val="single" w:color="BFC9D6" w:sz="4"/>
+              <w:bottom w:val="single" w:color="BFC9D6" w:sz="4"/>
+              <w:right w:val="single" w:color="BFC9D6" w:sz="4"/>
+            </w:tcBorders>
+            <w:tcMar>
+              <w:top w:type="dxa" w:w="50"/>
+              <w:left w:type="dxa" w:w="90"/>
+              <w:bottom w:type="dxa" w:w="50"/>
+              <w:right w:type="dxa" w:w="90"/>
+            </w:tcMar>
+            <w:vAlign w:val="top"/>
+          </w:tcPr>
+          <w:p>
+            <w:pPr>
+              <w:keepNext w:val="false"/>
+              <w:bidi/>
+              <w:spacing w:after="30" w:before="30" w:line="264"/>
+            </w:pPr>
+            <w:r>
+              <w:rPr>
+                <w:rFonts w:ascii="Segoe UI Emoji" w:cs="Segoe UI Emoji" w:eastAsia="Segoe UI Emoji" w:hAnsi="Segoe UI Emoji"/>
+                <w:sz w:val="18"/>
+                <w:szCs w:val="18"/>
+                <w:rtl/>
+              </w:rPr>
+              <w:t xml:space="preserve">✅</w:t>
+            </w:r>
+            <w:r>
+              <w:rPr>
+                <w:rFonts w:ascii="Arial" w:cs="Arial" w:eastAsia="Arial" w:hAnsi="Arial"/>
+                <w:b w:val="false"/>
+                <w:bCs w:val="false"/>
+                <w:sz w:val="18"/>
+                <w:szCs w:val="18"/>
+                <w:rtl/>
+              </w:rPr>
+              <w:t xml:space="preserve"> </w:t>
+            </w:r>
+            <w:r>
+              <w:rPr>
+                <w:rFonts w:ascii="Arial" w:cs="Arial" w:eastAsia="Arial" w:hAnsi="Arial"/>
+                <w:b/>
+                <w:bCs/>
+                <w:sz w:val="18"/>
+                <w:szCs w:val="18"/>
+                <w:rtl/>
+              </w:rPr>
+              <w:t xml:space="preserve">منفّذ (</w:t>
+            </w:r>
+            <w:r>
+              <w:rPr>
+                <w:rFonts w:ascii="Courier New" w:cs="Courier New" w:eastAsia="Courier New" w:hAnsi="Courier New"/>
+                <w:b/>
+                <w:bCs/>
+                <w:color w:val="1F2937"/>
+                <w:sz w:val="16"/>
+                <w:szCs w:val="16"/>
+                <w:shd w:fill="F1F3F5" w:color="auto" w:val="clear"/>
+                <w:rtl/>
+              </w:rPr>
+              <w:t xml:space="preserve">‎docs/60‎</w:t>
+            </w:r>
+            <w:r>
+              <w:rPr>
+                <w:rFonts w:ascii="Arial" w:cs="Arial" w:eastAsia="Arial" w:hAnsi="Arial"/>
+                <w:b/>
+                <w:bCs/>
+                <w:sz w:val="18"/>
+                <w:szCs w:val="18"/>
+                <w:rtl/>
+              </w:rPr>
+              <w:t xml:space="preserve">):</w:t>
+            </w:r>
+            <w:r>
+              <w:rPr>
+                <w:rFonts w:ascii="Arial" w:cs="Arial" w:eastAsia="Arial" w:hAnsi="Arial"/>
+                <w:b w:val="false"/>
+                <w:bCs w:val="false"/>
+                <w:sz w:val="18"/>
+                <w:szCs w:val="18"/>
+                <w:rtl/>
+              </w:rPr>
+              <w:t xml:space="preserve"> مراجع المواد بجانب كل حقل ومستند في شاشة الشروط، وفحوص جديدة للمواد 28 و29 و31-32 و19-24. ويبقى: مطابقة نصوص المواد على النسخة المرخّصة من ICC</w:t>
             </w:r>
           </w:p>
         </w:tc>

</xml_diff>

<commit_message>
Release 1.0.2: UCP 600 on the terms, single-server support, facility screenshots [release]
The pilot release 1.0.2 adds the UCP 600 references and checks on the letter-of-credit
terms (docs/60) and the single-server settings (docs/58); no database change. docs/59
section 3 shows the facilities as a facilities officer sees them: a facility created
and defined in the screens (one bank, two limits, a product line), approved by a
treasury manager, with a utilisation recorded.

Co-Authored-By: Claude Opus 5.5 <noreply@anthropic.com>
Claude-Session: https://claude.ai/code/session_012HHcRrzuvMBTL2FYxXtsyv
</commit_message>
<xml_diff>
--- a/treasury-platform/docs/31-OWNER-DECISIONS.docx
+++ b/treasury-platform/docs/31-OWNER-DECISIONS.docx
@@ -14698,7 +14698,7 @@
                 <w:szCs w:val="18"/>
                 <w:rtl/>
               </w:rPr>
-              <w:t xml:space="preserve"> 18 لقطة من النظام الحقيقي أُخذت أثناء اختبار المتصفح. وشاشة إنشاء التسهيل موجودة (اللقطة 29)، لكنها لا تظهر في قائمة مدير المشترك لأن دوره لا يشمل صلاحيات التسهيلات</w:t>
+              <w:t xml:space="preserve"> 18 لقطة من النظام الحقيقي أُخذت أثناء اختبار المتصفح. وشاشة إنشاء التسهيل موجودة (اللقطة 29)، لكنها لا تظهر في قائمة مدير المشترك لأن دوره لا يشمل صلاحيات التسهيلات. ثم أُضيفت لقطات من حساب مسؤول التسهيلات (40 إلى 45): تسهيل أُنشئ وعُرِّف ببنك وحدّين وخط منتج، واعتمده مدير الخزينة، وسُجّل عليه استخدام</w:t>
             </w:r>
           </w:p>
         </w:tc>
@@ -14914,6 +14914,273 @@
                 <w:rtl/>
               </w:rPr>
               <w:t xml:space="preserve"> مراجع المواد بجانب كل حقل ومستند في شاشة الشروط، وفحوص جديدة للمواد 28 و29 و31-32 و19-24. ويبقى: مطابقة نصوص المواد على النسخة المرخّصة من ICC</w:t>
+            </w:r>
+          </w:p>
+        </w:tc>
+      </w:tr>
+      <w:tr>
+        <w:trPr>
+          <w:cantSplit/>
+        </w:trPr>
+        <w:tc>
+          <w:tcPr>
+            <w:tcW w:type="dxa" w:w="925"/>
+            <w:tcBorders>
+              <w:top w:val="single" w:color="BFC9D6" w:sz="4"/>
+              <w:left w:val="single" w:color="BFC9D6" w:sz="4"/>
+              <w:bottom w:val="single" w:color="BFC9D6" w:sz="4"/>
+              <w:right w:val="single" w:color="BFC9D6" w:sz="4"/>
+            </w:tcBorders>
+            <w:shd w:fill="F5F8FC" w:color="auto" w:val="clear"/>
+            <w:tcMar>
+              <w:top w:type="dxa" w:w="50"/>
+              <w:left w:type="dxa" w:w="90"/>
+              <w:bottom w:type="dxa" w:w="50"/>
+              <w:right w:type="dxa" w:w="90"/>
+            </w:tcMar>
+            <w:vAlign w:val="top"/>
+          </w:tcPr>
+          <w:p>
+            <w:pPr>
+              <w:keepNext w:val="false"/>
+              <w:bidi/>
+              <w:spacing w:after="30" w:before="30" w:line="264"/>
+            </w:pPr>
+            <w:r>
+              <w:rPr>
+                <w:rFonts w:ascii="Arial" w:cs="Arial" w:eastAsia="Arial" w:hAnsi="Arial"/>
+                <w:b w:val="false"/>
+                <w:bCs w:val="false"/>
+                <w:sz w:val="18"/>
+                <w:szCs w:val="18"/>
+                <w:rtl/>
+              </w:rPr>
+              <w:t xml:space="preserve">66</w:t>
+            </w:r>
+          </w:p>
+        </w:tc>
+        <w:tc>
+          <w:tcPr>
+            <w:tcW w:type="dxa" w:w="2437"/>
+            <w:tcBorders>
+              <w:top w:val="single" w:color="BFC9D6" w:sz="4"/>
+              <w:left w:val="single" w:color="BFC9D6" w:sz="4"/>
+              <w:bottom w:val="single" w:color="BFC9D6" w:sz="4"/>
+              <w:right w:val="single" w:color="BFC9D6" w:sz="4"/>
+            </w:tcBorders>
+            <w:shd w:fill="F5F8FC" w:color="auto" w:val="clear"/>
+            <w:tcMar>
+              <w:top w:type="dxa" w:w="50"/>
+              <w:left w:type="dxa" w:w="90"/>
+              <w:bottom w:type="dxa" w:w="50"/>
+              <w:right w:type="dxa" w:w="90"/>
+            </w:tcMar>
+            <w:vAlign w:val="top"/>
+          </w:tcPr>
+          <w:p>
+            <w:pPr>
+              <w:keepNext w:val="false"/>
+              <w:bidi/>
+              <w:spacing w:after="30" w:before="30" w:line="264"/>
+            </w:pPr>
+            <w:r>
+              <w:rPr>
+                <w:rFonts w:ascii="Arial" w:cs="Arial" w:eastAsia="Arial" w:hAnsi="Arial"/>
+                <w:b/>
+                <w:bCs/>
+                <w:sz w:val="18"/>
+                <w:szCs w:val="18"/>
+                <w:rtl/>
+              </w:rPr>
+              <w:t xml:space="preserve">الإصدار 1.0.2 (2026-10-26).</w:t>
+            </w:r>
+            <w:r>
+              <w:rPr>
+                <w:rFonts w:ascii="Arial" w:cs="Arial" w:eastAsia="Arial" w:hAnsi="Arial"/>
+                <w:b w:val="false"/>
+                <w:bCs w:val="false"/>
+                <w:sz w:val="18"/>
+                <w:szCs w:val="18"/>
+                <w:rtl/>
+              </w:rPr>
+              <w:t xml:space="preserve"> «اعطني تقرير بالعربي ثم اكمل»</w:t>
+            </w:r>
+          </w:p>
+        </w:tc>
+        <w:tc>
+          <w:tcPr>
+            <w:tcW w:type="dxa" w:w="2290"/>
+            <w:tcBorders>
+              <w:top w:val="single" w:color="BFC9D6" w:sz="4"/>
+              <w:left w:val="single" w:color="BFC9D6" w:sz="4"/>
+              <w:bottom w:val="single" w:color="BFC9D6" w:sz="4"/>
+              <w:right w:val="single" w:color="BFC9D6" w:sz="4"/>
+            </w:tcBorders>
+            <w:shd w:fill="F5F8FC" w:color="auto" w:val="clear"/>
+            <w:tcMar>
+              <w:top w:type="dxa" w:w="50"/>
+              <w:left w:type="dxa" w:w="90"/>
+              <w:bottom w:type="dxa" w:w="50"/>
+              <w:right w:type="dxa" w:w="90"/>
+            </w:tcMar>
+            <w:vAlign w:val="top"/>
+          </w:tcPr>
+          <w:p>
+            <w:pPr>
+              <w:keepNext w:val="false"/>
+              <w:bidi/>
+              <w:spacing w:after="30" w:before="30" w:line="264"/>
+            </w:pPr>
+            <w:r>
+              <w:rPr>
+                <w:rFonts w:ascii="Arial" w:cs="Arial" w:eastAsia="Arial" w:hAnsi="Arial"/>
+                <w:b w:val="false"/>
+                <w:bCs w:val="false"/>
+                <w:sz w:val="18"/>
+                <w:szCs w:val="18"/>
+                <w:rtl/>
+              </w:rPr>
+              <w:t xml:space="preserve">النشر</w:t>
+            </w:r>
+          </w:p>
+        </w:tc>
+        <w:tc>
+          <w:tcPr>
+            <w:tcW w:type="dxa" w:w="4212"/>
+            <w:tcBorders>
+              <w:top w:val="single" w:color="BFC9D6" w:sz="4"/>
+              <w:left w:val="single" w:color="BFC9D6" w:sz="4"/>
+              <w:bottom w:val="single" w:color="BFC9D6" w:sz="4"/>
+              <w:right w:val="single" w:color="BFC9D6" w:sz="4"/>
+            </w:tcBorders>
+            <w:shd w:fill="F5F8FC" w:color="auto" w:val="clear"/>
+            <w:tcMar>
+              <w:top w:type="dxa" w:w="50"/>
+              <w:left w:type="dxa" w:w="90"/>
+              <w:bottom w:type="dxa" w:w="50"/>
+              <w:right w:type="dxa" w:w="90"/>
+            </w:tcMar>
+            <w:vAlign w:val="top"/>
+          </w:tcPr>
+          <w:p>
+            <w:pPr>
+              <w:keepNext w:val="false"/>
+              <w:bidi/>
+              <w:spacing w:after="30" w:before="30" w:line="264"/>
+            </w:pPr>
+            <w:r>
+              <w:rPr>
+                <w:rFonts w:ascii="Segoe UI Emoji" w:cs="Segoe UI Emoji" w:eastAsia="Segoe UI Emoji" w:hAnsi="Segoe UI Emoji"/>
+                <w:sz w:val="18"/>
+                <w:szCs w:val="18"/>
+                <w:rtl/>
+              </w:rPr>
+              <w:t xml:space="preserve">✅</w:t>
+            </w:r>
+            <w:r>
+              <w:rPr>
+                <w:rFonts w:ascii="Arial" w:cs="Arial" w:eastAsia="Arial" w:hAnsi="Arial"/>
+                <w:b w:val="false"/>
+                <w:bCs w:val="false"/>
+                <w:sz w:val="18"/>
+                <w:szCs w:val="18"/>
+                <w:rtl/>
+              </w:rPr>
+              <w:t xml:space="preserve"> </w:t>
+            </w:r>
+            <w:r>
+              <w:rPr>
+                <w:rFonts w:ascii="Arial" w:cs="Arial" w:eastAsia="Arial" w:hAnsi="Arial"/>
+                <w:b/>
+                <w:bCs/>
+                <w:sz w:val="18"/>
+                <w:szCs w:val="18"/>
+                <w:rtl/>
+              </w:rPr>
+              <w:t xml:space="preserve">منفّذ (</w:t>
+            </w:r>
+            <w:r>
+              <w:rPr>
+                <w:rFonts w:ascii="Courier New" w:cs="Courier New" w:eastAsia="Courier New" w:hAnsi="Courier New"/>
+                <w:b/>
+                <w:bCs/>
+                <w:color w:val="1F2937"/>
+                <w:sz w:val="16"/>
+                <w:szCs w:val="16"/>
+                <w:shd w:fill="F1F3F5" w:color="auto" w:val="clear"/>
+                <w:rtl/>
+              </w:rPr>
+              <w:t xml:space="preserve">‎docs/57‎</w:t>
+            </w:r>
+            <w:r>
+              <w:rPr>
+                <w:rFonts w:ascii="Arial" w:cs="Arial" w:eastAsia="Arial" w:hAnsi="Arial"/>
+                <w:b/>
+                <w:bCs/>
+                <w:sz w:val="18"/>
+                <w:szCs w:val="18"/>
+                <w:rtl/>
+              </w:rPr>
+              <w:t xml:space="preserve">):</w:t>
+            </w:r>
+            <w:r>
+              <w:rPr>
+                <w:rFonts w:ascii="Arial" w:cs="Arial" w:eastAsia="Arial" w:hAnsi="Arial"/>
+                <w:b w:val="false"/>
+                <w:bCs w:val="false"/>
+                <w:sz w:val="18"/>
+                <w:szCs w:val="18"/>
+                <w:rtl/>
+              </w:rPr>
+              <w:t xml:space="preserve"> الإصدار يضم مراجع UCP 600 وفحوصها (</w:t>
+            </w:r>
+            <w:r>
+              <w:rPr>
+                <w:rFonts w:ascii="Courier New" w:cs="Courier New" w:eastAsia="Courier New" w:hAnsi="Courier New"/>
+                <w:b w:val="false"/>
+                <w:bCs w:val="false"/>
+                <w:color w:val="1F2937"/>
+                <w:sz w:val="16"/>
+                <w:szCs w:val="16"/>
+                <w:shd w:fill="F1F3F5" w:color="auto" w:val="clear"/>
+                <w:rtl/>
+              </w:rPr>
+              <w:t xml:space="preserve">‎docs/60‎</w:t>
+            </w:r>
+            <w:r>
+              <w:rPr>
+                <w:rFonts w:ascii="Arial" w:cs="Arial" w:eastAsia="Arial" w:hAnsi="Arial"/>
+                <w:b w:val="false"/>
+                <w:bCs w:val="false"/>
+                <w:sz w:val="18"/>
+                <w:szCs w:val="18"/>
+                <w:rtl/>
+              </w:rPr>
+              <w:t xml:space="preserve">)، ودعم الخادم الواحد (</w:t>
+            </w:r>
+            <w:r>
+              <w:rPr>
+                <w:rFonts w:ascii="Courier New" w:cs="Courier New" w:eastAsia="Courier New" w:hAnsi="Courier New"/>
+                <w:b w:val="false"/>
+                <w:bCs w:val="false"/>
+                <w:color w:val="1F2937"/>
+                <w:sz w:val="16"/>
+                <w:szCs w:val="16"/>
+                <w:shd w:fill="F1F3F5" w:color="auto" w:val="clear"/>
+                <w:rtl/>
+              </w:rPr>
+              <w:t xml:space="preserve">‎docs/58‎</w:t>
+            </w:r>
+            <w:r>
+              <w:rPr>
+                <w:rFonts w:ascii="Arial" w:cs="Arial" w:eastAsia="Arial" w:hAnsi="Arial"/>
+                <w:b w:val="false"/>
+                <w:bCs w:val="false"/>
+                <w:sz w:val="18"/>
+                <w:szCs w:val="18"/>
+                <w:rtl/>
+              </w:rPr>
+              <w:t xml:space="preserve">). ولا تغيير في قاعدة البيانات: الترقية من 1.0.1 تحميل الصورتين فقط</w:t>
             </w:r>
           </w:p>
         </w:tc>

</xml_diff>

<commit_message>
Terms screen: the SWIFT MT700 field of each term instead of UCP references; no deferral on a sight credit
The owner asked for the field code of the MT700 message alone beside each term (41a, 32B,
39A, 31D, 43T, 46A, 59, 71D...), with no UCP wording on the screens; the checks' messages
no longer name UCP and the findings show the term and its code. The list values are in
Arabic. A sight credit is paid at sight: its deferral days and their basis are not shown
and are cleared on save (V-LCT-06 refused them already). docs/60 section 6, docs/31 row 67.

Co-Authored-By: Claude Opus 5.5 <noreply@anthropic.com>
Claude-Session: https://claude.ai/code/session_012HHcRrzuvMBTL2FYxXtsyv
</commit_message>
<xml_diff>
--- a/treasury-platform/docs/31-OWNER-DECISIONS.docx
+++ b/treasury-platform/docs/31-OWNER-DECISIONS.docx
@@ -15181,6 +15181,221 @@
                 <w:rtl/>
               </w:rPr>
               <w:t xml:space="preserve">). ولا تغيير في قاعدة البيانات: الترقية من 1.0.1 تحميل الصورتين فقط</w:t>
+            </w:r>
+          </w:p>
+        </w:tc>
+      </w:tr>
+      <w:tr>
+        <w:trPr>
+          <w:cantSplit/>
+        </w:trPr>
+        <w:tc>
+          <w:tcPr>
+            <w:tcW w:type="dxa" w:w="925"/>
+            <w:tcBorders>
+              <w:top w:val="single" w:color="BFC9D6" w:sz="4"/>
+              <w:left w:val="single" w:color="BFC9D6" w:sz="4"/>
+              <w:bottom w:val="single" w:color="BFC9D6" w:sz="4"/>
+              <w:right w:val="single" w:color="BFC9D6" w:sz="4"/>
+            </w:tcBorders>
+            <w:tcMar>
+              <w:top w:type="dxa" w:w="50"/>
+              <w:left w:type="dxa" w:w="90"/>
+              <w:bottom w:type="dxa" w:w="50"/>
+              <w:right w:type="dxa" w:w="90"/>
+            </w:tcMar>
+            <w:vAlign w:val="top"/>
+          </w:tcPr>
+          <w:p>
+            <w:pPr>
+              <w:keepNext w:val="false"/>
+              <w:bidi/>
+              <w:spacing w:after="30" w:before="30" w:line="264"/>
+            </w:pPr>
+            <w:r>
+              <w:rPr>
+                <w:rFonts w:ascii="Arial" w:cs="Arial" w:eastAsia="Arial" w:hAnsi="Arial"/>
+                <w:b w:val="false"/>
+                <w:bCs w:val="false"/>
+                <w:sz w:val="18"/>
+                <w:szCs w:val="18"/>
+                <w:rtl/>
+              </w:rPr>
+              <w:t xml:space="preserve">67</w:t>
+            </w:r>
+          </w:p>
+        </w:tc>
+        <w:tc>
+          <w:tcPr>
+            <w:tcW w:type="dxa" w:w="2437"/>
+            <w:tcBorders>
+              <w:top w:val="single" w:color="BFC9D6" w:sz="4"/>
+              <w:left w:val="single" w:color="BFC9D6" w:sz="4"/>
+              <w:bottom w:val="single" w:color="BFC9D6" w:sz="4"/>
+              <w:right w:val="single" w:color="BFC9D6" w:sz="4"/>
+            </w:tcBorders>
+            <w:tcMar>
+              <w:top w:type="dxa" w:w="50"/>
+              <w:left w:type="dxa" w:w="90"/>
+              <w:bottom w:type="dxa" w:w="50"/>
+              <w:right w:type="dxa" w:w="90"/>
+            </w:tcMar>
+            <w:vAlign w:val="top"/>
+          </w:tcPr>
+          <w:p>
+            <w:pPr>
+              <w:keepNext w:val="false"/>
+              <w:bidi/>
+              <w:spacing w:after="30" w:before="30" w:line="264"/>
+            </w:pPr>
+            <w:r>
+              <w:rPr>
+                <w:rFonts w:ascii="Arial" w:cs="Arial" w:eastAsia="Arial" w:hAnsi="Arial"/>
+                <w:b/>
+                <w:bCs/>
+                <w:sz w:val="18"/>
+                <w:szCs w:val="18"/>
+                <w:rtl/>
+              </w:rPr>
+              <w:t xml:space="preserve">رمز حقل سويفت بدل مراجع UCP في الشاشات (2026-10-26).</w:t>
+            </w:r>
+            <w:r>
+              <w:rPr>
+                <w:rFonts w:ascii="Arial" w:cs="Arial" w:eastAsia="Arial" w:hAnsi="Arial"/>
+                <w:b w:val="false"/>
+                <w:bCs w:val="false"/>
+                <w:sz w:val="18"/>
+                <w:szCs w:val="18"/>
+                <w:rtl/>
+              </w:rPr>
+              <w:t xml:space="preserve"> «لاتكتب في الشاشات UCP و لكن فقط رمز البند في سويفت»، و«عندما يكون الاعتماد sight مدة التاجيل لاتظهر»</w:t>
+            </w:r>
+          </w:p>
+        </w:tc>
+        <w:tc>
+          <w:tcPr>
+            <w:tcW w:type="dxa" w:w="2290"/>
+            <w:tcBorders>
+              <w:top w:val="single" w:color="BFC9D6" w:sz="4"/>
+              <w:left w:val="single" w:color="BFC9D6" w:sz="4"/>
+              <w:bottom w:val="single" w:color="BFC9D6" w:sz="4"/>
+              <w:right w:val="single" w:color="BFC9D6" w:sz="4"/>
+            </w:tcBorders>
+            <w:tcMar>
+              <w:top w:type="dxa" w:w="50"/>
+              <w:left w:type="dxa" w:w="90"/>
+              <w:bottom w:type="dxa" w:w="50"/>
+              <w:right w:type="dxa" w:w="90"/>
+            </w:tcMar>
+            <w:vAlign w:val="top"/>
+          </w:tcPr>
+          <w:p>
+            <w:pPr>
+              <w:keepNext w:val="false"/>
+              <w:bidi/>
+              <w:spacing w:after="30" w:before="30" w:line="264"/>
+            </w:pPr>
+            <w:r>
+              <w:rPr>
+                <w:rFonts w:ascii="Arial" w:cs="Arial" w:eastAsia="Arial" w:hAnsi="Arial"/>
+                <w:b w:val="false"/>
+                <w:bCs w:val="false"/>
+                <w:sz w:val="18"/>
+                <w:szCs w:val="18"/>
+                <w:rtl/>
+              </w:rPr>
+              <w:t xml:space="preserve">طلبات الخزينة</w:t>
+            </w:r>
+          </w:p>
+        </w:tc>
+        <w:tc>
+          <w:tcPr>
+            <w:tcW w:type="dxa" w:w="4212"/>
+            <w:tcBorders>
+              <w:top w:val="single" w:color="BFC9D6" w:sz="4"/>
+              <w:left w:val="single" w:color="BFC9D6" w:sz="4"/>
+              <w:bottom w:val="single" w:color="BFC9D6" w:sz="4"/>
+              <w:right w:val="single" w:color="BFC9D6" w:sz="4"/>
+            </w:tcBorders>
+            <w:tcMar>
+              <w:top w:type="dxa" w:w="50"/>
+              <w:left w:type="dxa" w:w="90"/>
+              <w:bottom w:type="dxa" w:w="50"/>
+              <w:right w:type="dxa" w:w="90"/>
+            </w:tcMar>
+            <w:vAlign w:val="top"/>
+          </w:tcPr>
+          <w:p>
+            <w:pPr>
+              <w:keepNext w:val="false"/>
+              <w:bidi/>
+              <w:spacing w:after="30" w:before="30" w:line="264"/>
+            </w:pPr>
+            <w:r>
+              <w:rPr>
+                <w:rFonts w:ascii="Segoe UI Emoji" w:cs="Segoe UI Emoji" w:eastAsia="Segoe UI Emoji" w:hAnsi="Segoe UI Emoji"/>
+                <w:sz w:val="18"/>
+                <w:szCs w:val="18"/>
+                <w:rtl/>
+              </w:rPr>
+              <w:t xml:space="preserve">✅</w:t>
+            </w:r>
+            <w:r>
+              <w:rPr>
+                <w:rFonts w:ascii="Arial" w:cs="Arial" w:eastAsia="Arial" w:hAnsi="Arial"/>
+                <w:b w:val="false"/>
+                <w:bCs w:val="false"/>
+                <w:sz w:val="18"/>
+                <w:szCs w:val="18"/>
+                <w:rtl/>
+              </w:rPr>
+              <w:t xml:space="preserve"> </w:t>
+            </w:r>
+            <w:r>
+              <w:rPr>
+                <w:rFonts w:ascii="Arial" w:cs="Arial" w:eastAsia="Arial" w:hAnsi="Arial"/>
+                <w:b/>
+                <w:bCs/>
+                <w:sz w:val="18"/>
+                <w:szCs w:val="18"/>
+                <w:rtl/>
+              </w:rPr>
+              <w:t xml:space="preserve">منفّذ (</w:t>
+            </w:r>
+            <w:r>
+              <w:rPr>
+                <w:rFonts w:ascii="Courier New" w:cs="Courier New" w:eastAsia="Courier New" w:hAnsi="Courier New"/>
+                <w:b/>
+                <w:bCs/>
+                <w:color w:val="1F2937"/>
+                <w:sz w:val="16"/>
+                <w:szCs w:val="16"/>
+                <w:shd w:fill="F1F3F5" w:color="auto" w:val="clear"/>
+                <w:rtl/>
+              </w:rPr>
+              <w:t xml:space="preserve">‎docs/60‎</w:t>
+            </w:r>
+            <w:r>
+              <w:rPr>
+                <w:rFonts w:ascii="Arial" w:cs="Arial" w:eastAsia="Arial" w:hAnsi="Arial"/>
+                <w:b/>
+                <w:bCs/>
+                <w:sz w:val="18"/>
+                <w:szCs w:val="18"/>
+                <w:rtl/>
+              </w:rPr>
+              <w:t xml:space="preserve"> §6):</w:t>
+            </w:r>
+            <w:r>
+              <w:rPr>
+                <w:rFonts w:ascii="Arial" w:cs="Arial" w:eastAsia="Arial" w:hAnsi="Arial"/>
+                <w:b w:val="false"/>
+                <w:bCs w:val="false"/>
+                <w:sz w:val="18"/>
+                <w:szCs w:val="18"/>
+                <w:rtl/>
+              </w:rPr>
+              <w:t xml:space="preserve"> بجانب كل شرط رمز حقله في MT700 فقط (مثل 39A و43T و46A)، ورسائل الفحوص بلا ذكر UCP، وقيم القوائم بالعربية. أيام التأجيل لا تظهر لاعتماد الاطلاع. والمطبوع ينتظر قرارك</w:t>
             </w:r>
           </w:p>
         </w:tc>

</xml_diff>

<commit_message>
Release 1.0.3: the letter of credit terms in SWIFT MT700 fields [release]
The pilot release 1.0.3: the terms screen and the printed terms carry each term's MT700
field code instead of UCP references, in Arabic words, and the screen asks every MT700
field of the dictionary when it applies (47A, 44A, 44B, 40A, 58a...); a sight credit has
no deferral. No database change. docs/57, docs/59 section 4, docs/60 section 7, docs/31
row 68.

Co-Authored-By: Claude Opus 5.5 <noreply@anthropic.com>
Claude-Session: https://claude.ai/code/session_012HHcRrzuvMBTL2FYxXtsyv
</commit_message>
<xml_diff>
--- a/treasury-platform/docs/31-OWNER-DECISIONS.docx
+++ b/treasury-platform/docs/31-OWNER-DECISIONS.docx
@@ -15395,7 +15395,250 @@
                 <w:szCs w:val="18"/>
                 <w:rtl/>
               </w:rPr>
-              <w:t xml:space="preserve"> بجانب كل شرط رمز حقله في MT700 فقط (مثل 39A و43T و46A)، ورسائل الفحوص بلا ذكر UCP، وقيم القوائم بالعربية. أيام التأجيل لا تظهر لاعتماد الاطلاع. والمطبوع ينتظر قرارك</w:t>
+              <w:t xml:space="preserve"> بجانب كل شرط رمز حقله في MT700 فقط (مثل 39A و43T و46A)، ورسائل الفحوص بلا ذكر UCP، وقيم القوائم بالعربية. أيام التأجيل لا تظهر لاعتماد الاطلاع.</w:t>
+            </w:r>
+          </w:p>
+        </w:tc>
+      </w:tr>
+      <w:tr>
+        <w:trPr>
+          <w:cantSplit/>
+        </w:trPr>
+        <w:tc>
+          <w:tcPr>
+            <w:tcW w:type="dxa" w:w="925"/>
+            <w:tcBorders>
+              <w:top w:val="single" w:color="BFC9D6" w:sz="4"/>
+              <w:left w:val="single" w:color="BFC9D6" w:sz="4"/>
+              <w:bottom w:val="single" w:color="BFC9D6" w:sz="4"/>
+              <w:right w:val="single" w:color="BFC9D6" w:sz="4"/>
+            </w:tcBorders>
+            <w:shd w:fill="F5F8FC" w:color="auto" w:val="clear"/>
+            <w:tcMar>
+              <w:top w:type="dxa" w:w="50"/>
+              <w:left w:type="dxa" w:w="90"/>
+              <w:bottom w:type="dxa" w:w="50"/>
+              <w:right w:type="dxa" w:w="90"/>
+            </w:tcMar>
+            <w:vAlign w:val="top"/>
+          </w:tcPr>
+          <w:p>
+            <w:pPr>
+              <w:keepNext w:val="false"/>
+              <w:bidi/>
+              <w:spacing w:after="30" w:before="30" w:line="264"/>
+            </w:pPr>
+            <w:r>
+              <w:rPr>
+                <w:rFonts w:ascii="Arial" w:cs="Arial" w:eastAsia="Arial" w:hAnsi="Arial"/>
+                <w:b w:val="false"/>
+                <w:bCs w:val="false"/>
+                <w:sz w:val="18"/>
+                <w:szCs w:val="18"/>
+                <w:rtl/>
+              </w:rPr>
+              <w:t xml:space="preserve">68</w:t>
+            </w:r>
+          </w:p>
+        </w:tc>
+        <w:tc>
+          <w:tcPr>
+            <w:tcW w:type="dxa" w:w="2437"/>
+            <w:tcBorders>
+              <w:top w:val="single" w:color="BFC9D6" w:sz="4"/>
+              <w:left w:val="single" w:color="BFC9D6" w:sz="4"/>
+              <w:bottom w:val="single" w:color="BFC9D6" w:sz="4"/>
+              <w:right w:val="single" w:color="BFC9D6" w:sz="4"/>
+            </w:tcBorders>
+            <w:shd w:fill="F5F8FC" w:color="auto" w:val="clear"/>
+            <w:tcMar>
+              <w:top w:type="dxa" w:w="50"/>
+              <w:left w:type="dxa" w:w="90"/>
+              <w:bottom w:type="dxa" w:w="50"/>
+              <w:right w:type="dxa" w:w="90"/>
+            </w:tcMar>
+            <w:vAlign w:val="top"/>
+          </w:tcPr>
+          <w:p>
+            <w:pPr>
+              <w:keepNext w:val="false"/>
+              <w:bidi/>
+              <w:spacing w:after="30" w:before="30" w:line="264"/>
+            </w:pPr>
+            <w:r>
+              <w:rPr>
+                <w:rFonts w:ascii="Arial" w:cs="Arial" w:eastAsia="Arial" w:hAnsi="Arial"/>
+                <w:b/>
+                <w:bCs/>
+                <w:sz w:val="18"/>
+                <w:szCs w:val="18"/>
+                <w:rtl/>
+              </w:rPr>
+              <w:t xml:space="preserve">المطبوع بلا UCP، وكل حقول MT700، والإصدار 1.0.3 (2026-10-26).</w:t>
+            </w:r>
+            <w:r>
+              <w:rPr>
+                <w:rFonts w:ascii="Arial" w:cs="Arial" w:eastAsia="Arial" w:hAnsi="Arial"/>
+                <w:b w:val="false"/>
+                <w:bCs w:val="false"/>
+                <w:sz w:val="18"/>
+                <w:szCs w:val="18"/>
+                <w:rtl/>
+              </w:rPr>
+              <w:t xml:space="preserve"> «نعم طبقه على المطبوع وأصدر 1.0.3»، و«الشروط الاضافية 47A، 49، 71D، 44B، 44A يجب ان يكون النظام يغطي كل النقاط»</w:t>
+            </w:r>
+          </w:p>
+        </w:tc>
+        <w:tc>
+          <w:tcPr>
+            <w:tcW w:type="dxa" w:w="2290"/>
+            <w:tcBorders>
+              <w:top w:val="single" w:color="BFC9D6" w:sz="4"/>
+              <w:left w:val="single" w:color="BFC9D6" w:sz="4"/>
+              <w:bottom w:val="single" w:color="BFC9D6" w:sz="4"/>
+              <w:right w:val="single" w:color="BFC9D6" w:sz="4"/>
+            </w:tcBorders>
+            <w:shd w:fill="F5F8FC" w:color="auto" w:val="clear"/>
+            <w:tcMar>
+              <w:top w:type="dxa" w:w="50"/>
+              <w:left w:type="dxa" w:w="90"/>
+              <w:bottom w:type="dxa" w:w="50"/>
+              <w:right w:type="dxa" w:w="90"/>
+            </w:tcMar>
+            <w:vAlign w:val="top"/>
+          </w:tcPr>
+          <w:p>
+            <w:pPr>
+              <w:keepNext w:val="false"/>
+              <w:bidi/>
+              <w:spacing w:after="30" w:before="30" w:line="264"/>
+            </w:pPr>
+            <w:r>
+              <w:rPr>
+                <w:rFonts w:ascii="Arial" w:cs="Arial" w:eastAsia="Arial" w:hAnsi="Arial"/>
+                <w:b w:val="false"/>
+                <w:bCs w:val="false"/>
+                <w:sz w:val="18"/>
+                <w:szCs w:val="18"/>
+                <w:rtl/>
+              </w:rPr>
+              <w:t xml:space="preserve">طلبات الخزينة</w:t>
+            </w:r>
+          </w:p>
+        </w:tc>
+        <w:tc>
+          <w:tcPr>
+            <w:tcW w:type="dxa" w:w="4212"/>
+            <w:tcBorders>
+              <w:top w:val="single" w:color="BFC9D6" w:sz="4"/>
+              <w:left w:val="single" w:color="BFC9D6" w:sz="4"/>
+              <w:bottom w:val="single" w:color="BFC9D6" w:sz="4"/>
+              <w:right w:val="single" w:color="BFC9D6" w:sz="4"/>
+            </w:tcBorders>
+            <w:shd w:fill="F5F8FC" w:color="auto" w:val="clear"/>
+            <w:tcMar>
+              <w:top w:type="dxa" w:w="50"/>
+              <w:left w:type="dxa" w:w="90"/>
+              <w:bottom w:type="dxa" w:w="50"/>
+              <w:right w:type="dxa" w:w="90"/>
+            </w:tcMar>
+            <w:vAlign w:val="top"/>
+          </w:tcPr>
+          <w:p>
+            <w:pPr>
+              <w:keepNext w:val="false"/>
+              <w:bidi/>
+              <w:spacing w:after="30" w:before="30" w:line="264"/>
+            </w:pPr>
+            <w:r>
+              <w:rPr>
+                <w:rFonts w:ascii="Segoe UI Emoji" w:cs="Segoe UI Emoji" w:eastAsia="Segoe UI Emoji" w:hAnsi="Segoe UI Emoji"/>
+                <w:sz w:val="18"/>
+                <w:szCs w:val="18"/>
+                <w:rtl/>
+              </w:rPr>
+              <w:t xml:space="preserve">✅</w:t>
+            </w:r>
+            <w:r>
+              <w:rPr>
+                <w:rFonts w:ascii="Arial" w:cs="Arial" w:eastAsia="Arial" w:hAnsi="Arial"/>
+                <w:b w:val="false"/>
+                <w:bCs w:val="false"/>
+                <w:sz w:val="18"/>
+                <w:szCs w:val="18"/>
+                <w:rtl/>
+              </w:rPr>
+              <w:t xml:space="preserve"> </w:t>
+            </w:r>
+            <w:r>
+              <w:rPr>
+                <w:rFonts w:ascii="Arial" w:cs="Arial" w:eastAsia="Arial" w:hAnsi="Arial"/>
+                <w:b/>
+                <w:bCs/>
+                <w:sz w:val="18"/>
+                <w:szCs w:val="18"/>
+                <w:rtl/>
+              </w:rPr>
+              <w:t xml:space="preserve">منفّذ (</w:t>
+            </w:r>
+            <w:r>
+              <w:rPr>
+                <w:rFonts w:ascii="Courier New" w:cs="Courier New" w:eastAsia="Courier New" w:hAnsi="Courier New"/>
+                <w:b/>
+                <w:bCs/>
+                <w:color w:val="1F2937"/>
+                <w:sz w:val="16"/>
+                <w:szCs w:val="16"/>
+                <w:shd w:fill="F1F3F5" w:color="auto" w:val="clear"/>
+                <w:rtl/>
+              </w:rPr>
+              <w:t xml:space="preserve">‎docs/60‎</w:t>
+            </w:r>
+            <w:r>
+              <w:rPr>
+                <w:rFonts w:ascii="Arial" w:cs="Arial" w:eastAsia="Arial" w:hAnsi="Arial"/>
+                <w:b/>
+                <w:bCs/>
+                <w:sz w:val="18"/>
+                <w:szCs w:val="18"/>
+                <w:rtl/>
+              </w:rPr>
+              <w:t xml:space="preserve"> §7، </w:t>
+            </w:r>
+            <w:r>
+              <w:rPr>
+                <w:rFonts w:ascii="Courier New" w:cs="Courier New" w:eastAsia="Courier New" w:hAnsi="Courier New"/>
+                <w:b/>
+                <w:bCs/>
+                <w:color w:val="1F2937"/>
+                <w:sz w:val="16"/>
+                <w:szCs w:val="16"/>
+                <w:shd w:fill="F1F3F5" w:color="auto" w:val="clear"/>
+                <w:rtl/>
+              </w:rPr>
+              <w:t xml:space="preserve">‎docs/57‎</w:t>
+            </w:r>
+            <w:r>
+              <w:rPr>
+                <w:rFonts w:ascii="Arial" w:cs="Arial" w:eastAsia="Arial" w:hAnsi="Arial"/>
+                <w:b/>
+                <w:bCs/>
+                <w:sz w:val="18"/>
+                <w:szCs w:val="18"/>
+                <w:rtl/>
+              </w:rPr>
+              <w:t xml:space="preserve">):</w:t>
+            </w:r>
+            <w:r>
+              <w:rPr>
+                <w:rFonts w:ascii="Arial" w:cs="Arial" w:eastAsia="Arial" w:hAnsi="Arial"/>
+                <w:b w:val="false"/>
+                <w:bCs w:val="false"/>
+                <w:sz w:val="18"/>
+                <w:szCs w:val="18"/>
+                <w:rtl/>
+              </w:rPr>
+              <w:t xml:space="preserve"> المطبوع برمز سويفت لكل حقل وبالكلمات العربية، والشاشة تسأل كل حقول MT700 في القاموس (منها 47A و44A و44B و40A و42C و58a) حين تنطبق</w:t>
             </w:r>
           </w:p>
         </w:tc>

</xml_diff>

<commit_message>
Goods category by its catalogue name; English is the default language
The terms print a catalogue list value (GOODS_CATEGORY) with its item's name, and the terms
screen asks the goods category from GET /lc/lists/{list} (only lists the field dictionary
names). The screens start in English whatever the browser's language, Arabic kept once
chosen; prints and e-mails are in English unless the user's language is Arabic.
docs/60 section 8, docs/31 row 69.

Co-Authored-By: Claude Opus 5.5 <noreply@anthropic.com>
Claude-Session: https://claude.ai/code/session_012HHcRrzuvMBTL2FYxXtsyv
</commit_message>
<xml_diff>
--- a/treasury-platform/docs/31-OWNER-DECISIONS.docx
+++ b/treasury-platform/docs/31-OWNER-DECISIONS.docx
@@ -15639,6 +15639,221 @@
                 <w:rtl/>
               </w:rPr>
               <w:t xml:space="preserve"> المطبوع برمز سويفت لكل حقل وبالكلمات العربية، والشاشة تسأل كل حقول MT700 في القاموس (منها 47A و44A و44B و40A و42C و58a) حين تنطبق</w:t>
+            </w:r>
+          </w:p>
+        </w:tc>
+      </w:tr>
+      <w:tr>
+        <w:trPr>
+          <w:cantSplit/>
+        </w:trPr>
+        <w:tc>
+          <w:tcPr>
+            <w:tcW w:type="dxa" w:w="925"/>
+            <w:tcBorders>
+              <w:top w:val="single" w:color="BFC9D6" w:sz="4"/>
+              <w:left w:val="single" w:color="BFC9D6" w:sz="4"/>
+              <w:bottom w:val="single" w:color="BFC9D6" w:sz="4"/>
+              <w:right w:val="single" w:color="BFC9D6" w:sz="4"/>
+            </w:tcBorders>
+            <w:tcMar>
+              <w:top w:type="dxa" w:w="50"/>
+              <w:left w:type="dxa" w:w="90"/>
+              <w:bottom w:type="dxa" w:w="50"/>
+              <w:right w:type="dxa" w:w="90"/>
+            </w:tcMar>
+            <w:vAlign w:val="top"/>
+          </w:tcPr>
+          <w:p>
+            <w:pPr>
+              <w:keepNext w:val="false"/>
+              <w:bidi/>
+              <w:spacing w:after="30" w:before="30" w:line="264"/>
+            </w:pPr>
+            <w:r>
+              <w:rPr>
+                <w:rFonts w:ascii="Arial" w:cs="Arial" w:eastAsia="Arial" w:hAnsi="Arial"/>
+                <w:b w:val="false"/>
+                <w:bCs w:val="false"/>
+                <w:sz w:val="18"/>
+                <w:szCs w:val="18"/>
+                <w:rtl/>
+              </w:rPr>
+              <w:t xml:space="preserve">69</w:t>
+            </w:r>
+          </w:p>
+        </w:tc>
+        <w:tc>
+          <w:tcPr>
+            <w:tcW w:type="dxa" w:w="2437"/>
+            <w:tcBorders>
+              <w:top w:val="single" w:color="BFC9D6" w:sz="4"/>
+              <w:left w:val="single" w:color="BFC9D6" w:sz="4"/>
+              <w:bottom w:val="single" w:color="BFC9D6" w:sz="4"/>
+              <w:right w:val="single" w:color="BFC9D6" w:sz="4"/>
+            </w:tcBorders>
+            <w:tcMar>
+              <w:top w:type="dxa" w:w="50"/>
+              <w:left w:type="dxa" w:w="90"/>
+              <w:bottom w:type="dxa" w:w="50"/>
+              <w:right w:type="dxa" w:w="90"/>
+            </w:tcMar>
+            <w:vAlign w:val="top"/>
+          </w:tcPr>
+          <w:p>
+            <w:pPr>
+              <w:keepNext w:val="false"/>
+              <w:bidi/>
+              <w:spacing w:after="30" w:before="30" w:line="264"/>
+            </w:pPr>
+            <w:r>
+              <w:rPr>
+                <w:rFonts w:ascii="Arial" w:cs="Arial" w:eastAsia="Arial" w:hAnsi="Arial"/>
+                <w:b/>
+                <w:bCs/>
+                <w:sz w:val="18"/>
+                <w:szCs w:val="18"/>
+                <w:rtl/>
+              </w:rPr>
+              <w:t xml:space="preserve">تصنيف البضاعة بالعربية، والإنجليزية لغة افتراضية (2026-10-26).</w:t>
+            </w:r>
+            <w:r>
+              <w:rPr>
+                <w:rFonts w:ascii="Arial" w:cs="Arial" w:eastAsia="Arial" w:hAnsi="Arial"/>
+                <w:b w:val="false"/>
+                <w:bCs w:val="false"/>
+                <w:sz w:val="18"/>
+                <w:szCs w:val="18"/>
+                <w:rtl/>
+              </w:rPr>
+              <w:t xml:space="preserve"> «اصلح تصنيف البضاعة ليظهر بالعربي»، و«النظام اللغة الافتراضية فيه الانكليزي و العربي الخيار الثاني... افتراضيا تلقائيا اللغة الانكليزية»</w:t>
+            </w:r>
+          </w:p>
+        </w:tc>
+        <w:tc>
+          <w:tcPr>
+            <w:tcW w:type="dxa" w:w="2290"/>
+            <w:tcBorders>
+              <w:top w:val="single" w:color="BFC9D6" w:sz="4"/>
+              <w:left w:val="single" w:color="BFC9D6" w:sz="4"/>
+              <w:bottom w:val="single" w:color="BFC9D6" w:sz="4"/>
+              <w:right w:val="single" w:color="BFC9D6" w:sz="4"/>
+            </w:tcBorders>
+            <w:tcMar>
+              <w:top w:type="dxa" w:w="50"/>
+              <w:left w:type="dxa" w:w="90"/>
+              <w:bottom w:type="dxa" w:w="50"/>
+              <w:right w:type="dxa" w:w="90"/>
+            </w:tcMar>
+            <w:vAlign w:val="top"/>
+          </w:tcPr>
+          <w:p>
+            <w:pPr>
+              <w:keepNext w:val="false"/>
+              <w:bidi/>
+              <w:spacing w:after="30" w:before="30" w:line="264"/>
+            </w:pPr>
+            <w:r>
+              <w:rPr>
+                <w:rFonts w:ascii="Arial" w:cs="Arial" w:eastAsia="Arial" w:hAnsi="Arial"/>
+                <w:b w:val="false"/>
+                <w:bCs w:val="false"/>
+                <w:sz w:val="18"/>
+                <w:szCs w:val="18"/>
+                <w:rtl/>
+              </w:rPr>
+              <w:t xml:space="preserve">الواجهة</w:t>
+            </w:r>
+          </w:p>
+        </w:tc>
+        <w:tc>
+          <w:tcPr>
+            <w:tcW w:type="dxa" w:w="4212"/>
+            <w:tcBorders>
+              <w:top w:val="single" w:color="BFC9D6" w:sz="4"/>
+              <w:left w:val="single" w:color="BFC9D6" w:sz="4"/>
+              <w:bottom w:val="single" w:color="BFC9D6" w:sz="4"/>
+              <w:right w:val="single" w:color="BFC9D6" w:sz="4"/>
+            </w:tcBorders>
+            <w:tcMar>
+              <w:top w:type="dxa" w:w="50"/>
+              <w:left w:type="dxa" w:w="90"/>
+              <w:bottom w:type="dxa" w:w="50"/>
+              <w:right w:type="dxa" w:w="90"/>
+            </w:tcMar>
+            <w:vAlign w:val="top"/>
+          </w:tcPr>
+          <w:p>
+            <w:pPr>
+              <w:keepNext w:val="false"/>
+              <w:bidi/>
+              <w:spacing w:after="30" w:before="30" w:line="264"/>
+            </w:pPr>
+            <w:r>
+              <w:rPr>
+                <w:rFonts w:ascii="Segoe UI Emoji" w:cs="Segoe UI Emoji" w:eastAsia="Segoe UI Emoji" w:hAnsi="Segoe UI Emoji"/>
+                <w:sz w:val="18"/>
+                <w:szCs w:val="18"/>
+                <w:rtl/>
+              </w:rPr>
+              <w:t xml:space="preserve">✅</w:t>
+            </w:r>
+            <w:r>
+              <w:rPr>
+                <w:rFonts w:ascii="Arial" w:cs="Arial" w:eastAsia="Arial" w:hAnsi="Arial"/>
+                <w:b w:val="false"/>
+                <w:bCs w:val="false"/>
+                <w:sz w:val="18"/>
+                <w:szCs w:val="18"/>
+                <w:rtl/>
+              </w:rPr>
+              <w:t xml:space="preserve"> </w:t>
+            </w:r>
+            <w:r>
+              <w:rPr>
+                <w:rFonts w:ascii="Arial" w:cs="Arial" w:eastAsia="Arial" w:hAnsi="Arial"/>
+                <w:b/>
+                <w:bCs/>
+                <w:sz w:val="18"/>
+                <w:szCs w:val="18"/>
+                <w:rtl/>
+              </w:rPr>
+              <w:t xml:space="preserve">منفّذ (</w:t>
+            </w:r>
+            <w:r>
+              <w:rPr>
+                <w:rFonts w:ascii="Courier New" w:cs="Courier New" w:eastAsia="Courier New" w:hAnsi="Courier New"/>
+                <w:b/>
+                <w:bCs/>
+                <w:color w:val="1F2937"/>
+                <w:sz w:val="16"/>
+                <w:szCs w:val="16"/>
+                <w:shd w:fill="F1F3F5" w:color="auto" w:val="clear"/>
+                <w:rtl/>
+              </w:rPr>
+              <w:t xml:space="preserve">‎docs/60‎</w:t>
+            </w:r>
+            <w:r>
+              <w:rPr>
+                <w:rFonts w:ascii="Arial" w:cs="Arial" w:eastAsia="Arial" w:hAnsi="Arial"/>
+                <w:b/>
+                <w:bCs/>
+                <w:sz w:val="18"/>
+                <w:szCs w:val="18"/>
+                <w:rtl/>
+              </w:rPr>
+              <w:t xml:space="preserve"> §8):</w:t>
+            </w:r>
+            <w:r>
+              <w:rPr>
+                <w:rFonts w:ascii="Arial" w:cs="Arial" w:eastAsia="Arial" w:hAnsi="Arial"/>
+                <w:b w:val="false"/>
+                <w:bCs w:val="false"/>
+                <w:sz w:val="18"/>
+                <w:szCs w:val="18"/>
+                <w:rtl/>
+              </w:rPr>
+              <w:t xml:space="preserve"> تصنيف البضاعة يظهر باسمه من الكتالوج في الشاشة والمطبوع. والشاشات تبدأ بالإنجليزية دائمًا، والعربية خيار يحفظه المستخدم. والمطبوعات والبريد بالإنجليزية ما لم يختر المستخدم العربية</w:t>
             </w:r>
           </w:p>
         </w:tc>

</xml_diff>

<commit_message>
Release 1.0.5: the terms screen in English words [release]
The pilot release 1.0.5: on the English terms screen the list values and the charges show as
English words instead of codes, and the text boxes' labels match the others. No database
change. docs/57, docs/31 row 70.

Co-Authored-By: Claude Opus 5.5 <noreply@anthropic.com>
Claude-Session: https://claude.ai/code/session_012HHcRrzuvMBTL2FYxXtsyv
</commit_message>
<xml_diff>
--- a/treasury-platform/docs/31-OWNER-DECISIONS.docx
+++ b/treasury-platform/docs/31-OWNER-DECISIONS.docx
@@ -15854,6 +15854,225 @@
                 <w:rtl/>
               </w:rPr>
               <w:t xml:space="preserve"> تصنيف البضاعة يظهر باسمه من الكتالوج في الشاشة والمطبوع. والشاشات تبدأ بالإنجليزية دائمًا، والعربية خيار يحفظه المستخدم. والمطبوعات والبريد بالإنجليزية ما لم يختر المستخدم العربية</w:t>
+            </w:r>
+          </w:p>
+        </w:tc>
+      </w:tr>
+      <w:tr>
+        <w:trPr>
+          <w:cantSplit/>
+        </w:trPr>
+        <w:tc>
+          <w:tcPr>
+            <w:tcW w:type="dxa" w:w="925"/>
+            <w:tcBorders>
+              <w:top w:val="single" w:color="BFC9D6" w:sz="4"/>
+              <w:left w:val="single" w:color="BFC9D6" w:sz="4"/>
+              <w:bottom w:val="single" w:color="BFC9D6" w:sz="4"/>
+              <w:right w:val="single" w:color="BFC9D6" w:sz="4"/>
+            </w:tcBorders>
+            <w:shd w:fill="F5F8FC" w:color="auto" w:val="clear"/>
+            <w:tcMar>
+              <w:top w:type="dxa" w:w="50"/>
+              <w:left w:type="dxa" w:w="90"/>
+              <w:bottom w:type="dxa" w:w="50"/>
+              <w:right w:type="dxa" w:w="90"/>
+            </w:tcMar>
+            <w:vAlign w:val="top"/>
+          </w:tcPr>
+          <w:p>
+            <w:pPr>
+              <w:keepNext w:val="false"/>
+              <w:bidi/>
+              <w:spacing w:after="30" w:before="30" w:line="264"/>
+            </w:pPr>
+            <w:r>
+              <w:rPr>
+                <w:rFonts w:ascii="Arial" w:cs="Arial" w:eastAsia="Arial" w:hAnsi="Arial"/>
+                <w:b w:val="false"/>
+                <w:bCs w:val="false"/>
+                <w:sz w:val="18"/>
+                <w:szCs w:val="18"/>
+                <w:rtl/>
+              </w:rPr>
+              <w:t xml:space="preserve">70</w:t>
+            </w:r>
+          </w:p>
+        </w:tc>
+        <w:tc>
+          <w:tcPr>
+            <w:tcW w:type="dxa" w:w="2437"/>
+            <w:tcBorders>
+              <w:top w:val="single" w:color="BFC9D6" w:sz="4"/>
+              <w:left w:val="single" w:color="BFC9D6" w:sz="4"/>
+              <w:bottom w:val="single" w:color="BFC9D6" w:sz="4"/>
+              <w:right w:val="single" w:color="BFC9D6" w:sz="4"/>
+            </w:tcBorders>
+            <w:shd w:fill="F5F8FC" w:color="auto" w:val="clear"/>
+            <w:tcMar>
+              <w:top w:type="dxa" w:w="50"/>
+              <w:left w:type="dxa" w:w="90"/>
+              <w:bottom w:type="dxa" w:w="50"/>
+              <w:right w:type="dxa" w:w="90"/>
+            </w:tcMar>
+            <w:vAlign w:val="top"/>
+          </w:tcPr>
+          <w:p>
+            <w:pPr>
+              <w:keepNext w:val="false"/>
+              <w:bidi/>
+              <w:spacing w:after="30" w:before="30" w:line="264"/>
+            </w:pPr>
+            <w:r>
+              <w:rPr>
+                <w:rFonts w:ascii="Arial" w:cs="Arial" w:eastAsia="Arial" w:hAnsi="Arial"/>
+                <w:b/>
+                <w:bCs/>
+                <w:sz w:val="18"/>
+                <w:szCs w:val="18"/>
+                <w:rtl/>
+              </w:rPr>
+              <w:t xml:space="preserve">الإصداران 1.0.4 و1.0.5 (2026-10-26).</w:t>
+            </w:r>
+            <w:r>
+              <w:rPr>
+                <w:rFonts w:ascii="Arial" w:cs="Arial" w:eastAsia="Arial" w:hAnsi="Arial"/>
+                <w:b w:val="false"/>
+                <w:bCs w:val="false"/>
+                <w:sz w:val="18"/>
+                <w:szCs w:val="18"/>
+                <w:rtl/>
+              </w:rPr>
+              <w:t xml:space="preserve"> «نعم أصدر 1.0.4»، ثم «نعم أصدر 1.0.5»</w:t>
+            </w:r>
+          </w:p>
+        </w:tc>
+        <w:tc>
+          <w:tcPr>
+            <w:tcW w:type="dxa" w:w="2290"/>
+            <w:tcBorders>
+              <w:top w:val="single" w:color="BFC9D6" w:sz="4"/>
+              <w:left w:val="single" w:color="BFC9D6" w:sz="4"/>
+              <w:bottom w:val="single" w:color="BFC9D6" w:sz="4"/>
+              <w:right w:val="single" w:color="BFC9D6" w:sz="4"/>
+            </w:tcBorders>
+            <w:shd w:fill="F5F8FC" w:color="auto" w:val="clear"/>
+            <w:tcMar>
+              <w:top w:type="dxa" w:w="50"/>
+              <w:left w:type="dxa" w:w="90"/>
+              <w:bottom w:type="dxa" w:w="50"/>
+              <w:right w:type="dxa" w:w="90"/>
+            </w:tcMar>
+            <w:vAlign w:val="top"/>
+          </w:tcPr>
+          <w:p>
+            <w:pPr>
+              <w:keepNext w:val="false"/>
+              <w:bidi/>
+              <w:spacing w:after="30" w:before="30" w:line="264"/>
+            </w:pPr>
+            <w:r>
+              <w:rPr>
+                <w:rFonts w:ascii="Arial" w:cs="Arial" w:eastAsia="Arial" w:hAnsi="Arial"/>
+                <w:b w:val="false"/>
+                <w:bCs w:val="false"/>
+                <w:sz w:val="18"/>
+                <w:szCs w:val="18"/>
+                <w:rtl/>
+              </w:rPr>
+              <w:t xml:space="preserve">النشر</w:t>
+            </w:r>
+          </w:p>
+        </w:tc>
+        <w:tc>
+          <w:tcPr>
+            <w:tcW w:type="dxa" w:w="4212"/>
+            <w:tcBorders>
+              <w:top w:val="single" w:color="BFC9D6" w:sz="4"/>
+              <w:left w:val="single" w:color="BFC9D6" w:sz="4"/>
+              <w:bottom w:val="single" w:color="BFC9D6" w:sz="4"/>
+              <w:right w:val="single" w:color="BFC9D6" w:sz="4"/>
+            </w:tcBorders>
+            <w:shd w:fill="F5F8FC" w:color="auto" w:val="clear"/>
+            <w:tcMar>
+              <w:top w:type="dxa" w:w="50"/>
+              <w:left w:type="dxa" w:w="90"/>
+              <w:bottom w:type="dxa" w:w="50"/>
+              <w:right w:type="dxa" w:w="90"/>
+            </w:tcMar>
+            <w:vAlign w:val="top"/>
+          </w:tcPr>
+          <w:p>
+            <w:pPr>
+              <w:keepNext w:val="false"/>
+              <w:bidi/>
+              <w:spacing w:after="30" w:before="30" w:line="264"/>
+            </w:pPr>
+            <w:r>
+              <w:rPr>
+                <w:rFonts w:ascii="Segoe UI Emoji" w:cs="Segoe UI Emoji" w:eastAsia="Segoe UI Emoji" w:hAnsi="Segoe UI Emoji"/>
+                <w:sz w:val="18"/>
+                <w:szCs w:val="18"/>
+                <w:rtl/>
+              </w:rPr>
+              <w:t xml:space="preserve">✅</w:t>
+            </w:r>
+            <w:r>
+              <w:rPr>
+                <w:rFonts w:ascii="Arial" w:cs="Arial" w:eastAsia="Arial" w:hAnsi="Arial"/>
+                <w:b w:val="false"/>
+                <w:bCs w:val="false"/>
+                <w:sz w:val="18"/>
+                <w:szCs w:val="18"/>
+                <w:rtl/>
+              </w:rPr>
+              <w:t xml:space="preserve"> </w:t>
+            </w:r>
+            <w:r>
+              <w:rPr>
+                <w:rFonts w:ascii="Arial" w:cs="Arial" w:eastAsia="Arial" w:hAnsi="Arial"/>
+                <w:b/>
+                <w:bCs/>
+                <w:sz w:val="18"/>
+                <w:szCs w:val="18"/>
+                <w:rtl/>
+              </w:rPr>
+              <w:t xml:space="preserve">منفّذ (</w:t>
+            </w:r>
+            <w:r>
+              <w:rPr>
+                <w:rFonts w:ascii="Courier New" w:cs="Courier New" w:eastAsia="Courier New" w:hAnsi="Courier New"/>
+                <w:b/>
+                <w:bCs/>
+                <w:color w:val="1F2937"/>
+                <w:sz w:val="16"/>
+                <w:szCs w:val="16"/>
+                <w:shd w:fill="F1F3F5" w:color="auto" w:val="clear"/>
+                <w:rtl/>
+              </w:rPr>
+              <w:t xml:space="preserve">‎docs/57‎</w:t>
+            </w:r>
+            <w:r>
+              <w:rPr>
+                <w:rFonts w:ascii="Arial" w:cs="Arial" w:eastAsia="Arial" w:hAnsi="Arial"/>
+                <w:b/>
+                <w:bCs/>
+                <w:sz w:val="18"/>
+                <w:szCs w:val="18"/>
+                <w:rtl/>
+              </w:rPr>
+              <w:t xml:space="preserve">):</w:t>
+            </w:r>
+            <w:r>
+              <w:rPr>
+                <w:rFonts w:ascii="Arial" w:cs="Arial" w:eastAsia="Arial" w:hAnsi="Arial"/>
+                <w:b w:val="false"/>
+                <w:bCs w:val="false"/>
+                <w:sz w:val="18"/>
+                <w:szCs w:val="18"/>
+                <w:rtl/>
+              </w:rPr>
+              <w:t xml:space="preserve"> 1.0.4 بتصنيف البضاعة والإنجليزية لغة افتراضية، و1.0.5 بقيم القوائم الإنجليزية في شاشة الشروط. والإصدار لا يُنشر إلا بعد نجاح كل الاختبارات في GitHub</w:t>
             </w:r>
           </w:p>
         </w:tc>

</xml_diff>

<commit_message>
Owner decisions 71 (codes as words in English) and 72 (request numbering by company and department, kept for later)
Co-Authored-By: Claude Opus 5.5 <noreply@anthropic.com>
Claude-Session: https://claude.ai/code/session_012HHcRrzuvMBTL2FYxXtsyv
</commit_message>
<xml_diff>
--- a/treasury-platform/docs/31-OWNER-DECISIONS.docx
+++ b/treasury-platform/docs/31-OWNER-DECISIONS.docx
@@ -16073,6 +16073,383 @@
                 <w:rtl/>
               </w:rPr>
               <w:t xml:space="preserve"> 1.0.4 بتصنيف البضاعة والإنجليزية لغة افتراضية، و1.0.5 بقيم القوائم الإنجليزية في شاشة الشروط. والإصدار لا يُنشر إلا بعد نجاح كل الاختبارات في GitHub</w:t>
+            </w:r>
+          </w:p>
+        </w:tc>
+      </w:tr>
+      <w:tr>
+        <w:trPr>
+          <w:cantSplit/>
+        </w:trPr>
+        <w:tc>
+          <w:tcPr>
+            <w:tcW w:type="dxa" w:w="925"/>
+            <w:tcBorders>
+              <w:top w:val="single" w:color="BFC9D6" w:sz="4"/>
+              <w:left w:val="single" w:color="BFC9D6" w:sz="4"/>
+              <w:bottom w:val="single" w:color="BFC9D6" w:sz="4"/>
+              <w:right w:val="single" w:color="BFC9D6" w:sz="4"/>
+            </w:tcBorders>
+            <w:tcMar>
+              <w:top w:type="dxa" w:w="50"/>
+              <w:left w:type="dxa" w:w="90"/>
+              <w:bottom w:type="dxa" w:w="50"/>
+              <w:right w:type="dxa" w:w="90"/>
+            </w:tcMar>
+            <w:vAlign w:val="top"/>
+          </w:tcPr>
+          <w:p>
+            <w:pPr>
+              <w:keepNext w:val="false"/>
+              <w:bidi/>
+              <w:spacing w:after="30" w:before="30" w:line="264"/>
+            </w:pPr>
+            <w:r>
+              <w:rPr>
+                <w:rFonts w:ascii="Arial" w:cs="Arial" w:eastAsia="Arial" w:hAnsi="Arial"/>
+                <w:b w:val="false"/>
+                <w:bCs w:val="false"/>
+                <w:sz w:val="18"/>
+                <w:szCs w:val="18"/>
+                <w:rtl/>
+              </w:rPr>
+              <w:t xml:space="preserve">71</w:t>
+            </w:r>
+          </w:p>
+        </w:tc>
+        <w:tc>
+          <w:tcPr>
+            <w:tcW w:type="dxa" w:w="2437"/>
+            <w:tcBorders>
+              <w:top w:val="single" w:color="BFC9D6" w:sz="4"/>
+              <w:left w:val="single" w:color="BFC9D6" w:sz="4"/>
+              <w:bottom w:val="single" w:color="BFC9D6" w:sz="4"/>
+              <w:right w:val="single" w:color="BFC9D6" w:sz="4"/>
+            </w:tcBorders>
+            <w:tcMar>
+              <w:top w:type="dxa" w:w="50"/>
+              <w:left w:type="dxa" w:w="90"/>
+              <w:bottom w:type="dxa" w:w="50"/>
+              <w:right w:type="dxa" w:w="90"/>
+            </w:tcMar>
+            <w:vAlign w:val="top"/>
+          </w:tcPr>
+          <w:p>
+            <w:pPr>
+              <w:keepNext w:val="false"/>
+              <w:bidi/>
+              <w:spacing w:after="30" w:before="30" w:line="264"/>
+            </w:pPr>
+            <w:r>
+              <w:rPr>
+                <w:rFonts w:ascii="Arial" w:cs="Arial" w:eastAsia="Arial" w:hAnsi="Arial"/>
+                <w:b/>
+                <w:bCs/>
+                <w:sz w:val="18"/>
+                <w:szCs w:val="18"/>
+                <w:rtl/>
+              </w:rPr>
+              <w:t xml:space="preserve">الرموز كلمات في الشاشات الإنجليزية، والإصدار 1.0.6 (2026-10-26).</w:t>
+            </w:r>
+            <w:r>
+              <w:rPr>
+                <w:rFonts w:ascii="Arial" w:cs="Arial" w:eastAsia="Arial" w:hAnsi="Arial"/>
+                <w:b w:val="false"/>
+                <w:bCs w:val="false"/>
+                <w:sz w:val="18"/>
+                <w:szCs w:val="18"/>
+                <w:rtl/>
+              </w:rPr>
+              <w:t xml:space="preserve"> «اصلح الرموز في بطاقة التسهيل وأصدر 1.0.6»</w:t>
+            </w:r>
+          </w:p>
+        </w:tc>
+        <w:tc>
+          <w:tcPr>
+            <w:tcW w:type="dxa" w:w="2290"/>
+            <w:tcBorders>
+              <w:top w:val="single" w:color="BFC9D6" w:sz="4"/>
+              <w:left w:val="single" w:color="BFC9D6" w:sz="4"/>
+              <w:bottom w:val="single" w:color="BFC9D6" w:sz="4"/>
+              <w:right w:val="single" w:color="BFC9D6" w:sz="4"/>
+            </w:tcBorders>
+            <w:tcMar>
+              <w:top w:type="dxa" w:w="50"/>
+              <w:left w:type="dxa" w:w="90"/>
+              <w:bottom w:type="dxa" w:w="50"/>
+              <w:right w:type="dxa" w:w="90"/>
+            </w:tcMar>
+            <w:vAlign w:val="top"/>
+          </w:tcPr>
+          <w:p>
+            <w:pPr>
+              <w:keepNext w:val="false"/>
+              <w:bidi/>
+              <w:spacing w:after="30" w:before="30" w:line="264"/>
+            </w:pPr>
+            <w:r>
+              <w:rPr>
+                <w:rFonts w:ascii="Arial" w:cs="Arial" w:eastAsia="Arial" w:hAnsi="Arial"/>
+                <w:b w:val="false"/>
+                <w:bCs w:val="false"/>
+                <w:sz w:val="18"/>
+                <w:szCs w:val="18"/>
+                <w:rtl/>
+              </w:rPr>
+              <w:t xml:space="preserve">الواجهة</w:t>
+            </w:r>
+          </w:p>
+        </w:tc>
+        <w:tc>
+          <w:tcPr>
+            <w:tcW w:type="dxa" w:w="4212"/>
+            <w:tcBorders>
+              <w:top w:val="single" w:color="BFC9D6" w:sz="4"/>
+              <w:left w:val="single" w:color="BFC9D6" w:sz="4"/>
+              <w:bottom w:val="single" w:color="BFC9D6" w:sz="4"/>
+              <w:right w:val="single" w:color="BFC9D6" w:sz="4"/>
+            </w:tcBorders>
+            <w:tcMar>
+              <w:top w:type="dxa" w:w="50"/>
+              <w:left w:type="dxa" w:w="90"/>
+              <w:bottom w:type="dxa" w:w="50"/>
+              <w:right w:type="dxa" w:w="90"/>
+            </w:tcMar>
+            <w:vAlign w:val="top"/>
+          </w:tcPr>
+          <w:p>
+            <w:pPr>
+              <w:keepNext w:val="false"/>
+              <w:bidi/>
+              <w:spacing w:after="30" w:before="30" w:line="264"/>
+            </w:pPr>
+            <w:r>
+              <w:rPr>
+                <w:rFonts w:ascii="Segoe UI Emoji" w:cs="Segoe UI Emoji" w:eastAsia="Segoe UI Emoji" w:hAnsi="Segoe UI Emoji"/>
+                <w:sz w:val="18"/>
+                <w:szCs w:val="18"/>
+                <w:rtl/>
+              </w:rPr>
+              <w:t xml:space="preserve">✅</w:t>
+            </w:r>
+            <w:r>
+              <w:rPr>
+                <w:rFonts w:ascii="Arial" w:cs="Arial" w:eastAsia="Arial" w:hAnsi="Arial"/>
+                <w:b w:val="false"/>
+                <w:bCs w:val="false"/>
+                <w:sz w:val="18"/>
+                <w:szCs w:val="18"/>
+                <w:rtl/>
+              </w:rPr>
+              <w:t xml:space="preserve"> </w:t>
+            </w:r>
+            <w:r>
+              <w:rPr>
+                <w:rFonts w:ascii="Arial" w:cs="Arial" w:eastAsia="Arial" w:hAnsi="Arial"/>
+                <w:b/>
+                <w:bCs/>
+                <w:sz w:val="18"/>
+                <w:szCs w:val="18"/>
+                <w:rtl/>
+              </w:rPr>
+              <w:t xml:space="preserve">منفّذ:</w:t>
+            </w:r>
+            <w:r>
+              <w:rPr>
+                <w:rFonts w:ascii="Arial" w:cs="Arial" w:eastAsia="Arial" w:hAnsi="Arial"/>
+                <w:b w:val="false"/>
+                <w:bCs w:val="false"/>
+                <w:sz w:val="18"/>
+                <w:szCs w:val="18"/>
+                <w:rtl/>
+              </w:rPr>
+              <w:t xml:space="preserve"> في الإنجليزية يظهر كل رمز من الخادم كلمة (Active، Valid، Sole lender، Documentary credits، Shared cap)، والاختصارات كما هي، وخط المنتج باسمه</w:t>
+            </w:r>
+          </w:p>
+        </w:tc>
+      </w:tr>
+      <w:tr>
+        <w:trPr>
+          <w:cantSplit/>
+        </w:trPr>
+        <w:tc>
+          <w:tcPr>
+            <w:tcW w:type="dxa" w:w="925"/>
+            <w:tcBorders>
+              <w:top w:val="single" w:color="BFC9D6" w:sz="4"/>
+              <w:left w:val="single" w:color="BFC9D6" w:sz="4"/>
+              <w:bottom w:val="single" w:color="BFC9D6" w:sz="4"/>
+              <w:right w:val="single" w:color="BFC9D6" w:sz="4"/>
+            </w:tcBorders>
+            <w:shd w:fill="F5F8FC" w:color="auto" w:val="clear"/>
+            <w:tcMar>
+              <w:top w:type="dxa" w:w="50"/>
+              <w:left w:type="dxa" w:w="90"/>
+              <w:bottom w:type="dxa" w:w="50"/>
+              <w:right w:type="dxa" w:w="90"/>
+            </w:tcMar>
+            <w:vAlign w:val="top"/>
+          </w:tcPr>
+          <w:p>
+            <w:pPr>
+              <w:keepNext w:val="false"/>
+              <w:bidi/>
+              <w:spacing w:after="30" w:before="30" w:line="264"/>
+            </w:pPr>
+            <w:r>
+              <w:rPr>
+                <w:rFonts w:ascii="Arial" w:cs="Arial" w:eastAsia="Arial" w:hAnsi="Arial"/>
+                <w:b w:val="false"/>
+                <w:bCs w:val="false"/>
+                <w:sz w:val="18"/>
+                <w:szCs w:val="18"/>
+                <w:rtl/>
+              </w:rPr>
+              <w:t xml:space="preserve">72</w:t>
+            </w:r>
+          </w:p>
+        </w:tc>
+        <w:tc>
+          <w:tcPr>
+            <w:tcW w:type="dxa" w:w="2437"/>
+            <w:tcBorders>
+              <w:top w:val="single" w:color="BFC9D6" w:sz="4"/>
+              <w:left w:val="single" w:color="BFC9D6" w:sz="4"/>
+              <w:bottom w:val="single" w:color="BFC9D6" w:sz="4"/>
+              <w:right w:val="single" w:color="BFC9D6" w:sz="4"/>
+            </w:tcBorders>
+            <w:shd w:fill="F5F8FC" w:color="auto" w:val="clear"/>
+            <w:tcMar>
+              <w:top w:type="dxa" w:w="50"/>
+              <w:left w:type="dxa" w:w="90"/>
+              <w:bottom w:type="dxa" w:w="50"/>
+              <w:right w:type="dxa" w:w="90"/>
+            </w:tcMar>
+            <w:vAlign w:val="top"/>
+          </w:tcPr>
+          <w:p>
+            <w:pPr>
+              <w:keepNext w:val="false"/>
+              <w:bidi/>
+              <w:spacing w:after="30" w:before="30" w:line="264"/>
+            </w:pPr>
+            <w:r>
+              <w:rPr>
+                <w:rFonts w:ascii="Arial" w:cs="Arial" w:eastAsia="Arial" w:hAnsi="Arial"/>
+                <w:b/>
+                <w:bCs/>
+                <w:sz w:val="18"/>
+                <w:szCs w:val="18"/>
+                <w:rtl/>
+              </w:rPr>
+              <w:t xml:space="preserve">ترقيم الطلبات برمز الشركة والقسم، ومراجع الطلب المتعددة (2026-10-26).</w:t>
+            </w:r>
+            <w:r>
+              <w:rPr>
+                <w:rFonts w:ascii="Arial" w:cs="Arial" w:eastAsia="Arial" w:hAnsi="Arial"/>
+                <w:b w:val="false"/>
+                <w:bCs w:val="false"/>
+                <w:sz w:val="18"/>
+                <w:szCs w:val="18"/>
+                <w:rtl/>
+              </w:rPr>
+              <w:t xml:space="preserve"> «ترميز الطلبات يعتمد على رمز الشركة... SA05-IMP-00001... ارى ان يتم ربط الطلب اولا حسب نوع الطلب الى حين الانتهاء كليا من اصداره... كلها ارقام مرجعية تحفظ لدينا في النظام»</w:t>
+            </w:r>
+          </w:p>
+        </w:tc>
+        <w:tc>
+          <w:tcPr>
+            <w:tcW w:type="dxa" w:w="2290"/>
+            <w:tcBorders>
+              <w:top w:val="single" w:color="BFC9D6" w:sz="4"/>
+              <w:left w:val="single" w:color="BFC9D6" w:sz="4"/>
+              <w:bottom w:val="single" w:color="BFC9D6" w:sz="4"/>
+              <w:right w:val="single" w:color="BFC9D6" w:sz="4"/>
+            </w:tcBorders>
+            <w:shd w:fill="F5F8FC" w:color="auto" w:val="clear"/>
+            <w:tcMar>
+              <w:top w:type="dxa" w:w="50"/>
+              <w:left w:type="dxa" w:w="90"/>
+              <w:bottom w:type="dxa" w:w="50"/>
+              <w:right w:type="dxa" w:w="90"/>
+            </w:tcMar>
+            <w:vAlign w:val="top"/>
+          </w:tcPr>
+          <w:p>
+            <w:pPr>
+              <w:keepNext w:val="false"/>
+              <w:bidi/>
+              <w:spacing w:after="30" w:before="30" w:line="264"/>
+            </w:pPr>
+            <w:r>
+              <w:rPr>
+                <w:rFonts w:ascii="Arial" w:cs="Arial" w:eastAsia="Arial" w:hAnsi="Arial"/>
+                <w:b w:val="false"/>
+                <w:bCs w:val="false"/>
+                <w:sz w:val="18"/>
+                <w:szCs w:val="18"/>
+                <w:rtl/>
+              </w:rPr>
+              <w:t xml:space="preserve">طلبات الخزينة</w:t>
+            </w:r>
+          </w:p>
+        </w:tc>
+        <w:tc>
+          <w:tcPr>
+            <w:tcW w:type="dxa" w:w="4212"/>
+            <w:tcBorders>
+              <w:top w:val="single" w:color="BFC9D6" w:sz="4"/>
+              <w:left w:val="single" w:color="BFC9D6" w:sz="4"/>
+              <w:bottom w:val="single" w:color="BFC9D6" w:sz="4"/>
+              <w:right w:val="single" w:color="BFC9D6" w:sz="4"/>
+            </w:tcBorders>
+            <w:shd w:fill="F5F8FC" w:color="auto" w:val="clear"/>
+            <w:tcMar>
+              <w:top w:type="dxa" w:w="50"/>
+              <w:left w:type="dxa" w:w="90"/>
+              <w:bottom w:type="dxa" w:w="50"/>
+              <w:right w:type="dxa" w:w="90"/>
+            </w:tcMar>
+            <w:vAlign w:val="top"/>
+          </w:tcPr>
+          <w:p>
+            <w:pPr>
+              <w:keepNext w:val="false"/>
+              <w:bidi/>
+              <w:spacing w:after="30" w:before="30" w:line="264"/>
+            </w:pPr>
+            <w:r>
+              <w:rPr>
+                <w:rFonts w:ascii="Arial" w:cs="Arial" w:eastAsia="Arial" w:hAnsi="Arial"/>
+                <w:b w:val="false"/>
+                <w:bCs w:val="false"/>
+                <w:sz w:val="18"/>
+                <w:szCs w:val="18"/>
+                <w:rtl/>
+              </w:rPr>
+              <w:t xml:space="preserve">⏳ </w:t>
+            </w:r>
+            <w:r>
+              <w:rPr>
+                <w:rFonts w:ascii="Arial" w:cs="Arial" w:eastAsia="Arial" w:hAnsi="Arial"/>
+                <w:b/>
+                <w:bCs/>
+                <w:sz w:val="18"/>
+                <w:szCs w:val="18"/>
+                <w:rtl/>
+              </w:rPr>
+              <w:t xml:space="preserve">مسجّل للتطوير اللاحق، كما طلب المالك («ان لم يتم تصميمها وفقا لها يتم تخزينها لتعديلات لاحقة»):</w:t>
+            </w:r>
+            <w:r>
+              <w:rPr>
+                <w:rFonts w:ascii="Arial" w:cs="Arial" w:eastAsia="Arial" w:hAnsi="Arial"/>
+                <w:b w:val="false"/>
+                <w:bCs w:val="false"/>
+                <w:sz w:val="18"/>
+                <w:szCs w:val="18"/>
+                <w:rtl/>
+              </w:rPr>
+              <w:t xml:space="preserve"> رقم عام للطلب حسب القسم يبقى ثابتًا، ورقم الشركة بعد الإصدار النهائي، وسجل مراجع للطلب (ERP، رقم الاعتماد من البنك، مرجع البنك، مرجع بنك المستفيد)</w:t>
             </w:r>
           </w:p>
         </w:tc>

</xml_diff>

<commit_message>
Owner decision 73: request types and workflows defined by the tenant's administrator, one screen per category (kept for later, with row 72)
Co-Authored-By: Claude Opus 5.5 <noreply@anthropic.com>
Claude-Session: https://claude.ai/code/session_012HHcRrzuvMBTL2FYxXtsyv
</commit_message>
<xml_diff>
--- a/treasury-platform/docs/31-OWNER-DECISIONS.docx
+++ b/treasury-platform/docs/31-OWNER-DECISIONS.docx
@@ -16450,6 +16450,188 @@
                 <w:rtl/>
               </w:rPr>
               <w:t xml:space="preserve"> رقم عام للطلب حسب القسم يبقى ثابتًا، ورقم الشركة بعد الإصدار النهائي، وسجل مراجع للطلب (ERP، رقم الاعتماد من البنك، مرجع البنك، مرجع بنك المستفيد)</w:t>
+            </w:r>
+          </w:p>
+        </w:tc>
+      </w:tr>
+      <w:tr>
+        <w:trPr>
+          <w:cantSplit/>
+        </w:trPr>
+        <w:tc>
+          <w:tcPr>
+            <w:tcW w:type="dxa" w:w="925"/>
+            <w:tcBorders>
+              <w:top w:val="single" w:color="BFC9D6" w:sz="4"/>
+              <w:left w:val="single" w:color="BFC9D6" w:sz="4"/>
+              <w:bottom w:val="single" w:color="BFC9D6" w:sz="4"/>
+              <w:right w:val="single" w:color="BFC9D6" w:sz="4"/>
+            </w:tcBorders>
+            <w:tcMar>
+              <w:top w:type="dxa" w:w="50"/>
+              <w:left w:type="dxa" w:w="90"/>
+              <w:bottom w:type="dxa" w:w="50"/>
+              <w:right w:type="dxa" w:w="90"/>
+            </w:tcMar>
+            <w:vAlign w:val="top"/>
+          </w:tcPr>
+          <w:p>
+            <w:pPr>
+              <w:keepNext w:val="false"/>
+              <w:bidi/>
+              <w:spacing w:after="30" w:before="30" w:line="264"/>
+            </w:pPr>
+            <w:r>
+              <w:rPr>
+                <w:rFonts w:ascii="Arial" w:cs="Arial" w:eastAsia="Arial" w:hAnsi="Arial"/>
+                <w:b w:val="false"/>
+                <w:bCs w:val="false"/>
+                <w:sz w:val="18"/>
+                <w:szCs w:val="18"/>
+                <w:rtl/>
+              </w:rPr>
+              <w:t xml:space="preserve">73</w:t>
+            </w:r>
+          </w:p>
+        </w:tc>
+        <w:tc>
+          <w:tcPr>
+            <w:tcW w:type="dxa" w:w="2437"/>
+            <w:tcBorders>
+              <w:top w:val="single" w:color="BFC9D6" w:sz="4"/>
+              <w:left w:val="single" w:color="BFC9D6" w:sz="4"/>
+              <w:bottom w:val="single" w:color="BFC9D6" w:sz="4"/>
+              <w:right w:val="single" w:color="BFC9D6" w:sz="4"/>
+            </w:tcBorders>
+            <w:tcMar>
+              <w:top w:type="dxa" w:w="50"/>
+              <w:left w:type="dxa" w:w="90"/>
+              <w:bottom w:type="dxa" w:w="50"/>
+              <w:right w:type="dxa" w:w="90"/>
+            </w:tcMar>
+            <w:vAlign w:val="top"/>
+          </w:tcPr>
+          <w:p>
+            <w:pPr>
+              <w:keepNext w:val="false"/>
+              <w:bidi/>
+              <w:spacing w:after="30" w:before="30" w:line="264"/>
+            </w:pPr>
+            <w:r>
+              <w:rPr>
+                <w:rFonts w:ascii="Arial" w:cs="Arial" w:eastAsia="Arial" w:hAnsi="Arial"/>
+                <w:b/>
+                <w:bCs/>
+                <w:sz w:val="18"/>
+                <w:szCs w:val="18"/>
+                <w:rtl/>
+              </w:rPr>
+              <w:t xml:space="preserve">دورات العمل يعرّفها مدير نظام المشترك، وشاشة واحدة لكل فئة (2026-10-26).</w:t>
+            </w:r>
+            <w:r>
+              <w:rPr>
+                <w:rFonts w:ascii="Arial" w:cs="Arial" w:eastAsia="Arial" w:hAnsi="Arial"/>
+                <w:b w:val="false"/>
+                <w:bCs w:val="false"/>
+                <w:sz w:val="18"/>
+                <w:szCs w:val="18"/>
+                <w:rtl/>
+              </w:rPr>
+              <w:t xml:space="preserve"> «في شاشة واحدة للطلبات العامة و يتم تحديد نوع الطلب من الخيارات... تعريف الطلبات لكل شركة يتم عبر مدير النظام لديهم... ادارة المنصة لا تتدخل... و لايمكن ان تتطلع على سجلاتهم... كل دورة عمل يتم تصنيفها لتظهر في اي شاشة (اعتمادات استيراد - اعتمادات تصدير - طلبات عامة - او اخرى)»، و«هذا السيناريو يعطي نظاما اقوى و مرنا و قابل للتخصيص»</w:t>
+            </w:r>
+          </w:p>
+        </w:tc>
+        <w:tc>
+          <w:tcPr>
+            <w:tcW w:type="dxa" w:w="2290"/>
+            <w:tcBorders>
+              <w:top w:val="single" w:color="BFC9D6" w:sz="4"/>
+              <w:left w:val="single" w:color="BFC9D6" w:sz="4"/>
+              <w:bottom w:val="single" w:color="BFC9D6" w:sz="4"/>
+              <w:right w:val="single" w:color="BFC9D6" w:sz="4"/>
+            </w:tcBorders>
+            <w:tcMar>
+              <w:top w:type="dxa" w:w="50"/>
+              <w:left w:type="dxa" w:w="90"/>
+              <w:bottom w:type="dxa" w:w="50"/>
+              <w:right w:type="dxa" w:w="90"/>
+            </w:tcMar>
+            <w:vAlign w:val="top"/>
+          </w:tcPr>
+          <w:p>
+            <w:pPr>
+              <w:keepNext w:val="false"/>
+              <w:bidi/>
+              <w:spacing w:after="30" w:before="30" w:line="264"/>
+            </w:pPr>
+            <w:r>
+              <w:rPr>
+                <w:rFonts w:ascii="Arial" w:cs="Arial" w:eastAsia="Arial" w:hAnsi="Arial"/>
+                <w:b w:val="false"/>
+                <w:bCs w:val="false"/>
+                <w:sz w:val="18"/>
+                <w:szCs w:val="18"/>
+                <w:rtl/>
+              </w:rPr>
+              <w:t xml:space="preserve">طلبات الخزينة</w:t>
+            </w:r>
+          </w:p>
+        </w:tc>
+        <w:tc>
+          <w:tcPr>
+            <w:tcW w:type="dxa" w:w="4212"/>
+            <w:tcBorders>
+              <w:top w:val="single" w:color="BFC9D6" w:sz="4"/>
+              <w:left w:val="single" w:color="BFC9D6" w:sz="4"/>
+              <w:bottom w:val="single" w:color="BFC9D6" w:sz="4"/>
+              <w:right w:val="single" w:color="BFC9D6" w:sz="4"/>
+            </w:tcBorders>
+            <w:tcMar>
+              <w:top w:type="dxa" w:w="50"/>
+              <w:left w:type="dxa" w:w="90"/>
+              <w:bottom w:type="dxa" w:w="50"/>
+              <w:right w:type="dxa" w:w="90"/>
+            </w:tcMar>
+            <w:vAlign w:val="top"/>
+          </w:tcPr>
+          <w:p>
+            <w:pPr>
+              <w:keepNext w:val="false"/>
+              <w:bidi/>
+              <w:spacing w:after="30" w:before="30" w:line="264"/>
+            </w:pPr>
+            <w:r>
+              <w:rPr>
+                <w:rFonts w:ascii="Arial" w:cs="Arial" w:eastAsia="Arial" w:hAnsi="Arial"/>
+                <w:b w:val="false"/>
+                <w:bCs w:val="false"/>
+                <w:sz w:val="18"/>
+                <w:szCs w:val="18"/>
+                <w:rtl/>
+              </w:rPr>
+              <w:t xml:space="preserve">⏳ </w:t>
+            </w:r>
+            <w:r>
+              <w:rPr>
+                <w:rFonts w:ascii="Arial" w:cs="Arial" w:eastAsia="Arial" w:hAnsi="Arial"/>
+                <w:b/>
+                <w:bCs/>
+                <w:sz w:val="18"/>
+                <w:szCs w:val="18"/>
+                <w:rtl/>
+              </w:rPr>
+              <w:t xml:space="preserve">مسجّل للتطوير اللاحق، يُنفَّذ مع الصف 72:</w:t>
+            </w:r>
+            <w:r>
+              <w:rPr>
+                <w:rFonts w:ascii="Arial" w:cs="Arial" w:eastAsia="Arial" w:hAnsi="Arial"/>
+                <w:b w:val="false"/>
+                <w:bCs w:val="false"/>
+                <w:sz w:val="18"/>
+                <w:szCs w:val="18"/>
+                <w:rtl/>
+              </w:rPr>
+              <w:t xml:space="preserve"> شاشة إعدادات لمدير نظام المشترك يعرّف فيها أنواع الطلبات ودوراتها وموافقاتها والمعنيين في الخزينة لكل نوع، وفئة لكل نوع تحدد شاشته. وعزل بيانات المشترك عن إدارة المنصة قائم اليوم، إلا بإذن دعم يمنحه المشترك</w:t>
             </w:r>
           </w:p>
         </w:tc>

</xml_diff>

<commit_message>
The company number of a request, given when the bank issues it (docs/31 row 72)
wfl.RequestCompanyNumber holds one number a request: the company's code, the department code of its
type (IMP, EXP, GEN or TRS by category, or the prefix of a tenant's own type) and the gap-free
sequence co:<code> of that company, as SA05-IMP-00001. The engine gives it once on reaching the
workflow's successful end, for the company the request is issued for then; a request on an issued
credit keeps its parent's numbers. The request page, the lists, the CSV, the search and the print
show it. Migration V0001 creates the table; a 1.0.7 database migrated with it has the fingerprint of
a fresh one (checked locally). No release.

Co-Authored-By: Claude Opus 5.5 <noreply@anthropic.com>
Claude-Session: https://claude.ai/code/session_012HHcRrzuvMBTL2FYxXtsyv
</commit_message>
<xml_diff>
--- a/treasury-platform/docs/31-OWNER-DECISIONS.docx
+++ b/treasury-platform/docs/31-OWNER-DECISIONS.docx
@@ -16420,14 +16420,23 @@
             </w:pPr>
             <w:r>
               <w:rPr>
-                <w:rFonts w:ascii="Arial" w:cs="Arial" w:eastAsia="Arial" w:hAnsi="Arial"/>
-                <w:b w:val="false"/>
-                <w:bCs w:val="false"/>
-                <w:sz w:val="18"/>
-                <w:szCs w:val="18"/>
-                <w:rtl/>
-              </w:rPr>
-              <w:t xml:space="preserve">⏳ </w:t>
+                <w:rFonts w:ascii="Segoe UI Emoji" w:cs="Segoe UI Emoji" w:eastAsia="Segoe UI Emoji" w:hAnsi="Segoe UI Emoji"/>
+                <w:sz w:val="18"/>
+                <w:szCs w:val="18"/>
+                <w:rtl/>
+              </w:rPr>
+              <w:t xml:space="preserve">✅</w:t>
+            </w:r>
+            <w:r>
+              <w:rPr>
+                <w:rFonts w:ascii="Arial" w:cs="Arial" w:eastAsia="Arial" w:hAnsi="Arial"/>
+                <w:b w:val="false"/>
+                <w:bCs w:val="false"/>
+                <w:sz w:val="18"/>
+                <w:szCs w:val="18"/>
+                <w:rtl/>
+              </w:rPr>
+              <w:t xml:space="preserve"> </w:t>
             </w:r>
             <w:r>
               <w:rPr>
@@ -16438,18 +16447,90 @@
                 <w:szCs w:val="18"/>
                 <w:rtl/>
               </w:rPr>
-              <w:t xml:space="preserve">مسجّل للتطوير اللاحق، كما طلب المالك («ان لم يتم تصميمها وفقا لها يتم تخزينها لتعديلات لاحقة»):</w:t>
-            </w:r>
-            <w:r>
-              <w:rPr>
-                <w:rFonts w:ascii="Arial" w:cs="Arial" w:eastAsia="Arial" w:hAnsi="Arial"/>
-                <w:b w:val="false"/>
-                <w:bCs w:val="false"/>
-                <w:sz w:val="18"/>
-                <w:szCs w:val="18"/>
-                <w:rtl/>
-              </w:rPr>
-              <w:t xml:space="preserve"> رقم عام للطلب حسب القسم يبقى ثابتًا، ورقم الشركة بعد الإصدار النهائي، وسجل مراجع للطلب (ERP، رقم الاعتماد من البنك، مرجع البنك، مرجع بنك المستفيد)</w:t>
+              <w:t xml:space="preserve">منفّذ في الفرع، لم يُصدر بعد:</w:t>
+            </w:r>
+            <w:r>
+              <w:rPr>
+                <w:rFonts w:ascii="Arial" w:cs="Arial" w:eastAsia="Arial" w:hAnsi="Arial"/>
+                <w:b w:val="false"/>
+                <w:bCs w:val="false"/>
+                <w:sz w:val="18"/>
+                <w:szCs w:val="18"/>
+                <w:rtl/>
+              </w:rPr>
+              <w:t xml:space="preserve"> رقم عام لكل نوع يُعطى عند دخول الخزينة ويبقى ثابتًا؛ ورقم الشركة عند الإصدار من البنك («عند الاصدار من البنك»، 2026-10-26)، أي عند نهاية الدورة بنجاح: رمز الشركة ثم رمز القسم ثم تسلسل بلا فجوات لكل شركة وقسم، مثل </w:t>
+            </w:r>
+            <w:r>
+              <w:rPr>
+                <w:rFonts w:ascii="Courier New" w:cs="Courier New" w:eastAsia="Courier New" w:hAnsi="Courier New"/>
+                <w:b w:val="false"/>
+                <w:bCs w:val="false"/>
+                <w:color w:val="1F2937"/>
+                <w:sz w:val="16"/>
+                <w:szCs w:val="16"/>
+                <w:shd w:fill="F1F3F5" w:color="auto" w:val="clear"/>
+                <w:rtl/>
+              </w:rPr>
+              <w:t xml:space="preserve">‎SA05-IMP-00001‎</w:t>
+            </w:r>
+            <w:r>
+              <w:rPr>
+                <w:rFonts w:ascii="Arial" w:cs="Arial" w:eastAsia="Arial" w:hAnsi="Arial"/>
+                <w:b w:val="false"/>
+                <w:bCs w:val="false"/>
+                <w:sz w:val="18"/>
+                <w:szCs w:val="18"/>
+                <w:rtl/>
+              </w:rPr>
+              <w:t xml:space="preserve"> (</w:t>
+            </w:r>
+            <w:r>
+              <w:rPr>
+                <w:rFonts w:ascii="Courier New" w:cs="Courier New" w:eastAsia="Courier New" w:hAnsi="Courier New"/>
+                <w:b w:val="false"/>
+                <w:bCs w:val="false"/>
+                <w:color w:val="1F2937"/>
+                <w:sz w:val="16"/>
+                <w:szCs w:val="16"/>
+                <w:shd w:fill="F1F3F5" w:color="auto" w:val="clear"/>
+                <w:rtl/>
+              </w:rPr>
+              <w:t xml:space="preserve">‎wfl.RequestCompanyNumber‎</w:t>
+            </w:r>
+            <w:r>
+              <w:rPr>
+                <w:rFonts w:ascii="Arial" w:cs="Arial" w:eastAsia="Arial" w:hAnsi="Arial"/>
+                <w:b w:val="false"/>
+                <w:bCs w:val="false"/>
+                <w:sz w:val="18"/>
+                <w:szCs w:val="18"/>
+                <w:rtl/>
+              </w:rPr>
+              <w:t xml:space="preserve">، الترحيل </w:t>
+            </w:r>
+            <w:r>
+              <w:rPr>
+                <w:rFonts w:ascii="Courier New" w:cs="Courier New" w:eastAsia="Courier New" w:hAnsi="Courier New"/>
+                <w:b w:val="false"/>
+                <w:bCs w:val="false"/>
+                <w:color w:val="1F2937"/>
+                <w:sz w:val="16"/>
+                <w:szCs w:val="16"/>
+                <w:shd w:fill="F1F3F5" w:color="auto" w:val="clear"/>
+                <w:rtl/>
+              </w:rPr>
+              <w:t xml:space="preserve">‎V0001‎</w:t>
+            </w:r>
+            <w:r>
+              <w:rPr>
+                <w:rFonts w:ascii="Arial" w:cs="Arial" w:eastAsia="Arial" w:hAnsi="Arial"/>
+                <w:b w:val="false"/>
+                <w:bCs w:val="false"/>
+                <w:sz w:val="18"/>
+                <w:szCs w:val="18"/>
+                <w:rtl/>
+              </w:rPr>
+              <w:t xml:space="preserve">). رمز القسم IMP للاستيراد وEXP للتصدير وGEN للعامة وTRS للأخرى، وللنوع الخاص بادئة رقمه. وسجل المراجع في صفحة الطلب: ERP، ورقم الاعتماد من البنك، ومرجع البنك، ومرجع بنك المستفيد، وأي مرجع آخر، مع البحث بها</w:t>
             </w:r>
           </w:p>
         </w:tc>
@@ -16602,14 +16683,23 @@
             </w:pPr>
             <w:r>
               <w:rPr>
-                <w:rFonts w:ascii="Arial" w:cs="Arial" w:eastAsia="Arial" w:hAnsi="Arial"/>
-                <w:b w:val="false"/>
-                <w:bCs w:val="false"/>
-                <w:sz w:val="18"/>
-                <w:szCs w:val="18"/>
-                <w:rtl/>
-              </w:rPr>
-              <w:t xml:space="preserve">⏳ </w:t>
+                <w:rFonts w:ascii="Segoe UI Emoji" w:cs="Segoe UI Emoji" w:eastAsia="Segoe UI Emoji" w:hAnsi="Segoe UI Emoji"/>
+                <w:sz w:val="18"/>
+                <w:szCs w:val="18"/>
+                <w:rtl/>
+              </w:rPr>
+              <w:t xml:space="preserve">✅</w:t>
+            </w:r>
+            <w:r>
+              <w:rPr>
+                <w:rFonts w:ascii="Arial" w:cs="Arial" w:eastAsia="Arial" w:hAnsi="Arial"/>
+                <w:b w:val="false"/>
+                <w:bCs w:val="false"/>
+                <w:sz w:val="18"/>
+                <w:szCs w:val="18"/>
+                <w:rtl/>
+              </w:rPr>
+              <w:t xml:space="preserve"> </w:t>
             </w:r>
             <w:r>
               <w:rPr>
@@ -16620,18 +16710,18 @@
                 <w:szCs w:val="18"/>
                 <w:rtl/>
               </w:rPr>
-              <w:t xml:space="preserve">مسجّل للتطوير اللاحق، يُنفَّذ مع الصف 72:</w:t>
-            </w:r>
-            <w:r>
-              <w:rPr>
-                <w:rFonts w:ascii="Arial" w:cs="Arial" w:eastAsia="Arial" w:hAnsi="Arial"/>
-                <w:b w:val="false"/>
-                <w:bCs w:val="false"/>
-                <w:sz w:val="18"/>
-                <w:szCs w:val="18"/>
-                <w:rtl/>
-              </w:rPr>
-              <w:t xml:space="preserve"> شاشة إعدادات لمدير نظام المشترك يعرّف فيها أنواع الطلبات ودوراتها وموافقاتها والمعنيين في الخزينة لكل نوع، وفئة لكل نوع تحدد شاشته. وعزل بيانات المشترك عن إدارة المنصة قائم اليوم، إلا بإذن دعم يمنحه المشترك</w:t>
+              <w:t xml:space="preserve">منفّذ:</w:t>
+            </w:r>
+            <w:r>
+              <w:rPr>
+                <w:rFonts w:ascii="Arial" w:cs="Arial" w:eastAsia="Arial" w:hAnsi="Arial"/>
+                <w:b w:val="false"/>
+                <w:bCs w:val="false"/>
+                <w:sz w:val="18"/>
+                <w:szCs w:val="18"/>
+                <w:rtl/>
+              </w:rPr>
+              <w:t xml:space="preserve"> شاشة «أنواع الطلبات ودورات العمل» لمدير النظام (في 1.0.7)، وشاشة لكل فئة مع عروض الخزينة: بانتظار الموافقة، والواردة، وقيد التنفيذ، والمسندة إليّ (في الفرع، لم تُصدر بعد)</w:t>
             </w:r>
           </w:p>
         </w:tc>

</xml_diff>

<commit_message>
Facility file per company and bank, with contracts by class and correspondence (docs/31 row 75)
- fac.FacilityFile COMPANY-BANK-NNNN, fac.FacilityFileFacility (class and order), fac.FacilityFileEntry
  (letters, e-mails, offers, renewal requests); migration V0002, also widens the company's reference code
  to two to six characters, a letter first.
- The first approval puts a facility in its file (the renewed facility's file, else the open file of the
  company and lead bank, else a new one) and writes CLASS-FILE or CLASS-FILE-NN.
- API /facility-files (list, detail, entries); screens for the files and a link from the facility card.
- The bank form requires the English name and the three-letter bank code.

Co-Authored-By: Claude Opus 5.5 <noreply@anthropic.com>
Claude-Session: https://claude.ai/code/session_012HHcRrzuvMBTL2FYxXtsyv
</commit_message>
<xml_diff>
--- a/treasury-platform/docs/31-OWNER-DECISIONS.docx
+++ b/treasury-platform/docs/31-OWNER-DECISIONS.docx
@@ -17242,6 +17242,219 @@
                 <w:rtl/>
               </w:rPr>
               <w:t xml:space="preserve">‎bankfas-1.0.7-server.tar‎</w:t>
+            </w:r>
+          </w:p>
+        </w:tc>
+      </w:tr>
+      <w:tr>
+        <w:trPr>
+          <w:cantSplit/>
+        </w:trPr>
+        <w:tc>
+          <w:tcPr>
+            <w:tcW w:type="dxa" w:w="925"/>
+            <w:tcBorders>
+              <w:top w:val="single" w:color="BFC9D6" w:sz="4"/>
+              <w:left w:val="single" w:color="BFC9D6" w:sz="4"/>
+              <w:bottom w:val="single" w:color="BFC9D6" w:sz="4"/>
+              <w:right w:val="single" w:color="BFC9D6" w:sz="4"/>
+            </w:tcBorders>
+            <w:tcMar>
+              <w:top w:type="dxa" w:w="50"/>
+              <w:left w:type="dxa" w:w="90"/>
+              <w:bottom w:type="dxa" w:w="50"/>
+              <w:right w:type="dxa" w:w="90"/>
+            </w:tcMar>
+            <w:vAlign w:val="top"/>
+          </w:tcPr>
+          <w:p>
+            <w:pPr>
+              <w:keepNext w:val="false"/>
+              <w:bidi/>
+              <w:spacing w:after="30" w:before="30" w:line="264"/>
+            </w:pPr>
+            <w:r>
+              <w:rPr>
+                <w:rFonts w:ascii="Arial" w:cs="Arial" w:eastAsia="Arial" w:hAnsi="Arial"/>
+                <w:b w:val="false"/>
+                <w:bCs w:val="false"/>
+                <w:sz w:val="18"/>
+                <w:szCs w:val="18"/>
+                <w:rtl/>
+              </w:rPr>
+              <w:t xml:space="preserve">75</w:t>
+            </w:r>
+          </w:p>
+        </w:tc>
+        <w:tc>
+          <w:tcPr>
+            <w:tcW w:type="dxa" w:w="2437"/>
+            <w:tcBorders>
+              <w:top w:val="single" w:color="BFC9D6" w:sz="4"/>
+              <w:left w:val="single" w:color="BFC9D6" w:sz="4"/>
+              <w:bottom w:val="single" w:color="BFC9D6" w:sz="4"/>
+              <w:right w:val="single" w:color="BFC9D6" w:sz="4"/>
+            </w:tcBorders>
+            <w:tcMar>
+              <w:top w:type="dxa" w:w="50"/>
+              <w:left w:type="dxa" w:w="90"/>
+              <w:bottom w:type="dxa" w:w="50"/>
+              <w:right w:type="dxa" w:w="90"/>
+            </w:tcMar>
+            <w:vAlign w:val="top"/>
+          </w:tcPr>
+          <w:p>
+            <w:pPr>
+              <w:keepNext w:val="false"/>
+              <w:bidi/>
+              <w:spacing w:after="30" w:before="30" w:line="264"/>
+            </w:pPr>
+            <w:r>
+              <w:rPr>
+                <w:rFonts w:ascii="Arial" w:cs="Arial" w:eastAsia="Arial" w:hAnsi="Arial"/>
+                <w:b/>
+                <w:bCs/>
+                <w:sz w:val="18"/>
+                <w:szCs w:val="18"/>
+                <w:rtl/>
+              </w:rPr>
+              <w:t xml:space="preserve">ملف التسهيلات مع البنك، ورمز البنك واسمه بالعربية والإنجليزية (2026-10-26).</w:t>
+            </w:r>
+            <w:r>
+              <w:rPr>
+                <w:rFonts w:ascii="Arial" w:cs="Arial" w:eastAsia="Arial" w:hAnsi="Arial"/>
+                <w:b w:val="false"/>
+                <w:bCs w:val="false"/>
+                <w:sz w:val="18"/>
+                <w:szCs w:val="18"/>
+                <w:rtl/>
+              </w:rPr>
+              <w:t xml:space="preserve"> «اسم البنك و كذلك الرمز الثلاثي... رمز البنك : ANB»، و«مرجع التسهيلات الاساسي بدون سنة و انما رقم متسلسل من 4 ارقام»، و«اريد ملف التسهيلات يتم بموجبه ربط كل التسهيلات على مدار حياة العقد مع البنك تجديدات مخاطبات و طلبات تجديد»، و«ملف واحد يضم شركة + بنك + رقم العقد ثم داخله يتم فتح عقود متعددة حسب النوع CAP - LTL - MTL»</w:t>
+            </w:r>
+          </w:p>
+        </w:tc>
+        <w:tc>
+          <w:tcPr>
+            <w:tcW w:type="dxa" w:w="2290"/>
+            <w:tcBorders>
+              <w:top w:val="single" w:color="BFC9D6" w:sz="4"/>
+              <w:left w:val="single" w:color="BFC9D6" w:sz="4"/>
+              <w:bottom w:val="single" w:color="BFC9D6" w:sz="4"/>
+              <w:right w:val="single" w:color="BFC9D6" w:sz="4"/>
+            </w:tcBorders>
+            <w:tcMar>
+              <w:top w:type="dxa" w:w="50"/>
+              <w:left w:type="dxa" w:w="90"/>
+              <w:bottom w:type="dxa" w:w="50"/>
+              <w:right w:type="dxa" w:w="90"/>
+            </w:tcMar>
+            <w:vAlign w:val="top"/>
+          </w:tcPr>
+          <w:p>
+            <w:pPr>
+              <w:keepNext w:val="false"/>
+              <w:bidi/>
+              <w:spacing w:after="30" w:before="30" w:line="264"/>
+            </w:pPr>
+            <w:r>
+              <w:rPr>
+                <w:rFonts w:ascii="Arial" w:cs="Arial" w:eastAsia="Arial" w:hAnsi="Arial"/>
+                <w:b w:val="false"/>
+                <w:bCs w:val="false"/>
+                <w:sz w:val="18"/>
+                <w:szCs w:val="18"/>
+                <w:rtl/>
+              </w:rPr>
+              <w:t xml:space="preserve">التسهيلات</w:t>
+            </w:r>
+          </w:p>
+        </w:tc>
+        <w:tc>
+          <w:tcPr>
+            <w:tcW w:type="dxa" w:w="4212"/>
+            <w:tcBorders>
+              <w:top w:val="single" w:color="BFC9D6" w:sz="4"/>
+              <w:left w:val="single" w:color="BFC9D6" w:sz="4"/>
+              <w:bottom w:val="single" w:color="BFC9D6" w:sz="4"/>
+              <w:right w:val="single" w:color="BFC9D6" w:sz="4"/>
+            </w:tcBorders>
+            <w:tcMar>
+              <w:top w:type="dxa" w:w="50"/>
+              <w:left w:type="dxa" w:w="90"/>
+              <w:bottom w:type="dxa" w:w="50"/>
+              <w:right w:type="dxa" w:w="90"/>
+            </w:tcMar>
+            <w:vAlign w:val="top"/>
+          </w:tcPr>
+          <w:p>
+            <w:pPr>
+              <w:keepNext w:val="false"/>
+              <w:bidi/>
+              <w:spacing w:after="30" w:before="30" w:line="264"/>
+            </w:pPr>
+            <w:r>
+              <w:rPr>
+                <w:rFonts w:ascii="Segoe UI Emoji" w:cs="Segoe UI Emoji" w:eastAsia="Segoe UI Emoji" w:hAnsi="Segoe UI Emoji"/>
+                <w:sz w:val="18"/>
+                <w:szCs w:val="18"/>
+                <w:rtl/>
+              </w:rPr>
+              <w:t xml:space="preserve">✅</w:t>
+            </w:r>
+            <w:r>
+              <w:rPr>
+                <w:rFonts w:ascii="Arial" w:cs="Arial" w:eastAsia="Arial" w:hAnsi="Arial"/>
+                <w:b w:val="false"/>
+                <w:bCs w:val="false"/>
+                <w:sz w:val="18"/>
+                <w:szCs w:val="18"/>
+                <w:rtl/>
+              </w:rPr>
+              <w:t xml:space="preserve"> </w:t>
+            </w:r>
+            <w:r>
+              <w:rPr>
+                <w:rFonts w:ascii="Arial" w:cs="Arial" w:eastAsia="Arial" w:hAnsi="Arial"/>
+                <w:b/>
+                <w:bCs/>
+                <w:sz w:val="18"/>
+                <w:szCs w:val="18"/>
+                <w:rtl/>
+              </w:rPr>
+              <w:t xml:space="preserve">منفّذ في الفرع، لم يُصدر بعد:</w:t>
+            </w:r>
+            <w:r>
+              <w:rPr>
+                <w:rFonts w:ascii="Arial" w:cs="Arial" w:eastAsia="Arial" w:hAnsi="Arial"/>
+                <w:b w:val="false"/>
+                <w:bCs w:val="false"/>
+                <w:sz w:val="18"/>
+                <w:szCs w:val="18"/>
+                <w:rtl/>
+              </w:rPr>
+              <w:t xml:space="preserve"> للبنك اسم عربي واسم إنجليزي ورمز من ثلاثة أحرف (مثل ANB)، وكلها إلزامية في نموذج البنك. ولكل شركة مع كل بنك </w:t>
+            </w:r>
+            <w:r>
+              <w:rPr>
+                <w:rFonts w:ascii="Arial" w:cs="Arial" w:eastAsia="Arial" w:hAnsi="Arial"/>
+                <w:b/>
+                <w:bCs/>
+                <w:sz w:val="18"/>
+                <w:szCs w:val="18"/>
+                <w:rtl/>
+              </w:rPr>
+              <w:t xml:space="preserve">ملف تسهيلات</w:t>
+            </w:r>
+            <w:r>
+              <w:rPr>
+                <w:rFonts w:ascii="Arial" w:cs="Arial" w:eastAsia="Arial" w:hAnsi="Arial"/>
+                <w:b w:val="false"/>
+                <w:bCs w:val="false"/>
+                <w:sz w:val="18"/>
+                <w:szCs w:val="18"/>
+                <w:rtl/>
+              </w:rPr>
+              <w:t xml:space="preserve"> مرجعه رمز الشركة ثم رمز البنك ثم رقم متسلسل من أربعة أرقام (SA05-ANB-0001)، ورمز الشركة من حرفين إلى ستة أولها حرف. يُفتح الملف عند أول اعتماد لتسهيل بين الشركة والبنك، وفيه تُفتح العقود حسب النوع: أول عقد CAP مرجعه CAP-SA05-ANB-0001، والتالي من النوع نفسه أو تجديده CAP-SA05-ANB-0001-02، وLTL-SA05-ANB-0001 لأول قرض طويل الأجل. التجديد يدخل ملف التسهيل الذي جدّده، والتسهيل الجديد يدخل آخر ملف مفتوح للشركة مع البنك، وإن لم يوجد يُفتح ملف جديد. وفي الملف سجل المراسلات مع البنك: خطابات وبريد إلكتروني وعروض وطلبات تجديد، واردة أو صادرة، مع مرجع البنك ووثيقة الشركة والعقد المعني. وفي الواجهة صفحة «ملفات التسهيلات» وصفحة الملف، ورابط إليه من بطاقة التسهيل. والمراجع المكتوبة سابقاً بالسنة لا تتغير. ترحيل القاعدة V0002</w:t>
             </w:r>
           </w:p>
         </w:tc>

</xml_diff>